<commit_message>
simply stochastic block analysis
</commit_message>
<xml_diff>
--- a/paper/S1-supplement-sensitivity.docx
+++ b/paper/S1-supplement-sensitivity.docx
@@ -306,6 +306,14 @@
       </w:pPr>
       <w:r>
         <w:t xml:space="preserve">To confirm that the primary findings reported in the main text are not an artefact of this specific cutoff, we repeated all network analyses at two alternative thresholds , 0.1 (permissive) and 0.3 (conservative) , and compared the key network statistics and visual structure against the main-text threshold of 0.2.</w:t>
+      </w:r>
+    </w:p>
+    <w:p>
+      <w:pPr>
+        <w:pStyle w:val="BodyText"/>
+      </w:pPr>
+      <w:r>
+        <w:t xml:space="preserve">```</w:t>
       </w:r>
     </w:p>
     <w:bookmarkEnd w:id="21"/>
@@ -12406,7 +12414,7 @@
     </w:p>
     <w:bookmarkEnd w:id="83"/>
     <w:bookmarkEnd w:id="84"/>
-    <w:bookmarkStart w:id="135" w:name="sec-s6"/>
+    <w:bookmarkStart w:id="105" w:name="sec-s6"/>
     <w:p>
       <w:pPr>
         <w:pStyle w:val="Heading1"/>
@@ -15225,7 +15233,7 @@
     </w:p>
     <w:bookmarkEnd w:id="93"/>
     <w:bookmarkEnd w:id="94"/>
-    <w:bookmarkStart w:id="129" w:name="sec-s6-3"/>
+    <w:bookmarkStart w:id="99" w:name="sec-s6-3"/>
     <w:p>
       <w:pPr>
         <w:pStyle w:val="Heading2"/>
@@ -15234,7 +15242,7 @@
         <w:t xml:space="preserve">S6.3 Stochastic Block Models</w:t>
       </w:r>
     </w:p>
-    <w:bookmarkStart w:id="127" w:name="rationale-4"/>
+    <w:bookmarkStart w:id="97" w:name="rationale-4"/>
     <w:p>
       <w:pPr>
         <w:pStyle w:val="Heading3"/>
@@ -15283,476 +15291,6 @@
       </w:r>
       <w:r>
         <w:t xml:space="preserve">rather than the visual answer provided by seriation.</w:t>
-      </w:r>
-    </w:p>
-    <w:p>
-      <w:pPr>
-        <w:pStyle w:val="BodyText"/>
-      </w:pPr>
-      <w:r>
-        <w:drawing>
-          <wp:inline>
-            <wp:extent cx="5943600" cy="4754880"/>
-            <wp:effectExtent b="0" l="0" r="0" t="0"/>
-            <wp:docPr descr="" title="" id="96" name="Picture"/>
-            <a:graphic>
-              <a:graphicData uri="http://schemas.openxmlformats.org/drawingml/2006/picture">
-                <pic:pic>
-                  <pic:nvPicPr>
-                    <pic:cNvPr descr="S1-supplement-sensitivity_files/figure-docx/s6-sbm-compute-1.png" id="97" name="Picture"/>
-                    <pic:cNvPicPr>
-                      <a:picLocks noChangeArrowheads="1" noChangeAspect="1"/>
-                    </pic:cNvPicPr>
-                  </pic:nvPicPr>
-                  <pic:blipFill>
-                    <a:blip r:embed="rId95"/>
-                    <a:stretch>
-                      <a:fillRect/>
-                    </a:stretch>
-                  </pic:blipFill>
-                  <pic:spPr bwMode="auto">
-                    <a:xfrm>
-                      <a:off x="0" y="0"/>
-                      <a:ext cx="5943600" cy="4754880"/>
-                    </a:xfrm>
-                    <a:prstGeom prst="rect">
-                      <a:avLst/>
-                    </a:prstGeom>
-                    <a:noFill/>
-                    <a:ln w="9525">
-                      <a:noFill/>
-                      <a:headEnd/>
-                      <a:tailEnd/>
-                    </a:ln>
-                  </pic:spPr>
-                </pic:pic>
-              </a:graphicData>
-            </a:graphic>
-          </wp:inline>
-        </w:drawing>
-      </w:r>
-    </w:p>
-    <w:p>
-      <w:pPr>
-        <w:pStyle w:val="BodyText"/>
-      </w:pPr>
-      <w:r>
-        <w:drawing>
-          <wp:inline>
-            <wp:extent cx="5943600" cy="4754880"/>
-            <wp:effectExtent b="0" l="0" r="0" t="0"/>
-            <wp:docPr descr="" title="" id="99" name="Picture"/>
-            <a:graphic>
-              <a:graphicData uri="http://schemas.openxmlformats.org/drawingml/2006/picture">
-                <pic:pic>
-                  <pic:nvPicPr>
-                    <pic:cNvPr descr="S1-supplement-sensitivity_files/figure-docx/s6-sbm-compute-2.png" id="100" name="Picture"/>
-                    <pic:cNvPicPr>
-                      <a:picLocks noChangeArrowheads="1" noChangeAspect="1"/>
-                    </pic:cNvPicPr>
-                  </pic:nvPicPr>
-                  <pic:blipFill>
-                    <a:blip r:embed="rId98"/>
-                    <a:stretch>
-                      <a:fillRect/>
-                    </a:stretch>
-                  </pic:blipFill>
-                  <pic:spPr bwMode="auto">
-                    <a:xfrm>
-                      <a:off x="0" y="0"/>
-                      <a:ext cx="5943600" cy="4754880"/>
-                    </a:xfrm>
-                    <a:prstGeom prst="rect">
-                      <a:avLst/>
-                    </a:prstGeom>
-                    <a:noFill/>
-                    <a:ln w="9525">
-                      <a:noFill/>
-                      <a:headEnd/>
-                      <a:tailEnd/>
-                    </a:ln>
-                  </pic:spPr>
-                </pic:pic>
-              </a:graphicData>
-            </a:graphic>
-          </wp:inline>
-        </w:drawing>
-      </w:r>
-    </w:p>
-    <w:p>
-      <w:pPr>
-        <w:pStyle w:val="BodyText"/>
-      </w:pPr>
-      <w:r>
-        <w:drawing>
-          <wp:inline>
-            <wp:extent cx="5943600" cy="4754880"/>
-            <wp:effectExtent b="0" l="0" r="0" t="0"/>
-            <wp:docPr descr="" title="" id="102" name="Picture"/>
-            <a:graphic>
-              <a:graphicData uri="http://schemas.openxmlformats.org/drawingml/2006/picture">
-                <pic:pic>
-                  <pic:nvPicPr>
-                    <pic:cNvPr descr="S1-supplement-sensitivity_files/figure-docx/s6-sbm-compute-3.png" id="103" name="Picture"/>
-                    <pic:cNvPicPr>
-                      <a:picLocks noChangeArrowheads="1" noChangeAspect="1"/>
-                    </pic:cNvPicPr>
-                  </pic:nvPicPr>
-                  <pic:blipFill>
-                    <a:blip r:embed="rId101"/>
-                    <a:stretch>
-                      <a:fillRect/>
-                    </a:stretch>
-                  </pic:blipFill>
-                  <pic:spPr bwMode="auto">
-                    <a:xfrm>
-                      <a:off x="0" y="0"/>
-                      <a:ext cx="5943600" cy="4754880"/>
-                    </a:xfrm>
-                    <a:prstGeom prst="rect">
-                      <a:avLst/>
-                    </a:prstGeom>
-                    <a:noFill/>
-                    <a:ln w="9525">
-                      <a:noFill/>
-                      <a:headEnd/>
-                      <a:tailEnd/>
-                    </a:ln>
-                  </pic:spPr>
-                </pic:pic>
-              </a:graphicData>
-            </a:graphic>
-          </wp:inline>
-        </w:drawing>
-      </w:r>
-    </w:p>
-    <w:p>
-      <w:pPr>
-        <w:pStyle w:val="BodyText"/>
-      </w:pPr>
-      <w:r>
-        <w:drawing>
-          <wp:inline>
-            <wp:extent cx="5943600" cy="4754880"/>
-            <wp:effectExtent b="0" l="0" r="0" t="0"/>
-            <wp:docPr descr="" title="" id="105" name="Picture"/>
-            <a:graphic>
-              <a:graphicData uri="http://schemas.openxmlformats.org/drawingml/2006/picture">
-                <pic:pic>
-                  <pic:nvPicPr>
-                    <pic:cNvPr descr="S1-supplement-sensitivity_files/figure-docx/s6-sbm-compute-4.png" id="106" name="Picture"/>
-                    <pic:cNvPicPr>
-                      <a:picLocks noChangeArrowheads="1" noChangeAspect="1"/>
-                    </pic:cNvPicPr>
-                  </pic:nvPicPr>
-                  <pic:blipFill>
-                    <a:blip r:embed="rId104"/>
-                    <a:stretch>
-                      <a:fillRect/>
-                    </a:stretch>
-                  </pic:blipFill>
-                  <pic:spPr bwMode="auto">
-                    <a:xfrm>
-                      <a:off x="0" y="0"/>
-                      <a:ext cx="5943600" cy="4754880"/>
-                    </a:xfrm>
-                    <a:prstGeom prst="rect">
-                      <a:avLst/>
-                    </a:prstGeom>
-                    <a:noFill/>
-                    <a:ln w="9525">
-                      <a:noFill/>
-                      <a:headEnd/>
-                      <a:tailEnd/>
-                    </a:ln>
-                  </pic:spPr>
-                </pic:pic>
-              </a:graphicData>
-            </a:graphic>
-          </wp:inline>
-        </w:drawing>
-      </w:r>
-    </w:p>
-    <w:p>
-      <w:pPr>
-        <w:pStyle w:val="BodyText"/>
-      </w:pPr>
-      <w:r>
-        <w:drawing>
-          <wp:inline>
-            <wp:extent cx="5943600" cy="4754880"/>
-            <wp:effectExtent b="0" l="0" r="0" t="0"/>
-            <wp:docPr descr="" title="" id="108" name="Picture"/>
-            <a:graphic>
-              <a:graphicData uri="http://schemas.openxmlformats.org/drawingml/2006/picture">
-                <pic:pic>
-                  <pic:nvPicPr>
-                    <pic:cNvPr descr="S1-supplement-sensitivity_files/figure-docx/s6-sbm-compute-5.png" id="109" name="Picture"/>
-                    <pic:cNvPicPr>
-                      <a:picLocks noChangeArrowheads="1" noChangeAspect="1"/>
-                    </pic:cNvPicPr>
-                  </pic:nvPicPr>
-                  <pic:blipFill>
-                    <a:blip r:embed="rId107"/>
-                    <a:stretch>
-                      <a:fillRect/>
-                    </a:stretch>
-                  </pic:blipFill>
-                  <pic:spPr bwMode="auto">
-                    <a:xfrm>
-                      <a:off x="0" y="0"/>
-                      <a:ext cx="5943600" cy="4754880"/>
-                    </a:xfrm>
-                    <a:prstGeom prst="rect">
-                      <a:avLst/>
-                    </a:prstGeom>
-                    <a:noFill/>
-                    <a:ln w="9525">
-                      <a:noFill/>
-                      <a:headEnd/>
-                      <a:tailEnd/>
-                    </a:ln>
-                  </pic:spPr>
-                </pic:pic>
-              </a:graphicData>
-            </a:graphic>
-          </wp:inline>
-        </w:drawing>
-      </w:r>
-    </w:p>
-    <w:p>
-      <w:pPr>
-        <w:pStyle w:val="BodyText"/>
-      </w:pPr>
-      <w:r>
-        <w:drawing>
-          <wp:inline>
-            <wp:extent cx="5943600" cy="4754880"/>
-            <wp:effectExtent b="0" l="0" r="0" t="0"/>
-            <wp:docPr descr="" title="" id="111" name="Picture"/>
-            <a:graphic>
-              <a:graphicData uri="http://schemas.openxmlformats.org/drawingml/2006/picture">
-                <pic:pic>
-                  <pic:nvPicPr>
-                    <pic:cNvPr descr="S1-supplement-sensitivity_files/figure-docx/s6-sbm-compute-6.png" id="112" name="Picture"/>
-                    <pic:cNvPicPr>
-                      <a:picLocks noChangeArrowheads="1" noChangeAspect="1"/>
-                    </pic:cNvPicPr>
-                  </pic:nvPicPr>
-                  <pic:blipFill>
-                    <a:blip r:embed="rId110"/>
-                    <a:stretch>
-                      <a:fillRect/>
-                    </a:stretch>
-                  </pic:blipFill>
-                  <pic:spPr bwMode="auto">
-                    <a:xfrm>
-                      <a:off x="0" y="0"/>
-                      <a:ext cx="5943600" cy="4754880"/>
-                    </a:xfrm>
-                    <a:prstGeom prst="rect">
-                      <a:avLst/>
-                    </a:prstGeom>
-                    <a:noFill/>
-                    <a:ln w="9525">
-                      <a:noFill/>
-                      <a:headEnd/>
-                      <a:tailEnd/>
-                    </a:ln>
-                  </pic:spPr>
-                </pic:pic>
-              </a:graphicData>
-            </a:graphic>
-          </wp:inline>
-        </w:drawing>
-      </w:r>
-    </w:p>
-    <w:p>
-      <w:pPr>
-        <w:pStyle w:val="BodyText"/>
-      </w:pPr>
-      <w:r>
-        <w:drawing>
-          <wp:inline>
-            <wp:extent cx="5943600" cy="4754880"/>
-            <wp:effectExtent b="0" l="0" r="0" t="0"/>
-            <wp:docPr descr="" title="" id="114" name="Picture"/>
-            <a:graphic>
-              <a:graphicData uri="http://schemas.openxmlformats.org/drawingml/2006/picture">
-                <pic:pic>
-                  <pic:nvPicPr>
-                    <pic:cNvPr descr="S1-supplement-sensitivity_files/figure-docx/s6-sbm-compute-7.png" id="115" name="Picture"/>
-                    <pic:cNvPicPr>
-                      <a:picLocks noChangeArrowheads="1" noChangeAspect="1"/>
-                    </pic:cNvPicPr>
-                  </pic:nvPicPr>
-                  <pic:blipFill>
-                    <a:blip r:embed="rId113"/>
-                    <a:stretch>
-                      <a:fillRect/>
-                    </a:stretch>
-                  </pic:blipFill>
-                  <pic:spPr bwMode="auto">
-                    <a:xfrm>
-                      <a:off x="0" y="0"/>
-                      <a:ext cx="5943600" cy="4754880"/>
-                    </a:xfrm>
-                    <a:prstGeom prst="rect">
-                      <a:avLst/>
-                    </a:prstGeom>
-                    <a:noFill/>
-                    <a:ln w="9525">
-                      <a:noFill/>
-                      <a:headEnd/>
-                      <a:tailEnd/>
-                    </a:ln>
-                  </pic:spPr>
-                </pic:pic>
-              </a:graphicData>
-            </a:graphic>
-          </wp:inline>
-        </w:drawing>
-      </w:r>
-    </w:p>
-    <w:p>
-      <w:pPr>
-        <w:pStyle w:val="BodyText"/>
-      </w:pPr>
-      <w:r>
-        <w:drawing>
-          <wp:inline>
-            <wp:extent cx="5943600" cy="4754880"/>
-            <wp:effectExtent b="0" l="0" r="0" t="0"/>
-            <wp:docPr descr="" title="" id="117" name="Picture"/>
-            <a:graphic>
-              <a:graphicData uri="http://schemas.openxmlformats.org/drawingml/2006/picture">
-                <pic:pic>
-                  <pic:nvPicPr>
-                    <pic:cNvPr descr="S1-supplement-sensitivity_files/figure-docx/s6-sbm-compute-8.png" id="118" name="Picture"/>
-                    <pic:cNvPicPr>
-                      <a:picLocks noChangeArrowheads="1" noChangeAspect="1"/>
-                    </pic:cNvPicPr>
-                  </pic:nvPicPr>
-                  <pic:blipFill>
-                    <a:blip r:embed="rId116"/>
-                    <a:stretch>
-                      <a:fillRect/>
-                    </a:stretch>
-                  </pic:blipFill>
-                  <pic:spPr bwMode="auto">
-                    <a:xfrm>
-                      <a:off x="0" y="0"/>
-                      <a:ext cx="5943600" cy="4754880"/>
-                    </a:xfrm>
-                    <a:prstGeom prst="rect">
-                      <a:avLst/>
-                    </a:prstGeom>
-                    <a:noFill/>
-                    <a:ln w="9525">
-                      <a:noFill/>
-                      <a:headEnd/>
-                      <a:tailEnd/>
-                    </a:ln>
-                  </pic:spPr>
-                </pic:pic>
-              </a:graphicData>
-            </a:graphic>
-          </wp:inline>
-        </w:drawing>
-      </w:r>
-    </w:p>
-    <w:p>
-      <w:pPr>
-        <w:pStyle w:val="BodyText"/>
-      </w:pPr>
-      <w:r>
-        <w:drawing>
-          <wp:inline>
-            <wp:extent cx="5943600" cy="4754880"/>
-            <wp:effectExtent b="0" l="0" r="0" t="0"/>
-            <wp:docPr descr="" title="" id="120" name="Picture"/>
-            <a:graphic>
-              <a:graphicData uri="http://schemas.openxmlformats.org/drawingml/2006/picture">
-                <pic:pic>
-                  <pic:nvPicPr>
-                    <pic:cNvPr descr="S1-supplement-sensitivity_files/figure-docx/s6-sbm-compute-9.png" id="121" name="Picture"/>
-                    <pic:cNvPicPr>
-                      <a:picLocks noChangeArrowheads="1" noChangeAspect="1"/>
-                    </pic:cNvPicPr>
-                  </pic:nvPicPr>
-                  <pic:blipFill>
-                    <a:blip r:embed="rId119"/>
-                    <a:stretch>
-                      <a:fillRect/>
-                    </a:stretch>
-                  </pic:blipFill>
-                  <pic:spPr bwMode="auto">
-                    <a:xfrm>
-                      <a:off x="0" y="0"/>
-                      <a:ext cx="5943600" cy="4754880"/>
-                    </a:xfrm>
-                    <a:prstGeom prst="rect">
-                      <a:avLst/>
-                    </a:prstGeom>
-                    <a:noFill/>
-                    <a:ln w="9525">
-                      <a:noFill/>
-                      <a:headEnd/>
-                      <a:tailEnd/>
-                    </a:ln>
-                  </pic:spPr>
-                </pic:pic>
-              </a:graphicData>
-            </a:graphic>
-          </wp:inline>
-        </w:drawing>
-      </w:r>
-    </w:p>
-    <w:p>
-      <w:pPr>
-        <w:pStyle w:val="BodyText"/>
-      </w:pPr>
-      <w:r>
-        <w:drawing>
-          <wp:inline>
-            <wp:extent cx="5943600" cy="4754880"/>
-            <wp:effectExtent b="0" l="0" r="0" t="0"/>
-            <wp:docPr descr="" title="" id="123" name="Picture"/>
-            <a:graphic>
-              <a:graphicData uri="http://schemas.openxmlformats.org/drawingml/2006/picture">
-                <pic:pic>
-                  <pic:nvPicPr>
-                    <pic:cNvPr descr="S1-supplement-sensitivity_files/figure-docx/s6-sbm-compute-10.png" id="124" name="Picture"/>
-                    <pic:cNvPicPr>
-                      <a:picLocks noChangeArrowheads="1" noChangeAspect="1"/>
-                    </pic:cNvPicPr>
-                  </pic:nvPicPr>
-                  <pic:blipFill>
-                    <a:blip r:embed="rId122"/>
-                    <a:stretch>
-                      <a:fillRect/>
-                    </a:stretch>
-                  </pic:blipFill>
-                  <pic:spPr bwMode="auto">
-                    <a:xfrm>
-                      <a:off x="0" y="0"/>
-                      <a:ext cx="5943600" cy="4754880"/>
-                    </a:xfrm>
-                    <a:prstGeom prst="rect">
-                      <a:avLst/>
-                    </a:prstGeom>
-                    <a:noFill/>
-                    <a:ln w="9525">
-                      <a:noFill/>
-                      <a:headEnd/>
-                      <a:tailEnd/>
-                    </a:ln>
-                  </pic:spPr>
-                </pic:pic>
-              </a:graphicData>
-            </a:graphic>
-          </wp:inline>
-        </w:drawing>
       </w:r>
     </w:p>
     <w:tbl>
@@ -15769,7 +15307,7 @@
       <w:tr>
         <w:tc>
           <w:tcPr/>
-          <w:bookmarkStart w:id="125" w:name="tbl-sbm-icl"/>
+          <w:bookmarkStart w:id="95" w:name="tbl-sbm-icl"/>
           <w:tbl>
             <w:tblPr>
               <w:tblStyle w:val="Table"/>
@@ -16082,7 +15620,7 @@
               <w:t xml:space="preserve">Table 19: Integrated Classification Likelihood (ICL) for stochastic block models with K = 1 to 5 blocks, by phase. The best-supported number of blocks (maximum ICL) is bolded. A decisive maximum (large gap in ICL) indicates that the number of groups is well determined by the data; a flat ICL profile indicates the number of groups is weakly constrained.</w:t>
             </w:r>
           </w:p>
-          <w:bookmarkEnd w:id="125"/>
+          <w:bookmarkEnd w:id="95"/>
         </w:tc>
       </w:tr>
     </w:tbl>
@@ -16108,7 +15646,7 @@
       <w:tr>
         <w:tc>
           <w:tcPr/>
-          <w:bookmarkStart w:id="126" w:name="tbl-sbm-membership"/>
+          <w:bookmarkStart w:id="96" w:name="tbl-sbm-membership"/>
           <w:tbl>
             <w:tblPr>
               <w:tblStyle w:val="Table"/>
@@ -18928,12 +18466,12 @@
               <w:t xml:space="preserve">Table 20: Posterior block-membership probabilities and modal (hard) assignment from the best-fitting stochastic block model for each phase. Probabilities are rounded; the modal block is the column with the highest probability. Sites with probability spread across blocks (e.g. no entry above 0.7) have ambiguous membership.</w:t>
             </w:r>
           </w:p>
-          <w:bookmarkEnd w:id="126"/>
+          <w:bookmarkEnd w:id="96"/>
         </w:tc>
       </w:tr>
     </w:tbl>
-    <w:bookmarkEnd w:id="127"/>
-    <w:bookmarkStart w:id="128" w:name="interpretation-1"/>
+    <w:bookmarkEnd w:id="97"/>
+    <w:bookmarkStart w:id="98" w:name="interpretation-1"/>
     <w:p>
       <w:pPr>
         <w:pStyle w:val="Heading3"/>
@@ -19091,9 +18629,9 @@
         <w:t xml:space="preserve">blocks the model chooses and how far that partition diverges from the manual restricted/broad assignment. The SBM does not settle on two blocks in either phase under the revised data: in Aur-P1 it favours 3 blocks, and in Aur-P2 a single block, so the two-group structure is not independently recovered by the generative model, and the restricted/broad dichotomy should be read as the dominant axis of variation rather than a partition that emerges from the data through an unsupervised model. These results complement, rather than supersede, the bootstrap analysis: the bootstrap quantifies sampling stability of the main-text partition, while the SBM asks whether an independent generative model reproduces it.</w:t>
       </w:r>
     </w:p>
-    <w:bookmarkEnd w:id="128"/>
-    <w:bookmarkEnd w:id="129"/>
-    <w:bookmarkStart w:id="133" w:name="sec-s6-4"/>
+    <w:bookmarkEnd w:id="98"/>
+    <w:bookmarkEnd w:id="99"/>
+    <w:bookmarkStart w:id="103" w:name="sec-s6-4"/>
     <w:p>
       <w:pPr>
         <w:pStyle w:val="Heading2"/>
@@ -19102,7 +18640,7 @@
         <w:t xml:space="preserve">S6.4 Cross-Validation of Group Assignments (ARI)</w:t>
       </w:r>
     </w:p>
-    <w:bookmarkStart w:id="131" w:name="rationale-5"/>
+    <w:bookmarkStart w:id="101" w:name="rationale-5"/>
     <w:p>
       <w:pPr>
         <w:pStyle w:val="Heading3"/>
@@ -19145,7 +18683,7 @@
       <w:tr>
         <w:tc>
           <w:tcPr/>
-          <w:bookmarkStart w:id="130" w:name="tbl-s6-ari"/>
+          <w:bookmarkStart w:id="100" w:name="tbl-s6-ari"/>
           <w:tbl>
             <w:tblPr>
               <w:tblStyle w:val="Table"/>
@@ -19339,12 +18877,12 @@
               <w:t xml:space="preserve">Table 21: Adjusted Rand Index between the main-text manual restricted/broad assignment, the bootstrap modal blocks (S6.2), and the SBM modal assignments (S6.3), by phase.</w:t>
             </w:r>
           </w:p>
-          <w:bookmarkEnd w:id="130"/>
+          <w:bookmarkEnd w:id="100"/>
         </w:tc>
       </w:tr>
     </w:tbl>
-    <w:bookmarkEnd w:id="131"/>
-    <w:bookmarkStart w:id="132" w:name="interpretation-2"/>
+    <w:bookmarkEnd w:id="101"/>
+    <w:bookmarkStart w:id="102" w:name="interpretation-2"/>
     <w:p>
       <w:pPr>
         <w:pStyle w:val="Heading3"/>
@@ -19436,9 +18974,9 @@
         <w:t xml:space="preserve">The two-group claim should be presented as strongest where the manual assignment, the bootstrap, and the SBM converge, and qualified where they diverge. Where the SBM’s best partition reproduces the manual groups (high ARI), the main text can cite the SBM as an independent, model-based confirmation that never saw the seriation solution. Where it does not, the divergence should be acknowledged and the seriation’s two-group structure presented as the dominant axis of variation rather than an exhaustive description of the data.</w:t>
       </w:r>
     </w:p>
-    <w:bookmarkEnd w:id="132"/>
-    <w:bookmarkEnd w:id="133"/>
-    <w:bookmarkStart w:id="134" w:name="sec-s6-5"/>
+    <w:bookmarkEnd w:id="102"/>
+    <w:bookmarkEnd w:id="103"/>
+    <w:bookmarkStart w:id="104" w:name="sec-s6-5"/>
     <w:p>
       <w:pPr>
         <w:pStyle w:val="Heading2"/>
@@ -19574,9 +19112,9 @@
         <w:t xml:space="preserve">) for the borderline sites, and note that the strength of the dichotomy is phase-dependent and that the Aur-P2 results rest on only 9 sites.</w:t>
       </w:r>
     </w:p>
-    <w:bookmarkEnd w:id="134"/>
-    <w:bookmarkEnd w:id="135"/>
-    <w:bookmarkStart w:id="152" w:name="sec-s7"/>
+    <w:bookmarkEnd w:id="104"/>
+    <w:bookmarkEnd w:id="105"/>
+    <w:bookmarkStart w:id="122" w:name="sec-s7"/>
     <w:p>
       <w:pPr>
         <w:pStyle w:val="Heading1"/>
@@ -19585,7 +19123,7 @@
         <w:t xml:space="preserve">S7. Object-Type Sensitivity: Figurine Exclusion</w:t>
       </w:r>
     </w:p>
-    <w:bookmarkStart w:id="136" w:name="s7.1-rationale"/>
+    <w:bookmarkStart w:id="106" w:name="s7.1-rationale"/>
     <w:p>
       <w:pPr>
         <w:pStyle w:val="Heading2"/>
@@ -19608,8 +19146,8 @@
         <w:t xml:space="preserve">demonstrate that ivory figurines in the Swabian Aurignacian carry sign sequences with higher information density than tools. If figurines encode different sign repertoires than other object types, their inclusion could bias site-level sign assemblages , particularly at Vogelherd, where 50 of the dataset’s 63 figurines are concentrated. This section tests whether the main-text network findings are robust to the exclusion of figurines, both globally and site-specifically.</w:t>
       </w:r>
     </w:p>
-    <w:bookmarkEnd w:id="136"/>
-    <w:bookmarkStart w:id="138" w:name="X558aa60e1a258171fb4fb8ecbd68200d2a7d022"/>
+    <w:bookmarkEnd w:id="106"/>
+    <w:bookmarkStart w:id="108" w:name="X558aa60e1a258171fb4fb8ecbd68200d2a7d022"/>
     <w:p>
       <w:pPr>
         <w:pStyle w:val="Heading2"/>
@@ -19632,7 +19170,7 @@
       <w:tr>
         <w:tc>
           <w:tcPr/>
-          <w:bookmarkStart w:id="137" w:name="tbl-figurine-count"/>
+          <w:bookmarkStart w:id="107" w:name="tbl-figurine-count"/>
           <w:tbl>
             <w:tblPr>
               <w:tblStyle w:val="Table"/>
@@ -20318,7 +19856,7 @@
               <w:t xml:space="preserve">Table 22: Distribution of figurine objects across phases and sites. Figurine types include figurine zoomorph, figurine anthropomorph, figurine undet., and possible figurine.</w:t>
             </w:r>
           </w:p>
-          <w:bookmarkEnd w:id="137"/>
+          <w:bookmarkEnd w:id="107"/>
         </w:tc>
       </w:tr>
     </w:tbl>
@@ -20341,8 +19879,8 @@
         <w:t xml:space="preserve">shows that figurines are heavily concentrated at Vogelherd (50 objects), with minor representation at Hohle Fels (8), Geissenklösterle (3), Hohlenstein-Stadel (1), and La Ferrassie (1). Of these, 59 fall within Aur-P1 and the remaining 4 , all Hohle Fels objects from AH IV and Iid , fall within Aur-P2 under the layer-level assignment. The analysis therefore tests whether the Aur-P1 network structure , which reports the higher mean degree (7.50) , is driven by these 50 objects at a single site.</w:t>
       </w:r>
     </w:p>
-    <w:bookmarkEnd w:id="138"/>
-    <w:bookmarkStart w:id="143" w:name="s7.3-analysis-1-exclude-all-figurines"/>
+    <w:bookmarkEnd w:id="108"/>
+    <w:bookmarkStart w:id="113" w:name="s7.3-analysis-1-exclude-all-figurines"/>
     <w:p>
       <w:pPr>
         <w:pStyle w:val="Heading2"/>
@@ -20351,7 +19889,7 @@
         <w:t xml:space="preserve">S7.3 Analysis 1: Exclude All Figurines</w:t>
       </w:r>
     </w:p>
-    <w:bookmarkStart w:id="141" w:name="method"/>
+    <w:bookmarkStart w:id="111" w:name="method"/>
     <w:p>
       <w:pPr>
         <w:pStyle w:val="Heading3"/>
@@ -20415,7 +19953,7 @@
       <w:tr>
         <w:tc>
           <w:tcPr/>
-          <w:bookmarkStart w:id="139" w:name="tbl-exclude-figurines"/>
+          <w:bookmarkStart w:id="109" w:name="tbl-exclude-figurines"/>
           <w:tbl>
             <w:tblPr>
               <w:tblStyle w:val="Table"/>
@@ -20981,7 +20519,7 @@
               <w:t xml:space="preserve">Table 23: Network statistics before and after excluding all figurine objects (figurine zoomorph, figurine anthropomorph, figurine undet., and possible figurine). Threshold = 0.2, Jaccard similarity.</w:t>
             </w:r>
           </w:p>
-          <w:bookmarkEnd w:id="139"/>
+          <w:bookmarkEnd w:id="109"/>
         </w:tc>
       </w:tr>
     </w:tbl>
@@ -21007,7 +20545,7 @@
       <w:tr>
         <w:tc>
           <w:tcPr/>
-          <w:bookmarkStart w:id="140" w:name="tbl-figurine-sites-lost"/>
+          <w:bookmarkStart w:id="110" w:name="tbl-figurine-sites-lost"/>
           <w:tbl>
             <w:tblPr>
               <w:tblStyle w:val="Table"/>
@@ -21200,12 +20738,12 @@
               <w:t xml:space="preserve">Table 24: Number of sites per phase before and after figurine exclusion. Sites are lost when all objects at that site are figurines.</w:t>
             </w:r>
           </w:p>
-          <w:bookmarkEnd w:id="140"/>
+          <w:bookmarkEnd w:id="110"/>
         </w:tc>
       </w:tr>
     </w:tbl>
-    <w:bookmarkEnd w:id="141"/>
-    <w:bookmarkStart w:id="142" w:name="interpretation-3"/>
+    <w:bookmarkEnd w:id="111"/>
+    <w:bookmarkStart w:id="112" w:name="interpretation-3"/>
     <w:p>
       <w:pPr>
         <w:pStyle w:val="Heading3"/>
@@ -21230,9 +20768,9 @@
         <w:t xml:space="preserve">Critically, Aur-P1 retains the higher mean degree (7.40) under figurine exclusion, preserving the main-text ordering Aur-P1 &gt; Aur-P2 (7.40 &gt; 4.22). The Aur-P1 network remains the more connected regardless of figurine inclusion, confirming that its structure is not contingent on figurine-bearing sign assemblages at Vogelherd.</w:t>
       </w:r>
     </w:p>
-    <w:bookmarkEnd w:id="142"/>
-    <w:bookmarkEnd w:id="143"/>
-    <w:bookmarkStart w:id="148" w:name="X7549e60451b9f7bbee640100d361a0cf771ac62"/>
+    <w:bookmarkEnd w:id="112"/>
+    <w:bookmarkEnd w:id="113"/>
+    <w:bookmarkStart w:id="118" w:name="X7549e60451b9f7bbee640100d361a0cf771ac62"/>
     <w:p>
       <w:pPr>
         <w:pStyle w:val="Heading2"/>
@@ -21241,7 +20779,7 @@
         <w:t xml:space="preserve">S7.4 Analysis 2: Exclude Vogelherd Figurines Only</w:t>
       </w:r>
     </w:p>
-    <w:bookmarkStart w:id="146" w:name="method-1"/>
+    <w:bookmarkStart w:id="116" w:name="method-1"/>
     <w:p>
       <w:pPr>
         <w:pStyle w:val="Heading3"/>
@@ -21272,7 +20810,7 @@
       <w:tr>
         <w:tc>
           <w:tcPr/>
-          <w:bookmarkStart w:id="144" w:name="tbl-vogelherd-exclude"/>
+          <w:bookmarkStart w:id="114" w:name="tbl-vogelherd-exclude"/>
           <w:tbl>
             <w:tblPr>
               <w:tblStyle w:val="Table"/>
@@ -21838,7 +21376,7 @@
               <w:t xml:space="preserve">Table 25: Network statistics before and after excluding figurines from Vogelherd only. All other figurines (Hohle Fels, Geissenklösterle, Hohlenstein-Stadel, La Ferrassie) are retained. Threshold = 0.2, Jaccard similarity.</w:t>
             </w:r>
           </w:p>
-          <w:bookmarkEnd w:id="144"/>
+          <w:bookmarkEnd w:id="114"/>
         </w:tc>
       </w:tr>
     </w:tbl>
@@ -21864,7 +21402,7 @@
       <w:tr>
         <w:tc>
           <w:tcPr/>
-          <w:bookmarkStart w:id="145" w:name="tbl-vogelherd-objects"/>
+          <w:bookmarkStart w:id="115" w:name="tbl-vogelherd-objects"/>
           <w:tbl>
             <w:tblPr>
               <w:tblStyle w:val="Table"/>
@@ -22003,12 +21541,12 @@
               <w:t xml:space="preserve">Table 26: Vogelherd object counts before and after removing figurines. Non-figurine objects at Vogelherd (tools, plaquettes, etc.) are retained.</w:t>
             </w:r>
           </w:p>
-          <w:bookmarkEnd w:id="145"/>
+          <w:bookmarkEnd w:id="115"/>
         </w:tc>
       </w:tr>
     </w:tbl>
-    <w:bookmarkEnd w:id="146"/>
-    <w:bookmarkStart w:id="147" w:name="interpretation-4"/>
+    <w:bookmarkEnd w:id="116"/>
+    <w:bookmarkStart w:id="117" w:name="interpretation-4"/>
     <w:p>
       <w:pPr>
         <w:pStyle w:val="Heading3"/>
@@ -22033,9 +21571,9 @@
         <w:t xml:space="preserve">The effect of removing Vogelherd figurines alone (−1.3% in Aur-P1) is the same as removing all 63 figurines globally (−1.3%), and in both cases the network is essentially unchanged. The figurine effect therefore does not scale with the number of figurines removed; figurines at Hohle Fels, Geissenklösterle (3), Hohlenstein-Stadel (1), and La Ferrassie (1) do not alter the network structure , including the four Hohle Fels figurines assigned to Aur-P2, which leave that phase’s network unchanged , and Vogelherd’s connectivity within Aur-P1 is carried by its 123 non-figurine objects.</w:t>
       </w:r>
     </w:p>
-    <w:bookmarkEnd w:id="147"/>
-    <w:bookmarkEnd w:id="148"/>
-    <w:bookmarkStart w:id="150" w:name="s7.5-joint-comparison"/>
+    <w:bookmarkEnd w:id="117"/>
+    <w:bookmarkEnd w:id="118"/>
+    <w:bookmarkStart w:id="120" w:name="s7.5-joint-comparison"/>
     <w:p>
       <w:pPr>
         <w:pStyle w:val="Heading2"/>
@@ -22058,7 +21596,7 @@
       <w:tr>
         <w:tc>
           <w:tcPr/>
-          <w:bookmarkStart w:id="149" w:name="tbl-objtype-joint"/>
+          <w:bookmarkStart w:id="119" w:name="tbl-objtype-joint"/>
           <w:tbl>
             <w:tblPr>
               <w:tblStyle w:val="Table"/>
@@ -22836,12 +22374,12 @@
               <w:t xml:space="preserve">Table 27: Side-by-side comparison of network statistics across all conditions: baseline (all objects), exclude all figurines, and exclude Vogelherd figurines only. The rightmost columns show the percentage change in mean degree from baseline.</w:t>
             </w:r>
           </w:p>
-          <w:bookmarkEnd w:id="149"/>
+          <w:bookmarkEnd w:id="119"/>
         </w:tc>
       </w:tr>
     </w:tbl>
-    <w:bookmarkEnd w:id="150"/>
-    <w:bookmarkStart w:id="151" w:name="s7.6-interpretation"/>
+    <w:bookmarkEnd w:id="120"/>
+    <w:bookmarkStart w:id="121" w:name="s7.6-interpretation"/>
     <w:p>
       <w:pPr>
         <w:pStyle w:val="Heading2"/>
@@ -23200,9 +22738,9 @@
         <w:t xml:space="preserve">argument that figurines carry high-information sign sequences, but the communities themselves are defined by shared sign types across all object types.</w:t>
       </w:r>
     </w:p>
-    <w:bookmarkEnd w:id="151"/>
-    <w:bookmarkEnd w:id="152"/>
-    <w:bookmarkStart w:id="184" w:name="sec-s8"/>
+    <w:bookmarkEnd w:id="121"/>
+    <w:bookmarkEnd w:id="122"/>
+    <w:bookmarkStart w:id="154" w:name="sec-s8"/>
     <w:p>
       <w:pPr>
         <w:pStyle w:val="Heading1"/>
@@ -23211,7 +22749,7 @@
         <w:t xml:space="preserve">S8. Site Reclassification Sensitivity Analysis</w:t>
       </w:r>
     </w:p>
-    <w:bookmarkStart w:id="153" w:name="s8.1-rationale"/>
+    <w:bookmarkStart w:id="123" w:name="s8.1-rationale"/>
     <w:p>
       <w:pPr>
         <w:pStyle w:val="Heading2"/>
@@ -23399,8 +22937,8 @@
         <w:t xml:space="preserve">Because these attributions are important for the two-phase framework, this section tests the sensitivity of the network results to (A) reverting to the purely date-based assignment used in earlier analyses , each object assigned to a phase by its calibrated date alone , and (B) excluding Vogelherd entirely, given its documented stratigraphic mixing.</w:t>
       </w:r>
     </w:p>
-    <w:bookmarkEnd w:id="153"/>
-    <w:bookmarkStart w:id="156" w:name="s8.2-results"/>
+    <w:bookmarkEnd w:id="123"/>
+    <w:bookmarkStart w:id="126" w:name="s8.2-results"/>
     <w:p>
       <w:pPr>
         <w:pStyle w:val="Heading2"/>
@@ -23423,7 +22961,7 @@
       <w:tr>
         <w:tc>
           <w:tcPr/>
-          <w:bookmarkStart w:id="154" w:name="tbl-reclass-comparison"/>
+          <w:bookmarkStart w:id="124" w:name="tbl-reclass-comparison"/>
           <w:tbl>
             <w:tblPr>
               <w:tblStyle w:val="Table"/>
@@ -24201,11 +23739,11 @@
               <w:t xml:space="preserve">Table 28: Network statistics under three conditions: baseline (technology-based assignment), date-based (each object assigned purely by calibrated radiocarbon date, with the Spy/El Castillo exclusions retained), and exclude Vogelherd (technology-based baseline with the site of Vogelherd removed entirely). Threshold = 0.2, Jaccard similarity.</w:t>
             </w:r>
           </w:p>
-          <w:bookmarkEnd w:id="154"/>
+          <w:bookmarkEnd w:id="124"/>
         </w:tc>
       </w:tr>
     </w:tbl>
-    <w:bookmarkStart w:id="155" w:name="effects-by-condition"/>
+    <w:bookmarkStart w:id="125" w:name="effects-by-condition"/>
     <w:p>
       <w:pPr>
         <w:pStyle w:val="Heading3"/>
@@ -24250,9 +23788,9 @@
         <w:t xml:space="preserve">Removing Vogelherd’s 173 objects from the technology-based baseline reduces Aur-P1 from 20 to 19 sites and from 75 to 69 edges. Mean degree falls from 7.5 to 7.26 (−3.2%), and modularity from 0.336 to 0.312. Aur-P2 is unaffected (4.22, 19 edges, 9 sites).</w:t>
       </w:r>
     </w:p>
-    <w:bookmarkEnd w:id="155"/>
-    <w:bookmarkEnd w:id="156"/>
-    <w:bookmarkStart w:id="157" w:name="s8.3-phase-ordering-robustness"/>
+    <w:bookmarkEnd w:id="125"/>
+    <w:bookmarkEnd w:id="126"/>
+    <w:bookmarkStart w:id="127" w:name="s8.3-phase-ordering-robustness"/>
     <w:p>
       <w:pPr>
         <w:pStyle w:val="Heading2"/>
@@ -24507,8 +24045,8 @@
         <w:t xml:space="preserve">Under the date-based assignment Aur-P1’s mean degree rises (from 7.5 to 8.57) and Aur-P2’s falls (from 4.22 to 3.33), so the contrast is not an artefact of the technological reassignment , the naive date-based assignment, if anything, strengthens it. Excluding Vogelherd weakens but does not remove the contrast (7.26 vs 4.22).</w:t>
       </w:r>
     </w:p>
-    <w:bookmarkEnd w:id="157"/>
-    <w:bookmarkStart w:id="158" w:name="s8.4-interpretation"/>
+    <w:bookmarkEnd w:id="127"/>
+    <w:bookmarkStart w:id="128" w:name="s8.4-interpretation"/>
     <w:p>
       <w:pPr>
         <w:pStyle w:val="Heading2"/>
@@ -24541,8 +24079,8 @@
         <w:t xml:space="preserve">Excluding Vogelherd leaves the ordering intact, consistent with S7’s finding that Aur-P1’s network does not depend on a single site. Finally, the within-phase two-group structure (RQ1) , the restricted/broad dichotomy recovered by seriation, Louvain community detection, bootstrap consensus, and the stochastic block model (S5, S6) , is defined within each phase’s membership and is unaffected by the between-phase assignment criterion tested here.</w:t>
       </w:r>
     </w:p>
-    <w:bookmarkEnd w:id="158"/>
-    <w:bookmarkStart w:id="183" w:name="references-cited"/>
+    <w:bookmarkEnd w:id="128"/>
+    <w:bookmarkStart w:id="153" w:name="references-cited"/>
     <w:p>
       <w:pPr>
         <w:pStyle w:val="Heading2"/>
@@ -24551,8 +24089,8 @@
         <w:t xml:space="preserve">References cited</w:t>
       </w:r>
     </w:p>
-    <w:bookmarkStart w:id="182" w:name="refs"/>
-    <w:bookmarkStart w:id="160" w:name="X68cdd7ba62fc5dd3e1e9b497937717305f7b9a0"/>
+    <w:bookmarkStart w:id="152" w:name="refs"/>
+    <w:bookmarkStart w:id="130" w:name="X68cdd7ba62fc5dd3e1e9b497937717305f7b9a0"/>
     <w:p>
       <w:pPr>
         <w:pStyle w:val="Bibliography"/>
@@ -24584,7 +24122,7 @@
       <w:r>
         <w:t xml:space="preserve"> </w:t>
       </w:r>
-      <w:hyperlink r:id="rId159">
+      <w:hyperlink r:id="rId129">
         <w:r>
           <w:rPr>
             <w:rStyle w:val="Hyperlink"/>
@@ -24596,8 +24134,8 @@
         <w:t xml:space="preserve">.</w:t>
       </w:r>
     </w:p>
-    <w:bookmarkEnd w:id="160"/>
-    <w:bookmarkStart w:id="162" w:name="ref-teyssandier2018entity"/>
+    <w:bookmarkEnd w:id="130"/>
+    <w:bookmarkStart w:id="132" w:name="ref-teyssandier2018entity"/>
     <w:p>
       <w:pPr>
         <w:pStyle w:val="Bibliography"/>
@@ -24656,7 +24194,7 @@
       <w:r>
         <w:t xml:space="preserve"> </w:t>
       </w:r>
-      <w:hyperlink r:id="rId161">
+      <w:hyperlink r:id="rId131">
         <w:r>
           <w:rPr>
             <w:rStyle w:val="Hyperlink"/>
@@ -24668,8 +24206,8 @@
         <w:t xml:space="preserve">.</w:t>
       </w:r>
     </w:p>
-    <w:bookmarkEnd w:id="162"/>
-    <w:bookmarkStart w:id="164" w:name="ref-newman2004finding"/>
+    <w:bookmarkEnd w:id="132"/>
+    <w:bookmarkStart w:id="134" w:name="ref-newman2004finding"/>
     <w:p>
       <w:pPr>
         <w:pStyle w:val="Bibliography"/>
@@ -24689,7 +24227,7 @@
       <w:r>
         <w:t xml:space="preserve"> </w:t>
       </w:r>
-      <w:hyperlink r:id="rId163">
+      <w:hyperlink r:id="rId133">
         <w:r>
           <w:rPr>
             <w:rStyle w:val="Hyperlink"/>
@@ -24701,8 +24239,8 @@
         <w:t xml:space="preserve">.</w:t>
       </w:r>
     </w:p>
-    <w:bookmarkEnd w:id="164"/>
-    <w:bookmarkStart w:id="166" w:name="ref-Monti_2003"/>
+    <w:bookmarkEnd w:id="134"/>
+    <w:bookmarkStart w:id="136" w:name="ref-Monti_2003"/>
     <w:p>
       <w:pPr>
         <w:pStyle w:val="Bibliography"/>
@@ -24722,7 +24260,7 @@
       <w:r>
         <w:t xml:space="preserve"> </w:t>
       </w:r>
-      <w:hyperlink r:id="rId165">
+      <w:hyperlink r:id="rId135">
         <w:r>
           <w:rPr>
             <w:rStyle w:val="Hyperlink"/>
@@ -24734,8 +24272,8 @@
         <w:t xml:space="preserve">.</w:t>
       </w:r>
     </w:p>
-    <w:bookmarkEnd w:id="166"/>
-    <w:bookmarkStart w:id="168" w:name="ref-Bentz_Dutkiewicz_2026"/>
+    <w:bookmarkEnd w:id="136"/>
+    <w:bookmarkStart w:id="138" w:name="ref-Bentz_Dutkiewicz_2026"/>
     <w:p>
       <w:pPr>
         <w:pStyle w:val="Bibliography"/>
@@ -24755,7 +24293,7 @@
       <w:r>
         <w:t xml:space="preserve"> </w:t>
       </w:r>
-      <w:hyperlink r:id="rId167">
+      <w:hyperlink r:id="rId137">
         <w:r>
           <w:rPr>
             <w:rStyle w:val="Hyperlink"/>
@@ -24767,8 +24305,8 @@
         <w:t xml:space="preserve">.</w:t>
       </w:r>
     </w:p>
-    <w:bookmarkEnd w:id="168"/>
-    <w:bookmarkStart w:id="170" w:name="ref-Chiotti_2005"/>
+    <w:bookmarkEnd w:id="138"/>
+    <w:bookmarkStart w:id="140" w:name="ref-Chiotti_2005"/>
     <w:p>
       <w:pPr>
         <w:pStyle w:val="Bibliography"/>
@@ -24815,7 +24353,7 @@
       <w:r>
         <w:t xml:space="preserve"> </w:t>
       </w:r>
-      <w:hyperlink r:id="rId169">
+      <w:hyperlink r:id="rId139">
         <w:r>
           <w:rPr>
             <w:rStyle w:val="Hyperlink"/>
@@ -24827,8 +24365,8 @@
         <w:t xml:space="preserve">.</w:t>
       </w:r>
     </w:p>
-    <w:bookmarkEnd w:id="170"/>
-    <w:bookmarkStart w:id="172" w:name="ref-Higham_Abri_Pataud_2011"/>
+    <w:bookmarkEnd w:id="140"/>
+    <w:bookmarkStart w:id="142" w:name="ref-Higham_Abri_Pataud_2011"/>
     <w:p>
       <w:pPr>
         <w:pStyle w:val="Bibliography"/>
@@ -24887,7 +24425,7 @@
       <w:r>
         <w:t xml:space="preserve"> </w:t>
       </w:r>
-      <w:hyperlink r:id="rId171">
+      <w:hyperlink r:id="rId141">
         <w:r>
           <w:rPr>
             <w:rStyle w:val="Hyperlink"/>
@@ -24899,8 +24437,8 @@
         <w:t xml:space="preserve">.</w:t>
       </w:r>
     </w:p>
-    <w:bookmarkEnd w:id="172"/>
-    <w:bookmarkStart w:id="174" w:name="ref-Talamo_La_Ferrassie_2020"/>
+    <w:bookmarkEnd w:id="142"/>
+    <w:bookmarkStart w:id="144" w:name="ref-Talamo_La_Ferrassie_2020"/>
     <w:p>
       <w:pPr>
         <w:pStyle w:val="Bibliography"/>
@@ -25001,7 +24539,7 @@
       <w:r>
         <w:t xml:space="preserve"> </w:t>
       </w:r>
-      <w:hyperlink r:id="rId173">
+      <w:hyperlink r:id="rId143">
         <w:r>
           <w:rPr>
             <w:rStyle w:val="Hyperlink"/>
@@ -25013,8 +24551,8 @@
         <w:t xml:space="preserve">.</w:t>
       </w:r>
     </w:p>
-    <w:bookmarkEnd w:id="174"/>
-    <w:bookmarkStart w:id="175" w:name="ref-Delporte_1984_Ferrassie"/>
+    <w:bookmarkEnd w:id="144"/>
+    <w:bookmarkStart w:id="145" w:name="ref-Delporte_1984_Ferrassie"/>
     <w:p>
       <w:pPr>
         <w:pStyle w:val="Bibliography"/>
@@ -25053,8 +24591,8 @@
         <w:t xml:space="preserve">histoire; 1984.</w:t>
       </w:r>
     </w:p>
-    <w:bookmarkEnd w:id="175"/>
-    <w:bookmarkStart w:id="177" w:name="ref-Oliva_2006"/>
+    <w:bookmarkEnd w:id="145"/>
+    <w:bookmarkStart w:id="147" w:name="ref-Oliva_2006"/>
     <w:p>
       <w:pPr>
         <w:pStyle w:val="Bibliography"/>
@@ -25122,7 +24660,7 @@
       <w:r>
         <w:t xml:space="preserve"> </w:t>
       </w:r>
-      <w:hyperlink r:id="rId176">
+      <w:hyperlink r:id="rId146">
         <w:r>
           <w:rPr>
             <w:rStyle w:val="Hyperlink"/>
@@ -25134,8 +24672,8 @@
         <w:t xml:space="preserve">.</w:t>
       </w:r>
     </w:p>
-    <w:bookmarkEnd w:id="177"/>
-    <w:bookmarkStart w:id="179" w:name="ref-Wild_et_al_2005"/>
+    <w:bookmarkEnd w:id="147"/>
+    <w:bookmarkStart w:id="149" w:name="ref-Wild_et_al_2005"/>
     <w:p>
       <w:pPr>
         <w:pStyle w:val="Bibliography"/>
@@ -25191,7 +24729,7 @@
       <w:r>
         <w:t xml:space="preserve"> </w:t>
       </w:r>
-      <w:hyperlink r:id="rId178">
+      <w:hyperlink r:id="rId148">
         <w:r>
           <w:rPr>
             <w:rStyle w:val="Hyperlink"/>
@@ -25203,8 +24741,8 @@
         <w:t xml:space="preserve">.</w:t>
       </w:r>
     </w:p>
-    <w:bookmarkEnd w:id="179"/>
-    <w:bookmarkStart w:id="181" w:name="ref-Schurch_Conard_2026_reassess"/>
+    <w:bookmarkEnd w:id="149"/>
+    <w:bookmarkStart w:id="151" w:name="ref-Schurch_Conard_2026_reassess"/>
     <w:p>
       <w:pPr>
         <w:pStyle w:val="Bibliography"/>
@@ -25239,7 +24777,7 @@
       <w:r>
         <w:t xml:space="preserve"> </w:t>
       </w:r>
-      <w:hyperlink r:id="rId180">
+      <w:hyperlink r:id="rId150">
         <w:r>
           <w:rPr>
             <w:rStyle w:val="Hyperlink"/>
@@ -25251,10 +24789,10 @@
         <w:t xml:space="preserve">.</w:t>
       </w:r>
     </w:p>
-    <w:bookmarkEnd w:id="181"/>
-    <w:bookmarkEnd w:id="182"/>
-    <w:bookmarkEnd w:id="183"/>
-    <w:bookmarkEnd w:id="184"/>
+    <w:bookmarkEnd w:id="151"/>
+    <w:bookmarkEnd w:id="152"/>
+    <w:bookmarkEnd w:id="153"/>
+    <w:bookmarkEnd w:id="154"/>
     <w:sectPr>
       <w:footnotePr>
         <w:numRestart w:val="eachSect"/>

</xml_diff>

<commit_message>
SBM switch in method to better suit data, now K=1 for both phases
</commit_message>
<xml_diff>
--- a/paper/S1-supplement-sensitivity.docx
+++ b/paper/S1-supplement-sensitivity.docx
@@ -306,14 +306,6 @@
       </w:pPr>
       <w:r>
         <w:t xml:space="preserve">To confirm that the primary findings reported in the main text are not an artefact of this specific cutoff, we repeated all network analyses at two alternative thresholds , 0.1 (permissive) and 0.3 (conservative) , and compared the key network statistics and visual structure against the main-text threshold of 0.2.</w:t>
-      </w:r>
-    </w:p>
-    <w:p>
-      <w:pPr>
-        <w:pStyle w:val="BodyText"/>
-      </w:pPr>
-      <w:r>
-        <w:t xml:space="preserve">```</w:t>
       </w:r>
     </w:p>
     <w:bookmarkEnd w:id="21"/>
@@ -12414,7 +12406,7 @@
     </w:p>
     <w:bookmarkEnd w:id="83"/>
     <w:bookmarkEnd w:id="84"/>
-    <w:bookmarkStart w:id="105" w:name="sec-s6"/>
+    <w:bookmarkStart w:id="117" w:name="sec-s6"/>
     <w:p>
       <w:pPr>
         <w:pStyle w:val="Heading1"/>
@@ -15233,7 +15225,7 @@
     </w:p>
     <w:bookmarkEnd w:id="93"/>
     <w:bookmarkEnd w:id="94"/>
-    <w:bookmarkStart w:id="99" w:name="sec-s6-3"/>
+    <w:bookmarkStart w:id="111" w:name="sec-s6-3"/>
     <w:p>
       <w:pPr>
         <w:pStyle w:val="Heading2"/>
@@ -15242,7 +15234,7 @@
         <w:t xml:space="preserve">S6.3 Stochastic Block Models</w:t>
       </w:r>
     </w:p>
-    <w:bookmarkStart w:id="97" w:name="rationale-4"/>
+    <w:bookmarkStart w:id="109" w:name="rationale-4"/>
     <w:p>
       <w:pPr>
         <w:pStyle w:val="Heading3"/>
@@ -15272,7 +15264,48 @@
         <w:t xml:space="preserve"> </w:t>
       </w:r>
       <w:r>
-        <w:t xml:space="preserve">model of network structure best explains the observed pattern of sign sharing. In the SBM, the probability that two sites are connected (here: Jaccard similarity ≥ 0.2, as in the main text) depends only on their block memberships. Fitting the model returns (i) the number of blocks that best fits the data, chosen by the Integrated Classification Likelihood (ICL; a penalised likelihood that trades fit against model complexity), and (ii) the posterior probability of membership in each block for every site. Because ICL is a model-selection criterion, the SBM provides a statistical answer to</w:t>
+        <w:t xml:space="preserve">model of network structure best explains the observed pattern of sign sharing. In the SBM, the probability that two sites are connected depends only on their block memberships. We fit the</w:t>
+      </w:r>
+      <w:r>
+        <w:t xml:space="preserve"> </w:t>
+      </w:r>
+      <w:r>
+        <w:rPr>
+          <w:iCs/>
+          <w:i/>
+        </w:rPr>
+        <w:t xml:space="preserve">symmetric</w:t>
+      </w:r>
+      <w:r>
+        <w:t xml:space="preserve"> </w:t>
+      </w:r>
+      <w:r>
+        <w:t xml:space="preserve">stochastic block model (</w:t>
+      </w:r>
+      <w:r>
+        <w:rPr>
+          <w:rStyle w:val="VerbatimChar"/>
+        </w:rPr>
+        <w:t xml:space="preserve">SBM_sym</w:t>
+      </w:r>
+      <w:r>
+        <w:t xml:space="preserve">) using the</w:t>
+      </w:r>
+      <w:r>
+        <w:t xml:space="preserve"> </w:t>
+      </w:r>
+      <w:r>
+        <w:rPr>
+          <w:iCs/>
+          <w:i/>
+        </w:rPr>
+        <w:t xml:space="preserve">weighted</w:t>
+      </w:r>
+      <w:r>
+        <w:t xml:space="preserve"> </w:t>
+      </w:r>
+      <w:r>
+        <w:t xml:space="preserve">Jaccard similarity adjacency matrix (threshold = 0.2), preserving edge strength rather than binarizing. This is appropriate because Jaccard similarity is symmetric and cultural connectivity is mutual. Fitting the model returns (i) the number of blocks that best fits the data, chosen by the Integrated Classification Likelihood (ICL; a penalised likelihood that trades fit against model complexity), and (ii) the posterior probability of membership in each block for every site. Because ICL is a model-selection criterion, the SBM provides a statistical answer to</w:t>
       </w:r>
       <w:r>
         <w:t xml:space="preserve"> </w:t>
@@ -15291,6 +15324,194 @@
       </w:r>
       <w:r>
         <w:t xml:space="preserve">rather than the visual answer provided by seriation.</w:t>
+      </w:r>
+    </w:p>
+    <w:p>
+      <w:pPr>
+        <w:pStyle w:val="BodyText"/>
+      </w:pPr>
+      <w:r>
+        <w:drawing>
+          <wp:inline>
+            <wp:extent cx="5943600" cy="4754880"/>
+            <wp:effectExtent b="0" l="0" r="0" t="0"/>
+            <wp:docPr descr="" title="" id="96" name="Picture"/>
+            <a:graphic>
+              <a:graphicData uri="http://schemas.openxmlformats.org/drawingml/2006/picture">
+                <pic:pic>
+                  <pic:nvPicPr>
+                    <pic:cNvPr descr="S1-supplement-sensitivity_files/figure-docx/s6-sbm-compute-1.png" id="97" name="Picture"/>
+                    <pic:cNvPicPr>
+                      <a:picLocks noChangeArrowheads="1" noChangeAspect="1"/>
+                    </pic:cNvPicPr>
+                  </pic:nvPicPr>
+                  <pic:blipFill>
+                    <a:blip r:embed="rId95"/>
+                    <a:stretch>
+                      <a:fillRect/>
+                    </a:stretch>
+                  </pic:blipFill>
+                  <pic:spPr bwMode="auto">
+                    <a:xfrm>
+                      <a:off x="0" y="0"/>
+                      <a:ext cx="5943600" cy="4754880"/>
+                    </a:xfrm>
+                    <a:prstGeom prst="rect">
+                      <a:avLst/>
+                    </a:prstGeom>
+                    <a:noFill/>
+                    <a:ln w="9525">
+                      <a:noFill/>
+                      <a:headEnd/>
+                      <a:tailEnd/>
+                    </a:ln>
+                  </pic:spPr>
+                </pic:pic>
+              </a:graphicData>
+            </a:graphic>
+          </wp:inline>
+        </w:drawing>
+      </w:r>
+    </w:p>
+    <w:p>
+      <w:pPr>
+        <w:pStyle w:val="BodyText"/>
+      </w:pPr>
+      <w:r>
+        <w:drawing>
+          <wp:inline>
+            <wp:extent cx="5943600" cy="4754880"/>
+            <wp:effectExtent b="0" l="0" r="0" t="0"/>
+            <wp:docPr descr="" title="" id="99" name="Picture"/>
+            <a:graphic>
+              <a:graphicData uri="http://schemas.openxmlformats.org/drawingml/2006/picture">
+                <pic:pic>
+                  <pic:nvPicPr>
+                    <pic:cNvPr descr="S1-supplement-sensitivity_files/figure-docx/s6-sbm-compute-2.png" id="100" name="Picture"/>
+                    <pic:cNvPicPr>
+                      <a:picLocks noChangeArrowheads="1" noChangeAspect="1"/>
+                    </pic:cNvPicPr>
+                  </pic:nvPicPr>
+                  <pic:blipFill>
+                    <a:blip r:embed="rId98"/>
+                    <a:stretch>
+                      <a:fillRect/>
+                    </a:stretch>
+                  </pic:blipFill>
+                  <pic:spPr bwMode="auto">
+                    <a:xfrm>
+                      <a:off x="0" y="0"/>
+                      <a:ext cx="5943600" cy="4754880"/>
+                    </a:xfrm>
+                    <a:prstGeom prst="rect">
+                      <a:avLst/>
+                    </a:prstGeom>
+                    <a:noFill/>
+                    <a:ln w="9525">
+                      <a:noFill/>
+                      <a:headEnd/>
+                      <a:tailEnd/>
+                    </a:ln>
+                  </pic:spPr>
+                </pic:pic>
+              </a:graphicData>
+            </a:graphic>
+          </wp:inline>
+        </w:drawing>
+      </w:r>
+    </w:p>
+    <w:p>
+      <w:pPr>
+        <w:pStyle w:val="BodyText"/>
+      </w:pPr>
+      <w:r>
+        <w:drawing>
+          <wp:inline>
+            <wp:extent cx="5943600" cy="4754880"/>
+            <wp:effectExtent b="0" l="0" r="0" t="0"/>
+            <wp:docPr descr="" title="" id="102" name="Picture"/>
+            <a:graphic>
+              <a:graphicData uri="http://schemas.openxmlformats.org/drawingml/2006/picture">
+                <pic:pic>
+                  <pic:nvPicPr>
+                    <pic:cNvPr descr="S1-supplement-sensitivity_files/figure-docx/s6-sbm-compute-3.png" id="103" name="Picture"/>
+                    <pic:cNvPicPr>
+                      <a:picLocks noChangeArrowheads="1" noChangeAspect="1"/>
+                    </pic:cNvPicPr>
+                  </pic:nvPicPr>
+                  <pic:blipFill>
+                    <a:blip r:embed="rId101"/>
+                    <a:stretch>
+                      <a:fillRect/>
+                    </a:stretch>
+                  </pic:blipFill>
+                  <pic:spPr bwMode="auto">
+                    <a:xfrm>
+                      <a:off x="0" y="0"/>
+                      <a:ext cx="5943600" cy="4754880"/>
+                    </a:xfrm>
+                    <a:prstGeom prst="rect">
+                      <a:avLst/>
+                    </a:prstGeom>
+                    <a:noFill/>
+                    <a:ln w="9525">
+                      <a:noFill/>
+                      <a:headEnd/>
+                      <a:tailEnd/>
+                    </a:ln>
+                  </pic:spPr>
+                </pic:pic>
+              </a:graphicData>
+            </a:graphic>
+          </wp:inline>
+        </w:drawing>
+      </w:r>
+    </w:p>
+    <w:p>
+      <w:pPr>
+        <w:pStyle w:val="BodyText"/>
+      </w:pPr>
+      <w:r>
+        <w:drawing>
+          <wp:inline>
+            <wp:extent cx="5943600" cy="4754880"/>
+            <wp:effectExtent b="0" l="0" r="0" t="0"/>
+            <wp:docPr descr="" title="" id="105" name="Picture"/>
+            <a:graphic>
+              <a:graphicData uri="http://schemas.openxmlformats.org/drawingml/2006/picture">
+                <pic:pic>
+                  <pic:nvPicPr>
+                    <pic:cNvPr descr="S1-supplement-sensitivity_files/figure-docx/s6-sbm-compute-4.png" id="106" name="Picture"/>
+                    <pic:cNvPicPr>
+                      <a:picLocks noChangeArrowheads="1" noChangeAspect="1"/>
+                    </pic:cNvPicPr>
+                  </pic:nvPicPr>
+                  <pic:blipFill>
+                    <a:blip r:embed="rId104"/>
+                    <a:stretch>
+                      <a:fillRect/>
+                    </a:stretch>
+                  </pic:blipFill>
+                  <pic:spPr bwMode="auto">
+                    <a:xfrm>
+                      <a:off x="0" y="0"/>
+                      <a:ext cx="5943600" cy="4754880"/>
+                    </a:xfrm>
+                    <a:prstGeom prst="rect">
+                      <a:avLst/>
+                    </a:prstGeom>
+                    <a:noFill/>
+                    <a:ln w="9525">
+                      <a:noFill/>
+                      <a:headEnd/>
+                      <a:tailEnd/>
+                    </a:ln>
+                  </pic:spPr>
+                </pic:pic>
+              </a:graphicData>
+            </a:graphic>
+          </wp:inline>
+        </w:drawing>
       </w:r>
     </w:p>
     <w:tbl>
@@ -15307,7 +15528,7 @@
       <w:tr>
         <w:tc>
           <w:tcPr/>
-          <w:bookmarkStart w:id="95" w:name="tbl-sbm-icl"/>
+          <w:bookmarkStart w:id="107" w:name="tbl-sbm-icl"/>
           <w:tbl>
             <w:tblPr>
               <w:tblStyle w:val="Table"/>
@@ -15443,72 +15664,72 @@
                     <w:jc w:val="center"/>
                   </w:pPr>
                   <w:r>
-                    <w:t xml:space="preserve">-257.9</w:t>
-                  </w:r>
-                </w:p>
-              </w:tc>
-              <w:tc>
-                <w:tcPr/>
-                <w:p>
-                  <w:pPr>
-                    <w:pStyle w:val="Compact"/>
-                    <w:jc w:val="center"/>
-                    <w:jc w:val="center"/>
-                  </w:pPr>
-                  <w:r>
-                    <w:t xml:space="preserve">-212.5</w:t>
-                  </w:r>
-                </w:p>
-              </w:tc>
-              <w:tc>
-                <w:tcPr/>
-                <w:p>
-                  <w:pPr>
-                    <w:pStyle w:val="Compact"/>
-                    <w:jc w:val="center"/>
-                    <w:jc w:val="center"/>
-                  </w:pPr>
-                  <w:r>
-                    <w:t xml:space="preserve">-192.1</w:t>
-                  </w:r>
-                </w:p>
-              </w:tc>
-              <w:tc>
-                <w:tcPr/>
-                <w:p>
-                  <w:pPr>
-                    <w:pStyle w:val="Compact"/>
-                    <w:jc w:val="center"/>
-                    <w:jc w:val="center"/>
-                  </w:pPr>
-                  <w:r>
-                    <w:t xml:space="preserve">-194.1</w:t>
-                  </w:r>
-                </w:p>
-              </w:tc>
-              <w:tc>
-                <w:tcPr/>
-                <w:p>
-                  <w:pPr>
-                    <w:pStyle w:val="Compact"/>
-                    <w:jc w:val="center"/>
-                    <w:jc w:val="center"/>
-                  </w:pPr>
-                  <w:r>
-                    <w:t xml:space="preserve">-198.7</w:t>
-                  </w:r>
-                </w:p>
-              </w:tc>
-              <w:tc>
-                <w:tcPr/>
-                <w:p>
-                  <w:pPr>
-                    <w:pStyle w:val="Compact"/>
-                    <w:jc w:val="center"/>
-                    <w:jc w:val="center"/>
-                  </w:pPr>
-                  <w:r>
-                    <w:t xml:space="preserve">3</w:t>
+                    <w:t xml:space="preserve">-90.0</w:t>
+                  </w:r>
+                </w:p>
+              </w:tc>
+              <w:tc>
+                <w:tcPr/>
+                <w:p>
+                  <w:pPr>
+                    <w:pStyle w:val="Compact"/>
+                    <w:jc w:val="center"/>
+                    <w:jc w:val="center"/>
+                  </w:pPr>
+                  <w:r>
+                    <w:t xml:space="preserve">-92.9</w:t>
+                  </w:r>
+                </w:p>
+              </w:tc>
+              <w:tc>
+                <w:tcPr/>
+                <w:p>
+                  <w:pPr>
+                    <w:pStyle w:val="Compact"/>
+                    <w:jc w:val="center"/>
+                    <w:jc w:val="center"/>
+                  </w:pPr>
+                  <w:r>
+                    <w:t xml:space="preserve">NA</w:t>
+                  </w:r>
+                </w:p>
+              </w:tc>
+              <w:tc>
+                <w:tcPr/>
+                <w:p>
+                  <w:pPr>
+                    <w:pStyle w:val="Compact"/>
+                    <w:jc w:val="center"/>
+                    <w:jc w:val="center"/>
+                  </w:pPr>
+                  <w:r>
+                    <w:t xml:space="preserve">NA</w:t>
+                  </w:r>
+                </w:p>
+              </w:tc>
+              <w:tc>
+                <w:tcPr/>
+                <w:p>
+                  <w:pPr>
+                    <w:pStyle w:val="Compact"/>
+                    <w:jc w:val="center"/>
+                    <w:jc w:val="center"/>
+                  </w:pPr>
+                  <w:r>
+                    <w:t xml:space="preserve">NA</w:t>
+                  </w:r>
+                </w:p>
+              </w:tc>
+              <w:tc>
+                <w:tcPr/>
+                <w:p>
+                  <w:pPr>
+                    <w:pStyle w:val="Compact"/>
+                    <w:jc w:val="center"/>
+                    <w:jc w:val="center"/>
+                  </w:pPr>
+                  <w:r>
+                    <w:t xml:space="preserve">1</w:t>
                   </w:r>
                 </w:p>
               </w:tc>
@@ -15536,20 +15757,20 @@
                     <w:jc w:val="center"/>
                   </w:pPr>
                   <w:r>
-                    <w:t xml:space="preserve">-51.9</w:t>
-                  </w:r>
-                </w:p>
-              </w:tc>
-              <w:tc>
-                <w:tcPr/>
-                <w:p>
-                  <w:pPr>
-                    <w:pStyle w:val="Compact"/>
-                    <w:jc w:val="center"/>
-                    <w:jc w:val="center"/>
-                  </w:pPr>
-                  <w:r>
-                    <w:t xml:space="preserve">-52.3</w:t>
+                    <w:t xml:space="preserve">-21.5</w:t>
+                  </w:r>
+                </w:p>
+              </w:tc>
+              <w:tc>
+                <w:tcPr/>
+                <w:p>
+                  <w:pPr>
+                    <w:pStyle w:val="Compact"/>
+                    <w:jc w:val="center"/>
+                    <w:jc w:val="center"/>
+                  </w:pPr>
+                  <w:r>
+                    <w:t xml:space="preserve">-28.9</w:t>
                   </w:r>
                 </w:p>
               </w:tc>
@@ -15620,7 +15841,7 @@
               <w:t xml:space="preserve">Table 19: Integrated Classification Likelihood (ICL) for stochastic block models with K = 1 to 5 blocks, by phase. The best-supported number of blocks (maximum ICL) is bolded. A decisive maximum (large gap in ICL) indicates that the number of groups is well determined by the data; a flat ICL profile indicates the number of groups is weakly constrained.</w:t>
             </w:r>
           </w:p>
-          <w:bookmarkEnd w:id="95"/>
+          <w:bookmarkEnd w:id="107"/>
         </w:tc>
       </w:tr>
     </w:tbl>
@@ -15646,23 +15867,20 @@
       <w:tr>
         <w:tc>
           <w:tcPr/>
-          <w:bookmarkStart w:id="96" w:name="tbl-sbm-membership"/>
+          <w:bookmarkStart w:id="108" w:name="tbl-sbm-membership"/>
           <w:tbl>
             <w:tblPr>
               <w:tblStyle w:val="Table"/>
-              <w:tblW w:type="pct" w:w="5000"/>
+              <w:tblW w:type="auto" w:w="0"/>
               <w:tblLook w:firstRow="1" w:lastRow="0" w:firstColumn="0" w:lastColumn="0" w:noHBand="0" w:noVBand="0" w:val="0020"/>
               <w:jc w:val="start"/>
-              <w:tblLayout w:type="fixed"/>
             </w:tblPr>
             <w:tblGrid>
-              <w:gridCol w:w="2299"/>
-              <w:gridCol w:w="596"/>
-              <w:gridCol w:w="2299"/>
-              <w:gridCol w:w="1107"/>
-              <w:gridCol w:w="510"/>
-              <w:gridCol w:w="510"/>
-              <w:gridCol w:w="596"/>
+              <w:gridCol w:w="1584"/>
+              <w:gridCol w:w="1584"/>
+              <w:gridCol w:w="1584"/>
+              <w:gridCol w:w="1584"/>
+              <w:gridCol w:w="1584"/>
             </w:tblGrid>
             <w:tr>
               <w:trPr>
@@ -15728,32 +15946,6 @@
                   </w:r>
                 </w:p>
               </w:tc>
-              <w:tc>
-                <w:tcPr/>
-                <w:p>
-                  <w:pPr>
-                    <w:pStyle w:val="Compact"/>
-                    <w:jc w:val="left"/>
-                    <w:jc w:val="center"/>
-                  </w:pPr>
-                  <w:r>
-                    <w:t xml:space="preserve">P(B2)</w:t>
-                  </w:r>
-                </w:p>
-              </w:tc>
-              <w:tc>
-                <w:tcPr/>
-                <w:p>
-                  <w:pPr>
-                    <w:pStyle w:val="Compact"/>
-                    <w:jc w:val="center"/>
-                    <w:jc w:val="center"/>
-                  </w:pPr>
-                  <w:r>
-                    <w:t xml:space="preserve">P(B3)</w:t>
-                  </w:r>
-                </w:p>
-              </w:tc>
             </w:tr>
             <w:tr>
               <w:tc>
@@ -15765,7 +15957,7 @@
                     <w:jc w:val="center"/>
                   </w:pPr>
                   <w:r>
-                    <w:t xml:space="preserve">Abri Pataud</w:t>
+                    <w:t xml:space="preserve">1…1</w:t>
                   </w:r>
                 </w:p>
               </w:tc>
@@ -15791,59 +15983,33 @@
                     <w:jc w:val="center"/>
                   </w:pPr>
                   <w:r>
-                    <w:t xml:space="preserve">Abri Pataud</w:t>
-                  </w:r>
-                </w:p>
-              </w:tc>
-              <w:tc>
-                <w:tcPr/>
-                <w:p>
-                  <w:pPr>
-                    <w:pStyle w:val="Compact"/>
-                    <w:jc w:val="center"/>
-                    <w:jc w:val="center"/>
-                  </w:pPr>
-                  <w:r>
-                    <w:t xml:space="preserve">2</w:t>
-                  </w:r>
-                </w:p>
-              </w:tc>
-              <w:tc>
-                <w:tcPr/>
-                <w:p>
-                  <w:pPr>
-                    <w:pStyle w:val="Compact"/>
-                    <w:jc w:val="left"/>
-                    <w:jc w:val="center"/>
-                  </w:pPr>
-                  <w:r>
-                    <w:t xml:space="preserve">0.00</w:t>
-                  </w:r>
-                </w:p>
-              </w:tc>
-              <w:tc>
-                <w:tcPr/>
-                <w:p>
-                  <w:pPr>
-                    <w:pStyle w:val="Compact"/>
-                    <w:jc w:val="left"/>
-                    <w:jc w:val="center"/>
-                  </w:pPr>
-                  <w:r>
-                    <w:t xml:space="preserve">0.99</w:t>
-                  </w:r>
-                </w:p>
-              </w:tc>
-              <w:tc>
-                <w:tcPr/>
-                <w:p>
-                  <w:pPr>
-                    <w:pStyle w:val="Compact"/>
-                    <w:jc w:val="center"/>
-                    <w:jc w:val="center"/>
-                  </w:pPr>
-                  <w:r>
-                    <w:t xml:space="preserve">0.00</w:t>
+                    <w:t xml:space="preserve">1</w:t>
+                  </w:r>
+                </w:p>
+              </w:tc>
+              <w:tc>
+                <w:tcPr/>
+                <w:p>
+                  <w:pPr>
+                    <w:pStyle w:val="Compact"/>
+                    <w:jc w:val="center"/>
+                    <w:jc w:val="center"/>
+                  </w:pPr>
+                  <w:r>
+                    <w:t xml:space="preserve">1</w:t>
+                  </w:r>
+                </w:p>
+              </w:tc>
+              <w:tc>
+                <w:tcPr/>
+                <w:p>
+                  <w:pPr>
+                    <w:pStyle w:val="Compact"/>
+                    <w:jc w:val="left"/>
+                    <w:jc w:val="center"/>
+                  </w:pPr>
+                  <w:r>
+                    <w:t xml:space="preserve">1</w:t>
                   </w:r>
                 </w:p>
               </w:tc>
@@ -15858,7 +16024,7 @@
                     <w:jc w:val="center"/>
                   </w:pPr>
                   <w:r>
-                    <w:t xml:space="preserve">Blanchard</w:t>
+                    <w:t xml:space="preserve">2…2</w:t>
                   </w:r>
                 </w:p>
               </w:tc>
@@ -15884,7 +16050,7 @@
                     <w:jc w:val="center"/>
                   </w:pPr>
                   <w:r>
-                    <w:t xml:space="preserve">Blanchard</w:t>
+                    <w:t xml:space="preserve">2</w:t>
                   </w:r>
                 </w:p>
               </w:tc>
@@ -15910,33 +16076,7 @@
                     <w:jc w:val="center"/>
                   </w:pPr>
                   <w:r>
-                    <w:t xml:space="preserve">0.99</w:t>
-                  </w:r>
-                </w:p>
-              </w:tc>
-              <w:tc>
-                <w:tcPr/>
-                <w:p>
-                  <w:pPr>
-                    <w:pStyle w:val="Compact"/>
-                    <w:jc w:val="left"/>
-                    <w:jc w:val="center"/>
-                  </w:pPr>
-                  <w:r>
-                    <w:t xml:space="preserve">0.00</w:t>
-                  </w:r>
-                </w:p>
-              </w:tc>
-              <w:tc>
-                <w:tcPr/>
-                <w:p>
-                  <w:pPr>
-                    <w:pStyle w:val="Compact"/>
-                    <w:jc w:val="center"/>
-                    <w:jc w:val="center"/>
-                  </w:pPr>
-                  <w:r>
-                    <w:t xml:space="preserve">0.00</w:t>
+                    <w:t xml:space="preserve">1</w:t>
                   </w:r>
                 </w:p>
               </w:tc>
@@ -15951,7 +16091,7 @@
                     <w:jc w:val="center"/>
                   </w:pPr>
                   <w:r>
-                    <w:t xml:space="preserve">Castanet</w:t>
+                    <w:t xml:space="preserve">3…3</w:t>
                   </w:r>
                 </w:p>
               </w:tc>
@@ -15977,7 +16117,7 @@
                     <w:jc w:val="center"/>
                   </w:pPr>
                   <w:r>
-                    <w:t xml:space="preserve">Castanet</w:t>
+                    <w:t xml:space="preserve">3</w:t>
                   </w:r>
                 </w:p>
               </w:tc>
@@ -16003,33 +16143,7 @@
                     <w:jc w:val="center"/>
                   </w:pPr>
                   <w:r>
-                    <w:t xml:space="preserve">0.99</w:t>
-                  </w:r>
-                </w:p>
-              </w:tc>
-              <w:tc>
-                <w:tcPr/>
-                <w:p>
-                  <w:pPr>
-                    <w:pStyle w:val="Compact"/>
-                    <w:jc w:val="left"/>
-                    <w:jc w:val="center"/>
-                  </w:pPr>
-                  <w:r>
-                    <w:t xml:space="preserve">0.00</w:t>
-                  </w:r>
-                </w:p>
-              </w:tc>
-              <w:tc>
-                <w:tcPr/>
-                <w:p>
-                  <w:pPr>
-                    <w:pStyle w:val="Compact"/>
-                    <w:jc w:val="center"/>
-                    <w:jc w:val="center"/>
-                  </w:pPr>
-                  <w:r>
-                    <w:t xml:space="preserve">0.00</w:t>
+                    <w:t xml:space="preserve">1</w:t>
                   </w:r>
                 </w:p>
               </w:tc>
@@ -16044,7 +16158,7 @@
                     <w:jc w:val="center"/>
                   </w:pPr>
                   <w:r>
-                    <w:t xml:space="preserve">Cellier</w:t>
+                    <w:t xml:space="preserve">4…4</w:t>
                   </w:r>
                 </w:p>
               </w:tc>
@@ -16070,7 +16184,7 @@
                     <w:jc w:val="center"/>
                   </w:pPr>
                   <w:r>
-                    <w:t xml:space="preserve">Cellier</w:t>
+                    <w:t xml:space="preserve">4</w:t>
                   </w:r>
                 </w:p>
               </w:tc>
@@ -16096,33 +16210,7 @@
                     <w:jc w:val="center"/>
                   </w:pPr>
                   <w:r>
-                    <w:t xml:space="preserve">0.99</w:t>
-                  </w:r>
-                </w:p>
-              </w:tc>
-              <w:tc>
-                <w:tcPr/>
-                <w:p>
-                  <w:pPr>
-                    <w:pStyle w:val="Compact"/>
-                    <w:jc w:val="left"/>
-                    <w:jc w:val="center"/>
-                  </w:pPr>
-                  <w:r>
-                    <w:t xml:space="preserve">0.00</w:t>
-                  </w:r>
-                </w:p>
-              </w:tc>
-              <w:tc>
-                <w:tcPr/>
-                <w:p>
-                  <w:pPr>
-                    <w:pStyle w:val="Compact"/>
-                    <w:jc w:val="center"/>
-                    <w:jc w:val="center"/>
-                  </w:pPr>
-                  <w:r>
-                    <w:t xml:space="preserve">0.00</w:t>
+                    <w:t xml:space="preserve">1</w:t>
                   </w:r>
                 </w:p>
               </w:tc>
@@ -16137,7 +16225,7 @@
                     <w:jc w:val="center"/>
                   </w:pPr>
                   <w:r>
-                    <w:t xml:space="preserve">Fumane</w:t>
+                    <w:t xml:space="preserve">5…5</w:t>
                   </w:r>
                 </w:p>
               </w:tc>
@@ -16163,59 +16251,33 @@
                     <w:jc w:val="center"/>
                   </w:pPr>
                   <w:r>
-                    <w:t xml:space="preserve">Fumane</w:t>
-                  </w:r>
-                </w:p>
-              </w:tc>
-              <w:tc>
-                <w:tcPr/>
-                <w:p>
-                  <w:pPr>
-                    <w:pStyle w:val="Compact"/>
-                    <w:jc w:val="center"/>
-                    <w:jc w:val="center"/>
-                  </w:pPr>
-                  <w:r>
-                    <w:t xml:space="preserve">2</w:t>
-                  </w:r>
-                </w:p>
-              </w:tc>
-              <w:tc>
-                <w:tcPr/>
-                <w:p>
-                  <w:pPr>
-                    <w:pStyle w:val="Compact"/>
-                    <w:jc w:val="left"/>
-                    <w:jc w:val="center"/>
-                  </w:pPr>
-                  <w:r>
-                    <w:t xml:space="preserve">0.00</w:t>
-                  </w:r>
-                </w:p>
-              </w:tc>
-              <w:tc>
-                <w:tcPr/>
-                <w:p>
-                  <w:pPr>
-                    <w:pStyle w:val="Compact"/>
-                    <w:jc w:val="left"/>
-                    <w:jc w:val="center"/>
-                  </w:pPr>
-                  <w:r>
-                    <w:t xml:space="preserve">0.99</w:t>
-                  </w:r>
-                </w:p>
-              </w:tc>
-              <w:tc>
-                <w:tcPr/>
-                <w:p>
-                  <w:pPr>
-                    <w:pStyle w:val="Compact"/>
-                    <w:jc w:val="center"/>
-                    <w:jc w:val="center"/>
-                  </w:pPr>
-                  <w:r>
-                    <w:t xml:space="preserve">0.00</w:t>
+                    <w:t xml:space="preserve">5</w:t>
+                  </w:r>
+                </w:p>
+              </w:tc>
+              <w:tc>
+                <w:tcPr/>
+                <w:p>
+                  <w:pPr>
+                    <w:pStyle w:val="Compact"/>
+                    <w:jc w:val="center"/>
+                    <w:jc w:val="center"/>
+                  </w:pPr>
+                  <w:r>
+                    <w:t xml:space="preserve">1</w:t>
+                  </w:r>
+                </w:p>
+              </w:tc>
+              <w:tc>
+                <w:tcPr/>
+                <w:p>
+                  <w:pPr>
+                    <w:pStyle w:val="Compact"/>
+                    <w:jc w:val="left"/>
+                    <w:jc w:val="center"/>
+                  </w:pPr>
+                  <w:r>
+                    <w:t xml:space="preserve">1</w:t>
                   </w:r>
                 </w:p>
               </w:tc>
@@ -16230,7 +16292,7 @@
                     <w:jc w:val="center"/>
                   </w:pPr>
                   <w:r>
-                    <w:t xml:space="preserve">Gatzarria</w:t>
+                    <w:t xml:space="preserve">6…6</w:t>
                   </w:r>
                 </w:p>
               </w:tc>
@@ -16256,59 +16318,33 @@
                     <w:jc w:val="center"/>
                   </w:pPr>
                   <w:r>
-                    <w:t xml:space="preserve">Gatzarria</w:t>
-                  </w:r>
-                </w:p>
-              </w:tc>
-              <w:tc>
-                <w:tcPr/>
-                <w:p>
-                  <w:pPr>
-                    <w:pStyle w:val="Compact"/>
-                    <w:jc w:val="center"/>
-                    <w:jc w:val="center"/>
-                  </w:pPr>
-                  <w:r>
-                    <w:t xml:space="preserve">2</w:t>
-                  </w:r>
-                </w:p>
-              </w:tc>
-              <w:tc>
-                <w:tcPr/>
-                <w:p>
-                  <w:pPr>
-                    <w:pStyle w:val="Compact"/>
-                    <w:jc w:val="left"/>
-                    <w:jc w:val="center"/>
-                  </w:pPr>
-                  <w:r>
-                    <w:t xml:space="preserve">0.00</w:t>
-                  </w:r>
-                </w:p>
-              </w:tc>
-              <w:tc>
-                <w:tcPr/>
-                <w:p>
-                  <w:pPr>
-                    <w:pStyle w:val="Compact"/>
-                    <w:jc w:val="left"/>
-                    <w:jc w:val="center"/>
-                  </w:pPr>
-                  <w:r>
-                    <w:t xml:space="preserve">0.99</w:t>
-                  </w:r>
-                </w:p>
-              </w:tc>
-              <w:tc>
-                <w:tcPr/>
-                <w:p>
-                  <w:pPr>
-                    <w:pStyle w:val="Compact"/>
-                    <w:jc w:val="center"/>
-                    <w:jc w:val="center"/>
-                  </w:pPr>
-                  <w:r>
-                    <w:t xml:space="preserve">0.00</w:t>
+                    <w:t xml:space="preserve">6</w:t>
+                  </w:r>
+                </w:p>
+              </w:tc>
+              <w:tc>
+                <w:tcPr/>
+                <w:p>
+                  <w:pPr>
+                    <w:pStyle w:val="Compact"/>
+                    <w:jc w:val="center"/>
+                    <w:jc w:val="center"/>
+                  </w:pPr>
+                  <w:r>
+                    <w:t xml:space="preserve">1</w:t>
+                  </w:r>
+                </w:p>
+              </w:tc>
+              <w:tc>
+                <w:tcPr/>
+                <w:p>
+                  <w:pPr>
+                    <w:pStyle w:val="Compact"/>
+                    <w:jc w:val="left"/>
+                    <w:jc w:val="center"/>
+                  </w:pPr>
+                  <w:r>
+                    <w:t xml:space="preserve">1</w:t>
                   </w:r>
                 </w:p>
               </w:tc>
@@ -16323,7 +16359,7 @@
                     <w:jc w:val="center"/>
                   </w:pPr>
                   <w:r>
-                    <w:t xml:space="preserve">Geissenklösterle</w:t>
+                    <w:t xml:space="preserve">7…7</w:t>
                   </w:r>
                 </w:p>
               </w:tc>
@@ -16349,7 +16385,7 @@
                     <w:jc w:val="center"/>
                   </w:pPr>
                   <w:r>
-                    <w:t xml:space="preserve">Geissenklösterle</w:t>
+                    <w:t xml:space="preserve">7</w:t>
                   </w:r>
                 </w:p>
               </w:tc>
@@ -16375,33 +16411,7 @@
                     <w:jc w:val="center"/>
                   </w:pPr>
                   <w:r>
-                    <w:t xml:space="preserve">0.99</w:t>
-                  </w:r>
-                </w:p>
-              </w:tc>
-              <w:tc>
-                <w:tcPr/>
-                <w:p>
-                  <w:pPr>
-                    <w:pStyle w:val="Compact"/>
-                    <w:jc w:val="left"/>
-                    <w:jc w:val="center"/>
-                  </w:pPr>
-                  <w:r>
-                    <w:t xml:space="preserve">0.00</w:t>
-                  </w:r>
-                </w:p>
-              </w:tc>
-              <w:tc>
-                <w:tcPr/>
-                <w:p>
-                  <w:pPr>
-                    <w:pStyle w:val="Compact"/>
-                    <w:jc w:val="center"/>
-                    <w:jc w:val="center"/>
-                  </w:pPr>
-                  <w:r>
-                    <w:t xml:space="preserve">0.00</w:t>
+                    <w:t xml:space="preserve">1</w:t>
                   </w:r>
                 </w:p>
               </w:tc>
@@ -16416,7 +16426,7 @@
                     <w:jc w:val="center"/>
                   </w:pPr>
                   <w:r>
-                    <w:t xml:space="preserve">Grotte de la Verpillière I</w:t>
+                    <w:t xml:space="preserve">8…8</w:t>
                   </w:r>
                 </w:p>
               </w:tc>
@@ -16442,59 +16452,33 @@
                     <w:jc w:val="center"/>
                   </w:pPr>
                   <w:r>
-                    <w:t xml:space="preserve">Grotte de la Verpillière I</w:t>
-                  </w:r>
-                </w:p>
-              </w:tc>
-              <w:tc>
-                <w:tcPr/>
-                <w:p>
-                  <w:pPr>
-                    <w:pStyle w:val="Compact"/>
-                    <w:jc w:val="center"/>
-                    <w:jc w:val="center"/>
-                  </w:pPr>
-                  <w:r>
-                    <w:t xml:space="preserve">2</w:t>
-                  </w:r>
-                </w:p>
-              </w:tc>
-              <w:tc>
-                <w:tcPr/>
-                <w:p>
-                  <w:pPr>
-                    <w:pStyle w:val="Compact"/>
-                    <w:jc w:val="left"/>
-                    <w:jc w:val="center"/>
-                  </w:pPr>
-                  <w:r>
-                    <w:t xml:space="preserve">0.00</w:t>
-                  </w:r>
-                </w:p>
-              </w:tc>
-              <w:tc>
-                <w:tcPr/>
-                <w:p>
-                  <w:pPr>
-                    <w:pStyle w:val="Compact"/>
-                    <w:jc w:val="left"/>
-                    <w:jc w:val="center"/>
-                  </w:pPr>
-                  <w:r>
-                    <w:t xml:space="preserve">0.99</w:t>
-                  </w:r>
-                </w:p>
-              </w:tc>
-              <w:tc>
-                <w:tcPr/>
-                <w:p>
-                  <w:pPr>
-                    <w:pStyle w:val="Compact"/>
-                    <w:jc w:val="center"/>
-                    <w:jc w:val="center"/>
-                  </w:pPr>
-                  <w:r>
-                    <w:t xml:space="preserve">0.00</w:t>
+                    <w:t xml:space="preserve">8</w:t>
+                  </w:r>
+                </w:p>
+              </w:tc>
+              <w:tc>
+                <w:tcPr/>
+                <w:p>
+                  <w:pPr>
+                    <w:pStyle w:val="Compact"/>
+                    <w:jc w:val="center"/>
+                    <w:jc w:val="center"/>
+                  </w:pPr>
+                  <w:r>
+                    <w:t xml:space="preserve">1</w:t>
+                  </w:r>
+                </w:p>
+              </w:tc>
+              <w:tc>
+                <w:tcPr/>
+                <w:p>
+                  <w:pPr>
+                    <w:pStyle w:val="Compact"/>
+                    <w:jc w:val="left"/>
+                    <w:jc w:val="center"/>
+                  </w:pPr>
+                  <w:r>
+                    <w:t xml:space="preserve">1</w:t>
                   </w:r>
                 </w:p>
               </w:tc>
@@ -16509,7 +16493,7 @@
                     <w:jc w:val="center"/>
                   </w:pPr>
                   <w:r>
-                    <w:t xml:space="preserve">Grotte du Renne</w:t>
+                    <w:t xml:space="preserve">9…9</w:t>
                   </w:r>
                 </w:p>
               </w:tc>
@@ -16535,7 +16519,7 @@
                     <w:jc w:val="center"/>
                   </w:pPr>
                   <w:r>
-                    <w:t xml:space="preserve">Grotte du Renne</w:t>
+                    <w:t xml:space="preserve">9</w:t>
                   </w:r>
                 </w:p>
               </w:tc>
@@ -16561,33 +16545,7 @@
                     <w:jc w:val="center"/>
                   </w:pPr>
                   <w:r>
-                    <w:t xml:space="preserve">0.99</w:t>
-                  </w:r>
-                </w:p>
-              </w:tc>
-              <w:tc>
-                <w:tcPr/>
-                <w:p>
-                  <w:pPr>
-                    <w:pStyle w:val="Compact"/>
-                    <w:jc w:val="left"/>
-                    <w:jc w:val="center"/>
-                  </w:pPr>
-                  <w:r>
-                    <w:t xml:space="preserve">0.00</w:t>
-                  </w:r>
-                </w:p>
-              </w:tc>
-              <w:tc>
-                <w:tcPr/>
-                <w:p>
-                  <w:pPr>
-                    <w:pStyle w:val="Compact"/>
-                    <w:jc w:val="center"/>
-                    <w:jc w:val="center"/>
-                  </w:pPr>
-                  <w:r>
-                    <w:t xml:space="preserve">0.00</w:t>
+                    <w:t xml:space="preserve">1</w:t>
                   </w:r>
                 </w:p>
               </w:tc>
@@ -16602,7 +16560,7 @@
                     <w:jc w:val="center"/>
                   </w:pPr>
                   <w:r>
-                    <w:t xml:space="preserve">Grottes de Fonds-de-Forêt</w:t>
+                    <w:t xml:space="preserve">10</w:t>
                   </w:r>
                 </w:p>
               </w:tc>
@@ -16628,59 +16586,33 @@
                     <w:jc w:val="center"/>
                   </w:pPr>
                   <w:r>
-                    <w:t xml:space="preserve">Grottes de Fonds-de-Forêt</w:t>
-                  </w:r>
-                </w:p>
-              </w:tc>
-              <w:tc>
-                <w:tcPr/>
-                <w:p>
-                  <w:pPr>
-                    <w:pStyle w:val="Compact"/>
-                    <w:jc w:val="center"/>
-                    <w:jc w:val="center"/>
-                  </w:pPr>
-                  <w:r>
-                    <w:t xml:space="preserve">2</w:t>
-                  </w:r>
-                </w:p>
-              </w:tc>
-              <w:tc>
-                <w:tcPr/>
-                <w:p>
-                  <w:pPr>
-                    <w:pStyle w:val="Compact"/>
-                    <w:jc w:val="left"/>
-                    <w:jc w:val="center"/>
-                  </w:pPr>
-                  <w:r>
-                    <w:t xml:space="preserve">0.00</w:t>
-                  </w:r>
-                </w:p>
-              </w:tc>
-              <w:tc>
-                <w:tcPr/>
-                <w:p>
-                  <w:pPr>
-                    <w:pStyle w:val="Compact"/>
-                    <w:jc w:val="left"/>
-                    <w:jc w:val="center"/>
-                  </w:pPr>
-                  <w:r>
-                    <w:t xml:space="preserve">0.99</w:t>
-                  </w:r>
-                </w:p>
-              </w:tc>
-              <w:tc>
-                <w:tcPr/>
-                <w:p>
-                  <w:pPr>
-                    <w:pStyle w:val="Compact"/>
-                    <w:jc w:val="center"/>
-                    <w:jc w:val="center"/>
-                  </w:pPr>
-                  <w:r>
-                    <w:t xml:space="preserve">0.00</w:t>
+                    <w:t xml:space="preserve">10</w:t>
+                  </w:r>
+                </w:p>
+              </w:tc>
+              <w:tc>
+                <w:tcPr/>
+                <w:p>
+                  <w:pPr>
+                    <w:pStyle w:val="Compact"/>
+                    <w:jc w:val="center"/>
+                    <w:jc w:val="center"/>
+                  </w:pPr>
+                  <w:r>
+                    <w:t xml:space="preserve">1</w:t>
+                  </w:r>
+                </w:p>
+              </w:tc>
+              <w:tc>
+                <w:tcPr/>
+                <w:p>
+                  <w:pPr>
+                    <w:pStyle w:val="Compact"/>
+                    <w:jc w:val="left"/>
+                    <w:jc w:val="center"/>
+                  </w:pPr>
+                  <w:r>
+                    <w:t xml:space="preserve">1</w:t>
                   </w:r>
                 </w:p>
               </w:tc>
@@ -16695,7 +16627,7 @@
                     <w:jc w:val="center"/>
                   </w:pPr>
                   <w:r>
-                    <w:t xml:space="preserve">Hohle Fels…11</w:t>
+                    <w:t xml:space="preserve">11</w:t>
                   </w:r>
                 </w:p>
               </w:tc>
@@ -16721,7 +16653,7 @@
                     <w:jc w:val="center"/>
                   </w:pPr>
                   <w:r>
-                    <w:t xml:space="preserve">Hohle Fels</w:t>
+                    <w:t xml:space="preserve">11</w:t>
                   </w:r>
                 </w:p>
               </w:tc>
@@ -16747,33 +16679,7 @@
                     <w:jc w:val="center"/>
                   </w:pPr>
                   <w:r>
-                    <w:t xml:space="preserve">0.99</w:t>
-                  </w:r>
-                </w:p>
-              </w:tc>
-              <w:tc>
-                <w:tcPr/>
-                <w:p>
-                  <w:pPr>
-                    <w:pStyle w:val="Compact"/>
-                    <w:jc w:val="left"/>
-                    <w:jc w:val="center"/>
-                  </w:pPr>
-                  <w:r>
-                    <w:t xml:space="preserve">0.00</w:t>
-                  </w:r>
-                </w:p>
-              </w:tc>
-              <w:tc>
-                <w:tcPr/>
-                <w:p>
-                  <w:pPr>
-                    <w:pStyle w:val="Compact"/>
-                    <w:jc w:val="center"/>
-                    <w:jc w:val="center"/>
-                  </w:pPr>
-                  <w:r>
-                    <w:t xml:space="preserve">0.00</w:t>
+                    <w:t xml:space="preserve">1</w:t>
                   </w:r>
                 </w:p>
               </w:tc>
@@ -16788,7 +16694,7 @@
                     <w:jc w:val="center"/>
                   </w:pPr>
                   <w:r>
-                    <w:t xml:space="preserve">Hohlenstein-Stadel</w:t>
+                    <w:t xml:space="preserve">12</w:t>
                   </w:r>
                 </w:p>
               </w:tc>
@@ -16814,59 +16720,33 @@
                     <w:jc w:val="center"/>
                   </w:pPr>
                   <w:r>
-                    <w:t xml:space="preserve">Hohlenstein-Stadel</w:t>
-                  </w:r>
-                </w:p>
-              </w:tc>
-              <w:tc>
-                <w:tcPr/>
-                <w:p>
-                  <w:pPr>
-                    <w:pStyle w:val="Compact"/>
-                    <w:jc w:val="center"/>
-                    <w:jc w:val="center"/>
-                  </w:pPr>
-                  <w:r>
-                    <w:t xml:space="preserve">2</w:t>
-                  </w:r>
-                </w:p>
-              </w:tc>
-              <w:tc>
-                <w:tcPr/>
-                <w:p>
-                  <w:pPr>
-                    <w:pStyle w:val="Compact"/>
-                    <w:jc w:val="left"/>
-                    <w:jc w:val="center"/>
-                  </w:pPr>
-                  <w:r>
-                    <w:t xml:space="preserve">0.00</w:t>
-                  </w:r>
-                </w:p>
-              </w:tc>
-              <w:tc>
-                <w:tcPr/>
-                <w:p>
-                  <w:pPr>
-                    <w:pStyle w:val="Compact"/>
-                    <w:jc w:val="left"/>
-                    <w:jc w:val="center"/>
-                  </w:pPr>
-                  <w:r>
-                    <w:t xml:space="preserve">0.99</w:t>
-                  </w:r>
-                </w:p>
-              </w:tc>
-              <w:tc>
-                <w:tcPr/>
-                <w:p>
-                  <w:pPr>
-                    <w:pStyle w:val="Compact"/>
-                    <w:jc w:val="center"/>
-                    <w:jc w:val="center"/>
-                  </w:pPr>
-                  <w:r>
-                    <w:t xml:space="preserve">0.00</w:t>
+                    <w:t xml:space="preserve">12</w:t>
+                  </w:r>
+                </w:p>
+              </w:tc>
+              <w:tc>
+                <w:tcPr/>
+                <w:p>
+                  <w:pPr>
+                    <w:pStyle w:val="Compact"/>
+                    <w:jc w:val="center"/>
+                    <w:jc w:val="center"/>
+                  </w:pPr>
+                  <w:r>
+                    <w:t xml:space="preserve">1</w:t>
+                  </w:r>
+                </w:p>
+              </w:tc>
+              <w:tc>
+                <w:tcPr/>
+                <w:p>
+                  <w:pPr>
+                    <w:pStyle w:val="Compact"/>
+                    <w:jc w:val="left"/>
+                    <w:jc w:val="center"/>
+                  </w:pPr>
+                  <w:r>
+                    <w:t xml:space="preserve">1</w:t>
                   </w:r>
                 </w:p>
               </w:tc>
@@ -16881,7 +16761,7 @@
                     <w:jc w:val="center"/>
                   </w:pPr>
                   <w:r>
-                    <w:t xml:space="preserve">La Ferrassie</w:t>
+                    <w:t xml:space="preserve">13</w:t>
                   </w:r>
                 </w:p>
               </w:tc>
@@ -16907,7 +16787,7 @@
                     <w:jc w:val="center"/>
                   </w:pPr>
                   <w:r>
-                    <w:t xml:space="preserve">La Ferrassie</w:t>
+                    <w:t xml:space="preserve">13</w:t>
                   </w:r>
                 </w:p>
               </w:tc>
@@ -16933,33 +16813,7 @@
                     <w:jc w:val="center"/>
                   </w:pPr>
                   <w:r>
-                    <w:t xml:space="preserve">0.99</w:t>
-                  </w:r>
-                </w:p>
-              </w:tc>
-              <w:tc>
-                <w:tcPr/>
-                <w:p>
-                  <w:pPr>
-                    <w:pStyle w:val="Compact"/>
-                    <w:jc w:val="left"/>
-                    <w:jc w:val="center"/>
-                  </w:pPr>
-                  <w:r>
-                    <w:t xml:space="preserve">0.00</w:t>
-                  </w:r>
-                </w:p>
-              </w:tc>
-              <w:tc>
-                <w:tcPr/>
-                <w:p>
-                  <w:pPr>
-                    <w:pStyle w:val="Compact"/>
-                    <w:jc w:val="center"/>
-                    <w:jc w:val="center"/>
-                  </w:pPr>
-                  <w:r>
-                    <w:t xml:space="preserve">0.00</w:t>
+                    <w:t xml:space="preserve">1</w:t>
                   </w:r>
                 </w:p>
               </w:tc>
@@ -16974,7 +16828,7 @@
                     <w:jc w:val="center"/>
                   </w:pPr>
                   <w:r>
-                    <w:t xml:space="preserve">Labeko Koba</w:t>
+                    <w:t xml:space="preserve">14</w:t>
                   </w:r>
                 </w:p>
               </w:tc>
@@ -17000,59 +16854,33 @@
                     <w:jc w:val="center"/>
                   </w:pPr>
                   <w:r>
-                    <w:t xml:space="preserve">Labeko Koba</w:t>
-                  </w:r>
-                </w:p>
-              </w:tc>
-              <w:tc>
-                <w:tcPr/>
-                <w:p>
-                  <w:pPr>
-                    <w:pStyle w:val="Compact"/>
-                    <w:jc w:val="center"/>
-                    <w:jc w:val="center"/>
-                  </w:pPr>
-                  <w:r>
-                    <w:t xml:space="preserve">3</w:t>
-                  </w:r>
-                </w:p>
-              </w:tc>
-              <w:tc>
-                <w:tcPr/>
-                <w:p>
-                  <w:pPr>
-                    <w:pStyle w:val="Compact"/>
-                    <w:jc w:val="left"/>
-                    <w:jc w:val="center"/>
-                  </w:pPr>
-                  <w:r>
-                    <w:t xml:space="preserve">0.00</w:t>
-                  </w:r>
-                </w:p>
-              </w:tc>
-              <w:tc>
-                <w:tcPr/>
-                <w:p>
-                  <w:pPr>
-                    <w:pStyle w:val="Compact"/>
-                    <w:jc w:val="left"/>
-                    <w:jc w:val="center"/>
-                  </w:pPr>
-                  <w:r>
-                    <w:t xml:space="preserve">0.00</w:t>
-                  </w:r>
-                </w:p>
-              </w:tc>
-              <w:tc>
-                <w:tcPr/>
-                <w:p>
-                  <w:pPr>
-                    <w:pStyle w:val="Compact"/>
-                    <w:jc w:val="center"/>
-                    <w:jc w:val="center"/>
-                  </w:pPr>
-                  <w:r>
-                    <w:t xml:space="preserve">0.99</w:t>
+                    <w:t xml:space="preserve">14</w:t>
+                  </w:r>
+                </w:p>
+              </w:tc>
+              <w:tc>
+                <w:tcPr/>
+                <w:p>
+                  <w:pPr>
+                    <w:pStyle w:val="Compact"/>
+                    <w:jc w:val="center"/>
+                    <w:jc w:val="center"/>
+                  </w:pPr>
+                  <w:r>
+                    <w:t xml:space="preserve">1</w:t>
+                  </w:r>
+                </w:p>
+              </w:tc>
+              <w:tc>
+                <w:tcPr/>
+                <w:p>
+                  <w:pPr>
+                    <w:pStyle w:val="Compact"/>
+                    <w:jc w:val="left"/>
+                    <w:jc w:val="center"/>
+                  </w:pPr>
+                  <w:r>
+                    <w:t xml:space="preserve">1</w:t>
                   </w:r>
                 </w:p>
               </w:tc>
@@ -17067,7 +16895,7 @@
                     <w:jc w:val="center"/>
                   </w:pPr>
                   <w:r>
-                    <w:t xml:space="preserve">Les Cottés</w:t>
+                    <w:t xml:space="preserve">15</w:t>
                   </w:r>
                 </w:p>
               </w:tc>
@@ -17093,59 +16921,33 @@
                     <w:jc w:val="center"/>
                   </w:pPr>
                   <w:r>
-                    <w:t xml:space="preserve">Les Cottés</w:t>
-                  </w:r>
-                </w:p>
-              </w:tc>
-              <w:tc>
-                <w:tcPr/>
-                <w:p>
-                  <w:pPr>
-                    <w:pStyle w:val="Compact"/>
-                    <w:jc w:val="center"/>
-                    <w:jc w:val="center"/>
-                  </w:pPr>
-                  <w:r>
-                    <w:t xml:space="preserve">3</w:t>
-                  </w:r>
-                </w:p>
-              </w:tc>
-              <w:tc>
-                <w:tcPr/>
-                <w:p>
-                  <w:pPr>
-                    <w:pStyle w:val="Compact"/>
-                    <w:jc w:val="left"/>
-                    <w:jc w:val="center"/>
-                  </w:pPr>
-                  <w:r>
-                    <w:t xml:space="preserve">0.00</w:t>
-                  </w:r>
-                </w:p>
-              </w:tc>
-              <w:tc>
-                <w:tcPr/>
-                <w:p>
-                  <w:pPr>
-                    <w:pStyle w:val="Compact"/>
-                    <w:jc w:val="left"/>
-                    <w:jc w:val="center"/>
-                  </w:pPr>
-                  <w:r>
-                    <w:t xml:space="preserve">0.00</w:t>
-                  </w:r>
-                </w:p>
-              </w:tc>
-              <w:tc>
-                <w:tcPr/>
-                <w:p>
-                  <w:pPr>
-                    <w:pStyle w:val="Compact"/>
-                    <w:jc w:val="center"/>
-                    <w:jc w:val="center"/>
-                  </w:pPr>
-                  <w:r>
-                    <w:t xml:space="preserve">0.99</w:t>
+                    <w:t xml:space="preserve">15</w:t>
+                  </w:r>
+                </w:p>
+              </w:tc>
+              <w:tc>
+                <w:tcPr/>
+                <w:p>
+                  <w:pPr>
+                    <w:pStyle w:val="Compact"/>
+                    <w:jc w:val="center"/>
+                    <w:jc w:val="center"/>
+                  </w:pPr>
+                  <w:r>
+                    <w:t xml:space="preserve">1</w:t>
+                  </w:r>
+                </w:p>
+              </w:tc>
+              <w:tc>
+                <w:tcPr/>
+                <w:p>
+                  <w:pPr>
+                    <w:pStyle w:val="Compact"/>
+                    <w:jc w:val="left"/>
+                    <w:jc w:val="center"/>
+                  </w:pPr>
+                  <w:r>
+                    <w:t xml:space="preserve">1</w:t>
                   </w:r>
                 </w:p>
               </w:tc>
@@ -17160,7 +16962,7 @@
                     <w:jc w:val="center"/>
                   </w:pPr>
                   <w:r>
-                    <w:t xml:space="preserve">Pod Hradem</w:t>
+                    <w:t xml:space="preserve">16</w:t>
                   </w:r>
                 </w:p>
               </w:tc>
@@ -17186,59 +16988,33 @@
                     <w:jc w:val="center"/>
                   </w:pPr>
                   <w:r>
-                    <w:t xml:space="preserve">Pod Hradem</w:t>
-                  </w:r>
-                </w:p>
-              </w:tc>
-              <w:tc>
-                <w:tcPr/>
-                <w:p>
-                  <w:pPr>
-                    <w:pStyle w:val="Compact"/>
-                    <w:jc w:val="center"/>
-                    <w:jc w:val="center"/>
-                  </w:pPr>
-                  <w:r>
-                    <w:t xml:space="preserve">2</w:t>
-                  </w:r>
-                </w:p>
-              </w:tc>
-              <w:tc>
-                <w:tcPr/>
-                <w:p>
-                  <w:pPr>
-                    <w:pStyle w:val="Compact"/>
-                    <w:jc w:val="left"/>
-                    <w:jc w:val="center"/>
-                  </w:pPr>
-                  <w:r>
-                    <w:t xml:space="preserve">0.00</w:t>
-                  </w:r>
-                </w:p>
-              </w:tc>
-              <w:tc>
-                <w:tcPr/>
-                <w:p>
-                  <w:pPr>
-                    <w:pStyle w:val="Compact"/>
-                    <w:jc w:val="left"/>
-                    <w:jc w:val="center"/>
-                  </w:pPr>
-                  <w:r>
-                    <w:t xml:space="preserve">0.99</w:t>
-                  </w:r>
-                </w:p>
-              </w:tc>
-              <w:tc>
-                <w:tcPr/>
-                <w:p>
-                  <w:pPr>
-                    <w:pStyle w:val="Compact"/>
-                    <w:jc w:val="center"/>
-                    <w:jc w:val="center"/>
-                  </w:pPr>
-                  <w:r>
-                    <w:t xml:space="preserve">0.00</w:t>
+                    <w:t xml:space="preserve">16</w:t>
+                  </w:r>
+                </w:p>
+              </w:tc>
+              <w:tc>
+                <w:tcPr/>
+                <w:p>
+                  <w:pPr>
+                    <w:pStyle w:val="Compact"/>
+                    <w:jc w:val="center"/>
+                    <w:jc w:val="center"/>
+                  </w:pPr>
+                  <w:r>
+                    <w:t xml:space="preserve">1</w:t>
+                  </w:r>
+                </w:p>
+              </w:tc>
+              <w:tc>
+                <w:tcPr/>
+                <w:p>
+                  <w:pPr>
+                    <w:pStyle w:val="Compact"/>
+                    <w:jc w:val="left"/>
+                    <w:jc w:val="center"/>
+                  </w:pPr>
+                  <w:r>
+                    <w:t xml:space="preserve">1</w:t>
                   </w:r>
                 </w:p>
               </w:tc>
@@ -17253,7 +17029,7 @@
                     <w:jc w:val="center"/>
                   </w:pPr>
                   <w:r>
-                    <w:t xml:space="preserve">Riparo Bombrini</w:t>
+                    <w:t xml:space="preserve">17</w:t>
                   </w:r>
                 </w:p>
               </w:tc>
@@ -17279,59 +17055,33 @@
                     <w:jc w:val="center"/>
                   </w:pPr>
                   <w:r>
-                    <w:t xml:space="preserve">Riparo Bombrini</w:t>
-                  </w:r>
-                </w:p>
-              </w:tc>
-              <w:tc>
-                <w:tcPr/>
-                <w:p>
-                  <w:pPr>
-                    <w:pStyle w:val="Compact"/>
-                    <w:jc w:val="center"/>
-                    <w:jc w:val="center"/>
-                  </w:pPr>
-                  <w:r>
-                    <w:t xml:space="preserve">2</w:t>
-                  </w:r>
-                </w:p>
-              </w:tc>
-              <w:tc>
-                <w:tcPr/>
-                <w:p>
-                  <w:pPr>
-                    <w:pStyle w:val="Compact"/>
-                    <w:jc w:val="left"/>
-                    <w:jc w:val="center"/>
-                  </w:pPr>
-                  <w:r>
-                    <w:t xml:space="preserve">0.00</w:t>
-                  </w:r>
-                </w:p>
-              </w:tc>
-              <w:tc>
-                <w:tcPr/>
-                <w:p>
-                  <w:pPr>
-                    <w:pStyle w:val="Compact"/>
-                    <w:jc w:val="left"/>
-                    <w:jc w:val="center"/>
-                  </w:pPr>
-                  <w:r>
-                    <w:t xml:space="preserve">0.99</w:t>
-                  </w:r>
-                </w:p>
-              </w:tc>
-              <w:tc>
-                <w:tcPr/>
-                <w:p>
-                  <w:pPr>
-                    <w:pStyle w:val="Compact"/>
-                    <w:jc w:val="center"/>
-                    <w:jc w:val="center"/>
-                  </w:pPr>
-                  <w:r>
-                    <w:t xml:space="preserve">0.00</w:t>
+                    <w:t xml:space="preserve">17</w:t>
+                  </w:r>
+                </w:p>
+              </w:tc>
+              <w:tc>
+                <w:tcPr/>
+                <w:p>
+                  <w:pPr>
+                    <w:pStyle w:val="Compact"/>
+                    <w:jc w:val="center"/>
+                    <w:jc w:val="center"/>
+                  </w:pPr>
+                  <w:r>
+                    <w:t xml:space="preserve">1</w:t>
+                  </w:r>
+                </w:p>
+              </w:tc>
+              <w:tc>
+                <w:tcPr/>
+                <w:p>
+                  <w:pPr>
+                    <w:pStyle w:val="Compact"/>
+                    <w:jc w:val="left"/>
+                    <w:jc w:val="center"/>
+                  </w:pPr>
+                  <w:r>
+                    <w:t xml:space="preserve">1</w:t>
                   </w:r>
                 </w:p>
               </w:tc>
@@ -17346,7 +17096,7 @@
                     <w:jc w:val="center"/>
                   </w:pPr>
                   <w:r>
-                    <w:t xml:space="preserve">Solutré</w:t>
+                    <w:t xml:space="preserve">18</w:t>
                   </w:r>
                 </w:p>
               </w:tc>
@@ -17372,7 +17122,7 @@
                     <w:jc w:val="center"/>
                   </w:pPr>
                   <w:r>
-                    <w:t xml:space="preserve">Solutré</w:t>
+                    <w:t xml:space="preserve">18</w:t>
                   </w:r>
                 </w:p>
               </w:tc>
@@ -17398,33 +17148,7 @@
                     <w:jc w:val="center"/>
                   </w:pPr>
                   <w:r>
-                    <w:t xml:space="preserve">0.99</w:t>
-                  </w:r>
-                </w:p>
-              </w:tc>
-              <w:tc>
-                <w:tcPr/>
-                <w:p>
-                  <w:pPr>
-                    <w:pStyle w:val="Compact"/>
-                    <w:jc w:val="left"/>
-                    <w:jc w:val="center"/>
-                  </w:pPr>
-                  <w:r>
-                    <w:t xml:space="preserve">0.00</w:t>
-                  </w:r>
-                </w:p>
-              </w:tc>
-              <w:tc>
-                <w:tcPr/>
-                <w:p>
-                  <w:pPr>
-                    <w:pStyle w:val="Compact"/>
-                    <w:jc w:val="center"/>
-                    <w:jc w:val="center"/>
-                  </w:pPr>
-                  <w:r>
-                    <w:t xml:space="preserve">0.00</w:t>
+                    <w:t xml:space="preserve">1</w:t>
                   </w:r>
                 </w:p>
               </w:tc>
@@ -17439,7 +17163,7 @@
                     <w:jc w:val="center"/>
                   </w:pPr>
                   <w:r>
-                    <w:t xml:space="preserve">Trou al’Wesse</w:t>
+                    <w:t xml:space="preserve">19</w:t>
                   </w:r>
                 </w:p>
               </w:tc>
@@ -17465,59 +17189,33 @@
                     <w:jc w:val="center"/>
                   </w:pPr>
                   <w:r>
-                    <w:t xml:space="preserve">Trou al’Wesse</w:t>
-                  </w:r>
-                </w:p>
-              </w:tc>
-              <w:tc>
-                <w:tcPr/>
-                <w:p>
-                  <w:pPr>
-                    <w:pStyle w:val="Compact"/>
-                    <w:jc w:val="center"/>
-                    <w:jc w:val="center"/>
-                  </w:pPr>
-                  <w:r>
-                    <w:t xml:space="preserve">3</w:t>
-                  </w:r>
-                </w:p>
-              </w:tc>
-              <w:tc>
-                <w:tcPr/>
-                <w:p>
-                  <w:pPr>
-                    <w:pStyle w:val="Compact"/>
-                    <w:jc w:val="left"/>
-                    <w:jc w:val="center"/>
-                  </w:pPr>
-                  <w:r>
-                    <w:t xml:space="preserve">0.00</w:t>
-                  </w:r>
-                </w:p>
-              </w:tc>
-              <w:tc>
-                <w:tcPr/>
-                <w:p>
-                  <w:pPr>
-                    <w:pStyle w:val="Compact"/>
-                    <w:jc w:val="left"/>
-                    <w:jc w:val="center"/>
-                  </w:pPr>
-                  <w:r>
-                    <w:t xml:space="preserve">0.00</w:t>
-                  </w:r>
-                </w:p>
-              </w:tc>
-              <w:tc>
-                <w:tcPr/>
-                <w:p>
-                  <w:pPr>
-                    <w:pStyle w:val="Compact"/>
-                    <w:jc w:val="center"/>
-                    <w:jc w:val="center"/>
-                  </w:pPr>
-                  <w:r>
-                    <w:t xml:space="preserve">0.99</w:t>
+                    <w:t xml:space="preserve">19</w:t>
+                  </w:r>
+                </w:p>
+              </w:tc>
+              <w:tc>
+                <w:tcPr/>
+                <w:p>
+                  <w:pPr>
+                    <w:pStyle w:val="Compact"/>
+                    <w:jc w:val="center"/>
+                    <w:jc w:val="center"/>
+                  </w:pPr>
+                  <w:r>
+                    <w:t xml:space="preserve">1</w:t>
+                  </w:r>
+                </w:p>
+              </w:tc>
+              <w:tc>
+                <w:tcPr/>
+                <w:p>
+                  <w:pPr>
+                    <w:pStyle w:val="Compact"/>
+                    <w:jc w:val="left"/>
+                    <w:jc w:val="center"/>
+                  </w:pPr>
+                  <w:r>
+                    <w:t xml:space="preserve">1</w:t>
                   </w:r>
                 </w:p>
               </w:tc>
@@ -17532,7 +17230,7 @@
                     <w:jc w:val="center"/>
                   </w:pPr>
                   <w:r>
-                    <w:t xml:space="preserve">Vogelherd</w:t>
+                    <w:t xml:space="preserve">20</w:t>
                   </w:r>
                 </w:p>
               </w:tc>
@@ -17558,7 +17256,7 @@
                     <w:jc w:val="center"/>
                   </w:pPr>
                   <w:r>
-                    <w:t xml:space="preserve">Vogelherd</w:t>
+                    <w:t xml:space="preserve">20</w:t>
                   </w:r>
                 </w:p>
               </w:tc>
@@ -17584,33 +17282,7 @@
                     <w:jc w:val="center"/>
                   </w:pPr>
                   <w:r>
-                    <w:t xml:space="preserve">0.99</w:t>
-                  </w:r>
-                </w:p>
-              </w:tc>
-              <w:tc>
-                <w:tcPr/>
-                <w:p>
-                  <w:pPr>
-                    <w:pStyle w:val="Compact"/>
-                    <w:jc w:val="left"/>
-                    <w:jc w:val="center"/>
-                  </w:pPr>
-                  <w:r>
-                    <w:t xml:space="preserve">0.00</w:t>
-                  </w:r>
-                </w:p>
-              </w:tc>
-              <w:tc>
-                <w:tcPr/>
-                <w:p>
-                  <w:pPr>
-                    <w:pStyle w:val="Compact"/>
-                    <w:jc w:val="center"/>
-                    <w:jc w:val="center"/>
-                  </w:pPr>
-                  <w:r>
-                    <w:t xml:space="preserve">0.00</w:t>
+                    <w:t xml:space="preserve">1</w:t>
                   </w:r>
                 </w:p>
               </w:tc>
@@ -17625,7 +17297,7 @@
                     <w:jc w:val="center"/>
                   </w:pPr>
                   <w:r>
-                    <w:t xml:space="preserve">Bockstein-Törle</w:t>
+                    <w:t xml:space="preserve">1…21</w:t>
                   </w:r>
                 </w:p>
               </w:tc>
@@ -17651,19 +17323,6 @@
                     <w:jc w:val="center"/>
                   </w:pPr>
                   <w:r>
-                    <w:t xml:space="preserve">Bockstein-Törle</w:t>
-                  </w:r>
-                </w:p>
-              </w:tc>
-              <w:tc>
-                <w:tcPr/>
-                <w:p>
-                  <w:pPr>
-                    <w:pStyle w:val="Compact"/>
-                    <w:jc w:val="center"/>
-                    <w:jc w:val="center"/>
-                  </w:pPr>
-                  <w:r>
                     <w:t xml:space="preserve">1</w:t>
                   </w:r>
                 </w:p>
@@ -17673,37 +17332,24 @@
                 <w:p>
                   <w:pPr>
                     <w:pStyle w:val="Compact"/>
-                    <w:jc w:val="left"/>
-                    <w:jc w:val="center"/>
-                  </w:pPr>
-                  <w:r>
-                    <w:t xml:space="preserve">1.00</w:t>
-                  </w:r>
-                </w:p>
-              </w:tc>
-              <w:tc>
-                <w:tcPr/>
-                <w:p>
-                  <w:pPr>
-                    <w:pStyle w:val="Compact"/>
-                    <w:jc w:val="left"/>
-                    <w:jc w:val="center"/>
-                  </w:pPr>
-                  <w:r>
-                    <w:t xml:space="preserve">NA</w:t>
-                  </w:r>
-                </w:p>
-              </w:tc>
-              <w:tc>
-                <w:tcPr/>
-                <w:p>
-                  <w:pPr>
-                    <w:pStyle w:val="Compact"/>
-                    <w:jc w:val="center"/>
-                    <w:jc w:val="center"/>
-                  </w:pPr>
-                  <w:r>
-                    <w:t xml:space="preserve">NA</w:t>
+                    <w:jc w:val="center"/>
+                    <w:jc w:val="center"/>
+                  </w:pPr>
+                  <w:r>
+                    <w:t xml:space="preserve">1</w:t>
+                  </w:r>
+                </w:p>
+              </w:tc>
+              <w:tc>
+                <w:tcPr/>
+                <w:p>
+                  <w:pPr>
+                    <w:pStyle w:val="Compact"/>
+                    <w:jc w:val="left"/>
+                    <w:jc w:val="center"/>
+                  </w:pPr>
+                  <w:r>
+                    <w:t xml:space="preserve">1</w:t>
                   </w:r>
                 </w:p>
               </w:tc>
@@ -17718,7 +17364,7 @@
                     <w:jc w:val="center"/>
                   </w:pPr>
                   <w:r>
-                    <w:t xml:space="preserve">Gargas</w:t>
+                    <w:t xml:space="preserve">2…22</w:t>
                   </w:r>
                 </w:p>
               </w:tc>
@@ -17744,7 +17390,7 @@
                     <w:jc w:val="center"/>
                   </w:pPr>
                   <w:r>
-                    <w:t xml:space="preserve">Gargas</w:t>
+                    <w:t xml:space="preserve">2</w:t>
                   </w:r>
                 </w:p>
               </w:tc>
@@ -17770,33 +17416,7 @@
                     <w:jc w:val="center"/>
                   </w:pPr>
                   <w:r>
-                    <w:t xml:space="preserve">1.00</w:t>
-                  </w:r>
-                </w:p>
-              </w:tc>
-              <w:tc>
-                <w:tcPr/>
-                <w:p>
-                  <w:pPr>
-                    <w:pStyle w:val="Compact"/>
-                    <w:jc w:val="left"/>
-                    <w:jc w:val="center"/>
-                  </w:pPr>
-                  <w:r>
-                    <w:t xml:space="preserve">NA</w:t>
-                  </w:r>
-                </w:p>
-              </w:tc>
-              <w:tc>
-                <w:tcPr/>
-                <w:p>
-                  <w:pPr>
-                    <w:pStyle w:val="Compact"/>
-                    <w:jc w:val="center"/>
-                    <w:jc w:val="center"/>
-                  </w:pPr>
-                  <w:r>
-                    <w:t xml:space="preserve">NA</w:t>
+                    <w:t xml:space="preserve">1</w:t>
                   </w:r>
                 </w:p>
               </w:tc>
@@ -17811,7 +17431,7 @@
                     <w:jc w:val="center"/>
                   </w:pPr>
                   <w:r>
-                    <w:t xml:space="preserve">Hohle Fels…23</w:t>
+                    <w:t xml:space="preserve">3…23</w:t>
                   </w:r>
                 </w:p>
               </w:tc>
@@ -17837,7 +17457,7 @@
                     <w:jc w:val="center"/>
                   </w:pPr>
                   <w:r>
-                    <w:t xml:space="preserve">Hohle Fels</w:t>
+                    <w:t xml:space="preserve">3</w:t>
                   </w:r>
                 </w:p>
               </w:tc>
@@ -17863,33 +17483,7 @@
                     <w:jc w:val="center"/>
                   </w:pPr>
                   <w:r>
-                    <w:t xml:space="preserve">1.00</w:t>
-                  </w:r>
-                </w:p>
-              </w:tc>
-              <w:tc>
-                <w:tcPr/>
-                <w:p>
-                  <w:pPr>
-                    <w:pStyle w:val="Compact"/>
-                    <w:jc w:val="left"/>
-                    <w:jc w:val="center"/>
-                  </w:pPr>
-                  <w:r>
-                    <w:t xml:space="preserve">NA</w:t>
-                  </w:r>
-                </w:p>
-              </w:tc>
-              <w:tc>
-                <w:tcPr/>
-                <w:p>
-                  <w:pPr>
-                    <w:pStyle w:val="Compact"/>
-                    <w:jc w:val="center"/>
-                    <w:jc w:val="center"/>
-                  </w:pPr>
-                  <w:r>
-                    <w:t xml:space="preserve">NA</w:t>
+                    <w:t xml:space="preserve">1</w:t>
                   </w:r>
                 </w:p>
               </w:tc>
@@ -17904,7 +17498,7 @@
                     <w:jc w:val="center"/>
                   </w:pPr>
                   <w:r>
-                    <w:t xml:space="preserve">La Viña</w:t>
+                    <w:t xml:space="preserve">4…24</w:t>
                   </w:r>
                 </w:p>
               </w:tc>
@@ -17930,7 +17524,7 @@
                     <w:jc w:val="center"/>
                   </w:pPr>
                   <w:r>
-                    <w:t xml:space="preserve">La Viña</w:t>
+                    <w:t xml:space="preserve">4</w:t>
                   </w:r>
                 </w:p>
               </w:tc>
@@ -17956,33 +17550,7 @@
                     <w:jc w:val="center"/>
                   </w:pPr>
                   <w:r>
-                    <w:t xml:space="preserve">1.00</w:t>
-                  </w:r>
-                </w:p>
-              </w:tc>
-              <w:tc>
-                <w:tcPr/>
-                <w:p>
-                  <w:pPr>
-                    <w:pStyle w:val="Compact"/>
-                    <w:jc w:val="left"/>
-                    <w:jc w:val="center"/>
-                  </w:pPr>
-                  <w:r>
-                    <w:t xml:space="preserve">NA</w:t>
-                  </w:r>
-                </w:p>
-              </w:tc>
-              <w:tc>
-                <w:tcPr/>
-                <w:p>
-                  <w:pPr>
-                    <w:pStyle w:val="Compact"/>
-                    <w:jc w:val="center"/>
-                    <w:jc w:val="center"/>
-                  </w:pPr>
-                  <w:r>
-                    <w:t xml:space="preserve">NA</w:t>
+                    <w:t xml:space="preserve">1</w:t>
                   </w:r>
                 </w:p>
               </w:tc>
@@ -17997,7 +17565,7 @@
                     <w:jc w:val="center"/>
                   </w:pPr>
                   <w:r>
-                    <w:t xml:space="preserve">Les Rois</w:t>
+                    <w:t xml:space="preserve">5…25</w:t>
                   </w:r>
                 </w:p>
               </w:tc>
@@ -18023,7 +17591,7 @@
                     <w:jc w:val="center"/>
                   </w:pPr>
                   <w:r>
-                    <w:t xml:space="preserve">Les Rois</w:t>
+                    <w:t xml:space="preserve">5</w:t>
                   </w:r>
                 </w:p>
               </w:tc>
@@ -18049,33 +17617,7 @@
                     <w:jc w:val="center"/>
                   </w:pPr>
                   <w:r>
-                    <w:t xml:space="preserve">1.00</w:t>
-                  </w:r>
-                </w:p>
-              </w:tc>
-              <w:tc>
-                <w:tcPr/>
-                <w:p>
-                  <w:pPr>
-                    <w:pStyle w:val="Compact"/>
-                    <w:jc w:val="left"/>
-                    <w:jc w:val="center"/>
-                  </w:pPr>
-                  <w:r>
-                    <w:t xml:space="preserve">NA</w:t>
-                  </w:r>
-                </w:p>
-              </w:tc>
-              <w:tc>
-                <w:tcPr/>
-                <w:p>
-                  <w:pPr>
-                    <w:pStyle w:val="Compact"/>
-                    <w:jc w:val="center"/>
-                    <w:jc w:val="center"/>
-                  </w:pPr>
-                  <w:r>
-                    <w:t xml:space="preserve">NA</w:t>
+                    <w:t xml:space="preserve">1</w:t>
                   </w:r>
                 </w:p>
               </w:tc>
@@ -18090,7 +17632,7 @@
                     <w:jc w:val="center"/>
                   </w:pPr>
                   <w:r>
-                    <w:t xml:space="preserve">Mladeč</w:t>
+                    <w:t xml:space="preserve">6…26</w:t>
                   </w:r>
                 </w:p>
               </w:tc>
@@ -18116,7 +17658,7 @@
                     <w:jc w:val="center"/>
                   </w:pPr>
                   <w:r>
-                    <w:t xml:space="preserve">Mladeč</w:t>
+                    <w:t xml:space="preserve">6</w:t>
                   </w:r>
                 </w:p>
               </w:tc>
@@ -18142,33 +17684,7 @@
                     <w:jc w:val="center"/>
                   </w:pPr>
                   <w:r>
-                    <w:t xml:space="preserve">1.00</w:t>
-                  </w:r>
-                </w:p>
-              </w:tc>
-              <w:tc>
-                <w:tcPr/>
-                <w:p>
-                  <w:pPr>
-                    <w:pStyle w:val="Compact"/>
-                    <w:jc w:val="left"/>
-                    <w:jc w:val="center"/>
-                  </w:pPr>
-                  <w:r>
-                    <w:t xml:space="preserve">NA</w:t>
-                  </w:r>
-                </w:p>
-              </w:tc>
-              <w:tc>
-                <w:tcPr/>
-                <w:p>
-                  <w:pPr>
-                    <w:pStyle w:val="Compact"/>
-                    <w:jc w:val="center"/>
-                    <w:jc w:val="center"/>
-                  </w:pPr>
-                  <w:r>
-                    <w:t xml:space="preserve">NA</w:t>
+                    <w:t xml:space="preserve">1</w:t>
                   </w:r>
                 </w:p>
               </w:tc>
@@ -18183,7 +17699,7 @@
                     <w:jc w:val="center"/>
                   </w:pPr>
                   <w:r>
-                    <w:t xml:space="preserve">Sirgenstein Cave</w:t>
+                    <w:t xml:space="preserve">7…27</w:t>
                   </w:r>
                 </w:p>
               </w:tc>
@@ -18209,7 +17725,7 @@
                     <w:jc w:val="center"/>
                   </w:pPr>
                   <w:r>
-                    <w:t xml:space="preserve">Sirgenstein Cave</w:t>
+                    <w:t xml:space="preserve">7</w:t>
                   </w:r>
                 </w:p>
               </w:tc>
@@ -18235,33 +17751,7 @@
                     <w:jc w:val="center"/>
                   </w:pPr>
                   <w:r>
-                    <w:t xml:space="preserve">1.00</w:t>
-                  </w:r>
-                </w:p>
-              </w:tc>
-              <w:tc>
-                <w:tcPr/>
-                <w:p>
-                  <w:pPr>
-                    <w:pStyle w:val="Compact"/>
-                    <w:jc w:val="left"/>
-                    <w:jc w:val="center"/>
-                  </w:pPr>
-                  <w:r>
-                    <w:t xml:space="preserve">NA</w:t>
-                  </w:r>
-                </w:p>
-              </w:tc>
-              <w:tc>
-                <w:tcPr/>
-                <w:p>
-                  <w:pPr>
-                    <w:pStyle w:val="Compact"/>
-                    <w:jc w:val="center"/>
-                    <w:jc w:val="center"/>
-                  </w:pPr>
-                  <w:r>
-                    <w:t xml:space="preserve">NA</w:t>
+                    <w:t xml:space="preserve">1</w:t>
                   </w:r>
                 </w:p>
               </w:tc>
@@ -18276,7 +17766,7 @@
                     <w:jc w:val="center"/>
                   </w:pPr>
                   <w:r>
-                    <w:t xml:space="preserve">Trou Magrite</w:t>
+                    <w:t xml:space="preserve">8…28</w:t>
                   </w:r>
                 </w:p>
               </w:tc>
@@ -18302,7 +17792,7 @@
                     <w:jc w:val="center"/>
                   </w:pPr>
                   <w:r>
-                    <w:t xml:space="preserve">Trou Magrite</w:t>
+                    <w:t xml:space="preserve">8</w:t>
                   </w:r>
                 </w:p>
               </w:tc>
@@ -18328,33 +17818,7 @@
                     <w:jc w:val="center"/>
                   </w:pPr>
                   <w:r>
-                    <w:t xml:space="preserve">1.00</w:t>
-                  </w:r>
-                </w:p>
-              </w:tc>
-              <w:tc>
-                <w:tcPr/>
-                <w:p>
-                  <w:pPr>
-                    <w:pStyle w:val="Compact"/>
-                    <w:jc w:val="left"/>
-                    <w:jc w:val="center"/>
-                  </w:pPr>
-                  <w:r>
-                    <w:t xml:space="preserve">NA</w:t>
-                  </w:r>
-                </w:p>
-              </w:tc>
-              <w:tc>
-                <w:tcPr/>
-                <w:p>
-                  <w:pPr>
-                    <w:pStyle w:val="Compact"/>
-                    <w:jc w:val="center"/>
-                    <w:jc w:val="center"/>
-                  </w:pPr>
-                  <w:r>
-                    <w:t xml:space="preserve">NA</w:t>
+                    <w:t xml:space="preserve">1</w:t>
                   </w:r>
                 </w:p>
               </w:tc>
@@ -18369,7 +17833,7 @@
                     <w:jc w:val="center"/>
                   </w:pPr>
                   <w:r>
-                    <w:t xml:space="preserve">Vindija Cave</w:t>
+                    <w:t xml:space="preserve">9…29</w:t>
                   </w:r>
                 </w:p>
               </w:tc>
@@ -18395,7 +17859,7 @@
                     <w:jc w:val="center"/>
                   </w:pPr>
                   <w:r>
-                    <w:t xml:space="preserve">Vindija Cave</w:t>
+                    <w:t xml:space="preserve">9</w:t>
                   </w:r>
                 </w:p>
               </w:tc>
@@ -18421,33 +17885,7 @@
                     <w:jc w:val="center"/>
                   </w:pPr>
                   <w:r>
-                    <w:t xml:space="preserve">1.00</w:t>
-                  </w:r>
-                </w:p>
-              </w:tc>
-              <w:tc>
-                <w:tcPr/>
-                <w:p>
-                  <w:pPr>
-                    <w:pStyle w:val="Compact"/>
-                    <w:jc w:val="left"/>
-                    <w:jc w:val="center"/>
-                  </w:pPr>
-                  <w:r>
-                    <w:t xml:space="preserve">NA</w:t>
-                  </w:r>
-                </w:p>
-              </w:tc>
-              <w:tc>
-                <w:tcPr/>
-                <w:p>
-                  <w:pPr>
-                    <w:pStyle w:val="Compact"/>
-                    <w:jc w:val="center"/>
-                    <w:jc w:val="center"/>
-                  </w:pPr>
-                  <w:r>
-                    <w:t xml:space="preserve">NA</w:t>
+                    <w:t xml:space="preserve">1</w:t>
                   </w:r>
                 </w:p>
               </w:tc>
@@ -18466,12 +17904,12 @@
               <w:t xml:space="preserve">Table 20: Posterior block-membership probabilities and modal (hard) assignment from the best-fitting stochastic block model for each phase. Probabilities are rounded; the modal block is the column with the highest probability. Sites with probability spread across blocks (e.g. no entry above 0.7) have ambiguous membership.</w:t>
             </w:r>
           </w:p>
-          <w:bookmarkEnd w:id="96"/>
+          <w:bookmarkEnd w:id="108"/>
         </w:tc>
       </w:tr>
     </w:tbl>
-    <w:bookmarkEnd w:id="97"/>
-    <w:bookmarkStart w:id="98" w:name="interpretation-1"/>
+    <w:bookmarkEnd w:id="109"/>
+    <w:bookmarkStart w:id="110" w:name="interpretation-1"/>
     <w:p>
       <w:pPr>
         <w:pStyle w:val="Heading3"/>
@@ -18496,7 +17934,7 @@
         </w:r>
       </w:hyperlink>
       <w:r>
-        <w:t xml:space="preserve">) report the number of blocks best supported by the sign-sharing network in each phase, providing a model-based counterpart to the seriation. In</w:t>
+        <w:t xml:space="preserve">) report the number of blocks best supported by the sign-sharing network in each phase, providing a model-based counterpart to the seriation. The Integrated Classification Likelihood (ICL) is a penalised likelihood criterion that balances model fit against complexity; unlike AIC or BIC, it integrates over the latent block memberships and therefore directly targets the quality of the partition itself. In</w:t>
       </w:r>
       <w:r>
         <w:t xml:space="preserve"> </w:t>
@@ -18512,7 +17950,7 @@
         <w:t xml:space="preserve"> </w:t>
       </w:r>
       <w:r>
-        <w:t xml:space="preserve">the best-supported model contains 3 blocks, and in</w:t>
+        <w:t xml:space="preserve">the best-supported model contains 1 block (ICL = -89.99), while the two-block solution scores -92.90 and the three-block solution NA. The ICL gap between the best and second-best model is 2.91, indicating that the one-block model is preferred but the preference is modest—the data do not strongly discriminate among one, two, or three blocks. In</w:t>
       </w:r>
       <w:r>
         <w:t xml:space="preserve"> </w:t>
@@ -18528,7 +17966,7 @@
         <w:t xml:space="preserve"> </w:t>
       </w:r>
       <w:r>
-        <w:t xml:space="preserve">it contains 1 block. The ICL gap between the best and second-best model quantifies how decisively the optimum is preferred ( NA in Aur-P1 and NA in Aur-P2); the comparison between the two phases tells the reader how much more strongly the block structure is determined in the better-sampled early phase.</w:t>
+        <w:t xml:space="preserve">the ICL profile is similarly flat: the one-block model scores -21.53, the two-block model -28.90, and the gap is only 7.37. In both phases the sparse sign-sharing networks (Aur-P1: 20 sites, 20 edges at threshold 0.2; Aur-P2: 9 sites, 9 edges) lack the information to decisively support any block structure beyond a single group. The comparison between the two phases shows that neither phase has a well-determined block structure under the generative SBM framework.</w:t>
       </w:r>
     </w:p>
     <w:p>
@@ -18547,52 +17985,7 @@
         </w:r>
       </w:hyperlink>
       <w:r>
-        <w:t xml:space="preserve">) gives posterior probabilities that qualify the deterministic group assignments used in the main text: every site is assigned to its modal block with posterior probability ≥ 0.00, so the SBM is never equivocal about the partition it identifies, and the informative quantity is the number of blocks chosen and how those blocks map onto the manual restricted/broad groups rather than the confidence of individual assignments. In</w:t>
-      </w:r>
-      <w:r>
-        <w:t xml:space="preserve"> </w:t>
-      </w:r>
-      <w:r>
-        <w:rPr>
-          <w:bCs/>
-          <w:b/>
-        </w:rPr>
-        <w:t xml:space="preserve">Aur-P1</w:t>
-      </w:r>
-      <w:r>
-        <w:t xml:space="preserve"> </w:t>
-      </w:r>
-      <w:r>
-        <w:t xml:space="preserve">the best-supported model contains 3 blocks, and after aligning each SBM block to the nearest manual group it diverges on 1 of 20 sites (Labeko Koba). In</w:t>
-      </w:r>
-      <w:r>
-        <w:t xml:space="preserve"> </w:t>
-      </w:r>
-      <w:r>
-        <w:rPr>
-          <w:bCs/>
-          <w:b/>
-        </w:rPr>
-        <w:t xml:space="preserve">Aur-P2</w:t>
-      </w:r>
-      <w:r>
-        <w:t xml:space="preserve"> </w:t>
-      </w:r>
-      <w:r>
-        <w:t xml:space="preserve">the SBM selects a</w:t>
-      </w:r>
-      <w:r>
-        <w:t xml:space="preserve"> </w:t>
-      </w:r>
-      <w:r>
-        <w:rPr>
-          <w:bCs/>
-          <w:b/>
-        </w:rPr>
-        <w:t xml:space="preserve">single block</w:t>
-      </w:r>
-      <w:r>
-        <w:t xml:space="preserve">: its ICL profile is essentially flat (the gap between the one- and two-block solutions is NA), so the sparse sign-sharing network of the late phase does not support a two-block partition at all, and the model-based route neither corroborates nor contradicts the manual split there. Where the number of blocks matches the seriation’s two-group structure and posterior probabilities are high, the two-group claim is independently corroborated by a generative model that was never shown the seriation solution. Where the SBM favours a different number of blocks, or assigns low posterior probability to specific sites, the main text should report those sites’ membership as uncertain and note that the seriation’s two-group simplification captures the dominant but not the complete structure.</w:t>
+        <w:t xml:space="preserve">) gives posterior probabilities that qualify the deterministic group assignments used in the main text. The SBM treats block membership as a latent variable and estimates, for each site, a probability distribution over blocks; the modal block is the one with highest posterior probability. With a single block selected in both phases, every site is assigned to that sole block with posterior probability 1.0. The informative quantity is therefore not the partition (which is trivial) but the fact that the generative model finds no evidence for multiple blocks in either phase. The model-based route neither corroborates nor contradicts the manual two-group split—it simply indicates that the sign-sharing networks are too sparse to resolve block structure.</w:t>
       </w:r>
     </w:p>
     <w:p>
@@ -18600,6 +17993,131 @@
         <w:pStyle w:val="BodyText"/>
       </w:pPr>
       <w:r>
+        <w:t xml:space="preserve">Where the number of blocks matches the seriation’s two-group structure and posterior probabilities are high, the two-group claim would be independently corroborated by a generative model that was never shown the seriation solution. Here, the SBM favours a single block in both phases, meaning it does not recover the two-group partition. This does not imply the two groups are absent; rather, the SBM’s generative framework—with its penalty for model complexity via ICL—requires stronger evidence for multiple blocks than the data provide. The manual restricted/broad assignment, defined partly by sign-type</w:t>
+      </w:r>
+      <w:r>
+        <w:t xml:space="preserve"> </w:t>
+      </w:r>
+      <w:r>
+        <w:rPr>
+          <w:iCs/>
+          <w:i/>
+        </w:rPr>
+        <w:t xml:space="preserve">richness</w:t>
+      </w:r>
+      <w:r>
+        <w:t xml:space="preserve"> </w:t>
+      </w:r>
+      <w:r>
+        <w:t xml:space="preserve">rather than purely by compositional</w:t>
+      </w:r>
+      <w:r>
+        <w:t xml:space="preserve"> </w:t>
+      </w:r>
+      <w:r>
+        <w:rPr>
+          <w:iCs/>
+          <w:i/>
+        </w:rPr>
+        <w:t xml:space="preserve">similarity</w:t>
+      </w:r>
+      <w:r>
+        <w:t xml:space="preserve">, may capture a real contrast (rich vs. poor sign repertoires) that is not well modelled as a block structure in the sign-sharing network.</w:t>
+      </w:r>
+    </w:p>
+    <w:p>
+      <w:pPr>
+        <w:pStyle w:val="BodyText"/>
+      </w:pPr>
+      <w:r>
+        <w:t xml:space="preserve">The SBM results must be interpreted alongside the bootstrap consensus (S6.2) and Louvain community detection (S5.1), as each method answers a different question. The bootstrap quantifies</w:t>
+      </w:r>
+      <w:r>
+        <w:t xml:space="preserve"> </w:t>
+      </w:r>
+      <w:r>
+        <w:rPr>
+          <w:iCs/>
+          <w:i/>
+        </w:rPr>
+        <w:t xml:space="preserve">sampling stability</w:t>
+      </w:r>
+      <w:r>
+        <w:t xml:space="preserve"> </w:t>
+      </w:r>
+      <w:r>
+        <w:t xml:space="preserve">of the observed two-group partition: it asks whether the same partition would emerge from slightly different samples of sites, and finds that within-block co-clustering exceeds across-block co-clustering in both phases, confirming the partition is not an artefact of a particular site sample. Louvain community detection (S5.1) is a descriptive modularity-optimisation algorithm that partitions the observed network without a generative model; it identifies 4 communities in Aur-P1 at threshold 0.2, with the two largest corresponding closely to the manual restricted/broad split and additional sub-communities within the broader-range group. The SBM is a</w:t>
+      </w:r>
+      <w:r>
+        <w:t xml:space="preserve"> </w:t>
+      </w:r>
+      <w:r>
+        <w:rPr>
+          <w:iCs/>
+          <w:i/>
+        </w:rPr>
+        <w:t xml:space="preserve">generative</w:t>
+      </w:r>
+      <w:r>
+        <w:t xml:space="preserve"> </w:t>
+      </w:r>
+      <w:r>
+        <w:t xml:space="preserve">model: it posits that edges are generated by latent block memberships and uses ICL to select the number of blocks that best explains the network. The three methods diverge in their conclusions: the bootstrap supports the two-group partition’s internal coherence; Louvain detects multiple communities including substructure within the broader-range sites; the SBM selects a single block in both phases. This divergence reflects their different objectives: the bootstrap tests stability of an</w:t>
+      </w:r>
+      <w:r>
+        <w:t xml:space="preserve"> </w:t>
+      </w:r>
+      <w:r>
+        <w:rPr>
+          <w:iCs/>
+          <w:i/>
+        </w:rPr>
+        <w:t xml:space="preserve">imposed</w:t>
+      </w:r>
+      <w:r>
+        <w:t xml:space="preserve"> </w:t>
+      </w:r>
+      <w:r>
+        <w:t xml:space="preserve">partition; Louvain finds</w:t>
+      </w:r>
+      <w:r>
+        <w:t xml:space="preserve"> </w:t>
+      </w:r>
+      <w:r>
+        <w:rPr>
+          <w:iCs/>
+          <w:i/>
+        </w:rPr>
+        <w:t xml:space="preserve">any</w:t>
+      </w:r>
+      <w:r>
+        <w:t xml:space="preserve"> </w:t>
+      </w:r>
+      <w:r>
+        <w:t xml:space="preserve">modular structure in the observed network; the SBM asks whether a</w:t>
+      </w:r>
+      <w:r>
+        <w:t xml:space="preserve"> </w:t>
+      </w:r>
+      <w:r>
+        <w:rPr>
+          <w:iCs/>
+          <w:i/>
+        </w:rPr>
+        <w:t xml:space="preserve">generative</w:t>
+      </w:r>
+      <w:r>
+        <w:t xml:space="preserve"> </w:t>
+      </w:r>
+      <w:r>
+        <w:t xml:space="preserve">block model is warranted by the data, and concludes it is not.</w:t>
+      </w:r>
+    </w:p>
+    <w:p>
+      <w:pPr>
+        <w:pStyle w:val="BodyText"/>
+      </w:pPr>
+      <w:r>
         <w:rPr>
           <w:bCs/>
           <w:b/>
@@ -18610,7 +18128,7 @@
         <w:t xml:space="preserve"> </w:t>
       </w:r>
       <w:r>
-        <w:t xml:space="preserve">The SBM posterior probabilities are effectively certain (each site’s modal block receives posterior ≥ 0.00) for the partition the model identifies, so the model is rarely equivocal about its own grouping; the important information lies in</w:t>
+        <w:t xml:space="preserve">The SBM selects a single block in both phases, so the two-group structure is not independently recovered by the generative model. The restricted/broad dichotomy should be read as the</w:t>
       </w:r>
       <w:r>
         <w:t xml:space="preserve"> </w:t>
@@ -18620,18 +18138,29 @@
           <w:iCs/>
           <w:i/>
         </w:rPr>
-        <w:t xml:space="preserve">how many</w:t>
-      </w:r>
-      <w:r>
-        <w:t xml:space="preserve"> </w:t>
-      </w:r>
-      <w:r>
-        <w:t xml:space="preserve">blocks the model chooses and how far that partition diverges from the manual restricted/broad assignment. The SBM does not settle on two blocks in either phase under the revised data: in Aur-P1 it favours 3 blocks, and in Aur-P2 a single block, so the two-group structure is not independently recovered by the generative model, and the restricted/broad dichotomy should be read as the dominant axis of variation rather than a partition that emerges from the data through an unsupervised model. These results complement, rather than supersede, the bootstrap analysis: the bootstrap quantifies sampling stability of the main-text partition, while the SBM asks whether an independent generative model reproduces it.</w:t>
+        <w:t xml:space="preserve">dominant axis of variation</w:t>
+      </w:r>
+      <w:r>
+        <w:t xml:space="preserve"> </w:t>
+      </w:r>
+      <w:r>
+        <w:t xml:space="preserve">(rich vs. poor sign repertoires) rather than a partition that emerges from compositional similarity through an unsupervised generative model. The main text should therefore: (1) present the two-group framing as a simplification that captures the primary contrast in sign repertoire size, (2) note that the generative SBM—unlike the descriptive Louvain and stability-based bootstrap—does not find evidence for multiple blocks in either phase, likely due to network sparsity and the ICL penalty for model complexity, (3) qualify the Aur-P2 results by stating that the small sample size (9 sites, sparse edges) precludes reliable block detection, and (4) cite the bootstrap consistency scores (</w:t>
+      </w:r>
+      <w:hyperlink w:anchor="tbl-bootstrap-sites">
+        <w:r>
+          <w:rPr>
+            <w:rStyle w:val="Hyperlink"/>
+          </w:rPr>
+          <w:t xml:space="preserve">Table 18</w:t>
+        </w:r>
+      </w:hyperlink>
+      <w:r>
+        <w:t xml:space="preserve">) for borderline sites such as Labeko Koba. These results complement the bootstrap analysis: the bootstrap shows the two blocks to be internally coherent and well separated under resampling, while the SBM asks whether an independent generative model reproduces the two-block partition—and finds that the data are too sparse to warrant a multi-block generative model in either phase.</w:t>
       </w:r>
     </w:p>
-    <w:bookmarkEnd w:id="98"/>
-    <w:bookmarkEnd w:id="99"/>
-    <w:bookmarkStart w:id="103" w:name="sec-s6-4"/>
+    <w:bookmarkEnd w:id="110"/>
+    <w:bookmarkEnd w:id="111"/>
+    <w:bookmarkStart w:id="115" w:name="sec-s6-4"/>
     <w:p>
       <w:pPr>
         <w:pStyle w:val="Heading2"/>
@@ -18640,7 +18169,7 @@
         <w:t xml:space="preserve">S6.4 Cross-Validation of Group Assignments (ARI)</w:t>
       </w:r>
     </w:p>
-    <w:bookmarkStart w:id="101" w:name="rationale-5"/>
+    <w:bookmarkStart w:id="113" w:name="rationale-5"/>
     <w:p>
       <w:pPr>
         <w:pStyle w:val="Heading3"/>
@@ -18683,7 +18212,7 @@
       <w:tr>
         <w:tc>
           <w:tcPr/>
-          <w:bookmarkStart w:id="100" w:name="tbl-s6-ari"/>
+          <w:bookmarkStart w:id="112" w:name="tbl-s6-ari"/>
           <w:tbl>
             <w:tblPr>
               <w:tblStyle w:val="Table"/>
@@ -18791,20 +18320,20 @@
                     <w:jc w:val="center"/>
                   </w:pPr>
                   <w:r>
-                    <w:t xml:space="preserve">0.7</w:t>
-                  </w:r>
-                </w:p>
-              </w:tc>
-              <w:tc>
-                <w:tcPr/>
-                <w:p>
-                  <w:pPr>
-                    <w:pStyle w:val="Compact"/>
-                    <w:jc w:val="center"/>
-                    <w:jc w:val="center"/>
-                  </w:pPr>
-                  <w:r>
-                    <w:t xml:space="preserve">0.7</w:t>
+                    <w:t xml:space="preserve">NA</w:t>
+                  </w:r>
+                </w:p>
+              </w:tc>
+              <w:tc>
+                <w:tcPr/>
+                <w:p>
+                  <w:pPr>
+                    <w:pStyle w:val="Compact"/>
+                    <w:jc w:val="center"/>
+                    <w:jc w:val="center"/>
+                  </w:pPr>
+                  <w:r>
+                    <w:t xml:space="preserve">NA</w:t>
                   </w:r>
                 </w:p>
               </w:tc>
@@ -18845,20 +18374,20 @@
                     <w:jc w:val="center"/>
                   </w:pPr>
                   <w:r>
-                    <w:t xml:space="preserve">0.0</w:t>
-                  </w:r>
-                </w:p>
-              </w:tc>
-              <w:tc>
-                <w:tcPr/>
-                <w:p>
-                  <w:pPr>
-                    <w:pStyle w:val="Compact"/>
-                    <w:jc w:val="center"/>
-                    <w:jc w:val="center"/>
-                  </w:pPr>
-                  <w:r>
-                    <w:t xml:space="preserve">0.0</w:t>
+                    <w:t xml:space="preserve">NA</w:t>
+                  </w:r>
+                </w:p>
+              </w:tc>
+              <w:tc>
+                <w:tcPr/>
+                <w:p>
+                  <w:pPr>
+                    <w:pStyle w:val="Compact"/>
+                    <w:jc w:val="center"/>
+                    <w:jc w:val="center"/>
+                  </w:pPr>
+                  <w:r>
+                    <w:t xml:space="preserve">NA</w:t>
                   </w:r>
                 </w:p>
               </w:tc>
@@ -18877,12 +18406,12 @@
               <w:t xml:space="preserve">Table 21: Adjusted Rand Index between the main-text manual restricted/broad assignment, the bootstrap modal blocks (S6.2), and the SBM modal assignments (S6.3), by phase.</w:t>
             </w:r>
           </w:p>
-          <w:bookmarkEnd w:id="100"/>
+          <w:bookmarkEnd w:id="112"/>
         </w:tc>
       </w:tr>
     </w:tbl>
-    <w:bookmarkEnd w:id="101"/>
-    <w:bookmarkStart w:id="102" w:name="interpretation-2"/>
+    <w:bookmarkEnd w:id="113"/>
+    <w:bookmarkStart w:id="114" w:name="interpretation-2"/>
     <w:p>
       <w:pPr>
         <w:pStyle w:val="Heading3"/>
@@ -18974,9 +18503,9 @@
         <w:t xml:space="preserve">The two-group claim should be presented as strongest where the manual assignment, the bootstrap, and the SBM converge, and qualified where they diverge. Where the SBM’s best partition reproduces the manual groups (high ARI), the main text can cite the SBM as an independent, model-based confirmation that never saw the seriation solution. Where it does not, the divergence should be acknowledged and the seriation’s two-group structure presented as the dominant axis of variation rather than an exhaustive description of the data.</w:t>
       </w:r>
     </w:p>
-    <w:bookmarkEnd w:id="102"/>
-    <w:bookmarkEnd w:id="103"/>
-    <w:bookmarkStart w:id="104" w:name="sec-s6-5"/>
+    <w:bookmarkEnd w:id="114"/>
+    <w:bookmarkEnd w:id="115"/>
+    <w:bookmarkStart w:id="116" w:name="sec-s6-5"/>
     <w:p>
       <w:pPr>
         <w:pStyle w:val="Heading2"/>
@@ -19063,7 +18592,7 @@
         </w:r>
       </w:hyperlink>
       <w:r>
-        <w:t xml:space="preserve">). (3)</w:t>
+        <w:t xml:space="preserve">). The SBM selects a single block in both Aur-P1 and Aur-P2, indicating that the sparse sign-sharing networks do not provide sufficient evidence for a multi-block generative model—this is a null result for block structure, not a contradiction of the two-group contrast. (3)</w:t>
       </w:r>
       <w:r>
         <w:t xml:space="preserve"> </w:t>
@@ -19087,7 +18616,7 @@
         </w:r>
       </w:hyperlink>
       <w:r>
-        <w:t xml:space="preserve">). The three routes are mutually supportive but not redundant: the bootstrap shows the two blocks to be internally coherent and well separated, while agreement between the manual restricted/broad assignment and the partitions recovered by unsupervised methods is phase-dependent. We recommend that the main text retain the two-group framing but cite the per-site consistency scores (</w:t>
+        <w:t xml:space="preserve">). The three routes are mutually informative but not redundant: the bootstrap shows the two blocks to be internally coherent and well separated under resampling; the SBM finds the data too sparse to warrant a multi-block generative model; and the manual assignment captures the dominant axis of variation in sign repertoire size. We recommend that the main text retain the two-group framing but cite the per-site consistency scores (</w:t>
       </w:r>
       <w:hyperlink w:anchor="tbl-bootstrap-sites">
         <w:r>
@@ -19098,23 +18627,12 @@
         </w:r>
       </w:hyperlink>
       <w:r>
-        <w:t xml:space="preserve">) and SBM posterior probabilities (</w:t>
-      </w:r>
-      <w:hyperlink w:anchor="tbl-sbm-membership">
-        <w:r>
-          <w:rPr>
-            <w:rStyle w:val="Hyperlink"/>
-          </w:rPr>
-          <w:t xml:space="preserve">Table 20</w:t>
-        </w:r>
-      </w:hyperlink>
-      <w:r>
-        <w:t xml:space="preserve">) for the borderline sites, and note that the strength of the dichotomy is phase-dependent and that the Aur-P2 results rest on only 9 sites.</w:t>
+        <w:t xml:space="preserve">) for borderline sites, note that the generative SBM does not recover multiple blocks in either phase (likely due to network sparsity and ICL penalisation), and acknowledge that the Aur-P2 results rest on only 9 sites.</w:t>
       </w:r>
     </w:p>
-    <w:bookmarkEnd w:id="104"/>
-    <w:bookmarkEnd w:id="105"/>
-    <w:bookmarkStart w:id="122" w:name="sec-s7"/>
+    <w:bookmarkEnd w:id="116"/>
+    <w:bookmarkEnd w:id="117"/>
+    <w:bookmarkStart w:id="134" w:name="sec-s7"/>
     <w:p>
       <w:pPr>
         <w:pStyle w:val="Heading1"/>
@@ -19123,7 +18641,7 @@
         <w:t xml:space="preserve">S7. Object-Type Sensitivity: Figurine Exclusion</w:t>
       </w:r>
     </w:p>
-    <w:bookmarkStart w:id="106" w:name="s7.1-rationale"/>
+    <w:bookmarkStart w:id="118" w:name="s7.1-rationale"/>
     <w:p>
       <w:pPr>
         <w:pStyle w:val="Heading2"/>
@@ -19146,8 +18664,8 @@
         <w:t xml:space="preserve">demonstrate that ivory figurines in the Swabian Aurignacian carry sign sequences with higher information density than tools. If figurines encode different sign repertoires than other object types, their inclusion could bias site-level sign assemblages , particularly at Vogelherd, where 50 of the dataset’s 63 figurines are concentrated. This section tests whether the main-text network findings are robust to the exclusion of figurines, both globally and site-specifically.</w:t>
       </w:r>
     </w:p>
-    <w:bookmarkEnd w:id="106"/>
-    <w:bookmarkStart w:id="108" w:name="X558aa60e1a258171fb4fb8ecbd68200d2a7d022"/>
+    <w:bookmarkEnd w:id="118"/>
+    <w:bookmarkStart w:id="120" w:name="X558aa60e1a258171fb4fb8ecbd68200d2a7d022"/>
     <w:p>
       <w:pPr>
         <w:pStyle w:val="Heading2"/>
@@ -19170,7 +18688,7 @@
       <w:tr>
         <w:tc>
           <w:tcPr/>
-          <w:bookmarkStart w:id="107" w:name="tbl-figurine-count"/>
+          <w:bookmarkStart w:id="119" w:name="tbl-figurine-count"/>
           <w:tbl>
             <w:tblPr>
               <w:tblStyle w:val="Table"/>
@@ -19856,7 +19374,7 @@
               <w:t xml:space="preserve">Table 22: Distribution of figurine objects across phases and sites. Figurine types include figurine zoomorph, figurine anthropomorph, figurine undet., and possible figurine.</w:t>
             </w:r>
           </w:p>
-          <w:bookmarkEnd w:id="107"/>
+          <w:bookmarkEnd w:id="119"/>
         </w:tc>
       </w:tr>
     </w:tbl>
@@ -19879,8 +19397,8 @@
         <w:t xml:space="preserve">shows that figurines are heavily concentrated at Vogelherd (50 objects), with minor representation at Hohle Fels (8), Geissenklösterle (3), Hohlenstein-Stadel (1), and La Ferrassie (1). Of these, 59 fall within Aur-P1 and the remaining 4 , all Hohle Fels objects from AH IV and Iid , fall within Aur-P2 under the layer-level assignment. The analysis therefore tests whether the Aur-P1 network structure , which reports the higher mean degree (7.50) , is driven by these 50 objects at a single site.</w:t>
       </w:r>
     </w:p>
-    <w:bookmarkEnd w:id="108"/>
-    <w:bookmarkStart w:id="113" w:name="s7.3-analysis-1-exclude-all-figurines"/>
+    <w:bookmarkEnd w:id="120"/>
+    <w:bookmarkStart w:id="125" w:name="s7.3-analysis-1-exclude-all-figurines"/>
     <w:p>
       <w:pPr>
         <w:pStyle w:val="Heading2"/>
@@ -19889,7 +19407,7 @@
         <w:t xml:space="preserve">S7.3 Analysis 1: Exclude All Figurines</w:t>
       </w:r>
     </w:p>
-    <w:bookmarkStart w:id="111" w:name="method"/>
+    <w:bookmarkStart w:id="123" w:name="method"/>
     <w:p>
       <w:pPr>
         <w:pStyle w:val="Heading3"/>
@@ -19953,7 +19471,7 @@
       <w:tr>
         <w:tc>
           <w:tcPr/>
-          <w:bookmarkStart w:id="109" w:name="tbl-exclude-figurines"/>
+          <w:bookmarkStart w:id="121" w:name="tbl-exclude-figurines"/>
           <w:tbl>
             <w:tblPr>
               <w:tblStyle w:val="Table"/>
@@ -20519,7 +20037,7 @@
               <w:t xml:space="preserve">Table 23: Network statistics before and after excluding all figurine objects (figurine zoomorph, figurine anthropomorph, figurine undet., and possible figurine). Threshold = 0.2, Jaccard similarity.</w:t>
             </w:r>
           </w:p>
-          <w:bookmarkEnd w:id="109"/>
+          <w:bookmarkEnd w:id="121"/>
         </w:tc>
       </w:tr>
     </w:tbl>
@@ -20545,7 +20063,7 @@
       <w:tr>
         <w:tc>
           <w:tcPr/>
-          <w:bookmarkStart w:id="110" w:name="tbl-figurine-sites-lost"/>
+          <w:bookmarkStart w:id="122" w:name="tbl-figurine-sites-lost"/>
           <w:tbl>
             <w:tblPr>
               <w:tblStyle w:val="Table"/>
@@ -20738,12 +20256,12 @@
               <w:t xml:space="preserve">Table 24: Number of sites per phase before and after figurine exclusion. Sites are lost when all objects at that site are figurines.</w:t>
             </w:r>
           </w:p>
-          <w:bookmarkEnd w:id="110"/>
+          <w:bookmarkEnd w:id="122"/>
         </w:tc>
       </w:tr>
     </w:tbl>
-    <w:bookmarkEnd w:id="111"/>
-    <w:bookmarkStart w:id="112" w:name="interpretation-3"/>
+    <w:bookmarkEnd w:id="123"/>
+    <w:bookmarkStart w:id="124" w:name="interpretation-3"/>
     <w:p>
       <w:pPr>
         <w:pStyle w:val="Heading3"/>
@@ -20768,9 +20286,9 @@
         <w:t xml:space="preserve">Critically, Aur-P1 retains the higher mean degree (7.40) under figurine exclusion, preserving the main-text ordering Aur-P1 &gt; Aur-P2 (7.40 &gt; 4.22). The Aur-P1 network remains the more connected regardless of figurine inclusion, confirming that its structure is not contingent on figurine-bearing sign assemblages at Vogelherd.</w:t>
       </w:r>
     </w:p>
-    <w:bookmarkEnd w:id="112"/>
-    <w:bookmarkEnd w:id="113"/>
-    <w:bookmarkStart w:id="118" w:name="X7549e60451b9f7bbee640100d361a0cf771ac62"/>
+    <w:bookmarkEnd w:id="124"/>
+    <w:bookmarkEnd w:id="125"/>
+    <w:bookmarkStart w:id="130" w:name="X7549e60451b9f7bbee640100d361a0cf771ac62"/>
     <w:p>
       <w:pPr>
         <w:pStyle w:val="Heading2"/>
@@ -20779,7 +20297,7 @@
         <w:t xml:space="preserve">S7.4 Analysis 2: Exclude Vogelherd Figurines Only</w:t>
       </w:r>
     </w:p>
-    <w:bookmarkStart w:id="116" w:name="method-1"/>
+    <w:bookmarkStart w:id="128" w:name="method-1"/>
     <w:p>
       <w:pPr>
         <w:pStyle w:val="Heading3"/>
@@ -20810,7 +20328,7 @@
       <w:tr>
         <w:tc>
           <w:tcPr/>
-          <w:bookmarkStart w:id="114" w:name="tbl-vogelherd-exclude"/>
+          <w:bookmarkStart w:id="126" w:name="tbl-vogelherd-exclude"/>
           <w:tbl>
             <w:tblPr>
               <w:tblStyle w:val="Table"/>
@@ -21376,7 +20894,7 @@
               <w:t xml:space="preserve">Table 25: Network statistics before and after excluding figurines from Vogelherd only. All other figurines (Hohle Fels, Geissenklösterle, Hohlenstein-Stadel, La Ferrassie) are retained. Threshold = 0.2, Jaccard similarity.</w:t>
             </w:r>
           </w:p>
-          <w:bookmarkEnd w:id="114"/>
+          <w:bookmarkEnd w:id="126"/>
         </w:tc>
       </w:tr>
     </w:tbl>
@@ -21402,7 +20920,7 @@
       <w:tr>
         <w:tc>
           <w:tcPr/>
-          <w:bookmarkStart w:id="115" w:name="tbl-vogelherd-objects"/>
+          <w:bookmarkStart w:id="127" w:name="tbl-vogelherd-objects"/>
           <w:tbl>
             <w:tblPr>
               <w:tblStyle w:val="Table"/>
@@ -21541,12 +21059,12 @@
               <w:t xml:space="preserve">Table 26: Vogelherd object counts before and after removing figurines. Non-figurine objects at Vogelherd (tools, plaquettes, etc.) are retained.</w:t>
             </w:r>
           </w:p>
-          <w:bookmarkEnd w:id="115"/>
+          <w:bookmarkEnd w:id="127"/>
         </w:tc>
       </w:tr>
     </w:tbl>
-    <w:bookmarkEnd w:id="116"/>
-    <w:bookmarkStart w:id="117" w:name="interpretation-4"/>
+    <w:bookmarkEnd w:id="128"/>
+    <w:bookmarkStart w:id="129" w:name="interpretation-4"/>
     <w:p>
       <w:pPr>
         <w:pStyle w:val="Heading3"/>
@@ -21571,9 +21089,9 @@
         <w:t xml:space="preserve">The effect of removing Vogelherd figurines alone (−1.3% in Aur-P1) is the same as removing all 63 figurines globally (−1.3%), and in both cases the network is essentially unchanged. The figurine effect therefore does not scale with the number of figurines removed; figurines at Hohle Fels, Geissenklösterle (3), Hohlenstein-Stadel (1), and La Ferrassie (1) do not alter the network structure , including the four Hohle Fels figurines assigned to Aur-P2, which leave that phase’s network unchanged , and Vogelherd’s connectivity within Aur-P1 is carried by its 123 non-figurine objects.</w:t>
       </w:r>
     </w:p>
-    <w:bookmarkEnd w:id="117"/>
-    <w:bookmarkEnd w:id="118"/>
-    <w:bookmarkStart w:id="120" w:name="s7.5-joint-comparison"/>
+    <w:bookmarkEnd w:id="129"/>
+    <w:bookmarkEnd w:id="130"/>
+    <w:bookmarkStart w:id="132" w:name="s7.5-joint-comparison"/>
     <w:p>
       <w:pPr>
         <w:pStyle w:val="Heading2"/>
@@ -21596,7 +21114,7 @@
       <w:tr>
         <w:tc>
           <w:tcPr/>
-          <w:bookmarkStart w:id="119" w:name="tbl-objtype-joint"/>
+          <w:bookmarkStart w:id="131" w:name="tbl-objtype-joint"/>
           <w:tbl>
             <w:tblPr>
               <w:tblStyle w:val="Table"/>
@@ -22374,12 +21892,12 @@
               <w:t xml:space="preserve">Table 27: Side-by-side comparison of network statistics across all conditions: baseline (all objects), exclude all figurines, and exclude Vogelherd figurines only. The rightmost columns show the percentage change in mean degree from baseline.</w:t>
             </w:r>
           </w:p>
-          <w:bookmarkEnd w:id="119"/>
+          <w:bookmarkEnd w:id="131"/>
         </w:tc>
       </w:tr>
     </w:tbl>
-    <w:bookmarkEnd w:id="120"/>
-    <w:bookmarkStart w:id="121" w:name="s7.6-interpretation"/>
+    <w:bookmarkEnd w:id="132"/>
+    <w:bookmarkStart w:id="133" w:name="s7.6-interpretation"/>
     <w:p>
       <w:pPr>
         <w:pStyle w:val="Heading2"/>
@@ -22738,9 +22256,9 @@
         <w:t xml:space="preserve">argument that figurines carry high-information sign sequences, but the communities themselves are defined by shared sign types across all object types.</w:t>
       </w:r>
     </w:p>
-    <w:bookmarkEnd w:id="121"/>
-    <w:bookmarkEnd w:id="122"/>
-    <w:bookmarkStart w:id="154" w:name="sec-s8"/>
+    <w:bookmarkEnd w:id="133"/>
+    <w:bookmarkEnd w:id="134"/>
+    <w:bookmarkStart w:id="166" w:name="sec-s8"/>
     <w:p>
       <w:pPr>
         <w:pStyle w:val="Heading1"/>
@@ -22749,7 +22267,7 @@
         <w:t xml:space="preserve">S8. Site Reclassification Sensitivity Analysis</w:t>
       </w:r>
     </w:p>
-    <w:bookmarkStart w:id="123" w:name="s8.1-rationale"/>
+    <w:bookmarkStart w:id="135" w:name="s8.1-rationale"/>
     <w:p>
       <w:pPr>
         <w:pStyle w:val="Heading2"/>
@@ -22937,8 +22455,8 @@
         <w:t xml:space="preserve">Because these attributions are important for the two-phase framework, this section tests the sensitivity of the network results to (A) reverting to the purely date-based assignment used in earlier analyses , each object assigned to a phase by its calibrated date alone , and (B) excluding Vogelherd entirely, given its documented stratigraphic mixing.</w:t>
       </w:r>
     </w:p>
-    <w:bookmarkEnd w:id="123"/>
-    <w:bookmarkStart w:id="126" w:name="s8.2-results"/>
+    <w:bookmarkEnd w:id="135"/>
+    <w:bookmarkStart w:id="138" w:name="s8.2-results"/>
     <w:p>
       <w:pPr>
         <w:pStyle w:val="Heading2"/>
@@ -22961,7 +22479,7 @@
       <w:tr>
         <w:tc>
           <w:tcPr/>
-          <w:bookmarkStart w:id="124" w:name="tbl-reclass-comparison"/>
+          <w:bookmarkStart w:id="136" w:name="tbl-reclass-comparison"/>
           <w:tbl>
             <w:tblPr>
               <w:tblStyle w:val="Table"/>
@@ -23739,11 +23257,11 @@
               <w:t xml:space="preserve">Table 28: Network statistics under three conditions: baseline (technology-based assignment), date-based (each object assigned purely by calibrated radiocarbon date, with the Spy/El Castillo exclusions retained), and exclude Vogelherd (technology-based baseline with the site of Vogelherd removed entirely). Threshold = 0.2, Jaccard similarity.</w:t>
             </w:r>
           </w:p>
-          <w:bookmarkEnd w:id="124"/>
+          <w:bookmarkEnd w:id="136"/>
         </w:tc>
       </w:tr>
     </w:tbl>
-    <w:bookmarkStart w:id="125" w:name="effects-by-condition"/>
+    <w:bookmarkStart w:id="137" w:name="effects-by-condition"/>
     <w:p>
       <w:pPr>
         <w:pStyle w:val="Heading3"/>
@@ -23788,9 +23306,9 @@
         <w:t xml:space="preserve">Removing Vogelherd’s 173 objects from the technology-based baseline reduces Aur-P1 from 20 to 19 sites and from 75 to 69 edges. Mean degree falls from 7.5 to 7.26 (−3.2%), and modularity from 0.336 to 0.312. Aur-P2 is unaffected (4.22, 19 edges, 9 sites).</w:t>
       </w:r>
     </w:p>
-    <w:bookmarkEnd w:id="125"/>
-    <w:bookmarkEnd w:id="126"/>
-    <w:bookmarkStart w:id="127" w:name="s8.3-phase-ordering-robustness"/>
+    <w:bookmarkEnd w:id="137"/>
+    <w:bookmarkEnd w:id="138"/>
+    <w:bookmarkStart w:id="139" w:name="s8.3-phase-ordering-robustness"/>
     <w:p>
       <w:pPr>
         <w:pStyle w:val="Heading2"/>
@@ -24045,8 +23563,8 @@
         <w:t xml:space="preserve">Under the date-based assignment Aur-P1’s mean degree rises (from 7.5 to 8.57) and Aur-P2’s falls (from 4.22 to 3.33), so the contrast is not an artefact of the technological reassignment , the naive date-based assignment, if anything, strengthens it. Excluding Vogelherd weakens but does not remove the contrast (7.26 vs 4.22).</w:t>
       </w:r>
     </w:p>
-    <w:bookmarkEnd w:id="127"/>
-    <w:bookmarkStart w:id="128" w:name="s8.4-interpretation"/>
+    <w:bookmarkEnd w:id="139"/>
+    <w:bookmarkStart w:id="140" w:name="s8.4-interpretation"/>
     <w:p>
       <w:pPr>
         <w:pStyle w:val="Heading2"/>
@@ -24079,8 +23597,8 @@
         <w:t xml:space="preserve">Excluding Vogelherd leaves the ordering intact, consistent with S7’s finding that Aur-P1’s network does not depend on a single site. Finally, the within-phase two-group structure (RQ1) , the restricted/broad dichotomy recovered by seriation, Louvain community detection, bootstrap consensus, and the stochastic block model (S5, S6) , is defined within each phase’s membership and is unaffected by the between-phase assignment criterion tested here.</w:t>
       </w:r>
     </w:p>
-    <w:bookmarkEnd w:id="128"/>
-    <w:bookmarkStart w:id="153" w:name="references-cited"/>
+    <w:bookmarkEnd w:id="140"/>
+    <w:bookmarkStart w:id="165" w:name="references-cited"/>
     <w:p>
       <w:pPr>
         <w:pStyle w:val="Heading2"/>
@@ -24089,8 +23607,8 @@
         <w:t xml:space="preserve">References cited</w:t>
       </w:r>
     </w:p>
-    <w:bookmarkStart w:id="152" w:name="refs"/>
-    <w:bookmarkStart w:id="130" w:name="X68cdd7ba62fc5dd3e1e9b497937717305f7b9a0"/>
+    <w:bookmarkStart w:id="164" w:name="refs"/>
+    <w:bookmarkStart w:id="142" w:name="X68cdd7ba62fc5dd3e1e9b497937717305f7b9a0"/>
     <w:p>
       <w:pPr>
         <w:pStyle w:val="Bibliography"/>
@@ -24122,7 +23640,7 @@
       <w:r>
         <w:t xml:space="preserve"> </w:t>
       </w:r>
-      <w:hyperlink r:id="rId129">
+      <w:hyperlink r:id="rId141">
         <w:r>
           <w:rPr>
             <w:rStyle w:val="Hyperlink"/>
@@ -24134,8 +23652,8 @@
         <w:t xml:space="preserve">.</w:t>
       </w:r>
     </w:p>
-    <w:bookmarkEnd w:id="130"/>
-    <w:bookmarkStart w:id="132" w:name="ref-teyssandier2018entity"/>
+    <w:bookmarkEnd w:id="142"/>
+    <w:bookmarkStart w:id="144" w:name="ref-teyssandier2018entity"/>
     <w:p>
       <w:pPr>
         <w:pStyle w:val="Bibliography"/>
@@ -24194,7 +23712,7 @@
       <w:r>
         <w:t xml:space="preserve"> </w:t>
       </w:r>
-      <w:hyperlink r:id="rId131">
+      <w:hyperlink r:id="rId143">
         <w:r>
           <w:rPr>
             <w:rStyle w:val="Hyperlink"/>
@@ -24206,8 +23724,8 @@
         <w:t xml:space="preserve">.</w:t>
       </w:r>
     </w:p>
-    <w:bookmarkEnd w:id="132"/>
-    <w:bookmarkStart w:id="134" w:name="ref-newman2004finding"/>
+    <w:bookmarkEnd w:id="144"/>
+    <w:bookmarkStart w:id="146" w:name="ref-newman2004finding"/>
     <w:p>
       <w:pPr>
         <w:pStyle w:val="Bibliography"/>
@@ -24227,7 +23745,7 @@
       <w:r>
         <w:t xml:space="preserve"> </w:t>
       </w:r>
-      <w:hyperlink r:id="rId133">
+      <w:hyperlink r:id="rId145">
         <w:r>
           <w:rPr>
             <w:rStyle w:val="Hyperlink"/>
@@ -24239,8 +23757,8 @@
         <w:t xml:space="preserve">.</w:t>
       </w:r>
     </w:p>
-    <w:bookmarkEnd w:id="134"/>
-    <w:bookmarkStart w:id="136" w:name="ref-Monti_2003"/>
+    <w:bookmarkEnd w:id="146"/>
+    <w:bookmarkStart w:id="148" w:name="ref-Monti_2003"/>
     <w:p>
       <w:pPr>
         <w:pStyle w:val="Bibliography"/>
@@ -24260,7 +23778,7 @@
       <w:r>
         <w:t xml:space="preserve"> </w:t>
       </w:r>
-      <w:hyperlink r:id="rId135">
+      <w:hyperlink r:id="rId147">
         <w:r>
           <w:rPr>
             <w:rStyle w:val="Hyperlink"/>
@@ -24272,8 +23790,8 @@
         <w:t xml:space="preserve">.</w:t>
       </w:r>
     </w:p>
-    <w:bookmarkEnd w:id="136"/>
-    <w:bookmarkStart w:id="138" w:name="ref-Bentz_Dutkiewicz_2026"/>
+    <w:bookmarkEnd w:id="148"/>
+    <w:bookmarkStart w:id="150" w:name="ref-Bentz_Dutkiewicz_2026"/>
     <w:p>
       <w:pPr>
         <w:pStyle w:val="Bibliography"/>
@@ -24293,7 +23811,7 @@
       <w:r>
         <w:t xml:space="preserve"> </w:t>
       </w:r>
-      <w:hyperlink r:id="rId137">
+      <w:hyperlink r:id="rId149">
         <w:r>
           <w:rPr>
             <w:rStyle w:val="Hyperlink"/>
@@ -24305,8 +23823,8 @@
         <w:t xml:space="preserve">.</w:t>
       </w:r>
     </w:p>
-    <w:bookmarkEnd w:id="138"/>
-    <w:bookmarkStart w:id="140" w:name="ref-Chiotti_2005"/>
+    <w:bookmarkEnd w:id="150"/>
+    <w:bookmarkStart w:id="152" w:name="ref-Chiotti_2005"/>
     <w:p>
       <w:pPr>
         <w:pStyle w:val="Bibliography"/>
@@ -24353,7 +23871,7 @@
       <w:r>
         <w:t xml:space="preserve"> </w:t>
       </w:r>
-      <w:hyperlink r:id="rId139">
+      <w:hyperlink r:id="rId151">
         <w:r>
           <w:rPr>
             <w:rStyle w:val="Hyperlink"/>
@@ -24365,8 +23883,8 @@
         <w:t xml:space="preserve">.</w:t>
       </w:r>
     </w:p>
-    <w:bookmarkEnd w:id="140"/>
-    <w:bookmarkStart w:id="142" w:name="ref-Higham_Abri_Pataud_2011"/>
+    <w:bookmarkEnd w:id="152"/>
+    <w:bookmarkStart w:id="154" w:name="ref-Higham_Abri_Pataud_2011"/>
     <w:p>
       <w:pPr>
         <w:pStyle w:val="Bibliography"/>
@@ -24425,7 +23943,7 @@
       <w:r>
         <w:t xml:space="preserve"> </w:t>
       </w:r>
-      <w:hyperlink r:id="rId141">
+      <w:hyperlink r:id="rId153">
         <w:r>
           <w:rPr>
             <w:rStyle w:val="Hyperlink"/>
@@ -24437,8 +23955,8 @@
         <w:t xml:space="preserve">.</w:t>
       </w:r>
     </w:p>
-    <w:bookmarkEnd w:id="142"/>
-    <w:bookmarkStart w:id="144" w:name="ref-Talamo_La_Ferrassie_2020"/>
+    <w:bookmarkEnd w:id="154"/>
+    <w:bookmarkStart w:id="156" w:name="ref-Talamo_La_Ferrassie_2020"/>
     <w:p>
       <w:pPr>
         <w:pStyle w:val="Bibliography"/>
@@ -24539,7 +24057,7 @@
       <w:r>
         <w:t xml:space="preserve"> </w:t>
       </w:r>
-      <w:hyperlink r:id="rId143">
+      <w:hyperlink r:id="rId155">
         <w:r>
           <w:rPr>
             <w:rStyle w:val="Hyperlink"/>
@@ -24551,8 +24069,8 @@
         <w:t xml:space="preserve">.</w:t>
       </w:r>
     </w:p>
-    <w:bookmarkEnd w:id="144"/>
-    <w:bookmarkStart w:id="145" w:name="ref-Delporte_1984_Ferrassie"/>
+    <w:bookmarkEnd w:id="156"/>
+    <w:bookmarkStart w:id="157" w:name="ref-Delporte_1984_Ferrassie"/>
     <w:p>
       <w:pPr>
         <w:pStyle w:val="Bibliography"/>
@@ -24591,8 +24109,8 @@
         <w:t xml:space="preserve">histoire; 1984.</w:t>
       </w:r>
     </w:p>
-    <w:bookmarkEnd w:id="145"/>
-    <w:bookmarkStart w:id="147" w:name="ref-Oliva_2006"/>
+    <w:bookmarkEnd w:id="157"/>
+    <w:bookmarkStart w:id="159" w:name="ref-Oliva_2006"/>
     <w:p>
       <w:pPr>
         <w:pStyle w:val="Bibliography"/>
@@ -24660,7 +24178,7 @@
       <w:r>
         <w:t xml:space="preserve"> </w:t>
       </w:r>
-      <w:hyperlink r:id="rId146">
+      <w:hyperlink r:id="rId158">
         <w:r>
           <w:rPr>
             <w:rStyle w:val="Hyperlink"/>
@@ -24672,8 +24190,8 @@
         <w:t xml:space="preserve">.</w:t>
       </w:r>
     </w:p>
-    <w:bookmarkEnd w:id="147"/>
-    <w:bookmarkStart w:id="149" w:name="ref-Wild_et_al_2005"/>
+    <w:bookmarkEnd w:id="159"/>
+    <w:bookmarkStart w:id="161" w:name="ref-Wild_et_al_2005"/>
     <w:p>
       <w:pPr>
         <w:pStyle w:val="Bibliography"/>
@@ -24729,7 +24247,7 @@
       <w:r>
         <w:t xml:space="preserve"> </w:t>
       </w:r>
-      <w:hyperlink r:id="rId148">
+      <w:hyperlink r:id="rId160">
         <w:r>
           <w:rPr>
             <w:rStyle w:val="Hyperlink"/>
@@ -24741,8 +24259,8 @@
         <w:t xml:space="preserve">.</w:t>
       </w:r>
     </w:p>
-    <w:bookmarkEnd w:id="149"/>
-    <w:bookmarkStart w:id="151" w:name="ref-Schurch_Conard_2026_reassess"/>
+    <w:bookmarkEnd w:id="161"/>
+    <w:bookmarkStart w:id="163" w:name="ref-Schurch_Conard_2026_reassess"/>
     <w:p>
       <w:pPr>
         <w:pStyle w:val="Bibliography"/>
@@ -24777,7 +24295,7 @@
       <w:r>
         <w:t xml:space="preserve"> </w:t>
       </w:r>
-      <w:hyperlink r:id="rId150">
+      <w:hyperlink r:id="rId162">
         <w:r>
           <w:rPr>
             <w:rStyle w:val="Hyperlink"/>
@@ -24789,10 +24307,10 @@
         <w:t xml:space="preserve">.</w:t>
       </w:r>
     </w:p>
-    <w:bookmarkEnd w:id="151"/>
-    <w:bookmarkEnd w:id="152"/>
-    <w:bookmarkEnd w:id="153"/>
-    <w:bookmarkEnd w:id="154"/>
+    <w:bookmarkEnd w:id="163"/>
+    <w:bookmarkEnd w:id="164"/>
+    <w:bookmarkEnd w:id="165"/>
+    <w:bookmarkEnd w:id="166"/>
     <w:sectPr>
       <w:footnotePr>
         <w:numRestart w:val="eachSect"/>

</xml_diff>

<commit_message>
adding new circularity-breaking analysis to S1
</commit_message>
<xml_diff>
--- a/paper/S1-supplement-sensitivity.docx
+++ b/paper/S1-supplement-sensitivity.docx
@@ -205,7 +205,7 @@
         <w:t xml:space="preserve"> </w:t>
       </w:r>
       <w:r>
-        <w:t xml:space="preserve">23,</w:t>
+        <w:t xml:space="preserve">24,</w:t>
       </w:r>
       <w:r>
         <w:t xml:space="preserve"> </w:t>
@@ -4734,7 +4734,7 @@
         <w:pStyle w:val="Heading1"/>
       </w:pPr>
       <w:r>
-        <w:t xml:space="preserve">S5. Automated Group Recovery and Circularity Validation</w:t>
+        <w:t xml:space="preserve">S5. Automated Group Recovery as a Circularity Check</w:t>
       </w:r>
     </w:p>
     <w:p>
@@ -4775,7 +4775,21 @@
         <w:t xml:space="preserve"> </w:t>
       </w:r>
       <w:r>
-        <w:t xml:space="preserve">the procedure is circular: the analysis cannot fail to confirm a structure that was imported by the analyst. This section resolves that circularity by deriving group memberships automatically from the data using unsupervised community detection.</w:t>
+        <w:t xml:space="preserve">the procedure is circular: the analysis cannot fail to confirm a structure that was imported by the analyst. This section examines that circularity by deriving group memberships automatically from the data using unsupervised community detection. Because Louvain, bootstrap, and stochastic block models all operate on the same underlying sign-composition data as the manual assignment, they are useful descriptive checks on the stability and data-drivenness of the partition, but they do not by themselves remove the circularity; genuine independent validation is provided separately in</w:t>
+      </w:r>
+      <w:r>
+        <w:t xml:space="preserve"> </w:t>
+      </w:r>
+      <w:hyperlink w:anchor="sec-s6-6">
+        <w:r>
+          <w:rPr>
+            <w:rStyle w:val="Hyperlink"/>
+          </w:rPr>
+          <w:t xml:space="preserve">Section 7</w:t>
+        </w:r>
+      </w:hyperlink>
+      <w:r>
+        <w:t xml:space="preserve">.</w:t>
       </w:r>
     </w:p>
     <w:bookmarkStart w:id="54" w:name="sec-s5-1"/>
@@ -4810,7 +4824,7 @@
         <w:t xml:space="preserve">[3]</w:t>
       </w:r>
       <w:r>
-        <w:t xml:space="preserve">. By comparing these data-driven communities to the ones used in the main analysis, we quantify how much of the two-group structure emerges from the data rather than being imported by the analyst.</w:t>
+        <w:t xml:space="preserve">. By comparing these data-driven communities to the ones used in the main analysis, we quantify how much of the two-group structure is reproduced by data-driven methods.</w:t>
       </w:r>
     </w:p>
     <w:p>
@@ -8196,7 +8210,21 @@
         <w:pStyle w:val="FirstParagraph"/>
       </w:pPr>
       <w:r>
-        <w:t xml:space="preserve">These results directly address the concern that the restricted/broad grouping is circular: because the groups were defined by the analysts who also designed the seriation, the analysis might simply be recovering its own input. The ARI values demonstrate that the manual assignment closely reproduces a structure that emerges independently from the data in Aur-P1 (ARI = 0.798 at threshold 0.2), and that in Aur-P2 it reproduces the data-driven structure for the broad-range sites in particular (ARI = 0.556 at threshold 0.2, driven by Louvain’s exact recovery of the broad-range community). More importantly, the PerMANOVA comparison shows that the manual grouping is conservative rather than circular: the algorithmically derived partitions consistently explain more variance than the manual ones, meaning the main-text R² values (0.196 in Aur-P1 and 0.223 in Aur-P2) underestimate the true strength of the group contrast. In Aur-P2 the Louvain grouping even recovers a significant contrast (p = 0.003 at threshold 0.3) where the manual two-group split is non-significant (p = 0.076), although this phase rests on only nine sites and its PerMANOVA results must be read with that limitation in mind. If anything, replacing the manual assignment with a data-driven partition would strengthen, not weaken, the statistical evidence for differentiated sign repertoires across the two spatial groupings. The conclusion that sign composition differs between restricted-range and broader-range sites is therefore genuinely supported by the data and is not an artefact of analyst choice.</w:t>
+        <w:t xml:space="preserve">This section asks whether the manual restricted/broad grouping is consistent with structure recovered by data-driven methods, using Louvain community detection, bootstrap consensus, and stochastic block models. The ARI values show the manual assignment closely reproduces a data-driven structure in Aur-P1 (ARI = 0.798 at threshold 0.2) and, in Aur-P2, the broad-range sites in particular (ARI = 0.556 at threshold 0.2, driven by Louvain’s exact recovery of the broad-range community). The PerMANOVA comparison shows the manual grouping is conservative rather than liberal: the algorithmically derived partitions consistently explain more variance than the manual ones, so the main-text R² values (0.196 in Aur-P1 and 0.223 in Aur-P2) are a lower bound on the strength of the group contrast. In Aur-P2 the Louvain grouping even recovers a significant contrast (p = 0.003 at threshold 0.3) where the manual two-group split is non-significant (p = 0.076), although this phase rests on only nine sites and its PerMANOVA results must be read with that limitation in mind. However, because Louvain, bootstrap, and SBM all operate on the same sign-composition data used to define the manual groups, they do not by themselves remove the circularity of the original PerMANOVA: agreement among methods that share the same input is not independent confirmation that the groups differ. Genuine independent validation — holding out data from the definition of the groups — is provided separately in</w:t>
+      </w:r>
+      <w:r>
+        <w:t xml:space="preserve"> </w:t>
+      </w:r>
+      <w:hyperlink w:anchor="sec-s6-6">
+        <w:r>
+          <w:rPr>
+            <w:rStyle w:val="Hyperlink"/>
+          </w:rPr>
+          <w:t xml:space="preserve">Section 7</w:t>
+        </w:r>
+      </w:hyperlink>
+      <w:r>
+        <w:t xml:space="preserve">.</w:t>
       </w:r>
     </w:p>
     <w:bookmarkEnd w:id="58"/>
@@ -18144,18 +18172,7 @@
         <w:t xml:space="preserve"> </w:t>
       </w:r>
       <w:r>
-        <w:t xml:space="preserve">(rich vs. poor sign repertoires) rather than a partition that emerges from compositional similarity through an unsupervised generative model. The main text should therefore: (1) present the two-group framing as a simplification that captures the primary contrast in sign repertoire size, (2) note that the generative SBM—unlike the descriptive Louvain and stability-based bootstrap—does not find evidence for multiple blocks in either phase, likely due to network sparsity and the ICL penalty for model complexity, (3) qualify the Aur-P2 results by stating that the small sample size (9 sites, sparse edges) precludes reliable block detection, and (4) cite the bootstrap consistency scores (</w:t>
-      </w:r>
-      <w:hyperlink w:anchor="tbl-bootstrap-sites">
-        <w:r>
-          <w:rPr>
-            <w:rStyle w:val="Hyperlink"/>
-          </w:rPr>
-          <w:t xml:space="preserve">Table 18</w:t>
-        </w:r>
-      </w:hyperlink>
-      <w:r>
-        <w:t xml:space="preserve">) for borderline sites such as Labeko Koba. These results complement the bootstrap analysis: the bootstrap shows the two blocks to be internally coherent and well separated under resampling, while the SBM asks whether an independent generative model reproduces the two-block partition—and finds that the data are too sparse to warrant a multi-block generative model in either phase.</w:t>
+        <w:t xml:space="preserve">(rich vs. poor sign repertoires) rather than a partition that emerges from compositional similarity through an unsupervised generative model. The main findings are therefore: (1) the two-group framing is a simplification that captures the primary contrast in sign repertoire size, (2) the generative SBM—unlike the descriptive Louvain and stability-based bootstrap—does not find evidence for multiple blocks in either phase, likely due to network sparsity and the ICL penalty for model complexity, (3) the Aur-P2 results are qualified by the small sample size (9 sites, sparse edges) precludes reliable block detection. These results complement the bootstrap analysis: the bootstrap shows the two blocks to be internally coherent and well separated under resampling, while the SBM asks whether an independent generative model reproduces the two-block partition—and finds that the data are too sparse to warrant a multi-block generative model in either phase.</w:t>
       </w:r>
     </w:p>
     <w:bookmarkEnd w:id="110"/>
@@ -18436,7 +18453,7 @@
         </w:r>
       </w:hyperlink>
       <w:r>
-        <w:t xml:space="preserve">). A high ARI between the manual groups and an unsupervised partition (SBM or bootstrap) indicates that the main-text grouping is not merely an analyst construction but is recoverable from the data. A low ARI indicates a genuine divergence: the manual restricted/broad split and the partition recovered by an unsupervised method organise the sites differently. Because the restricted/broad divide is defined partly by sign-type</w:t>
+        <w:t xml:space="preserve">). A high ARI between the manual groups and an unsupervised partition (SBM or bootstrap) indicates that the main-text grouping is broadly reproduced by data-driven partitions; because those partitions are also derived from the same sign data, this agreement is not independent confirmation that the groups differ. A low ARI indicates a genuine divergence: the manual restricted/broad split and the partition recovered by an unsupervised method organise the sites differently. Because the restricted/broad divide is defined partly by sign-type</w:t>
       </w:r>
       <w:r>
         <w:t xml:space="preserve"> </w:t>
@@ -18482,7 +18499,7 @@
         <w:t xml:space="preserve"> </w:t>
       </w:r>
       <w:r>
-        <w:t xml:space="preserve">and should be used in the main text to state precisely where the two-group structure is independently supported and where it is a simplifying summary.</w:t>
+        <w:t xml:space="preserve">and should be used in the main text to state precisely where the two-group structure is reproduced by data-driven methods and where it is a simplifying summary.</w:t>
       </w:r>
     </w:p>
     <w:p>
@@ -18500,7 +18517,7 @@
         <w:t xml:space="preserve"> </w:t>
       </w:r>
       <w:r>
-        <w:t xml:space="preserve">The two-group claim should be presented as strongest where the manual assignment, the bootstrap, and the SBM converge, and qualified where they diverge. Where the SBM’s best partition reproduces the manual groups (high ARI), the main text can cite the SBM as an independent, model-based confirmation that never saw the seriation solution. Where it does not, the divergence should be acknowledged and the seriation’s two-group structure presented as the dominant axis of variation rather than an exhaustive description of the data.</w:t>
+        <w:t xml:space="preserve">The two-group claim should be presented as strongest where the manual assignment, the bootstrap, and the SBM converge, and qualified where they diverge. Where the SBM’s best partition reproduces the manual groups (high ARI), the main text can cite the SBM as a model-based cross-check that was fit without reference to the seriation solution; because it uses the same sign data, it remains a consistency check rather than a fully independent confirmation. Where it does not, the divergence should be acknowledged and the seriation’s two-group structure presented as the dominant axis of variation rather than an exhaustive description of the data.</w:t>
       </w:r>
     </w:p>
     <w:bookmarkEnd w:id="114"/>
@@ -18616,38 +18633,41 @@
         </w:r>
       </w:hyperlink>
       <w:r>
-        <w:t xml:space="preserve">). The three routes are mutually informative but not redundant: the bootstrap shows the two blocks to be internally coherent and well separated under resampling; the SBM finds the data too sparse to warrant a multi-block generative model; and the manual assignment captures the dominant axis of variation in sign repertoire size. We recommend that the main text retain the two-group framing but cite the per-site consistency scores (</w:t>
-      </w:r>
-      <w:hyperlink w:anchor="tbl-bootstrap-sites">
+        <w:t xml:space="preserve">). The three routes are mutually informative but not redundant: the bootstrap shows the two blocks to be internally coherent and well separated under resampling; the SBM finds the data too sparse to warrant a multi-block generative model; and the manual assignment captures the dominant axis of variation in sign repertoire size. The circularity of the main-text PerMANOVA itself is addressed separately in</w:t>
+      </w:r>
+      <w:r>
+        <w:t xml:space="preserve"> </w:t>
+      </w:r>
+      <w:hyperlink w:anchor="sec-s6-6">
         <w:r>
           <w:rPr>
             <w:rStyle w:val="Hyperlink"/>
           </w:rPr>
-          <w:t xml:space="preserve">Table 18</w:t>
+          <w:t xml:space="preserve">Section 7</w:t>
         </w:r>
       </w:hyperlink>
       <w:r>
-        <w:t xml:space="preserve">) for borderline sites, note that the generative SBM does not recover multiple blocks in either phase (likely due to network sparsity and ICL penalisation), and acknowledge that the Aur-P2 results rest on only 9 sites.</w:t>
+        <w:t xml:space="preserve">, which validates the grouping on withheld data rather than on the data used to define it.</w:t>
       </w:r>
     </w:p>
     <w:bookmarkEnd w:id="116"/>
     <w:bookmarkEnd w:id="117"/>
-    <w:bookmarkStart w:id="134" w:name="sec-s7"/>
+    <w:bookmarkStart w:id="121" w:name="sec-s6-6"/>
     <w:p>
       <w:pPr>
         <w:pStyle w:val="Heading1"/>
       </w:pPr>
       <w:r>
-        <w:t xml:space="preserve">S7. Object-Type Sensitivity: Figurine Exclusion</w:t>
+        <w:t xml:space="preserve">S6.6 Circularity-Breaking Validation of the Restricted/Broad Group Difference</w:t>
       </w:r>
     </w:p>
-    <w:bookmarkStart w:id="118" w:name="s7.1-rationale"/>
+    <w:bookmarkStart w:id="120" w:name="rationale-6"/>
     <w:p>
       <w:pPr>
         <w:pStyle w:val="Heading2"/>
       </w:pPr>
       <w:r>
-        <w:t xml:space="preserve">S7.1 Rationale</w:t>
+        <w:t xml:space="preserve">Rationale</w:t>
       </w:r>
     </w:p>
     <w:p>
@@ -18655,23 +18675,129 @@
         <w:pStyle w:val="FirstParagraph"/>
       </w:pPr>
       <w:r>
-        <w:t xml:space="preserve">[5]</w:t>
-      </w:r>
-      <w:r>
-        <w:t xml:space="preserve"> </w:t>
-      </w:r>
-      <w:r>
-        <w:t xml:space="preserve">demonstrate that ivory figurines in the Swabian Aurignacian carry sign sequences with higher information density than tools. If figurines encode different sign repertoires than other object types, their inclusion could bias site-level sign assemblages , particularly at Vogelherd, where 50 of the dataset’s 63 figurines are concentrated. This section tests whether the main-text network findings are robust to the exclusion of figurines, both globally and site-specifically.</w:t>
+        <w:t xml:space="preserve">The restricted/broad groups were defined from the same sign-composition data that the main-text PerMANOVA later tests, so its p-values cannot be read as</w:t>
+      </w:r>
+      <w:r>
+        <w:t xml:space="preserve"> </w:t>
+      </w:r>
+      <w:r>
+        <w:rPr>
+          <w:iCs/>
+          <w:i/>
+        </w:rPr>
+        <w:t xml:space="preserve">independent</w:t>
+      </w:r>
+      <w:r>
+        <w:t xml:space="preserve"> </w:t>
+      </w:r>
+      <w:r>
+        <w:t xml:space="preserve">confirmation that the groups differ. Louvain, bootstrap and stochastic block model analyses (S5, S6) also operate on that same underlying dataset, so they do not remove the circularity either. To address this directly we implement three complementary methods that break the circularity, each following a distinct validation strategy:</w:t>
       </w:r>
     </w:p>
-    <w:bookmarkEnd w:id="118"/>
-    <w:bookmarkStart w:id="120" w:name="X558aa60e1a258171fb4fb8ecbd68200d2a7d022"/>
     <w:p>
       <w:pPr>
-        <w:pStyle w:val="Heading2"/>
+        <w:numPr>
+          <w:ilvl w:val="0"/>
+          <w:numId w:val="1003"/>
+        </w:numPr>
+        <w:pStyle w:val="Compact"/>
       </w:pPr>
       <w:r>
-        <w:t xml:space="preserve">S7.2 Figurine Distribution in the Dataset</w:t>
+        <w:rPr>
+          <w:bCs/>
+          <w:b/>
+        </w:rPr>
+        <w:t xml:space="preserve">(A) Maximally-selected achieved-significance test:</w:t>
+      </w:r>
+      <w:r>
+        <w:t xml:space="preserve"> </w:t>
+      </w:r>
+      <w:r>
+        <w:t xml:space="preserve">the optimal two-group split is re-derived from</w:t>
+      </w:r>
+      <w:r>
+        <w:t xml:space="preserve"> </w:t>
+      </w:r>
+      <w:r>
+        <w:rPr>
+          <w:iCs/>
+          <w:i/>
+        </w:rPr>
+        <w:t xml:space="preserve">randomised</w:t>
+      </w:r>
+      <w:r>
+        <w:t xml:space="preserve"> </w:t>
+      </w:r>
+      <w:r>
+        <w:t xml:space="preserve">data in every permutation, and the observed optimal split is compared against that null. This controls for the fact that the grouping was itself optimised to maximise separation.</w:t>
+      </w:r>
+    </w:p>
+    <w:p>
+      <w:pPr>
+        <w:numPr>
+          <w:ilvl w:val="0"/>
+          <w:numId w:val="1003"/>
+        </w:numPr>
+        <w:pStyle w:val="Compact"/>
+      </w:pPr>
+      <w:r>
+        <w:rPr>
+          <w:bCs/>
+          <w:b/>
+        </w:rPr>
+        <w:t xml:space="preserve">(B) Cross-validation on withheld data:</w:t>
+      </w:r>
+      <w:r>
+        <w:t xml:space="preserve"> </w:t>
+      </w:r>
+      <w:r>
+        <w:t xml:space="preserve">the grouping is validated on data that did not contribute to its definition. We do this at two levels — (i) site level: leave-one-site-out k-nearest-neighbour classification, where each held-out site is predicted from the other sites only; and (ii) object level: the two-group rule is learned from one random half of each site’s objects and tested, by PerMANOVA, on the</w:t>
+      </w:r>
+      <w:r>
+        <w:t xml:space="preserve"> </w:t>
+      </w:r>
+      <w:r>
+        <w:rPr>
+          <w:iCs/>
+          <w:i/>
+        </w:rPr>
+        <w:t xml:space="preserve">other</w:t>
+      </w:r>
+      <w:r>
+        <w:t xml:space="preserve"> </w:t>
+      </w:r>
+      <w:r>
+        <w:t xml:space="preserve">half.</w:t>
+      </w:r>
+    </w:p>
+    <w:p>
+      <w:pPr>
+        <w:numPr>
+          <w:ilvl w:val="0"/>
+          <w:numId w:val="1003"/>
+        </w:numPr>
+        <w:pStyle w:val="Compact"/>
+      </w:pPr>
+      <w:r>
+        <w:rPr>
+          <w:bCs/>
+          <w:b/>
+        </w:rPr>
+        <w:t xml:space="preserve">(C) Group-free gradient PerMANOVA:</w:t>
+      </w:r>
+      <w:r>
+        <w:t xml:space="preserve"> </w:t>
+      </w:r>
+      <w:r>
+        <w:t xml:space="preserve">instead of asserting discrete groups, sign composition is regressed on a continuous ordination axis, testing for a gradient rather than a partition.</w:t>
+      </w:r>
+    </w:p>
+    <w:p>
+      <w:pPr>
+        <w:pStyle w:val="FirstParagraph"/>
+      </w:pPr>
+      <w:r>
+        <w:t xml:space="preserve">All three are exploratory companions to, not replacements for, the main-text PerMANOVA, which we present as descriptive rather than confirmatory.</w:t>
       </w:r>
     </w:p>
     <w:tbl>
@@ -18688,7 +18814,826 @@
       <w:tr>
         <w:tc>
           <w:tcPr/>
-          <w:bookmarkStart w:id="119" w:name="tbl-figurine-count"/>
+          <w:bookmarkStart w:id="118" w:name="tbl-s9-summary"/>
+          <w:tbl>
+            <w:tblPr>
+              <w:tblStyle w:val="Table"/>
+              <w:tblW w:type="auto" w:w="0"/>
+              <w:tblLook w:firstRow="1" w:lastRow="0" w:firstColumn="0" w:lastColumn="0" w:noHBand="0" w:noVBand="0" w:val="0020"/>
+              <w:jc w:val="start"/>
+            </w:tblPr>
+            <w:tblGrid>
+              <w:gridCol w:w="2640"/>
+              <w:gridCol w:w="2640"/>
+              <w:gridCol w:w="2640"/>
+            </w:tblGrid>
+            <w:tr>
+              <w:trPr>
+                <w:tblHeader w:val="true"/>
+              </w:trPr>
+              <w:tc>
+                <w:tcPr/>
+                <w:p>
+                  <w:pPr>
+                    <w:pStyle w:val="Compact"/>
+                    <w:jc w:val="left"/>
+                    <w:jc w:val="center"/>
+                  </w:pPr>
+                  <w:r>
+                    <w:t xml:space="preserve">Method</w:t>
+                  </w:r>
+                </w:p>
+              </w:tc>
+              <w:tc>
+                <w:tcPr/>
+                <w:p>
+                  <w:pPr>
+                    <w:pStyle w:val="Compact"/>
+                    <w:jc w:val="left"/>
+                    <w:jc w:val="center"/>
+                  </w:pPr>
+                  <w:r>
+                    <w:t xml:space="preserve">Statistic</w:t>
+                  </w:r>
+                </w:p>
+              </w:tc>
+              <w:tc>
+                <w:tcPr/>
+                <w:p>
+                  <w:pPr>
+                    <w:pStyle w:val="Compact"/>
+                    <w:jc w:val="center"/>
+                    <w:jc w:val="center"/>
+                  </w:pPr>
+                  <w:r>
+                    <w:t xml:space="preserve">p.value</w:t>
+                  </w:r>
+                </w:p>
+              </w:tc>
+            </w:tr>
+            <w:tr>
+              <w:tc>
+                <w:tcPr/>
+                <w:p>
+                  <w:pPr>
+                    <w:pStyle w:val="Compact"/>
+                    <w:jc w:val="left"/>
+                    <w:jc w:val="center"/>
+                  </w:pPr>
+                  <w:r>
+                    <w:t xml:space="preserve">A: Maximally-selected split (P1)</w:t>
+                  </w:r>
+                </w:p>
+              </w:tc>
+              <w:tc>
+                <w:tcPr/>
+                <w:p>
+                  <w:pPr>
+                    <w:pStyle w:val="Compact"/>
+                    <w:jc w:val="left"/>
+                    <w:jc w:val="center"/>
+                  </w:pPr>
+                  <w:r>
+                    <w:t xml:space="preserve">5.25</w:t>
+                  </w:r>
+                </w:p>
+              </w:tc>
+              <w:tc>
+                <w:tcPr/>
+                <w:p>
+                  <w:pPr>
+                    <w:pStyle w:val="Compact"/>
+                    <w:jc w:val="center"/>
+                    <w:jc w:val="center"/>
+                  </w:pPr>
+                  <w:r>
+                    <w:t xml:space="preserve">0.352</w:t>
+                  </w:r>
+                </w:p>
+              </w:tc>
+            </w:tr>
+            <w:tr>
+              <w:tc>
+                <w:tcPr/>
+                <w:p>
+                  <w:pPr>
+                    <w:pStyle w:val="Compact"/>
+                    <w:jc w:val="left"/>
+                    <w:jc w:val="center"/>
+                  </w:pPr>
+                  <w:r>
+                    <w:t xml:space="preserve">A: Maximally-selected split (P2)</w:t>
+                  </w:r>
+                </w:p>
+              </w:tc>
+              <w:tc>
+                <w:tcPr/>
+                <w:p>
+                  <w:pPr>
+                    <w:pStyle w:val="Compact"/>
+                    <w:jc w:val="left"/>
+                    <w:jc w:val="center"/>
+                  </w:pPr>
+                  <w:r>
+                    <w:t xml:space="preserve">2.2</w:t>
+                  </w:r>
+                </w:p>
+              </w:tc>
+              <w:tc>
+                <w:tcPr/>
+                <w:p>
+                  <w:pPr>
+                    <w:pStyle w:val="Compact"/>
+                    <w:jc w:val="center"/>
+                    <w:jc w:val="center"/>
+                  </w:pPr>
+                  <w:r>
+                    <w:t xml:space="preserve">1.000</w:t>
+                  </w:r>
+                </w:p>
+              </w:tc>
+            </w:tr>
+            <w:tr>
+              <w:tc>
+                <w:tcPr/>
+                <w:p>
+                  <w:pPr>
+                    <w:pStyle w:val="Compact"/>
+                    <w:jc w:val="left"/>
+                    <w:jc w:val="center"/>
+                  </w:pPr>
+                  <w:r>
+                    <w:t xml:space="preserve">B: LOOCV site classification (P1)</w:t>
+                  </w:r>
+                </w:p>
+              </w:tc>
+              <w:tc>
+                <w:tcPr/>
+                <w:p>
+                  <w:pPr>
+                    <w:pStyle w:val="Compact"/>
+                    <w:jc w:val="left"/>
+                    <w:jc w:val="center"/>
+                  </w:pPr>
+                  <w:r>
+                    <w:t xml:space="preserve">1 acc</w:t>
+                  </w:r>
+                </w:p>
+              </w:tc>
+              <w:tc>
+                <w:tcPr/>
+                <w:p>
+                  <w:pPr>
+                    <w:pStyle w:val="Compact"/>
+                    <w:jc w:val="center"/>
+                    <w:jc w:val="center"/>
+                  </w:pPr>
+                  <w:r>
+                    <w:t xml:space="preserve">0.001</w:t>
+                  </w:r>
+                </w:p>
+              </w:tc>
+            </w:tr>
+            <w:tr>
+              <w:tc>
+                <w:tcPr/>
+                <w:p>
+                  <w:pPr>
+                    <w:pStyle w:val="Compact"/>
+                    <w:jc w:val="left"/>
+                    <w:jc w:val="center"/>
+                  </w:pPr>
+                  <w:r>
+                    <w:t xml:space="preserve">B: LOOCV site classification (P2)</w:t>
+                  </w:r>
+                </w:p>
+              </w:tc>
+              <w:tc>
+                <w:tcPr/>
+                <w:p>
+                  <w:pPr>
+                    <w:pStyle w:val="Compact"/>
+                    <w:jc w:val="left"/>
+                    <w:jc w:val="center"/>
+                  </w:pPr>
+                  <w:r>
+                    <w:t xml:space="preserve">0.89 acc</w:t>
+                  </w:r>
+                </w:p>
+              </w:tc>
+              <w:tc>
+                <w:tcPr/>
+                <w:p>
+                  <w:pPr>
+                    <w:pStyle w:val="Compact"/>
+                    <w:jc w:val="center"/>
+                    <w:jc w:val="center"/>
+                  </w:pPr>
+                  <w:r>
+                    <w:t xml:space="preserve">0.028</w:t>
+                  </w:r>
+                </w:p>
+              </w:tc>
+            </w:tr>
+            <w:tr>
+              <w:tc>
+                <w:tcPr/>
+                <w:p>
+                  <w:pPr>
+                    <w:pStyle w:val="Compact"/>
+                    <w:jc w:val="left"/>
+                    <w:jc w:val="center"/>
+                  </w:pPr>
+                  <w:r>
+                    <w:t xml:space="preserve">B: Object-half holdout (P1)</w:t>
+                  </w:r>
+                </w:p>
+              </w:tc>
+              <w:tc>
+                <w:tcPr/>
+                <w:p>
+                  <w:pPr>
+                    <w:pStyle w:val="Compact"/>
+                    <w:jc w:val="left"/>
+                    <w:jc w:val="center"/>
+                  </w:pPr>
+                  <w:r>
+                    <w:t xml:space="preserve">comb p =&lt;2e-16</w:t>
+                  </w:r>
+                </w:p>
+              </w:tc>
+              <w:tc>
+                <w:tcPr/>
+                <w:p>
+                  <w:pPr>
+                    <w:pStyle w:val="Compact"/>
+                    <w:jc w:val="center"/>
+                    <w:jc w:val="center"/>
+                  </w:pPr>
+                  <w:r>
+                    <w:t xml:space="preserve">0.000</w:t>
+                  </w:r>
+                </w:p>
+              </w:tc>
+            </w:tr>
+            <w:tr>
+              <w:tc>
+                <w:tcPr/>
+                <w:p>
+                  <w:pPr>
+                    <w:pStyle w:val="Compact"/>
+                    <w:jc w:val="left"/>
+                    <w:jc w:val="center"/>
+                  </w:pPr>
+                  <w:r>
+                    <w:t xml:space="preserve">B: Object-half holdout (P2)</w:t>
+                  </w:r>
+                </w:p>
+              </w:tc>
+              <w:tc>
+                <w:tcPr/>
+                <w:p>
+                  <w:pPr>
+                    <w:pStyle w:val="Compact"/>
+                    <w:jc w:val="left"/>
+                    <w:jc w:val="center"/>
+                  </w:pPr>
+                  <w:r>
+                    <w:t xml:space="preserve">comb p =4.1e-07</w:t>
+                  </w:r>
+                </w:p>
+              </w:tc>
+              <w:tc>
+                <w:tcPr/>
+                <w:p>
+                  <w:pPr>
+                    <w:pStyle w:val="Compact"/>
+                    <w:jc w:val="center"/>
+                    <w:jc w:val="center"/>
+                  </w:pPr>
+                  <w:r>
+                    <w:t xml:space="preserve">0.000</w:t>
+                  </w:r>
+                </w:p>
+              </w:tc>
+            </w:tr>
+            <w:tr>
+              <w:tc>
+                <w:tcPr/>
+                <w:p>
+                  <w:pPr>
+                    <w:pStyle w:val="Compact"/>
+                    <w:jc w:val="left"/>
+                    <w:jc w:val="center"/>
+                  </w:pPr>
+                  <w:r>
+                    <w:t xml:space="preserve">C: Gradient PerMANOVA (P1)</w:t>
+                  </w:r>
+                </w:p>
+              </w:tc>
+              <w:tc>
+                <w:tcPr/>
+                <w:p>
+                  <w:pPr>
+                    <w:pStyle w:val="Compact"/>
+                    <w:jc w:val="left"/>
+                    <w:jc w:val="center"/>
+                  </w:pPr>
+                  <w:r>
+                    <w:t xml:space="preserve">R2 =0.312</w:t>
+                  </w:r>
+                </w:p>
+              </w:tc>
+              <w:tc>
+                <w:tcPr/>
+                <w:p>
+                  <w:pPr>
+                    <w:pStyle w:val="Compact"/>
+                    <w:jc w:val="center"/>
+                    <w:jc w:val="center"/>
+                  </w:pPr>
+                  <w:r>
+                    <w:t xml:space="preserve">0.001</w:t>
+                  </w:r>
+                </w:p>
+              </w:tc>
+            </w:tr>
+            <w:tr>
+              <w:tc>
+                <w:tcPr/>
+                <w:p>
+                  <w:pPr>
+                    <w:pStyle w:val="Compact"/>
+                    <w:jc w:val="left"/>
+                    <w:jc w:val="center"/>
+                  </w:pPr>
+                  <w:r>
+                    <w:t xml:space="preserve">C: Gradient PerMANOVA (P2)</w:t>
+                  </w:r>
+                </w:p>
+              </w:tc>
+              <w:tc>
+                <w:tcPr/>
+                <w:p>
+                  <w:pPr>
+                    <w:pStyle w:val="Compact"/>
+                    <w:jc w:val="left"/>
+                    <w:jc w:val="center"/>
+                  </w:pPr>
+                  <w:r>
+                    <w:t xml:space="preserve">R2 =0.439</w:t>
+                  </w:r>
+                </w:p>
+              </w:tc>
+              <w:tc>
+                <w:tcPr/>
+                <w:p>
+                  <w:pPr>
+                    <w:pStyle w:val="Compact"/>
+                    <w:jc w:val="center"/>
+                    <w:jc w:val="center"/>
+                  </w:pPr>
+                  <w:r>
+                    <w:t xml:space="preserve">0.001</w:t>
+                  </w:r>
+                </w:p>
+              </w:tc>
+            </w:tr>
+          </w:tbl>
+          <w:p>
+            <w:pPr>
+              <w:jc w:val="center"/>
+            </w:pPr>
+            <w:pPr>
+              <w:jc w:val="start"/>
+              <w:spacing w:before="200"/>
+              <w:pStyle w:val="ImageCaption"/>
+            </w:pPr>
+            <w:r>
+              <w:t xml:space="preserve">Table 22: Circularity-breaking validation of the restricted/broad group difference. Method A re-derives the optimal two-group split from randomised data in every permutation (observed optimal pseudo-F vs. its null). Method B validates the grouping on withheld data: site-level leave-one-out k-NN classification accuracy (with permutation p-value) and object-level holdout where groups are defined from one random half of each site’s objects and tested on the other half (Fisher-combined p across 100 random splits). Method C is a group-free continuous gradient PerMANOVA on the first PCoA axis. A significant result indicates the group structure is recoverable from data not used to define it.</w:t>
+            </w:r>
+          </w:p>
+          <w:bookmarkEnd w:id="118"/>
+        </w:tc>
+      </w:tr>
+    </w:tbl>
+    <w:bookmarkStart w:id="119" w:name="interpretation-3"/>
+    <w:p>
+      <w:pPr>
+        <w:pStyle w:val="Heading3"/>
+      </w:pPr>
+      <w:r>
+        <w:t xml:space="preserve">Interpretation</w:t>
+      </w:r>
+    </w:p>
+    <w:p>
+      <w:pPr>
+        <w:pStyle w:val="FirstParagraph"/>
+      </w:pPr>
+      <w:r>
+        <w:t xml:space="preserve">The methods below answer one general question, whether the restricted/broad difference is a genuine pattern recoverable from data independent of how the groups were originally defined, through three specific questions, each answered by a different route.</w:t>
+      </w:r>
+    </w:p>
+    <w:p>
+      <w:pPr>
+        <w:pStyle w:val="BodyText"/>
+      </w:pPr>
+      <w:r>
+        <w:rPr>
+          <w:bCs/>
+          <w:b/>
+        </w:rPr>
+        <w:t xml:space="preserve">Question 1 (strategy A):</w:t>
+      </w:r>
+      <w:r>
+        <w:t xml:space="preserve"> </w:t>
+      </w:r>
+      <w:r>
+        <w:t xml:space="preserve">Is the observed two-group split</w:t>
+      </w:r>
+      <w:r>
+        <w:t xml:space="preserve"> </w:t>
+      </w:r>
+      <w:r>
+        <w:rPr>
+          <w:iCs/>
+          <w:i/>
+        </w:rPr>
+        <w:t xml:space="preserve">stronger</w:t>
+      </w:r>
+      <w:r>
+        <w:t xml:space="preserve"> </w:t>
+      </w:r>
+      <w:r>
+        <w:t xml:space="preserve">than the best split one would obtain by optimising on randomised data, that is, does the restricted/broad partition survive a null that accounts for the fact that the grouping was itself optimised to maximise separation?</w:t>
+      </w:r>
+      <w:r>
+        <w:t xml:space="preserve"> </w:t>
+      </w:r>
+      <w:r>
+        <w:t xml:space="preserve">-</w:t>
+      </w:r>
+      <w:r>
+        <w:t xml:space="preserve"> </w:t>
+      </w:r>
+      <w:r>
+        <w:rPr>
+          <w:iCs/>
+          <w:i/>
+        </w:rPr>
+        <w:t xml:space="preserve">Answer:</w:t>
+      </w:r>
+      <w:r>
+        <w:t xml:space="preserve"> </w:t>
+      </w:r>
+      <w:r>
+        <w:t xml:space="preserve">No. The observed optimal split is</w:t>
+      </w:r>
+      <w:r>
+        <w:t xml:space="preserve"> </w:t>
+      </w:r>
+      <w:r>
+        <w:rPr>
+          <w:bCs/>
+          <w:b/>
+        </w:rPr>
+        <w:t xml:space="preserve">not</w:t>
+      </w:r>
+      <w:r>
+        <w:t xml:space="preserve"> </w:t>
+      </w:r>
+      <w:r>
+        <w:t xml:space="preserve">significant (Aur-P1 observed optimal pseudo-F = 5.25, permutation p = 0.352; Aur-P2 p = 1). This is consistent with , not contradictory to , the conclusions below: the restricted/broad contrast is a real, recoverable</w:t>
+      </w:r>
+      <w:r>
+        <w:t xml:space="preserve"> </w:t>
+      </w:r>
+      <w:r>
+        <w:rPr>
+          <w:iCs/>
+          <w:i/>
+        </w:rPr>
+        <w:t xml:space="preserve">gradient/axis of variation</w:t>
+      </w:r>
+      <w:r>
+        <w:t xml:space="preserve">, but it is not a sharp discontinuous partition that survives the most stringent</w:t>
+      </w:r>
+      <w:r>
+        <w:t xml:space="preserve"> </w:t>
+      </w:r>
+      <w:r>
+        <w:t xml:space="preserve">“</w:t>
+      </w:r>
+      <w:r>
+        <w:t xml:space="preserve">optimisation-accounted-for</w:t>
+      </w:r>
+      <w:r>
+        <w:t xml:space="preserve">”</w:t>
+      </w:r>
+      <w:r>
+        <w:t xml:space="preserve"> </w:t>
+      </w:r>
+      <w:r>
+        <w:t xml:space="preserve">null.</w:t>
+      </w:r>
+    </w:p>
+    <w:p>
+      <w:pPr>
+        <w:pStyle w:val="BodyText"/>
+      </w:pPr>
+      <w:r>
+        <w:rPr>
+          <w:bCs/>
+          <w:b/>
+        </w:rPr>
+        <w:t xml:space="preserve">Question 2 (strategy B):</w:t>
+      </w:r>
+      <w:r>
+        <w:t xml:space="preserve"> </w:t>
+      </w:r>
+      <w:r>
+        <w:t xml:space="preserve">Can the group assignment be recovered from data that did</w:t>
+      </w:r>
+      <w:r>
+        <w:t xml:space="preserve"> </w:t>
+      </w:r>
+      <w:r>
+        <w:rPr>
+          <w:bCs/>
+          <w:b/>
+        </w:rPr>
+        <w:t xml:space="preserve">not</w:t>
+      </w:r>
+      <w:r>
+        <w:t xml:space="preserve"> </w:t>
+      </w:r>
+      <w:r>
+        <w:t xml:space="preserve">contribute to defining it?</w:t>
+      </w:r>
+      <w:r>
+        <w:t xml:space="preserve"> </w:t>
+      </w:r>
+      <w:r>
+        <w:t xml:space="preserve">-</w:t>
+      </w:r>
+      <w:r>
+        <w:t xml:space="preserve"> </w:t>
+      </w:r>
+      <w:r>
+        <w:rPr>
+          <w:iCs/>
+          <w:i/>
+        </w:rPr>
+        <w:t xml:space="preserve">Site level (B-i):</w:t>
+      </w:r>
+      <w:r>
+        <w:t xml:space="preserve"> </w:t>
+      </w:r>
+      <w:r>
+        <w:t xml:space="preserve">Can a held-out site’s restricted/broad label be predicted from a classifier trained only on the other sites?</w:t>
+      </w:r>
+      <w:r>
+        <w:t xml:space="preserve"> </w:t>
+      </w:r>
+      <w:r>
+        <w:t xml:space="preserve">-</w:t>
+      </w:r>
+      <w:r>
+        <w:t xml:space="preserve"> </w:t>
+      </w:r>
+      <w:r>
+        <w:rPr>
+          <w:iCs/>
+          <w:i/>
+        </w:rPr>
+        <w:t xml:space="preserve">Answer:</w:t>
+      </w:r>
+      <w:r>
+        <w:t xml:space="preserve"> </w:t>
+      </w:r>
+      <w:r>
+        <w:t xml:space="preserve">Yes. Leave-one-site-out classification recovers the manual label for 1 of Aur-P1 sites (95% CI 0.83–1, permutation p = 0.001) and 0.8888889 of Aur-P2 sites (permutation p = 0.028). A site’s group is therefore predictable from a classifier trained on the</w:t>
+      </w:r>
+      <w:r>
+        <w:t xml:space="preserve"> </w:t>
+      </w:r>
+      <w:r>
+        <w:rPr>
+          <w:iCs/>
+          <w:i/>
+        </w:rPr>
+        <w:t xml:space="preserve">other</w:t>
+      </w:r>
+      <w:r>
+        <w:t xml:space="preserve"> </w:t>
+      </w:r>
+      <w:r>
+        <w:t xml:space="preserve">sites, so the assignment is not an artefact of fitting all sites simultaneously.</w:t>
+      </w:r>
+      <w:r>
+        <w:t xml:space="preserve"> </w:t>
+      </w:r>
+      <w:r>
+        <w:t xml:space="preserve">-</w:t>
+      </w:r>
+      <w:r>
+        <w:t xml:space="preserve"> </w:t>
+      </w:r>
+      <w:r>
+        <w:rPr>
+          <w:iCs/>
+          <w:i/>
+        </w:rPr>
+        <w:t xml:space="preserve">Object level (B-ii):</w:t>
+      </w:r>
+      <w:r>
+        <w:t xml:space="preserve"> </w:t>
+      </w:r>
+      <w:r>
+        <w:t xml:space="preserve">When the two-group rule is learned from one random half of each site’s objects and tested, by PerMANOVA, on the</w:t>
+      </w:r>
+      <w:r>
+        <w:t xml:space="preserve"> </w:t>
+      </w:r>
+      <w:r>
+        <w:rPr>
+          <w:iCs/>
+          <w:i/>
+        </w:rPr>
+        <w:t xml:space="preserve">other</w:t>
+      </w:r>
+      <w:r>
+        <w:t xml:space="preserve"> </w:t>
+      </w:r>
+      <w:r>
+        <w:t xml:space="preserve">half, is the held-out contrast still significant?</w:t>
+      </w:r>
+      <w:r>
+        <w:t xml:space="preserve"> </w:t>
+      </w:r>
+      <w:r>
+        <w:t xml:space="preserve">-</w:t>
+      </w:r>
+      <w:r>
+        <w:t xml:space="preserve"> </w:t>
+      </w:r>
+      <w:r>
+        <w:rPr>
+          <w:iCs/>
+          <w:i/>
+        </w:rPr>
+        <w:t xml:space="preserve">Answer:</w:t>
+      </w:r>
+      <w:r>
+        <w:t xml:space="preserve"> </w:t>
+      </w:r>
+      <w:r>
+        <w:t xml:space="preserve">Yes for Aur-P1: the held-out PerMANOVA is significant in the large majority of random splits (0.88 of 100; Fisher-combined p = &lt;2e-16), using 16 of 20 sites that have enough objects for splitting. For Aur-P2 the combined evidence is likewise significant (Fisher-combined p = 4.1e-07), although only 5 of 9 Aur-P2 sites have two or more objects, so each individual split has low power (few splits clear p &lt; 0.05 on their own) and the conclusion for Aur-P2 rests on the combined test rather than any single split. This shows the grouping is stable across</w:t>
+      </w:r>
+      <w:r>
+        <w:t xml:space="preserve"> </w:t>
+      </w:r>
+      <w:r>
+        <w:rPr>
+          <w:iCs/>
+          <w:i/>
+        </w:rPr>
+        <w:t xml:space="preserve">disjoint sets of objects</w:t>
+      </w:r>
+      <w:r>
+        <w:t xml:space="preserve">, which the original PerMANOVA , using every object to both define and test the groups , could not establish.</w:t>
+      </w:r>
+    </w:p>
+    <w:p>
+      <w:pPr>
+        <w:pStyle w:val="BodyText"/>
+      </w:pPr>
+      <w:r>
+        <w:rPr>
+          <w:bCs/>
+          <w:b/>
+        </w:rPr>
+        <w:t xml:space="preserve">Question 3 (strategy C):</w:t>
+      </w:r>
+      <w:r>
+        <w:t xml:space="preserve"> </w:t>
+      </w:r>
+      <w:r>
+        <w:t xml:space="preserve">If we abandon the discrete two-group partition entirely and instead ask whether sign composition varies continuously along the main compositional axis, is that gradient significant?</w:t>
+      </w:r>
+      <w:r>
+        <w:t xml:space="preserve"> </w:t>
+      </w:r>
+      <w:r>
+        <w:t xml:space="preserve">-</w:t>
+      </w:r>
+      <w:r>
+        <w:t xml:space="preserve"> </w:t>
+      </w:r>
+      <w:r>
+        <w:rPr>
+          <w:iCs/>
+          <w:i/>
+        </w:rPr>
+        <w:t xml:space="preserve">Answer:</w:t>
+      </w:r>
+      <w:r>
+        <w:t xml:space="preserve"> </w:t>
+      </w:r>
+      <w:r>
+        <w:t xml:space="preserve">Yes. A group-free gradient PerMANOVA regressing sign composition on the continuous first ordination axis is significant in both phases (Aur-P1: R² = 0.312, p = 0.001; Aur-P2: R² = 0.439, p = 0.001). Even without asserting discrete groups, a compositional gradient explains a significant fraction of the variation.</w:t>
+      </w:r>
+    </w:p>
+    <w:p>
+      <w:pPr>
+        <w:pStyle w:val="BodyText"/>
+      </w:pPr>
+      <w:r>
+        <w:rPr>
+          <w:bCs/>
+          <w:b/>
+        </w:rPr>
+        <w:t xml:space="preserve">Summary.</w:t>
+      </w:r>
+      <w:r>
+        <w:t xml:space="preserve"> </w:t>
+      </w:r>
+      <w:r>
+        <w:t xml:space="preserve">Strategies B and C provide the strongest evidence that the</w:t>
+      </w:r>
+      <w:r>
+        <w:t xml:space="preserve"> </w:t>
+      </w:r>
+      <w:r>
+        <w:t xml:space="preserve">restricted/broad contrast is not a circularity artefact: the grouping is</w:t>
+      </w:r>
+      <w:r>
+        <w:t xml:space="preserve"> </w:t>
+      </w:r>
+      <w:r>
+        <w:t xml:space="preserve">recovered from withheld data (strategy B) and a continuous gradient is significant without any group definition (strategy C). Strategy A, the most conservative test, shows the contrast is a real but gradual axis of variation rather than a sharp partition. We therefore present the main-text PerMANOVA as descriptive and exploratory, and we rely on the cross-validation results (strategy B) as the appropriate independent confirmation that the grouping is not a circularity artefact.</w:t>
+      </w:r>
+    </w:p>
+    <w:bookmarkEnd w:id="119"/>
+    <w:bookmarkEnd w:id="120"/>
+    <w:bookmarkEnd w:id="121"/>
+    <w:bookmarkStart w:id="138" w:name="sec-s7"/>
+    <w:p>
+      <w:pPr>
+        <w:pStyle w:val="Heading1"/>
+      </w:pPr>
+      <w:r>
+        <w:t xml:space="preserve">S7. Object-Type Sensitivity: Figurine Exclusion</w:t>
+      </w:r>
+    </w:p>
+    <w:bookmarkStart w:id="122" w:name="s7.1-rationale"/>
+    <w:p>
+      <w:pPr>
+        <w:pStyle w:val="Heading2"/>
+      </w:pPr>
+      <w:r>
+        <w:t xml:space="preserve">S7.1 Rationale</w:t>
+      </w:r>
+    </w:p>
+    <w:p>
+      <w:pPr>
+        <w:pStyle w:val="FirstParagraph"/>
+      </w:pPr>
+      <w:r>
+        <w:t xml:space="preserve">[5]</w:t>
+      </w:r>
+      <w:r>
+        <w:t xml:space="preserve"> </w:t>
+      </w:r>
+      <w:r>
+        <w:t xml:space="preserve">demonstrate that ivory figurines in the Swabian Aurignacian carry sign sequences with higher information density than tools. If figurines encode different sign repertoires than other object types, their inclusion could bias site-level sign assemblages , particularly at Vogelherd, where 50 of the dataset’s 63 figurines are concentrated. This section tests whether the main-text network findings are robust to the exclusion of figurines, both globally and site-specifically.</w:t>
+      </w:r>
+    </w:p>
+    <w:bookmarkEnd w:id="122"/>
+    <w:bookmarkStart w:id="124" w:name="X558aa60e1a258171fb4fb8ecbd68200d2a7d022"/>
+    <w:p>
+      <w:pPr>
+        <w:pStyle w:val="Heading2"/>
+      </w:pPr>
+      <w:r>
+        <w:t xml:space="preserve">S7.2 Figurine Distribution in the Dataset</w:t>
+      </w:r>
+    </w:p>
+    <w:tbl>
+      <w:tblPr>
+        <w:tblStyle w:val="Table"/>
+        <w:tblW w:type="pct" w:w="5000"/>
+        <w:tblLook w:firstRow="0" w:lastRow="0" w:firstColumn="0" w:lastColumn="0" w:noHBand="0" w:noVBand="0" w:val="0000"/>
+        <w:jc w:val="start"/>
+        <w:tblLayout w:type="fixed"/>
+      </w:tblPr>
+      <w:tblGrid>
+        <w:gridCol w:w="7920"/>
+      </w:tblGrid>
+      <w:tr>
+        <w:tc>
+          <w:tcPr/>
+          <w:bookmarkStart w:id="123" w:name="tbl-figurine-count"/>
           <w:tbl>
             <w:tblPr>
               <w:tblStyle w:val="Table"/>
@@ -19371,10 +20316,10 @@
               <w:pStyle w:val="ImageCaption"/>
             </w:pPr>
             <w:r>
-              <w:t xml:space="preserve">Table 22: Distribution of figurine objects across phases and sites. Figurine types include figurine zoomorph, figurine anthropomorph, figurine undet., and possible figurine.</w:t>
+              <w:t xml:space="preserve">Table 23: Distribution of figurine objects across phases and sites. Figurine types include figurine zoomorph, figurine anthropomorph, figurine undet., and possible figurine.</w:t>
             </w:r>
           </w:p>
-          <w:bookmarkEnd w:id="119"/>
+          <w:bookmarkEnd w:id="123"/>
         </w:tc>
       </w:tr>
     </w:tbl>
@@ -19387,7 +20332,7 @@
           <w:rPr>
             <w:rStyle w:val="Hyperlink"/>
           </w:rPr>
-          <w:t xml:space="preserve">Table 22</w:t>
+          <w:t xml:space="preserve">Table 23</w:t>
         </w:r>
       </w:hyperlink>
       <w:r>
@@ -19397,8 +20342,8 @@
         <w:t xml:space="preserve">shows that figurines are heavily concentrated at Vogelherd (50 objects), with minor representation at Hohle Fels (8), Geissenklösterle (3), Hohlenstein-Stadel (1), and La Ferrassie (1). Of these, 59 fall within Aur-P1 and the remaining 4 , all Hohle Fels objects from AH IV and Iid , fall within Aur-P2 under the layer-level assignment. The analysis therefore tests whether the Aur-P1 network structure , which reports the higher mean degree (7.50) , is driven by these 50 objects at a single site.</w:t>
       </w:r>
     </w:p>
-    <w:bookmarkEnd w:id="120"/>
-    <w:bookmarkStart w:id="125" w:name="s7.3-analysis-1-exclude-all-figurines"/>
+    <w:bookmarkEnd w:id="124"/>
+    <w:bookmarkStart w:id="129" w:name="s7.3-analysis-1-exclude-all-figurines"/>
     <w:p>
       <w:pPr>
         <w:pStyle w:val="Heading2"/>
@@ -19407,7 +20352,7 @@
         <w:t xml:space="preserve">S7.3 Analysis 1: Exclude All Figurines</w:t>
       </w:r>
     </w:p>
-    <w:bookmarkStart w:id="123" w:name="method"/>
+    <w:bookmarkStart w:id="127" w:name="method"/>
     <w:p>
       <w:pPr>
         <w:pStyle w:val="Heading3"/>
@@ -19471,7 +20416,7 @@
       <w:tr>
         <w:tc>
           <w:tcPr/>
-          <w:bookmarkStart w:id="121" w:name="tbl-exclude-figurines"/>
+          <w:bookmarkStart w:id="125" w:name="tbl-exclude-figurines"/>
           <w:tbl>
             <w:tblPr>
               <w:tblStyle w:val="Table"/>
@@ -20034,10 +20979,10 @@
               <w:pStyle w:val="ImageCaption"/>
             </w:pPr>
             <w:r>
-              <w:t xml:space="preserve">Table 23: Network statistics before and after excluding all figurine objects (figurine zoomorph, figurine anthropomorph, figurine undet., and possible figurine). Threshold = 0.2, Jaccard similarity.</w:t>
+              <w:t xml:space="preserve">Table 24: Network statistics before and after excluding all figurine objects (figurine zoomorph, figurine anthropomorph, figurine undet., and possible figurine). Threshold = 0.2, Jaccard similarity.</w:t>
             </w:r>
           </w:p>
-          <w:bookmarkEnd w:id="121"/>
+          <w:bookmarkEnd w:id="125"/>
         </w:tc>
       </w:tr>
     </w:tbl>
@@ -20063,7 +21008,7 @@
       <w:tr>
         <w:tc>
           <w:tcPr/>
-          <w:bookmarkStart w:id="122" w:name="tbl-figurine-sites-lost"/>
+          <w:bookmarkStart w:id="126" w:name="tbl-figurine-sites-lost"/>
           <w:tbl>
             <w:tblPr>
               <w:tblStyle w:val="Table"/>
@@ -20253,15 +21198,15 @@
               <w:pStyle w:val="ImageCaption"/>
             </w:pPr>
             <w:r>
-              <w:t xml:space="preserve">Table 24: Number of sites per phase before and after figurine exclusion. Sites are lost when all objects at that site are figurines.</w:t>
+              <w:t xml:space="preserve">Table 25: Number of sites per phase before and after figurine exclusion. Sites are lost when all objects at that site are figurines.</w:t>
             </w:r>
           </w:p>
-          <w:bookmarkEnd w:id="122"/>
+          <w:bookmarkEnd w:id="126"/>
         </w:tc>
       </w:tr>
     </w:tbl>
-    <w:bookmarkEnd w:id="123"/>
-    <w:bookmarkStart w:id="124" w:name="interpretation-3"/>
+    <w:bookmarkEnd w:id="127"/>
+    <w:bookmarkStart w:id="128" w:name="interpretation-4"/>
     <w:p>
       <w:pPr>
         <w:pStyle w:val="Heading3"/>
@@ -20286,9 +21231,9 @@
         <w:t xml:space="preserve">Critically, Aur-P1 retains the higher mean degree (7.40) under figurine exclusion, preserving the main-text ordering Aur-P1 &gt; Aur-P2 (7.40 &gt; 4.22). The Aur-P1 network remains the more connected regardless of figurine inclusion, confirming that its structure is not contingent on figurine-bearing sign assemblages at Vogelherd.</w:t>
       </w:r>
     </w:p>
-    <w:bookmarkEnd w:id="124"/>
-    <w:bookmarkEnd w:id="125"/>
-    <w:bookmarkStart w:id="130" w:name="X7549e60451b9f7bbee640100d361a0cf771ac62"/>
+    <w:bookmarkEnd w:id="128"/>
+    <w:bookmarkEnd w:id="129"/>
+    <w:bookmarkStart w:id="134" w:name="X7549e60451b9f7bbee640100d361a0cf771ac62"/>
     <w:p>
       <w:pPr>
         <w:pStyle w:val="Heading2"/>
@@ -20297,7 +21242,7 @@
         <w:t xml:space="preserve">S7.4 Analysis 2: Exclude Vogelherd Figurines Only</w:t>
       </w:r>
     </w:p>
-    <w:bookmarkStart w:id="128" w:name="method-1"/>
+    <w:bookmarkStart w:id="132" w:name="method-1"/>
     <w:p>
       <w:pPr>
         <w:pStyle w:val="Heading3"/>
@@ -20328,7 +21273,7 @@
       <w:tr>
         <w:tc>
           <w:tcPr/>
-          <w:bookmarkStart w:id="126" w:name="tbl-vogelherd-exclude"/>
+          <w:bookmarkStart w:id="130" w:name="tbl-vogelherd-exclude"/>
           <w:tbl>
             <w:tblPr>
               <w:tblStyle w:val="Table"/>
@@ -20891,10 +21836,10 @@
               <w:pStyle w:val="ImageCaption"/>
             </w:pPr>
             <w:r>
-              <w:t xml:space="preserve">Table 25: Network statistics before and after excluding figurines from Vogelherd only. All other figurines (Hohle Fels, Geissenklösterle, Hohlenstein-Stadel, La Ferrassie) are retained. Threshold = 0.2, Jaccard similarity.</w:t>
+              <w:t xml:space="preserve">Table 26: Network statistics before and after excluding figurines from Vogelherd only. All other figurines (Hohle Fels, Geissenklösterle, Hohlenstein-Stadel, La Ferrassie) are retained. Threshold = 0.2, Jaccard similarity.</w:t>
             </w:r>
           </w:p>
-          <w:bookmarkEnd w:id="126"/>
+          <w:bookmarkEnd w:id="130"/>
         </w:tc>
       </w:tr>
     </w:tbl>
@@ -20920,7 +21865,7 @@
       <w:tr>
         <w:tc>
           <w:tcPr/>
-          <w:bookmarkStart w:id="127" w:name="tbl-vogelherd-objects"/>
+          <w:bookmarkStart w:id="131" w:name="tbl-vogelherd-objects"/>
           <w:tbl>
             <w:tblPr>
               <w:tblStyle w:val="Table"/>
@@ -21056,15 +22001,15 @@
               <w:pStyle w:val="ImageCaption"/>
             </w:pPr>
             <w:r>
-              <w:t xml:space="preserve">Table 26: Vogelherd object counts before and after removing figurines. Non-figurine objects at Vogelherd (tools, plaquettes, etc.) are retained.</w:t>
+              <w:t xml:space="preserve">Table 27: Vogelherd object counts before and after removing figurines. Non-figurine objects at Vogelherd (tools, plaquettes, etc.) are retained.</w:t>
             </w:r>
           </w:p>
-          <w:bookmarkEnd w:id="127"/>
+          <w:bookmarkEnd w:id="131"/>
         </w:tc>
       </w:tr>
     </w:tbl>
-    <w:bookmarkEnd w:id="128"/>
-    <w:bookmarkStart w:id="129" w:name="interpretation-4"/>
+    <w:bookmarkEnd w:id="132"/>
+    <w:bookmarkStart w:id="133" w:name="interpretation-5"/>
     <w:p>
       <w:pPr>
         <w:pStyle w:val="Heading3"/>
@@ -21089,9 +22034,9 @@
         <w:t xml:space="preserve">The effect of removing Vogelherd figurines alone (−1.3% in Aur-P1) is the same as removing all 63 figurines globally (−1.3%), and in both cases the network is essentially unchanged. The figurine effect therefore does not scale with the number of figurines removed; figurines at Hohle Fels, Geissenklösterle (3), Hohlenstein-Stadel (1), and La Ferrassie (1) do not alter the network structure , including the four Hohle Fels figurines assigned to Aur-P2, which leave that phase’s network unchanged , and Vogelherd’s connectivity within Aur-P1 is carried by its 123 non-figurine objects.</w:t>
       </w:r>
     </w:p>
-    <w:bookmarkEnd w:id="129"/>
-    <w:bookmarkEnd w:id="130"/>
-    <w:bookmarkStart w:id="132" w:name="s7.5-joint-comparison"/>
+    <w:bookmarkEnd w:id="133"/>
+    <w:bookmarkEnd w:id="134"/>
+    <w:bookmarkStart w:id="136" w:name="s7.5-joint-comparison"/>
     <w:p>
       <w:pPr>
         <w:pStyle w:val="Heading2"/>
@@ -21114,7 +22059,7 @@
       <w:tr>
         <w:tc>
           <w:tcPr/>
-          <w:bookmarkStart w:id="131" w:name="tbl-objtype-joint"/>
+          <w:bookmarkStart w:id="135" w:name="tbl-objtype-joint"/>
           <w:tbl>
             <w:tblPr>
               <w:tblStyle w:val="Table"/>
@@ -21889,15 +22834,15 @@
               <w:pStyle w:val="ImageCaption"/>
             </w:pPr>
             <w:r>
-              <w:t xml:space="preserve">Table 27: Side-by-side comparison of network statistics across all conditions: baseline (all objects), exclude all figurines, and exclude Vogelherd figurines only. The rightmost columns show the percentage change in mean degree from baseline.</w:t>
+              <w:t xml:space="preserve">Table 28: Side-by-side comparison of network statistics across all conditions: baseline (all objects), exclude all figurines, and exclude Vogelherd figurines only. The rightmost columns show the percentage change in mean degree from baseline.</w:t>
             </w:r>
           </w:p>
-          <w:bookmarkEnd w:id="131"/>
+          <w:bookmarkEnd w:id="135"/>
         </w:tc>
       </w:tr>
     </w:tbl>
-    <w:bookmarkEnd w:id="132"/>
-    <w:bookmarkStart w:id="133" w:name="s7.6-interpretation"/>
+    <w:bookmarkEnd w:id="136"/>
+    <w:bookmarkStart w:id="137" w:name="s7.6-interpretation"/>
     <w:p>
       <w:pPr>
         <w:pStyle w:val="Heading2"/>
@@ -21921,7 +22866,7 @@
           <w:rPr>
             <w:rStyle w:val="Hyperlink"/>
           </w:rPr>
-          <w:t xml:space="preserve">Table 27</w:t>
+          <w:t xml:space="preserve">Table 28</w:t>
         </w:r>
       </w:hyperlink>
       <w:r>
@@ -22256,9 +23201,9 @@
         <w:t xml:space="preserve">argument that figurines carry high-information sign sequences, but the communities themselves are defined by shared sign types across all object types.</w:t>
       </w:r>
     </w:p>
-    <w:bookmarkEnd w:id="133"/>
-    <w:bookmarkEnd w:id="134"/>
-    <w:bookmarkStart w:id="166" w:name="sec-s8"/>
+    <w:bookmarkEnd w:id="137"/>
+    <w:bookmarkEnd w:id="138"/>
+    <w:bookmarkStart w:id="170" w:name="sec-s8"/>
     <w:p>
       <w:pPr>
         <w:pStyle w:val="Heading1"/>
@@ -22267,7 +23212,7 @@
         <w:t xml:space="preserve">S8. Site Reclassification Sensitivity Analysis</w:t>
       </w:r>
     </w:p>
-    <w:bookmarkStart w:id="135" w:name="s8.1-rationale"/>
+    <w:bookmarkStart w:id="139" w:name="s8.1-rationale"/>
     <w:p>
       <w:pPr>
         <w:pStyle w:val="Heading2"/>
@@ -22306,7 +23251,7 @@
       <w:pPr>
         <w:numPr>
           <w:ilvl w:val="0"/>
-          <w:numId w:val="1003"/>
+          <w:numId w:val="1004"/>
         </w:numPr>
         <w:pStyle w:val="Compact"/>
       </w:pPr>
@@ -22334,7 +23279,7 @@
       <w:pPr>
         <w:numPr>
           <w:ilvl w:val="0"/>
-          <w:numId w:val="1003"/>
+          <w:numId w:val="1004"/>
         </w:numPr>
         <w:pStyle w:val="Compact"/>
       </w:pPr>
@@ -22374,7 +23319,7 @@
       <w:pPr>
         <w:numPr>
           <w:ilvl w:val="0"/>
-          <w:numId w:val="1003"/>
+          <w:numId w:val="1004"/>
         </w:numPr>
         <w:pStyle w:val="Compact"/>
       </w:pPr>
@@ -22423,7 +23368,7 @@
       <w:pPr>
         <w:numPr>
           <w:ilvl w:val="0"/>
-          <w:numId w:val="1003"/>
+          <w:numId w:val="1004"/>
         </w:numPr>
         <w:pStyle w:val="Compact"/>
       </w:pPr>
@@ -22455,8 +23400,8 @@
         <w:t xml:space="preserve">Because these attributions are important for the two-phase framework, this section tests the sensitivity of the network results to (A) reverting to the purely date-based assignment used in earlier analyses , each object assigned to a phase by its calibrated date alone , and (B) excluding Vogelherd entirely, given its documented stratigraphic mixing.</w:t>
       </w:r>
     </w:p>
-    <w:bookmarkEnd w:id="135"/>
-    <w:bookmarkStart w:id="138" w:name="s8.2-results"/>
+    <w:bookmarkEnd w:id="139"/>
+    <w:bookmarkStart w:id="142" w:name="s8.2-results"/>
     <w:p>
       <w:pPr>
         <w:pStyle w:val="Heading2"/>
@@ -22479,7 +23424,7 @@
       <w:tr>
         <w:tc>
           <w:tcPr/>
-          <w:bookmarkStart w:id="136" w:name="tbl-reclass-comparison"/>
+          <w:bookmarkStart w:id="140" w:name="tbl-reclass-comparison"/>
           <w:tbl>
             <w:tblPr>
               <w:tblStyle w:val="Table"/>
@@ -23254,14 +24199,14 @@
               <w:pStyle w:val="ImageCaption"/>
             </w:pPr>
             <w:r>
-              <w:t xml:space="preserve">Table 28: Network statistics under three conditions: baseline (technology-based assignment), date-based (each object assigned purely by calibrated radiocarbon date, with the Spy/El Castillo exclusions retained), and exclude Vogelherd (technology-based baseline with the site of Vogelherd removed entirely). Threshold = 0.2, Jaccard similarity.</w:t>
+              <w:t xml:space="preserve">Table 29: Network statistics under three conditions: baseline (technology-based assignment), date-based (each object assigned purely by calibrated radiocarbon date, with the Spy/El Castillo exclusions retained), and exclude Vogelherd (technology-based baseline with the site of Vogelherd removed entirely). Threshold = 0.2, Jaccard similarity.</w:t>
             </w:r>
           </w:p>
-          <w:bookmarkEnd w:id="136"/>
+          <w:bookmarkEnd w:id="140"/>
         </w:tc>
       </w:tr>
     </w:tbl>
-    <w:bookmarkStart w:id="137" w:name="effects-by-condition"/>
+    <w:bookmarkStart w:id="141" w:name="effects-by-condition"/>
     <w:p>
       <w:pPr>
         <w:pStyle w:val="Heading3"/>
@@ -23306,9 +24251,9 @@
         <w:t xml:space="preserve">Removing Vogelherd’s 173 objects from the technology-based baseline reduces Aur-P1 from 20 to 19 sites and from 75 to 69 edges. Mean degree falls from 7.5 to 7.26 (−3.2%), and modularity from 0.336 to 0.312. Aur-P2 is unaffected (4.22, 19 edges, 9 sites).</w:t>
       </w:r>
     </w:p>
-    <w:bookmarkEnd w:id="137"/>
-    <w:bookmarkEnd w:id="138"/>
-    <w:bookmarkStart w:id="139" w:name="s8.3-phase-ordering-robustness"/>
+    <w:bookmarkEnd w:id="141"/>
+    <w:bookmarkEnd w:id="142"/>
+    <w:bookmarkStart w:id="143" w:name="s8.3-phase-ordering-robustness"/>
     <w:p>
       <w:pPr>
         <w:pStyle w:val="Heading2"/>
@@ -23563,8 +24508,8 @@
         <w:t xml:space="preserve">Under the date-based assignment Aur-P1’s mean degree rises (from 7.5 to 8.57) and Aur-P2’s falls (from 4.22 to 3.33), so the contrast is not an artefact of the technological reassignment , the naive date-based assignment, if anything, strengthens it. Excluding Vogelherd weakens but does not remove the contrast (7.26 vs 4.22).</w:t>
       </w:r>
     </w:p>
-    <w:bookmarkEnd w:id="139"/>
-    <w:bookmarkStart w:id="140" w:name="s8.4-interpretation"/>
+    <w:bookmarkEnd w:id="143"/>
+    <w:bookmarkStart w:id="144" w:name="s8.4-interpretation"/>
     <w:p>
       <w:pPr>
         <w:pStyle w:val="Heading2"/>
@@ -23597,8 +24542,8 @@
         <w:t xml:space="preserve">Excluding Vogelherd leaves the ordering intact, consistent with S7’s finding that Aur-P1’s network does not depend on a single site. Finally, the within-phase two-group structure (RQ1) , the restricted/broad dichotomy recovered by seriation, Louvain community detection, bootstrap consensus, and the stochastic block model (S5, S6) , is defined within each phase’s membership and is unaffected by the between-phase assignment criterion tested here.</w:t>
       </w:r>
     </w:p>
-    <w:bookmarkEnd w:id="140"/>
-    <w:bookmarkStart w:id="165" w:name="references-cited"/>
+    <w:bookmarkEnd w:id="144"/>
+    <w:bookmarkStart w:id="169" w:name="references-cited"/>
     <w:p>
       <w:pPr>
         <w:pStyle w:val="Heading2"/>
@@ -23607,8 +24552,8 @@
         <w:t xml:space="preserve">References cited</w:t>
       </w:r>
     </w:p>
-    <w:bookmarkStart w:id="164" w:name="refs"/>
-    <w:bookmarkStart w:id="142" w:name="X68cdd7ba62fc5dd3e1e9b497937717305f7b9a0"/>
+    <w:bookmarkStart w:id="168" w:name="refs"/>
+    <w:bookmarkStart w:id="146" w:name="X68cdd7ba62fc5dd3e1e9b497937717305f7b9a0"/>
     <w:p>
       <w:pPr>
         <w:pStyle w:val="Bibliography"/>
@@ -23640,7 +24585,7 @@
       <w:r>
         <w:t xml:space="preserve"> </w:t>
       </w:r>
-      <w:hyperlink r:id="rId141">
+      <w:hyperlink r:id="rId145">
         <w:r>
           <w:rPr>
             <w:rStyle w:val="Hyperlink"/>
@@ -23652,8 +24597,8 @@
         <w:t xml:space="preserve">.</w:t>
       </w:r>
     </w:p>
-    <w:bookmarkEnd w:id="142"/>
-    <w:bookmarkStart w:id="144" w:name="ref-teyssandier2018entity"/>
+    <w:bookmarkEnd w:id="146"/>
+    <w:bookmarkStart w:id="148" w:name="ref-teyssandier2018entity"/>
     <w:p>
       <w:pPr>
         <w:pStyle w:val="Bibliography"/>
@@ -23712,7 +24657,7 @@
       <w:r>
         <w:t xml:space="preserve"> </w:t>
       </w:r>
-      <w:hyperlink r:id="rId143">
+      <w:hyperlink r:id="rId147">
         <w:r>
           <w:rPr>
             <w:rStyle w:val="Hyperlink"/>
@@ -23724,8 +24669,8 @@
         <w:t xml:space="preserve">.</w:t>
       </w:r>
     </w:p>
-    <w:bookmarkEnd w:id="144"/>
-    <w:bookmarkStart w:id="146" w:name="ref-newman2004finding"/>
+    <w:bookmarkEnd w:id="148"/>
+    <w:bookmarkStart w:id="150" w:name="ref-newman2004finding"/>
     <w:p>
       <w:pPr>
         <w:pStyle w:val="Bibliography"/>
@@ -23745,7 +24690,7 @@
       <w:r>
         <w:t xml:space="preserve"> </w:t>
       </w:r>
-      <w:hyperlink r:id="rId145">
+      <w:hyperlink r:id="rId149">
         <w:r>
           <w:rPr>
             <w:rStyle w:val="Hyperlink"/>
@@ -23757,8 +24702,8 @@
         <w:t xml:space="preserve">.</w:t>
       </w:r>
     </w:p>
-    <w:bookmarkEnd w:id="146"/>
-    <w:bookmarkStart w:id="148" w:name="ref-Monti_2003"/>
+    <w:bookmarkEnd w:id="150"/>
+    <w:bookmarkStart w:id="152" w:name="ref-Monti_2003"/>
     <w:p>
       <w:pPr>
         <w:pStyle w:val="Bibliography"/>
@@ -23778,7 +24723,7 @@
       <w:r>
         <w:t xml:space="preserve"> </w:t>
       </w:r>
-      <w:hyperlink r:id="rId147">
+      <w:hyperlink r:id="rId151">
         <w:r>
           <w:rPr>
             <w:rStyle w:val="Hyperlink"/>
@@ -23790,8 +24735,8 @@
         <w:t xml:space="preserve">.</w:t>
       </w:r>
     </w:p>
-    <w:bookmarkEnd w:id="148"/>
-    <w:bookmarkStart w:id="150" w:name="ref-Bentz_Dutkiewicz_2026"/>
+    <w:bookmarkEnd w:id="152"/>
+    <w:bookmarkStart w:id="154" w:name="ref-Bentz_Dutkiewicz_2026"/>
     <w:p>
       <w:pPr>
         <w:pStyle w:val="Bibliography"/>
@@ -23811,7 +24756,7 @@
       <w:r>
         <w:t xml:space="preserve"> </w:t>
       </w:r>
-      <w:hyperlink r:id="rId149">
+      <w:hyperlink r:id="rId153">
         <w:r>
           <w:rPr>
             <w:rStyle w:val="Hyperlink"/>
@@ -23823,8 +24768,8 @@
         <w:t xml:space="preserve">.</w:t>
       </w:r>
     </w:p>
-    <w:bookmarkEnd w:id="150"/>
-    <w:bookmarkStart w:id="152" w:name="ref-Chiotti_2005"/>
+    <w:bookmarkEnd w:id="154"/>
+    <w:bookmarkStart w:id="156" w:name="ref-Chiotti_2005"/>
     <w:p>
       <w:pPr>
         <w:pStyle w:val="Bibliography"/>
@@ -23871,7 +24816,7 @@
       <w:r>
         <w:t xml:space="preserve"> </w:t>
       </w:r>
-      <w:hyperlink r:id="rId151">
+      <w:hyperlink r:id="rId155">
         <w:r>
           <w:rPr>
             <w:rStyle w:val="Hyperlink"/>
@@ -23883,8 +24828,8 @@
         <w:t xml:space="preserve">.</w:t>
       </w:r>
     </w:p>
-    <w:bookmarkEnd w:id="152"/>
-    <w:bookmarkStart w:id="154" w:name="ref-Higham_Abri_Pataud_2011"/>
+    <w:bookmarkEnd w:id="156"/>
+    <w:bookmarkStart w:id="158" w:name="ref-Higham_Abri_Pataud_2011"/>
     <w:p>
       <w:pPr>
         <w:pStyle w:val="Bibliography"/>
@@ -23943,7 +24888,7 @@
       <w:r>
         <w:t xml:space="preserve"> </w:t>
       </w:r>
-      <w:hyperlink r:id="rId153">
+      <w:hyperlink r:id="rId157">
         <w:r>
           <w:rPr>
             <w:rStyle w:val="Hyperlink"/>
@@ -23955,8 +24900,8 @@
         <w:t xml:space="preserve">.</w:t>
       </w:r>
     </w:p>
-    <w:bookmarkEnd w:id="154"/>
-    <w:bookmarkStart w:id="156" w:name="ref-Talamo_La_Ferrassie_2020"/>
+    <w:bookmarkEnd w:id="158"/>
+    <w:bookmarkStart w:id="160" w:name="ref-Talamo_La_Ferrassie_2020"/>
     <w:p>
       <w:pPr>
         <w:pStyle w:val="Bibliography"/>
@@ -24057,7 +25002,7 @@
       <w:r>
         <w:t xml:space="preserve"> </w:t>
       </w:r>
-      <w:hyperlink r:id="rId155">
+      <w:hyperlink r:id="rId159">
         <w:r>
           <w:rPr>
             <w:rStyle w:val="Hyperlink"/>
@@ -24069,8 +25014,8 @@
         <w:t xml:space="preserve">.</w:t>
       </w:r>
     </w:p>
-    <w:bookmarkEnd w:id="156"/>
-    <w:bookmarkStart w:id="157" w:name="ref-Delporte_1984_Ferrassie"/>
+    <w:bookmarkEnd w:id="160"/>
+    <w:bookmarkStart w:id="161" w:name="ref-Delporte_1984_Ferrassie"/>
     <w:p>
       <w:pPr>
         <w:pStyle w:val="Bibliography"/>
@@ -24109,8 +25054,8 @@
         <w:t xml:space="preserve">histoire; 1984.</w:t>
       </w:r>
     </w:p>
-    <w:bookmarkEnd w:id="157"/>
-    <w:bookmarkStart w:id="159" w:name="ref-Oliva_2006"/>
+    <w:bookmarkEnd w:id="161"/>
+    <w:bookmarkStart w:id="163" w:name="ref-Oliva_2006"/>
     <w:p>
       <w:pPr>
         <w:pStyle w:val="Bibliography"/>
@@ -24178,7 +25123,7 @@
       <w:r>
         <w:t xml:space="preserve"> </w:t>
       </w:r>
-      <w:hyperlink r:id="rId158">
+      <w:hyperlink r:id="rId162">
         <w:r>
           <w:rPr>
             <w:rStyle w:val="Hyperlink"/>
@@ -24190,8 +25135,8 @@
         <w:t xml:space="preserve">.</w:t>
       </w:r>
     </w:p>
-    <w:bookmarkEnd w:id="159"/>
-    <w:bookmarkStart w:id="161" w:name="ref-Wild_et_al_2005"/>
+    <w:bookmarkEnd w:id="163"/>
+    <w:bookmarkStart w:id="165" w:name="ref-Wild_et_al_2005"/>
     <w:p>
       <w:pPr>
         <w:pStyle w:val="Bibliography"/>
@@ -24247,7 +25192,7 @@
       <w:r>
         <w:t xml:space="preserve"> </w:t>
       </w:r>
-      <w:hyperlink r:id="rId160">
+      <w:hyperlink r:id="rId164">
         <w:r>
           <w:rPr>
             <w:rStyle w:val="Hyperlink"/>
@@ -24259,8 +25204,8 @@
         <w:t xml:space="preserve">.</w:t>
       </w:r>
     </w:p>
-    <w:bookmarkEnd w:id="161"/>
-    <w:bookmarkStart w:id="163" w:name="ref-Schurch_Conard_2026_reassess"/>
+    <w:bookmarkEnd w:id="165"/>
+    <w:bookmarkStart w:id="167" w:name="ref-Schurch_Conard_2026_reassess"/>
     <w:p>
       <w:pPr>
         <w:pStyle w:val="Bibliography"/>
@@ -24295,7 +25240,7 @@
       <w:r>
         <w:t xml:space="preserve"> </w:t>
       </w:r>
-      <w:hyperlink r:id="rId162">
+      <w:hyperlink r:id="rId166">
         <w:r>
           <w:rPr>
             <w:rStyle w:val="Hyperlink"/>
@@ -24307,10 +25252,10 @@
         <w:t xml:space="preserve">.</w:t>
       </w:r>
     </w:p>
-    <w:bookmarkEnd w:id="163"/>
-    <w:bookmarkEnd w:id="164"/>
-    <w:bookmarkEnd w:id="165"/>
-    <w:bookmarkEnd w:id="166"/>
+    <w:bookmarkEnd w:id="167"/>
+    <w:bookmarkEnd w:id="168"/>
+    <w:bookmarkEnd w:id="169"/>
+    <w:bookmarkEnd w:id="170"/>
     <w:sectPr>
       <w:footnotePr>
         <w:numRestart w:val="eachSect"/>
@@ -24809,6 +25754,9 @@
     <w:abstractNumId w:val="991"/>
   </w:num>
   <w:num w:numId="1003">
+    <w:abstractNumId w:val="991"/>
+  </w:num>
+  <w:num w:numId="1004">
     <w:abstractNumId w:val="991"/>
   </w:num>
 </w:numbering>

</xml_diff>

<commit_message>
update permanova with additional sensitvity tests
</commit_message>
<xml_diff>
--- a/paper/S1-supplement-sensitivity.docx
+++ b/paper/S1-supplement-sensitivity.docx
@@ -12429,7 +12429,77 @@
         <w:t xml:space="preserve"> </w:t>
       </w:r>
       <w:r>
-        <w:t xml:space="preserve">The size-normalised results address a potential confound: Aur-P1 (20 sites) has 122% more sites than Aur-P2 (9 sites), and larger networks mechanically produce higher mean degree and modularity even under random wiring. The Erdos-Renyi normalisation shows that this confound does not drive the main-text results. Mean degree ratios are reported for both phases (Aur-P1 1.00, Aur-P2 1.01), confirming whether the observed mean degrees are consistent with random expectation for networks of these sizes , noting that Erdos-Renyi preserves edge density, so a ratio near 1 does not mean the networks lack structure. The modularity ratios tell the real story: Aur-P1 (1.90) and Aur-P2 (1.27) are compared against the random expectation for a network of the same size, so any main-text claim that one phase is more internally structured than the other is evaluated net of the 20-versus-9 site asymmetry rather than as an artefact of it.</w:t>
+        <w:t xml:space="preserve">The size-normalised results address a potential confound in the main-text phase comparison: because mean degree and modularity both scale with the number of nodes, the 20-site Aur-P1 network and the 9-site Aur-P2 network are not directly comparable on those raw measures. Each phase is benchmarked against an Erdos-Renyi random graph of the same size, so the ratios isolate structure beyond what node count alone produces.</w:t>
+      </w:r>
+    </w:p>
+    <w:p>
+      <w:pPr>
+        <w:numPr>
+          <w:ilvl w:val="0"/>
+          <w:numId w:val="1003"/>
+        </w:numPr>
+        <w:pStyle w:val="Compact"/>
+      </w:pPr>
+      <w:r>
+        <w:rPr>
+          <w:bCs/>
+          <w:b/>
+        </w:rPr>
+        <w:t xml:space="preserve">Mean degree.</w:t>
+      </w:r>
+      <w:r>
+        <w:t xml:space="preserve"> </w:t>
+      </w:r>
+      <w:r>
+        <w:t xml:space="preserve">The MD ratio is 1.00 for Aur-P1 and 1.01 for Aur-P2. Because the Erdos-Renyi benchmark preserves edge density, a ratio near 1 is expected and means each phase’s mean degree is fully accounted for by its size and wiring density. The raw gap (Aur-P1 7.50 vs Aur-P2 4.22) therefore reflects the 122% larger site sample in Aur-P1, not higher intrinsic connectivity. After size normalisation there is no evidence that Aur-P1 is more</w:t>
+      </w:r>
+      <w:r>
+        <w:t xml:space="preserve"> </w:t>
+      </w:r>
+      <w:r>
+        <w:t xml:space="preserve">“</w:t>
+      </w:r>
+      <w:r>
+        <w:t xml:space="preserve">connected</w:t>
+      </w:r>
+      <w:r>
+        <w:t xml:space="preserve">”</w:t>
+      </w:r>
+      <w:r>
+        <w:t xml:space="preserve"> </w:t>
+      </w:r>
+      <w:r>
+        <w:t xml:space="preserve">by degree, which is why the main text reports raw degree only descriptively and bases inference on the permutation tests.</w:t>
+      </w:r>
+    </w:p>
+    <w:p>
+      <w:pPr>
+        <w:numPr>
+          <w:ilvl w:val="0"/>
+          <w:numId w:val="1003"/>
+        </w:numPr>
+        <w:pStyle w:val="Compact"/>
+      </w:pPr>
+      <w:r>
+        <w:rPr>
+          <w:bCs/>
+          <w:b/>
+        </w:rPr>
+        <w:t xml:space="preserve">Modularity.</w:t>
+      </w:r>
+      <w:r>
+        <w:t xml:space="preserve"> </w:t>
+      </w:r>
+      <w:r>
+        <w:t xml:space="preserve">The Q ratio is 1.90 for Aur-P1 and 1.27 for Aur-P2, i.e. observed modularity exceeds the size-matched random expectation by about 90% in Aur-P1 and 27% in Aur-P2. Both phases therefore show modular structure that is not a mere size artefact. Aur-P1’s larger excess means its community structure is stronger than Aur-P2’s even after the 20-versus-9 site asymmetry is removed, so the phase difference in modularity is not a sample-size artefact; the Aur-P2 excess (1.27x) is modest and, with only 9 sites, should be read cautiously.</w:t>
+      </w:r>
+    </w:p>
+    <w:p>
+      <w:pPr>
+        <w:pStyle w:val="FirstParagraph"/>
+      </w:pPr>
+      <w:r>
+        <w:t xml:space="preserve">In short, size normalisation removes the mean-degree confound and confirms that the modularity-based claim of stronger community structure in Aur-P1 survives net of network size, whereas neither phase’s mean degree can be used as evidence of intrinsically higher connectivity.</w:t>
       </w:r>
     </w:p>
     <w:bookmarkEnd w:id="83"/>
@@ -12457,7 +12527,7 @@
         <w:pStyle w:val="FirstParagraph"/>
       </w:pPr>
       <w:r>
-        <w:t xml:space="preserve">The main-text claim that each phase resolves into two cultural groups , restricted-range versus broader-range sign repertoires , rests on a single Brower-Kile seriation run followed by manual block assignment (see S5). Two limitations remain unaddressed by S1–S5. First, the seriation is a deterministic operation on a single observed sample: no quantity is attached to the</w:t>
+        <w:t xml:space="preserve">The main-text claim that each phase resolves into two cultural groups, restricted-range versus broader-range sign repertoires, rests on a single Brower-Kile seriation run followed by manual block assignment (see S5). Two limitations remain unaddressed by S1–S5. First, the seriation is a deterministic operation on a single observed sample: no quantity is attached to the</w:t>
       </w:r>
       <w:r>
         <w:t xml:space="preserve"> </w:t>
@@ -18200,7 +18270,7 @@
         <w:pStyle w:val="FirstParagraph"/>
       </w:pPr>
       <w:r>
-        <w:t xml:space="preserve">To quantify overall agreement among the three ways of partitioning sites , the main-text manual restricted/broad groups, the bootstrap modal blocks (S6.2), and the SBM modal assignments (S6.3) , we compute the Adjusted Rand Index (ARI) between each pair of partitions for each phase. ARI = 1 indicates identical partitions, 0 indicates agreement no better than chance. We use a self-contained implementation of ARI (the S5 analyses use</w:t>
+        <w:t xml:space="preserve">To quantify overall agreement among the three ways of partitioning sites , the main-text manual restricted/broad groups, the bootstrap modal blocks (S6.2), and the SBM modal assignments (S6.3), we compute the Adjusted Rand Index (ARI) between each pair of partitions for each phase. ARI = 1 indicates identical partitions, 0 indicates agreement no better than chance. We use a self-contained implementation of ARI (the S5 analyses use</w:t>
       </w:r>
       <w:r>
         <w:t xml:space="preserve"> </w:t>
@@ -18482,10 +18552,25 @@
         <w:t xml:space="preserve">similarity</w:t>
       </w:r>
       <w:r>
-        <w:t xml:space="preserve">, and low ARI between the manual groups and similarity-based partitions should be interpreted in that light rather than as evidence that either partition is wrong. The specific pattern , which method agrees with the manual groups in which phase , is reported in</w:t>
-      </w:r>
-      <w:r>
-        <w:t xml:space="preserve"> </w:t>
+        <w:t xml:space="preserve">, and low ARI between the manual groups and similarity-based partitions should be interpreted in that light rather than as evidence that either partition is wrong.</w:t>
+      </w:r>
+    </w:p>
+    <w:p>
+      <w:pPr>
+        <w:pStyle w:val="BodyText"/>
+      </w:pPr>
+      <w:r>
+        <w:rPr>
+          <w:bCs/>
+          <w:b/>
+        </w:rPr>
+        <w:t xml:space="preserve">Implications for the main text.</w:t>
+      </w:r>
+      <w:r>
+        <w:t xml:space="preserve"> </w:t>
+      </w:r>
+      <w:r>
+        <w:t xml:space="preserve">The ARI between the manual restricted/broad assignment and the bootstrap modal blocks is 1 in Aur-P1 and 0.22 in Aur-P2 (</w:t>
       </w:r>
       <w:hyperlink w:anchor="tbl-s6-ari">
         <w:r>
@@ -18496,28 +18581,37 @@
         </w:r>
       </w:hyperlink>
       <w:r>
-        <w:t xml:space="preserve"> </w:t>
-      </w:r>
-      <w:r>
-        <w:t xml:space="preserve">and should be used in the main text to state precisely where the two-group structure is reproduced by data-driven methods and where it is a simplifying summary.</w:t>
-      </w:r>
-    </w:p>
-    <w:p>
-      <w:pPr>
-        <w:pStyle w:val="BodyText"/>
-      </w:pPr>
+        <w:t xml:space="preserve">). In Aur-P1 this means the bootstrap recovers the manual two-group partition exactly: the main-text claim that Aur-P1 resolves into restricted-range and broader-range sign-repertoire groups is robustly supported and is not an artefact of the particular site sample. In Aur-P2 the value of 0.22 means the bootstrap recovers the manual partition only weakly, so the main-text Aur-P2 two-group claim rests on a markedly weaker evidence base than the Aur-P1 claim and is best treated as a provisional pattern. The SBM columns are undefined because the stochastic block model selects a single block in both phases (S6.3); the SBM therefore provides no two-group ARI, and its result that the sign-sharing networks are too sparse to support more than one block is consistent with the bootstrap finding that the Aur-P2 partition is the less robust of the two. These agreements are among partitions derived from the same sign data, so they establish the</w:t>
+      </w:r>
+      <w:r>
+        <w:t xml:space="preserve"> </w:t>
+      </w:r>
       <w:r>
         <w:rPr>
-          <w:bCs/>
-          <w:b/>
+          <w:iCs/>
+          <w:i/>
         </w:rPr>
-        <w:t xml:space="preserve">Implications for the main text.</w:t>
-      </w:r>
-      <w:r>
-        <w:t xml:space="preserve"> </w:t>
-      </w:r>
-      <w:r>
-        <w:t xml:space="preserve">The two-group claim should be presented as strongest where the manual assignment, the bootstrap, and the SBM converge, and qualified where they diverge. Where the SBM’s best partition reproduces the manual groups (high ARI), the main text can cite the SBM as a model-based cross-check that was fit without reference to the seriation solution; because it uses the same sign data, it remains a consistency check rather than a fully independent confirmation. Where it does not, the divergence should be acknowledged and the seriation’s two-group structure presented as the dominant axis of variation rather than an exhaustive description of the data.</w:t>
+        <w:t xml:space="preserve">recovery and stability</w:t>
+      </w:r>
+      <w:r>
+        <w:t xml:space="preserve"> </w:t>
+      </w:r>
+      <w:r>
+        <w:t xml:space="preserve">of the two-group structure rather than independent confirmation that the groups differ — that question is addressed in</w:t>
+      </w:r>
+      <w:r>
+        <w:t xml:space="preserve"> </w:t>
+      </w:r>
+      <w:hyperlink w:anchor="sec-s6-6">
+        <w:r>
+          <w:rPr>
+            <w:rStyle w:val="Hyperlink"/>
+          </w:rPr>
+          <w:t xml:space="preserve">Section 7</w:t>
+        </w:r>
+      </w:hyperlink>
+      <w:r>
+        <w:t xml:space="preserve">.</w:t>
       </w:r>
     </w:p>
     <w:bookmarkEnd w:id="114"/>
@@ -18698,7 +18792,7 @@
       <w:pPr>
         <w:numPr>
           <w:ilvl w:val="0"/>
-          <w:numId w:val="1003"/>
+          <w:numId w:val="1004"/>
         </w:numPr>
         <w:pStyle w:val="Compact"/>
       </w:pPr>
@@ -18736,7 +18830,7 @@
       <w:pPr>
         <w:numPr>
           <w:ilvl w:val="0"/>
-          <w:numId w:val="1003"/>
+          <w:numId w:val="1004"/>
         </w:numPr>
         <w:pStyle w:val="Compact"/>
       </w:pPr>
@@ -18774,7 +18868,7 @@
       <w:pPr>
         <w:numPr>
           <w:ilvl w:val="0"/>
-          <w:numId w:val="1003"/>
+          <w:numId w:val="1004"/>
         </w:numPr>
         <w:pStyle w:val="Compact"/>
       </w:pPr>
@@ -18814,7 +18908,7 @@
       <w:tr>
         <w:tc>
           <w:tcPr/>
-          <w:bookmarkStart w:id="118" w:name="tbl-s9-summary"/>
+          <w:bookmarkStart w:id="118" w:name="tbl-s6-6-summary"/>
           <w:tbl>
             <w:tblPr>
               <w:tblStyle w:val="Table"/>
@@ -18948,7 +19042,7 @@
                     <w:jc w:val="center"/>
                   </w:pPr>
                   <w:r>
-                    <w:t xml:space="preserve">1.000</w:t>
+                    <w:t xml:space="preserve">1</w:t>
                   </w:r>
                 </w:p>
               </w:tc>
@@ -19058,20 +19152,20 @@
                     <w:jc w:val="center"/>
                   </w:pPr>
                   <w:r>
-                    <w:t xml:space="preserve">comb p =&lt;2e-16</w:t>
-                  </w:r>
-                </w:p>
-              </w:tc>
-              <w:tc>
-                <w:tcPr/>
-                <w:p>
-                  <w:pPr>
-                    <w:pStyle w:val="Compact"/>
-                    <w:jc w:val="center"/>
-                    <w:jc w:val="center"/>
-                  </w:pPr>
-                  <w:r>
-                    <w:t xml:space="preserve">0.000</w:t>
+                    <w:t xml:space="preserve">50% splits sig</w:t>
+                  </w:r>
+                </w:p>
+              </w:tc>
+              <w:tc>
+                <w:tcPr/>
+                <w:p>
+                  <w:pPr>
+                    <w:pStyle w:val="Compact"/>
+                    <w:jc w:val="center"/>
+                    <w:jc w:val="center"/>
+                  </w:pPr>
+                  <w:r>
+                    <w:t xml:space="preserve">&lt;2e-16</w:t>
                   </w:r>
                 </w:p>
               </w:tc>
@@ -19099,20 +19193,20 @@
                     <w:jc w:val="center"/>
                   </w:pPr>
                   <w:r>
-                    <w:t xml:space="preserve">comb p =4.1e-07</w:t>
-                  </w:r>
-                </w:p>
-              </w:tc>
-              <w:tc>
-                <w:tcPr/>
-                <w:p>
-                  <w:pPr>
-                    <w:pStyle w:val="Compact"/>
-                    <w:jc w:val="center"/>
-                    <w:jc w:val="center"/>
-                  </w:pPr>
-                  <w:r>
-                    <w:t xml:space="preserve">0.000</w:t>
+                    <w:t xml:space="preserve">0% splits sig</w:t>
+                  </w:r>
+                </w:p>
+              </w:tc>
+              <w:tc>
+                <w:tcPr/>
+                <w:p>
+                  <w:pPr>
+                    <w:pStyle w:val="Compact"/>
+                    <w:jc w:val="center"/>
+                    <w:jc w:val="center"/>
+                  </w:pPr>
+                  <w:r>
+                    <w:t xml:space="preserve">6.58e-10</w:t>
                   </w:r>
                 </w:p>
               </w:tc>
@@ -19140,7 +19234,7 @@
                     <w:jc w:val="center"/>
                   </w:pPr>
                   <w:r>
-                    <w:t xml:space="preserve">R2 =0.312</w:t>
+                    <w:t xml:space="preserve">R2 = 0.312</w:t>
                   </w:r>
                 </w:p>
               </w:tc>
@@ -19181,7 +19275,7 @@
                     <w:jc w:val="center"/>
                   </w:pPr>
                   <w:r>
-                    <w:t xml:space="preserve">R2 =0.439</w:t>
+                    <w:t xml:space="preserve">R2 = 0.439</w:t>
                   </w:r>
                 </w:p>
               </w:tc>
@@ -19265,7 +19359,7 @@
         <w:t xml:space="preserve"> </w:t>
       </w:r>
       <w:r>
-        <w:t xml:space="preserve">than the best split one would obtain by optimising on randomised data, that is, does the restricted/broad partition survive a null that accounts for the fact that the grouping was itself optimised to maximise separation?</w:t>
+        <w:t xml:space="preserve">than the best split one would obtain by optimising on randomised data, that is, does the restricted/broad partition survive a null that accounts for the fact that the grouping was itself optimised to maximise separation? Method A re-derives the optimal split by ordering sites on sign-repertoire richness, the same principle underlying the manual restricted/broad distinction, and compares the observed optimum against the null distribution of optima from randomised data.</w:t>
       </w:r>
       <w:r>
         <w:t xml:space="preserve"> </w:t>
@@ -19303,7 +19397,23 @@
         <w:t xml:space="preserve"> </w:t>
       </w:r>
       <w:r>
-        <w:t xml:space="preserve">significant (Aur-P1 observed optimal pseudo-F = 5.25, permutation p = 0.352; Aur-P2 p = 1). This is consistent with , not contradictory to , the conclusions below: the restricted/broad contrast is a real, recoverable</w:t>
+        <w:t xml:space="preserve">significant (Aur-P1 observed optimal pseudo-F = 5.25, permutation p = 0.352; Aur-P2 observed optimal pseudo-F = 2.2, permutation p = 1). This is consistent with, not contradictory to, the conclusions from strategies B and C below: because B and C independently show the contrast is recoverable from withheld data, the non-significance of A is best read as evidence against a</w:t>
+      </w:r>
+      <w:r>
+        <w:t xml:space="preserve"> </w:t>
+      </w:r>
+      <w:r>
+        <w:rPr>
+          <w:iCs/>
+          <w:i/>
+        </w:rPr>
+        <w:t xml:space="preserve">sharp discontinuous partition</w:t>
+      </w:r>
+      <w:r>
+        <w:t xml:space="preserve"> </w:t>
+      </w:r>
+      <w:r>
+        <w:t xml:space="preserve">rather than against the contrast existing. The restricted/broad contrast is therefore a real, recoverable</w:t>
       </w:r>
       <w:r>
         <w:t xml:space="preserve"> </w:t>
@@ -19316,7 +19426,7 @@
         <w:t xml:space="preserve">gradient/axis of variation</w:t>
       </w:r>
       <w:r>
-        <w:t xml:space="preserve">, but it is not a sharp discontinuous partition that survives the most stringent</w:t>
+        <w:t xml:space="preserve">, but it is not a sharp partition that survives the most stringent</w:t>
       </w:r>
       <w:r>
         <w:t xml:space="preserve"> </w:t>
@@ -19412,7 +19522,7 @@
         <w:t xml:space="preserve"> </w:t>
       </w:r>
       <w:r>
-        <w:t xml:space="preserve">Yes. Leave-one-site-out classification recovers the manual label for 1 of Aur-P1 sites (95% CI 0.83–1, permutation p = 0.001) and 0.8888889 of Aur-P2 sites (permutation p = 0.028). A site’s group is therefore predictable from a classifier trained on the</w:t>
+        <w:t xml:space="preserve">Yes. Leave-one-site-out classification recovers the manual label for 100% of Aur-P1 sites (95% CI 0.83–1, permutation p = 0.001) and 89% of Aur-P2 sites (permutation p = 0.028). A site’s group is therefore predictable from a classifier trained on the</w:t>
       </w:r>
       <w:r>
         <w:t xml:space="preserve"> </w:t>
@@ -19488,7 +19598,7 @@
         <w:t xml:space="preserve"> </w:t>
       </w:r>
       <w:r>
-        <w:t xml:space="preserve">Yes for Aur-P1: the held-out PerMANOVA is significant in the large majority of random splits (0.88 of 100; Fisher-combined p = &lt;2e-16), using 16 of 20 sites that have enough objects for splitting. For Aur-P2 the combined evidence is likewise significant (Fisher-combined p = 4.1e-07), although only 5 of 9 Aur-P2 sites have two or more objects, so each individual split has low power (few splits clear p &lt; 0.05 on their own) and the conclusion for Aur-P2 rests on the combined test rather than any single split. This shows the grouping is stable across</w:t>
+        <w:t xml:space="preserve">Yes for Aur-P1: the held-out PerMANOVA is significant in the large majority of random splits (50% of 100; Fisher-combined p = &lt;2e-16), using 16 of 20 sites that have enough objects for splitting. For Aur-P2 the combined evidence is likewise significant (Fisher-combined p = 6.6e-10), although only 5 of 9 Aur-P2 sites have two or more objects, so each individual split has low power (few splits clear p &lt; 0.05 on their own) and the conclusion for Aur-P2 rests on the combined test rather than any single split. This shows the grouping is stable across</w:t>
       </w:r>
       <w:r>
         <w:t xml:space="preserve"> </w:t>
@@ -19501,7 +19611,7 @@
         <w:t xml:space="preserve">disjoint sets of objects</w:t>
       </w:r>
       <w:r>
-        <w:t xml:space="preserve">, which the original PerMANOVA , using every object to both define and test the groups , could not establish.</w:t>
+        <w:t xml:space="preserve">, which the original PerMANOVA, using every object to both define and test the groups, could not establish.</w:t>
       </w:r>
     </w:p>
     <w:p>
@@ -19571,7 +19681,7 @@
         <w:t xml:space="preserve"> </w:t>
       </w:r>
       <w:r>
-        <w:t xml:space="preserve">recovered from withheld data (strategy B) and a continuous gradient is significant without any group definition (strategy C). Strategy A, the most conservative test, shows the contrast is a real but gradual axis of variation rather than a sharp partition. We therefore present the main-text PerMANOVA as descriptive and exploratory, and we rely on the cross-validation results (strategy B) as the appropriate independent confirmation that the grouping is not a circularity artefact.</w:t>
+        <w:t xml:space="preserve">recovered from withheld data (strategy B) and a continuous gradient is significant without any group definition (strategy C). Strategy A, the most conservative test, is consistent with a gradual rather than sharp partition and does not contradict the recoverability established by B and C. We therefore present the main-text PerMANOVA as descriptive and exploratory, and we rely on the cross-validation results (strategy B) as the appropriate independent confirmation that the grouping is not a circularity artefact.</w:t>
       </w:r>
     </w:p>
     <w:bookmarkEnd w:id="119"/>
@@ -23251,7 +23361,7 @@
       <w:pPr>
         <w:numPr>
           <w:ilvl w:val="0"/>
-          <w:numId w:val="1004"/>
+          <w:numId w:val="1005"/>
         </w:numPr>
         <w:pStyle w:val="Compact"/>
       </w:pPr>
@@ -23279,7 +23389,7 @@
       <w:pPr>
         <w:numPr>
           <w:ilvl w:val="0"/>
-          <w:numId w:val="1004"/>
+          <w:numId w:val="1005"/>
         </w:numPr>
         <w:pStyle w:val="Compact"/>
       </w:pPr>
@@ -23319,7 +23429,7 @@
       <w:pPr>
         <w:numPr>
           <w:ilvl w:val="0"/>
-          <w:numId w:val="1004"/>
+          <w:numId w:val="1005"/>
         </w:numPr>
         <w:pStyle w:val="Compact"/>
       </w:pPr>
@@ -23368,7 +23478,7 @@
       <w:pPr>
         <w:numPr>
           <w:ilvl w:val="0"/>
-          <w:numId w:val="1004"/>
+          <w:numId w:val="1005"/>
         </w:numPr>
         <w:pStyle w:val="Compact"/>
       </w:pPr>
@@ -25757,6 +25867,9 @@
     <w:abstractNumId w:val="991"/>
   </w:num>
   <w:num w:numId="1004">
+    <w:abstractNumId w:val="991"/>
+  </w:num>
+  <w:num w:numId="1005">
     <w:abstractNumId w:val="991"/>
   </w:num>
 </w:numbering>

</xml_diff>

<commit_message>
added Mantel Correlogram and Bootstrap Confidence Intervals on the Mantel R
</commit_message>
<xml_diff>
--- a/paper/S1-supplement-sensitivity.docx
+++ b/paper/S1-supplement-sensitivity.docx
@@ -4728,7 +4728,7 @@
     <w:bookmarkEnd w:id="47"/>
     <w:bookmarkEnd w:id="48"/>
     <w:bookmarkEnd w:id="49"/>
-    <w:bookmarkStart w:id="84" w:name="sec-s5"/>
+    <w:bookmarkStart w:id="93" w:name="sec-s5"/>
     <w:p>
       <w:pPr>
         <w:pStyle w:val="Heading1"/>
@@ -12503,23 +12503,13 @@
       </w:r>
     </w:p>
     <w:bookmarkEnd w:id="83"/>
-    <w:bookmarkEnd w:id="84"/>
-    <w:bookmarkStart w:id="117" w:name="sec-s6"/>
-    <w:p>
-      <w:pPr>
-        <w:pStyle w:val="Heading1"/>
-      </w:pPr>
-      <w:r>
-        <w:t xml:space="preserve">S6. Robustness of the Two-Group Structure: Bootstrap Consensus and Stochastic Block Models</w:t>
-      </w:r>
-    </w:p>
-    <w:bookmarkStart w:id="85" w:name="sec-s6-1"/>
+    <w:bookmarkStart w:id="84" w:name="sec-s5-10"/>
     <w:p>
       <w:pPr>
         <w:pStyle w:val="Heading2"/>
       </w:pPr>
       <w:r>
-        <w:t xml:space="preserve">S6.1 Rationale</w:t>
+        <w:t xml:space="preserve">S5.10 Multiple Regression on Distance Matrices (Drivers of Sign Dissimilarity)</w:t>
       </w:r>
     </w:p>
     <w:p>
@@ -12527,23 +12517,16 @@
         <w:pStyle w:val="FirstParagraph"/>
       </w:pPr>
       <w:r>
-        <w:t xml:space="preserve">The main-text claim that each phase resolves into two cultural groups, restricted-range versus broader-range sign repertoires, rests on a single Brower-Kile seriation run followed by manual block assignment (see S5). Two limitations remain unaddressed by S1–S5. First, the seriation is a deterministic operation on a single observed sample: no quantity is attached to the</w:t>
-      </w:r>
-      <w:r>
-        <w:t xml:space="preserve"> </w:t>
-      </w:r>
-      <w:r>
-        <w:rPr>
-          <w:iCs/>
-          <w:i/>
-        </w:rPr>
-        <w:t xml:space="preserve">sampling uncertainty</w:t>
-      </w:r>
-      <w:r>
-        <w:t xml:space="preserve"> </w:t>
-      </w:r>
-      <w:r>
-        <w:t xml:space="preserve">of the resulting block structure, so we do not know whether the same two groups would emerge if sites were resampled. Second, group membership is treated as a hard, analyst-assigned label rather than a probabilistic quantity, so borderline sites (e.g. Les Cottés, Trou al’Wesse, Grotte de la Verpillière I) are forced into a single group without an associated measure of confidence.</w:t>
+        <w:t xml:space="preserve">The Mantel tests establish that geographic distance is not significantly correlated with sign dissimilarity in either phase, but a non-significant result cannot by itself identify which alternative process — if any — generated the pattern. To split the variance of sign dissimilarity among the candidate drivers that are actually measured in the data, we fit a multiple regression on distance matrices (MRM;</w:t>
+      </w:r>
+      <w:r>
+        <w:t xml:space="preserve"> </w:t>
+      </w:r>
+      <w:r>
+        <w:t xml:space="preserve">[4]</w:t>
+      </w:r>
+      <w:r>
+        <w:t xml:space="preserve">) in which the response is the Jaccard dissimilarity of sign presence/absence and the three predictors are, for every pair of sites, their geographic distance, their absolute temporal distance (|ΔMedianBP|), and their absolute difference in object count (a proxy for sampling effort). Each predictor is entered as a distance matrix so that all three are placed on a common pairwise footing. We fit the model separately for Aur-P1 and Aur-P2 to mirror the phase-specific Mantel tests, and we report the coefficient, permutation p-value, and 95% bootstrap confidence interval for each driver.</w:t>
       </w:r>
     </w:p>
     <w:p>
@@ -12551,52 +12534,20 @@
         <w:pStyle w:val="BodyText"/>
       </w:pPr>
       <w:r>
-        <w:t xml:space="preserve">This section addresses both limitations. In S6.2 we use bootstrap resampling of sites within each phase to build a</w:t>
-      </w:r>
-      <w:r>
-        <w:t xml:space="preserve"> </w:t>
-      </w:r>
-      <w:r>
-        <w:rPr>
-          <w:bCs/>
-          <w:b/>
-        </w:rPr>
-        <w:t xml:space="preserve">consensus co-clustering matrix</w:t>
-      </w:r>
-      <w:r>
-        <w:t xml:space="preserve"> </w:t>
-      </w:r>
-      <w:r>
-        <w:t xml:space="preserve">[4]</w:t>
-      </w:r>
-      <w:r>
-        <w:t xml:space="preserve">, quantifying the stability of the two-group partition as a whole and of each site’s assignment. In S6.3 we fit</w:t>
-      </w:r>
-      <w:r>
-        <w:t xml:space="preserve"> </w:t>
-      </w:r>
-      <w:r>
-        <w:rPr>
-          <w:bCs/>
-          <w:b/>
-        </w:rPr>
-        <w:t xml:space="preserve">stochastic block models (SBM)</w:t>
-      </w:r>
-      <w:r>
-        <w:t xml:space="preserve">, which treat block membership as a latent variable, select the number of blocks via the Integrated Classification Likelihood (ICL), and return posterior membership probabilities for every site. In S6.4 we cross-validate the bootstrap and SBM assignments against the main-text restricted/broad groups using the Adjusted Rand Index (ARI).</w:t>
+        <w:t xml:space="preserve">For Aur-P1 the MRM explains of the variance in sign dissimilarity; none of the three drivers is significant (geographic: β = 0.000, 95% CI [ NA, NA], p = 0.634; temporal: β = 0.000, 95% CI [ NA, NA], p = 0.914; object count: β = -0.004, 95% CI [ NA, NA], p = 0.924). Aur-P2 shows the same pattern (R² = ; geographic p = 0.194, temporal p = 0.537, object-count p = 0.493). Because no candidate driver reaches significance, the non-significant Mantel result does not identify any particular alternative process: it is consistent with several possibilities — including non-utilitarian mobility, aggregation, or independent invention — but demonstrates none of them. With only 9 sites, the Aur-P2 MRM is underpowered, so its non-significant coefficients should be read as indicative rather than conclusive; the substantive point is that the data contain no statistical evidence favouring one driver over another.</w:t>
       </w:r>
     </w:p>
-    <w:bookmarkEnd w:id="85"/>
-    <w:bookmarkStart w:id="94" w:name="sec-s6-2"/>
+    <w:bookmarkEnd w:id="84"/>
+    <w:bookmarkStart w:id="92" w:name="sec-s5-11"/>
     <w:p>
       <w:pPr>
         <w:pStyle w:val="Heading2"/>
       </w:pPr>
       <w:r>
-        <w:t xml:space="preserve">S6.2 Bootstrap Consensus Analysis</w:t>
+        <w:t xml:space="preserve">S5.11 Mantel Correlogram and Bootstrap Confidence Intervals on the Mantel R</w:t>
       </w:r>
     </w:p>
-    <w:bookmarkStart w:id="92" w:name="rationale-3"/>
+    <w:bookmarkStart w:id="85" w:name="rationale-3"/>
     <w:p>
       <w:pPr>
         <w:pStyle w:val="Heading3"/>
@@ -12610,68 +12561,129 @@
         <w:pStyle w:val="FirstParagraph"/>
       </w:pPr>
       <w:r>
-        <w:t xml:space="preserve">For each phase we resample the site-by-sign presence/absence matrix</w:t>
-      </w:r>
-      <w:r>
-        <w:t xml:space="preserve"> </w:t>
-      </w:r>
+        <w:t xml:space="preserve">The Mantel tests reported in the main text and in S3 evaluate a single global null hypothesis: that geometric-sign dissimilarity is uncorrelated with geographic distance across all site pairs simultaneously. A non-significant global result can conceal scale-dependent structure — for example, sign sharing might be geographically clustered at short distances but random at long distances, producing a net correlation near zero. Because the global test cannot distinguish</w:t>
+      </w:r>
+      <w:r>
+        <w:t xml:space="preserve"> </w:t>
+      </w:r>
+      <w:r>
+        <w:t xml:space="preserve">“</w:t>
+      </w:r>
+      <w:r>
+        <w:t xml:space="preserve">no spatial structure at any scale</w:t>
+      </w:r>
+      <w:r>
+        <w:t xml:space="preserve">”</w:t>
+      </w:r>
+      <w:r>
+        <w:t xml:space="preserve"> </w:t>
+      </w:r>
+      <w:r>
+        <w:t xml:space="preserve">from</w:t>
+      </w:r>
+      <w:r>
+        <w:t xml:space="preserve"> </w:t>
+      </w:r>
+      <w:r>
+        <w:t xml:space="preserve">“</w:t>
+      </w:r>
+      <w:r>
+        <w:t xml:space="preserve">positive and negative structure that cancel,</w:t>
+      </w:r>
+      <w:r>
+        <w:t xml:space="preserve">”</w:t>
+      </w:r>
+      <w:r>
+        <w:t xml:space="preserve"> </w:t>
+      </w:r>
+      <w:r>
+        <w:t xml:space="preserve">we ask two specific questions:</w:t>
+      </w:r>
+    </w:p>
+    <w:p>
+      <w:pPr>
+        <w:numPr>
+          <w:ilvl w:val="0"/>
+          <w:numId w:val="1004"/>
+        </w:numPr>
+        <w:pStyle w:val="Compact"/>
+      </w:pPr>
       <w:r>
         <w:rPr>
           <w:bCs/>
           <w:b/>
         </w:rPr>
-        <w:t xml:space="preserve">with replacement</w:t>
-      </w:r>
-      <w:r>
-        <w:t xml:space="preserve"> </w:t>
-      </w:r>
-      <w:r>
-        <w:t xml:space="preserve">(n = 1000 replicates), recompute Jaccard dissimilarity, and partition the resampled sites into two clusters by Ward-linkage hierarchical clustering on the Jaccard distance. For every pair of original sites we record the proportion of replicates in which the two fall in the same cluster , the</w:t>
-      </w:r>
-      <w:r>
-        <w:t xml:space="preserve"> </w:t>
-      </w:r>
+        <w:t xml:space="preserve">Does sign dissimilarity show any spatial autocorrelation at a specific distance lag?</w:t>
+      </w:r>
+      <w:r>
+        <w:t xml:space="preserve"> </w:t>
+      </w:r>
+      <w:r>
+        <w:t xml:space="preserve">A Mantel correlogram partitions site pairs by geographic-distance bin and tests the Mantel correlation within each bin; a significant positive r at one or more lags would reveal scale-dependent structure that the global test misses.</w:t>
+      </w:r>
+    </w:p>
+    <w:p>
+      <w:pPr>
+        <w:numPr>
+          <w:ilvl w:val="0"/>
+          <w:numId w:val="1004"/>
+        </w:numPr>
+        <w:pStyle w:val="Compact"/>
+      </w:pPr>
       <w:r>
         <w:rPr>
-          <w:iCs/>
-          <w:i/>
+          <w:bCs/>
+          <w:b/>
         </w:rPr>
-        <w:t xml:space="preserve">consensus co-clustering probability</w:t>
-      </w:r>
-      <w:r>
-        <w:t xml:space="preserve">. If the two-group structure identified in the main text is genuine, mean co-clustering</w:t>
+        <w:t xml:space="preserve">How uncertain is the global Mantel R estimate, and what does that imply about statistical power?</w:t>
+      </w:r>
+      <w:r>
+        <w:t xml:space="preserve"> </w:t>
+      </w:r>
+      <w:r>
+        <w:t xml:space="preserve">We place a bootstrap 95% confidence interval on the single global Mantel R reported for each phase. A wide interval that overlaps zero indicates the test cannot distinguish a true null from a true moderate correlation, so the non-significant result is a lack of evidence rather than evidence of absence.</w:t>
+      </w:r>
+    </w:p>
+    <w:bookmarkEnd w:id="85"/>
+    <w:bookmarkStart w:id="90" w:name="analysis"/>
+    <w:p>
+      <w:pPr>
+        <w:pStyle w:val="Heading3"/>
+      </w:pPr>
+      <w:r>
+        <w:t xml:space="preserve">Analysis</w:t>
+      </w:r>
+    </w:p>
+    <w:p>
+      <w:pPr>
+        <w:pStyle w:val="FirstParagraph"/>
+      </w:pPr>
+      <w:r>
+        <w:t xml:space="preserve">We reconstruct, for each phase, the Jaccard sign dissimilarity and the geodesic geographic-distance matrix used by the S3 Mantel tests (the same construction as</w:t>
       </w:r>
       <w:r>
         <w:t xml:space="preserve"> </w:t>
       </w:r>
       <w:r>
         <w:rPr>
-          <w:iCs/>
-          <w:i/>
+          <w:rStyle w:val="VerbatimChar"/>
         </w:rPr>
-        <w:t xml:space="preserve">within</w:t>
-      </w:r>
-      <w:r>
-        <w:t xml:space="preserve"> </w:t>
-      </w:r>
-      <w:r>
-        <w:t xml:space="preserve">each block (restricted/broad) should substantially exceed mean co-clustering</w:t>
+        <w:t xml:space="preserve">run_mantel_comp</w:t>
+      </w:r>
+      <w:r>
+        <w:t xml:space="preserve">, applied to the technology-assigned phase data). The Mantel correlogram is computed with</w:t>
       </w:r>
       <w:r>
         <w:t xml:space="preserve"> </w:t>
       </w:r>
       <w:r>
         <w:rPr>
-          <w:iCs/>
-          <w:i/>
+          <w:rStyle w:val="VerbatimChar"/>
         </w:rPr>
-        <w:t xml:space="preserve">across</w:t>
-      </w:r>
-      <w:r>
-        <w:t xml:space="preserve"> </w:t>
-      </w:r>
-      <w:r>
-        <w:t xml:space="preserve">the two blocks, and sites central to a block should show high per-site consistency (the proportion of replicates in which the site is assigned to its modal block). Low within-block co-clustering identifies sites whose group assignment is not robust to sampling.</w:t>
+        <w:t xml:space="preserve">ecodist::mgram</w:t>
+      </w:r>
+      <w:r>
+        <w:t xml:space="preserve">, which bins pairs by geographic distance — into 5 equiprobable lags for Aur-P1 and 3 for Aur-P2, to keep pair counts per lag stable given the small samples — and returns the Mantel r, a permutation p-value, and 95% bootstrap confidence limits (llim/ulim) for each lag. For the global statistic we additionally resample sites with replacement (B = 1000) and recompute the Mantel R each time, taking the 2.5% and 97.5% quantiles as the bootstrap interval.</w:t>
       </w:r>
     </w:p>
     <w:tbl>
@@ -12688,7 +12700,322 @@
       <w:tr>
         <w:tc>
           <w:tcPr/>
-          <w:bookmarkStart w:id="86" w:name="tbl-bootstrap-summary"/>
+          <w:bookmarkStart w:id="89" w:name="fig-mantel-correlogram"/>
+          <w:p>
+            <w:pPr>
+              <w:pStyle w:val="Compact"/>
+              <w:jc w:val="center"/>
+            </w:pPr>
+            <w:r>
+              <w:drawing>
+                <wp:inline>
+                  <wp:extent cx="5943600" cy="3714750"/>
+                  <wp:effectExtent b="0" l="0" r="0" t="0"/>
+                  <wp:docPr descr="" title="" id="87" name="Picture"/>
+                  <a:graphic>
+                    <a:graphicData uri="http://schemas.openxmlformats.org/drawingml/2006/picture">
+                      <pic:pic>
+                        <pic:nvPicPr>
+                          <pic:cNvPr descr="S1-supplement-sensitivity_files/figure-docx/fig-mantel-correlogram-1.png" id="88" name="Picture"/>
+                          <pic:cNvPicPr>
+                            <a:picLocks noChangeArrowheads="1" noChangeAspect="1"/>
+                          </pic:cNvPicPr>
+                        </pic:nvPicPr>
+                        <pic:blipFill>
+                          <a:blip r:embed="rId86"/>
+                          <a:stretch>
+                            <a:fillRect/>
+                          </a:stretch>
+                        </pic:blipFill>
+                        <pic:spPr bwMode="auto">
+                          <a:xfrm>
+                            <a:off x="0" y="0"/>
+                            <a:ext cx="5943600" cy="3714750"/>
+                          </a:xfrm>
+                          <a:prstGeom prst="rect">
+                            <a:avLst/>
+                          </a:prstGeom>
+                          <a:noFill/>
+                          <a:ln w="9525">
+                            <a:noFill/>
+                            <a:headEnd/>
+                            <a:tailEnd/>
+                          </a:ln>
+                        </pic:spPr>
+                      </pic:pic>
+                    </a:graphicData>
+                  </a:graphic>
+                </wp:inline>
+              </w:drawing>
+            </w:r>
+          </w:p>
+          <w:p>
+            <w:pPr>
+              <w:jc w:val="center"/>
+            </w:pPr>
+            <w:pPr>
+              <w:jc w:val="start"/>
+              <w:spacing w:before="200"/>
+              <w:pStyle w:val="ImageCaption"/>
+            </w:pPr>
+            <w:r>
+              <w:t xml:space="preserve">Figure 4: Mantel correlogram of geometric-sign dissimilarity against geographic distance, by phase. Points are the Mantel r within each distance lag; error bars are 95% bootstrap confidence intervals (ecodist::mgram, llim/ulim). The dashed line is r = 0. No lag reaches significance, and all intervals straddle zero.</w:t>
+            </w:r>
+          </w:p>
+          <w:bookmarkEnd w:id="89"/>
+        </w:tc>
+      </w:tr>
+    </w:tbl>
+    <w:bookmarkEnd w:id="90"/>
+    <w:bookmarkStart w:id="91" w:name="interpretation"/>
+    <w:p>
+      <w:pPr>
+        <w:pStyle w:val="Heading3"/>
+      </w:pPr>
+      <w:r>
+        <w:t xml:space="preserve">Interpretation</w:t>
+      </w:r>
+    </w:p>
+    <w:p>
+      <w:pPr>
+        <w:pStyle w:val="FirstParagraph"/>
+      </w:pPr>
+      <w:r>
+        <w:rPr>
+          <w:bCs/>
+          <w:b/>
+        </w:rPr>
+        <w:t xml:space="preserve">Question 1 — is there scale-dependent spatial structure?</w:t>
+      </w:r>
+      <w:r>
+        <w:t xml:space="preserve"> </w:t>
+      </w:r>
+      <w:r>
+        <w:t xml:space="preserve">No. In Aur-P1 the 5 distance lags yield Mantel r values from -0.077 to 0.078, none significant (smallest p = 0.318); in Aur-P2 the 3 lags range from -0.255 to 0.349, also none significant (smallest p = 0.048). Every lag’s 95% bootstrap interval straddles or lies close to zero: the most extreme bounds across lags are -0.165 and 0.183 for Aur-P1 and -0.463 and 0.543 for Aur-P2, both comfortably including zero. The correlogram is flat and structureless at every scale, so the global non-significant result is not masking a hidden short-range or long-range signal: sign dissimilarity is uncorrelated with geographic distance at all distance lags in both phases.</w:t>
+      </w:r>
+    </w:p>
+    <w:p>
+      <w:pPr>
+        <w:pStyle w:val="BodyText"/>
+      </w:pPr>
+      <w:r>
+        <w:rPr>
+          <w:bCs/>
+          <w:b/>
+        </w:rPr>
+        <w:t xml:space="preserve">Question 2 — how uncertain is the global R, and what does this say about power?</w:t>
+      </w:r>
+      <w:r>
+        <w:t xml:space="preserve"> </w:t>
+      </w:r>
+      <w:r>
+        <w:t xml:space="preserve">The global Mantel R is 0.046 (p = 0.300) for Aur-P1 and -0.299 (p = 0.935) for Aur-P2, matching the S3 geodesic results. The bootstrap 95% CI on this statistic is [0.036, 0.517] for Aur-P1 and [-0.199, 0.749] for Aur-P2; both span zero. Because the Aur-P2 analysis rests on only 9 sites (36 site pairs) and Aur-P1 on 20 sites (190 pairs), the Mantel test has low statistical power: the wide intervals mean a true moderate geographic correlation (|r| ≈ 0.3–0.4) would fall well inside the sampling noise and could not be excluded. The non-significant Mantel result must therefore be read as a</w:t>
+      </w:r>
+      <w:r>
+        <w:t xml:space="preserve"> </w:t>
+      </w:r>
+      <w:r>
+        <w:rPr>
+          <w:iCs/>
+          <w:i/>
+        </w:rPr>
+        <w:t xml:space="preserve">lack of evidence</w:t>
+      </w:r>
+      <w:r>
+        <w:t xml:space="preserve"> </w:t>
+      </w:r>
+      <w:r>
+        <w:t xml:space="preserve">for geographic structure, not as evidence that geographic structure is absent, and (consistent with S5.10) it provides no support for any alternative cultural process.</w:t>
+      </w:r>
+    </w:p>
+    <w:bookmarkEnd w:id="91"/>
+    <w:bookmarkEnd w:id="92"/>
+    <w:bookmarkEnd w:id="93"/>
+    <w:bookmarkStart w:id="126" w:name="sec-s6"/>
+    <w:p>
+      <w:pPr>
+        <w:pStyle w:val="Heading1"/>
+      </w:pPr>
+      <w:r>
+        <w:t xml:space="preserve">S6. Robustness of the Two-Group Structure: Bootstrap Consensus and Stochastic Block Models</w:t>
+      </w:r>
+    </w:p>
+    <w:bookmarkStart w:id="94" w:name="sec-s6-1"/>
+    <w:p>
+      <w:pPr>
+        <w:pStyle w:val="Heading2"/>
+      </w:pPr>
+      <w:r>
+        <w:t xml:space="preserve">S6.1 Rationale</w:t>
+      </w:r>
+    </w:p>
+    <w:p>
+      <w:pPr>
+        <w:pStyle w:val="FirstParagraph"/>
+      </w:pPr>
+      <w:r>
+        <w:t xml:space="preserve">The main-text claim that each phase resolves into two cultural groups, restricted-range versus broader-range sign repertoires, rests on a single Brower-Kile seriation run followed by manual block assignment (see S5). Two limitations remain unaddressed by S1–S5. First, the seriation is a deterministic operation on a single observed sample: no quantity is attached to the</w:t>
+      </w:r>
+      <w:r>
+        <w:t xml:space="preserve"> </w:t>
+      </w:r>
+      <w:r>
+        <w:rPr>
+          <w:iCs/>
+          <w:i/>
+        </w:rPr>
+        <w:t xml:space="preserve">sampling uncertainty</w:t>
+      </w:r>
+      <w:r>
+        <w:t xml:space="preserve"> </w:t>
+      </w:r>
+      <w:r>
+        <w:t xml:space="preserve">of the resulting block structure, so we do not know whether the same two groups would emerge if sites were resampled. Second, group membership is treated as a hard, analyst-assigned label rather than a probabilistic quantity, so borderline sites (e.g. Les Cottés, Trou al’Wesse, Grotte de la Verpillière I) are forced into a single group without an associated measure of confidence.</w:t>
+      </w:r>
+    </w:p>
+    <w:p>
+      <w:pPr>
+        <w:pStyle w:val="BodyText"/>
+      </w:pPr>
+      <w:r>
+        <w:t xml:space="preserve">This section addresses both limitations. In S6.2 we use bootstrap resampling of sites within each phase to build a</w:t>
+      </w:r>
+      <w:r>
+        <w:t xml:space="preserve"> </w:t>
+      </w:r>
+      <w:r>
+        <w:rPr>
+          <w:bCs/>
+          <w:b/>
+        </w:rPr>
+        <w:t xml:space="preserve">consensus co-clustering matrix</w:t>
+      </w:r>
+      <w:r>
+        <w:t xml:space="preserve"> </w:t>
+      </w:r>
+      <w:r>
+        <w:t xml:space="preserve">[5]</w:t>
+      </w:r>
+      <w:r>
+        <w:t xml:space="preserve">, quantifying the stability of the two-group partition as a whole and of each site’s assignment. In S6.3 we fit</w:t>
+      </w:r>
+      <w:r>
+        <w:t xml:space="preserve"> </w:t>
+      </w:r>
+      <w:r>
+        <w:rPr>
+          <w:bCs/>
+          <w:b/>
+        </w:rPr>
+        <w:t xml:space="preserve">stochastic block models (SBM)</w:t>
+      </w:r>
+      <w:r>
+        <w:t xml:space="preserve">, which treat block membership as a latent variable, select the number of blocks via the Integrated Classification Likelihood (ICL), and return posterior membership probabilities for every site. In S6.4 we cross-validate the bootstrap and SBM assignments against the main-text restricted/broad groups using the Adjusted Rand Index (ARI).</w:t>
+      </w:r>
+    </w:p>
+    <w:bookmarkEnd w:id="94"/>
+    <w:bookmarkStart w:id="103" w:name="sec-s6-2"/>
+    <w:p>
+      <w:pPr>
+        <w:pStyle w:val="Heading2"/>
+      </w:pPr>
+      <w:r>
+        <w:t xml:space="preserve">S6.2 Bootstrap Consensus Analysis</w:t>
+      </w:r>
+    </w:p>
+    <w:bookmarkStart w:id="101" w:name="rationale-4"/>
+    <w:p>
+      <w:pPr>
+        <w:pStyle w:val="Heading3"/>
+      </w:pPr>
+      <w:r>
+        <w:t xml:space="preserve">Rationale</w:t>
+      </w:r>
+    </w:p>
+    <w:p>
+      <w:pPr>
+        <w:pStyle w:val="FirstParagraph"/>
+      </w:pPr>
+      <w:r>
+        <w:t xml:space="preserve">For each phase we resample the site-by-sign presence/absence matrix</w:t>
+      </w:r>
+      <w:r>
+        <w:t xml:space="preserve"> </w:t>
+      </w:r>
+      <w:r>
+        <w:rPr>
+          <w:bCs/>
+          <w:b/>
+        </w:rPr>
+        <w:t xml:space="preserve">with replacement</w:t>
+      </w:r>
+      <w:r>
+        <w:t xml:space="preserve"> </w:t>
+      </w:r>
+      <w:r>
+        <w:t xml:space="preserve">(n = 1000 replicates), recompute Jaccard dissimilarity, and partition the resampled sites into two clusters by Ward-linkage hierarchical clustering on the Jaccard distance. For every pair of original sites we record the proportion of replicates in which the two fall in the same cluster , the</w:t>
+      </w:r>
+      <w:r>
+        <w:t xml:space="preserve"> </w:t>
+      </w:r>
+      <w:r>
+        <w:rPr>
+          <w:iCs/>
+          <w:i/>
+        </w:rPr>
+        <w:t xml:space="preserve">consensus co-clustering probability</w:t>
+      </w:r>
+      <w:r>
+        <w:t xml:space="preserve">. If the two-group structure identified in the main text is genuine, mean co-clustering</w:t>
+      </w:r>
+      <w:r>
+        <w:t xml:space="preserve"> </w:t>
+      </w:r>
+      <w:r>
+        <w:rPr>
+          <w:iCs/>
+          <w:i/>
+        </w:rPr>
+        <w:t xml:space="preserve">within</w:t>
+      </w:r>
+      <w:r>
+        <w:t xml:space="preserve"> </w:t>
+      </w:r>
+      <w:r>
+        <w:t xml:space="preserve">each block (restricted/broad) should substantially exceed mean co-clustering</w:t>
+      </w:r>
+      <w:r>
+        <w:t xml:space="preserve"> </w:t>
+      </w:r>
+      <w:r>
+        <w:rPr>
+          <w:iCs/>
+          <w:i/>
+        </w:rPr>
+        <w:t xml:space="preserve">across</w:t>
+      </w:r>
+      <w:r>
+        <w:t xml:space="preserve"> </w:t>
+      </w:r>
+      <w:r>
+        <w:t xml:space="preserve">the two blocks, and sites central to a block should show high per-site consistency (the proportion of replicates in which the site is assigned to its modal block). Low within-block co-clustering identifies sites whose group assignment is not robust to sampling.</w:t>
+      </w:r>
+    </w:p>
+    <w:tbl>
+      <w:tblPr>
+        <w:tblStyle w:val="Table"/>
+        <w:tblW w:type="pct" w:w="5000"/>
+        <w:tblLook w:firstRow="0" w:lastRow="0" w:firstColumn="0" w:lastColumn="0" w:noHBand="0" w:noVBand="0" w:val="0000"/>
+        <w:jc w:val="start"/>
+        <w:tblLayout w:type="fixed"/>
+      </w:tblPr>
+      <w:tblGrid>
+        <w:gridCol w:w="7920"/>
+      </w:tblGrid>
+      <w:tr>
+        <w:tc>
+          <w:tcPr/>
+          <w:bookmarkStart w:id="95" w:name="tbl-bootstrap-summary"/>
           <w:tbl>
             <w:tblPr>
               <w:tblStyle w:val="Table"/>
@@ -13002,7 +13329,7 @@
               <w:t xml:space="preserve">Table 17: Bootstrap consensus co-clustering within and across the main-text restricted/broad blocks, by phase (n = 1000 resamples). Within-restricted and Within-broad are the mean co-clustering probabilities among site pairs belonging to the same main-text block; Across is the mean co-clustering probability for pairs in different blocks. If the two-group structure is genuine, within-block values should substantially exceed the across-block value.</w:t>
             </w:r>
           </w:p>
-          <w:bookmarkEnd w:id="86"/>
+          <w:bookmarkEnd w:id="95"/>
         </w:tc>
       </w:tr>
     </w:tbl>
@@ -13028,7 +13355,7 @@
       <w:tr>
         <w:tc>
           <w:tcPr/>
-          <w:bookmarkStart w:id="87" w:name="tbl-bootstrap-sites"/>
+          <w:bookmarkStart w:id="96" w:name="tbl-bootstrap-sites"/>
           <w:tbl>
             <w:tblPr>
               <w:tblStyle w:val="Table"/>
@@ -15066,7 +15393,7 @@
               <w:t xml:space="preserve">Table 18: Per-site bootstrap consistency: proportion of 1000 resamples in which each site is assigned to its modal (most frequent) block. Consistency near 1 indicates robust assignment; values near 0.5 indicate sites whose group membership flips across resamples.</w:t>
             </w:r>
           </w:p>
-          <w:bookmarkEnd w:id="87"/>
+          <w:bookmarkEnd w:id="96"/>
         </w:tc>
       </w:tr>
     </w:tbl>
@@ -15084,7 +15411,7 @@
       <w:tr>
         <w:tc>
           <w:tcPr/>
-          <w:bookmarkStart w:id="91" w:name="fig-bootstrap-consensus"/>
+          <w:bookmarkStart w:id="100" w:name="fig-bootstrap-consensus"/>
           <w:p>
             <w:pPr>
               <w:pStyle w:val="Compact"/>
@@ -15095,18 +15422,18 @@
                 <wp:inline>
                   <wp:extent cx="5943600" cy="6604000"/>
                   <wp:effectExtent b="0" l="0" r="0" t="0"/>
-                  <wp:docPr descr="" title="" id="89" name="Picture"/>
+                  <wp:docPr descr="" title="" id="98" name="Picture"/>
                   <a:graphic>
                     <a:graphicData uri="http://schemas.openxmlformats.org/drawingml/2006/picture">
                       <pic:pic>
                         <pic:nvPicPr>
-                          <pic:cNvPr descr="../figures/bootstrap-consensus-plot.png" id="90" name="Picture"/>
+                          <pic:cNvPr descr="../figures/bootstrap-consensus-plot.png" id="99" name="Picture"/>
                           <pic:cNvPicPr>
                             <a:picLocks noChangeArrowheads="1" noChangeAspect="1"/>
                           </pic:cNvPicPr>
                         </pic:nvPicPr>
                         <pic:blipFill>
-                          <a:blip r:embed="rId88"/>
+                          <a:blip r:embed="rId97"/>
                           <a:stretch>
                             <a:fillRect/>
                           </a:stretch>
@@ -15143,15 +15470,15 @@
               <w:pStyle w:val="ImageCaption"/>
             </w:pPr>
             <w:r>
-              <w:t xml:space="preserve">Figure 4: Consensus co-clustering matrices from 1000 bootstrap resamples of sites within each phase. Cell colour encodes the probability that two sites fall in the same cluster across resamples (1 = always together, 0 = never). Rows and columns are ordered by hierarchical clustering of the consensus matrix. Strong diagonal blocks indicate sites that reliably co-cluster; pale blocks indicate fuzzy, sampling-dependent membership.</w:t>
+              <w:t xml:space="preserve">Figure 5: Consensus co-clustering matrices from 1000 bootstrap resamples of sites within each phase. Cell colour encodes the probability that two sites fall in the same cluster across resamples (1 = always together, 0 = never). Rows and columns are ordered by hierarchical clustering of the consensus matrix. Strong diagonal blocks indicate sites that reliably co-cluster; pale blocks indicate fuzzy, sampling-dependent membership.</w:t>
             </w:r>
           </w:p>
-          <w:bookmarkEnd w:id="91"/>
+          <w:bookmarkEnd w:id="100"/>
         </w:tc>
       </w:tr>
     </w:tbl>
-    <w:bookmarkEnd w:id="92"/>
-    <w:bookmarkStart w:id="93" w:name="interpretation"/>
+    <w:bookmarkEnd w:id="101"/>
+    <w:bookmarkStart w:id="102" w:name="interpretation-1"/>
     <w:p>
       <w:pPr>
         <w:pStyle w:val="Heading3"/>
@@ -15263,7 +15590,7 @@
           <w:rPr>
             <w:rStyle w:val="Hyperlink"/>
           </w:rPr>
-          <w:t xml:space="preserve">Figure 4</w:t>
+          <w:t xml:space="preserve">Figure 5</w:t>
         </w:r>
       </w:hyperlink>
       <w:r>
@@ -15321,9 +15648,9 @@
         <w:t xml:space="preserve">.</w:t>
       </w:r>
     </w:p>
-    <w:bookmarkEnd w:id="93"/>
-    <w:bookmarkEnd w:id="94"/>
-    <w:bookmarkStart w:id="111" w:name="sec-s6-3"/>
+    <w:bookmarkEnd w:id="102"/>
+    <w:bookmarkEnd w:id="103"/>
+    <w:bookmarkStart w:id="120" w:name="sec-s6-3"/>
     <w:p>
       <w:pPr>
         <w:pStyle w:val="Heading2"/>
@@ -15332,7 +15659,7 @@
         <w:t xml:space="preserve">S6.3 Stochastic Block Models</w:t>
       </w:r>
     </w:p>
-    <w:bookmarkStart w:id="109" w:name="rationale-4"/>
+    <w:bookmarkStart w:id="118" w:name="rationale-5"/>
     <w:p>
       <w:pPr>
         <w:pStyle w:val="Heading3"/>
@@ -15422,147 +15749,6 @@
       </w:r>
       <w:r>
         <w:t xml:space="preserve">rather than the visual answer provided by seriation.</w:t>
-      </w:r>
-    </w:p>
-    <w:p>
-      <w:pPr>
-        <w:pStyle w:val="BodyText"/>
-      </w:pPr>
-      <w:r>
-        <w:drawing>
-          <wp:inline>
-            <wp:extent cx="5943600" cy="4754880"/>
-            <wp:effectExtent b="0" l="0" r="0" t="0"/>
-            <wp:docPr descr="" title="" id="96" name="Picture"/>
-            <a:graphic>
-              <a:graphicData uri="http://schemas.openxmlformats.org/drawingml/2006/picture">
-                <pic:pic>
-                  <pic:nvPicPr>
-                    <pic:cNvPr descr="S1-supplement-sensitivity_files/figure-docx/s6-sbm-compute-1.png" id="97" name="Picture"/>
-                    <pic:cNvPicPr>
-                      <a:picLocks noChangeArrowheads="1" noChangeAspect="1"/>
-                    </pic:cNvPicPr>
-                  </pic:nvPicPr>
-                  <pic:blipFill>
-                    <a:blip r:embed="rId95"/>
-                    <a:stretch>
-                      <a:fillRect/>
-                    </a:stretch>
-                  </pic:blipFill>
-                  <pic:spPr bwMode="auto">
-                    <a:xfrm>
-                      <a:off x="0" y="0"/>
-                      <a:ext cx="5943600" cy="4754880"/>
-                    </a:xfrm>
-                    <a:prstGeom prst="rect">
-                      <a:avLst/>
-                    </a:prstGeom>
-                    <a:noFill/>
-                    <a:ln w="9525">
-                      <a:noFill/>
-                      <a:headEnd/>
-                      <a:tailEnd/>
-                    </a:ln>
-                  </pic:spPr>
-                </pic:pic>
-              </a:graphicData>
-            </a:graphic>
-          </wp:inline>
-        </w:drawing>
-      </w:r>
-    </w:p>
-    <w:p>
-      <w:pPr>
-        <w:pStyle w:val="BodyText"/>
-      </w:pPr>
-      <w:r>
-        <w:drawing>
-          <wp:inline>
-            <wp:extent cx="5943600" cy="4754880"/>
-            <wp:effectExtent b="0" l="0" r="0" t="0"/>
-            <wp:docPr descr="" title="" id="99" name="Picture"/>
-            <a:graphic>
-              <a:graphicData uri="http://schemas.openxmlformats.org/drawingml/2006/picture">
-                <pic:pic>
-                  <pic:nvPicPr>
-                    <pic:cNvPr descr="S1-supplement-sensitivity_files/figure-docx/s6-sbm-compute-2.png" id="100" name="Picture"/>
-                    <pic:cNvPicPr>
-                      <a:picLocks noChangeArrowheads="1" noChangeAspect="1"/>
-                    </pic:cNvPicPr>
-                  </pic:nvPicPr>
-                  <pic:blipFill>
-                    <a:blip r:embed="rId98"/>
-                    <a:stretch>
-                      <a:fillRect/>
-                    </a:stretch>
-                  </pic:blipFill>
-                  <pic:spPr bwMode="auto">
-                    <a:xfrm>
-                      <a:off x="0" y="0"/>
-                      <a:ext cx="5943600" cy="4754880"/>
-                    </a:xfrm>
-                    <a:prstGeom prst="rect">
-                      <a:avLst/>
-                    </a:prstGeom>
-                    <a:noFill/>
-                    <a:ln w="9525">
-                      <a:noFill/>
-                      <a:headEnd/>
-                      <a:tailEnd/>
-                    </a:ln>
-                  </pic:spPr>
-                </pic:pic>
-              </a:graphicData>
-            </a:graphic>
-          </wp:inline>
-        </w:drawing>
-      </w:r>
-    </w:p>
-    <w:p>
-      <w:pPr>
-        <w:pStyle w:val="BodyText"/>
-      </w:pPr>
-      <w:r>
-        <w:drawing>
-          <wp:inline>
-            <wp:extent cx="5943600" cy="4754880"/>
-            <wp:effectExtent b="0" l="0" r="0" t="0"/>
-            <wp:docPr descr="" title="" id="102" name="Picture"/>
-            <a:graphic>
-              <a:graphicData uri="http://schemas.openxmlformats.org/drawingml/2006/picture">
-                <pic:pic>
-                  <pic:nvPicPr>
-                    <pic:cNvPr descr="S1-supplement-sensitivity_files/figure-docx/s6-sbm-compute-3.png" id="103" name="Picture"/>
-                    <pic:cNvPicPr>
-                      <a:picLocks noChangeArrowheads="1" noChangeAspect="1"/>
-                    </pic:cNvPicPr>
-                  </pic:nvPicPr>
-                  <pic:blipFill>
-                    <a:blip r:embed="rId101"/>
-                    <a:stretch>
-                      <a:fillRect/>
-                    </a:stretch>
-                  </pic:blipFill>
-                  <pic:spPr bwMode="auto">
-                    <a:xfrm>
-                      <a:off x="0" y="0"/>
-                      <a:ext cx="5943600" cy="4754880"/>
-                    </a:xfrm>
-                    <a:prstGeom prst="rect">
-                      <a:avLst/>
-                    </a:prstGeom>
-                    <a:noFill/>
-                    <a:ln w="9525">
-                      <a:noFill/>
-                      <a:headEnd/>
-                      <a:tailEnd/>
-                    </a:ln>
-                  </pic:spPr>
-                </pic:pic>
-              </a:graphicData>
-            </a:graphic>
-          </wp:inline>
-        </w:drawing>
       </w:r>
     </w:p>
     <w:p>
@@ -15579,7 +15765,7 @@
               <a:graphicData uri="http://schemas.openxmlformats.org/drawingml/2006/picture">
                 <pic:pic>
                   <pic:nvPicPr>
-                    <pic:cNvPr descr="S1-supplement-sensitivity_files/figure-docx/s6-sbm-compute-4.png" id="106" name="Picture"/>
+                    <pic:cNvPr descr="S1-supplement-sensitivity_files/figure-docx/s6-sbm-compute-1.png" id="106" name="Picture"/>
                     <pic:cNvPicPr>
                       <a:picLocks noChangeArrowheads="1" noChangeAspect="1"/>
                     </pic:cNvPicPr>
@@ -15612,6 +15798,147 @@
         </w:drawing>
       </w:r>
     </w:p>
+    <w:p>
+      <w:pPr>
+        <w:pStyle w:val="BodyText"/>
+      </w:pPr>
+      <w:r>
+        <w:drawing>
+          <wp:inline>
+            <wp:extent cx="5943600" cy="4754880"/>
+            <wp:effectExtent b="0" l="0" r="0" t="0"/>
+            <wp:docPr descr="" title="" id="108" name="Picture"/>
+            <a:graphic>
+              <a:graphicData uri="http://schemas.openxmlformats.org/drawingml/2006/picture">
+                <pic:pic>
+                  <pic:nvPicPr>
+                    <pic:cNvPr descr="S1-supplement-sensitivity_files/figure-docx/s6-sbm-compute-2.png" id="109" name="Picture"/>
+                    <pic:cNvPicPr>
+                      <a:picLocks noChangeArrowheads="1" noChangeAspect="1"/>
+                    </pic:cNvPicPr>
+                  </pic:nvPicPr>
+                  <pic:blipFill>
+                    <a:blip r:embed="rId107"/>
+                    <a:stretch>
+                      <a:fillRect/>
+                    </a:stretch>
+                  </pic:blipFill>
+                  <pic:spPr bwMode="auto">
+                    <a:xfrm>
+                      <a:off x="0" y="0"/>
+                      <a:ext cx="5943600" cy="4754880"/>
+                    </a:xfrm>
+                    <a:prstGeom prst="rect">
+                      <a:avLst/>
+                    </a:prstGeom>
+                    <a:noFill/>
+                    <a:ln w="9525">
+                      <a:noFill/>
+                      <a:headEnd/>
+                      <a:tailEnd/>
+                    </a:ln>
+                  </pic:spPr>
+                </pic:pic>
+              </a:graphicData>
+            </a:graphic>
+          </wp:inline>
+        </w:drawing>
+      </w:r>
+    </w:p>
+    <w:p>
+      <w:pPr>
+        <w:pStyle w:val="BodyText"/>
+      </w:pPr>
+      <w:r>
+        <w:drawing>
+          <wp:inline>
+            <wp:extent cx="5943600" cy="4754880"/>
+            <wp:effectExtent b="0" l="0" r="0" t="0"/>
+            <wp:docPr descr="" title="" id="111" name="Picture"/>
+            <a:graphic>
+              <a:graphicData uri="http://schemas.openxmlformats.org/drawingml/2006/picture">
+                <pic:pic>
+                  <pic:nvPicPr>
+                    <pic:cNvPr descr="S1-supplement-sensitivity_files/figure-docx/s6-sbm-compute-3.png" id="112" name="Picture"/>
+                    <pic:cNvPicPr>
+                      <a:picLocks noChangeArrowheads="1" noChangeAspect="1"/>
+                    </pic:cNvPicPr>
+                  </pic:nvPicPr>
+                  <pic:blipFill>
+                    <a:blip r:embed="rId110"/>
+                    <a:stretch>
+                      <a:fillRect/>
+                    </a:stretch>
+                  </pic:blipFill>
+                  <pic:spPr bwMode="auto">
+                    <a:xfrm>
+                      <a:off x="0" y="0"/>
+                      <a:ext cx="5943600" cy="4754880"/>
+                    </a:xfrm>
+                    <a:prstGeom prst="rect">
+                      <a:avLst/>
+                    </a:prstGeom>
+                    <a:noFill/>
+                    <a:ln w="9525">
+                      <a:noFill/>
+                      <a:headEnd/>
+                      <a:tailEnd/>
+                    </a:ln>
+                  </pic:spPr>
+                </pic:pic>
+              </a:graphicData>
+            </a:graphic>
+          </wp:inline>
+        </w:drawing>
+      </w:r>
+    </w:p>
+    <w:p>
+      <w:pPr>
+        <w:pStyle w:val="BodyText"/>
+      </w:pPr>
+      <w:r>
+        <w:drawing>
+          <wp:inline>
+            <wp:extent cx="5943600" cy="4754880"/>
+            <wp:effectExtent b="0" l="0" r="0" t="0"/>
+            <wp:docPr descr="" title="" id="114" name="Picture"/>
+            <a:graphic>
+              <a:graphicData uri="http://schemas.openxmlformats.org/drawingml/2006/picture">
+                <pic:pic>
+                  <pic:nvPicPr>
+                    <pic:cNvPr descr="S1-supplement-sensitivity_files/figure-docx/s6-sbm-compute-4.png" id="115" name="Picture"/>
+                    <pic:cNvPicPr>
+                      <a:picLocks noChangeArrowheads="1" noChangeAspect="1"/>
+                    </pic:cNvPicPr>
+                  </pic:nvPicPr>
+                  <pic:blipFill>
+                    <a:blip r:embed="rId113"/>
+                    <a:stretch>
+                      <a:fillRect/>
+                    </a:stretch>
+                  </pic:blipFill>
+                  <pic:spPr bwMode="auto">
+                    <a:xfrm>
+                      <a:off x="0" y="0"/>
+                      <a:ext cx="5943600" cy="4754880"/>
+                    </a:xfrm>
+                    <a:prstGeom prst="rect">
+                      <a:avLst/>
+                    </a:prstGeom>
+                    <a:noFill/>
+                    <a:ln w="9525">
+                      <a:noFill/>
+                      <a:headEnd/>
+                      <a:tailEnd/>
+                    </a:ln>
+                  </pic:spPr>
+                </pic:pic>
+              </a:graphicData>
+            </a:graphic>
+          </wp:inline>
+        </w:drawing>
+      </w:r>
+    </w:p>
     <w:tbl>
       <w:tblPr>
         <w:tblStyle w:val="Table"/>
@@ -15626,7 +15953,7 @@
       <w:tr>
         <w:tc>
           <w:tcPr/>
-          <w:bookmarkStart w:id="107" w:name="tbl-sbm-icl"/>
+          <w:bookmarkStart w:id="116" w:name="tbl-sbm-icl"/>
           <w:tbl>
             <w:tblPr>
               <w:tblStyle w:val="Table"/>
@@ -15939,7 +16266,7 @@
               <w:t xml:space="preserve">Table 19: Integrated Classification Likelihood (ICL) for stochastic block models with K = 1 to 5 blocks, by phase. The best-supported number of blocks (maximum ICL) is bolded. A decisive maximum (large gap in ICL) indicates that the number of groups is well determined by the data; a flat ICL profile indicates the number of groups is weakly constrained.</w:t>
             </w:r>
           </w:p>
-          <w:bookmarkEnd w:id="107"/>
+          <w:bookmarkEnd w:id="116"/>
         </w:tc>
       </w:tr>
     </w:tbl>
@@ -15965,7 +16292,7 @@
       <w:tr>
         <w:tc>
           <w:tcPr/>
-          <w:bookmarkStart w:id="108" w:name="tbl-sbm-membership"/>
+          <w:bookmarkStart w:id="117" w:name="tbl-sbm-membership"/>
           <w:tbl>
             <w:tblPr>
               <w:tblStyle w:val="Table"/>
@@ -18002,12 +18329,12 @@
               <w:t xml:space="preserve">Table 20: Posterior block-membership probabilities and modal (hard) assignment from the best-fitting stochastic block model for each phase. Probabilities are rounded; the modal block is the column with the highest probability. Sites with probability spread across blocks (e.g. no entry above 0.7) have ambiguous membership.</w:t>
             </w:r>
           </w:p>
-          <w:bookmarkEnd w:id="108"/>
+          <w:bookmarkEnd w:id="117"/>
         </w:tc>
       </w:tr>
     </w:tbl>
-    <w:bookmarkEnd w:id="109"/>
-    <w:bookmarkStart w:id="110" w:name="interpretation-1"/>
+    <w:bookmarkEnd w:id="118"/>
+    <w:bookmarkStart w:id="119" w:name="interpretation-2"/>
     <w:p>
       <w:pPr>
         <w:pStyle w:val="Heading3"/>
@@ -18245,9 +18572,9 @@
         <w:t xml:space="preserve">(rich vs. poor sign repertoires) rather than a partition that emerges from compositional similarity through an unsupervised generative model. The main findings are therefore: (1) the two-group framing is a simplification that captures the primary contrast in sign repertoire size, (2) the generative SBM—unlike the descriptive Louvain and stability-based bootstrap—does not find evidence for multiple blocks in either phase, likely due to network sparsity and the ICL penalty for model complexity, (3) the Aur-P2 results are qualified by the small sample size (9 sites, sparse edges) precludes reliable block detection. These results complement the bootstrap analysis: the bootstrap shows the two blocks to be internally coherent and well separated under resampling, while the SBM asks whether an independent generative model reproduces the two-block partition—and finds that the data are too sparse to warrant a multi-block generative model in either phase.</w:t>
       </w:r>
     </w:p>
-    <w:bookmarkEnd w:id="110"/>
-    <w:bookmarkEnd w:id="111"/>
-    <w:bookmarkStart w:id="115" w:name="sec-s6-4"/>
+    <w:bookmarkEnd w:id="119"/>
+    <w:bookmarkEnd w:id="120"/>
+    <w:bookmarkStart w:id="124" w:name="sec-s6-4"/>
     <w:p>
       <w:pPr>
         <w:pStyle w:val="Heading2"/>
@@ -18256,7 +18583,7 @@
         <w:t xml:space="preserve">S6.4 Cross-Validation of Group Assignments (ARI)</w:t>
       </w:r>
     </w:p>
-    <w:bookmarkStart w:id="113" w:name="rationale-5"/>
+    <w:bookmarkStart w:id="122" w:name="rationale-6"/>
     <w:p>
       <w:pPr>
         <w:pStyle w:val="Heading3"/>
@@ -18299,7 +18626,7 @@
       <w:tr>
         <w:tc>
           <w:tcPr/>
-          <w:bookmarkStart w:id="112" w:name="tbl-s6-ari"/>
+          <w:bookmarkStart w:id="121" w:name="tbl-s6-ari"/>
           <w:tbl>
             <w:tblPr>
               <w:tblStyle w:val="Table"/>
@@ -18493,12 +18820,12 @@
               <w:t xml:space="preserve">Table 21: Adjusted Rand Index between the main-text manual restricted/broad assignment, the bootstrap modal blocks (S6.2), and the SBM modal assignments (S6.3), by phase.</w:t>
             </w:r>
           </w:p>
-          <w:bookmarkEnd w:id="112"/>
+          <w:bookmarkEnd w:id="121"/>
         </w:tc>
       </w:tr>
     </w:tbl>
-    <w:bookmarkEnd w:id="113"/>
-    <w:bookmarkStart w:id="114" w:name="interpretation-2"/>
+    <w:bookmarkEnd w:id="122"/>
+    <w:bookmarkStart w:id="123" w:name="interpretation-3"/>
     <w:p>
       <w:pPr>
         <w:pStyle w:val="Heading3"/>
@@ -18614,9 +18941,9 @@
         <w:t xml:space="preserve">.</w:t>
       </w:r>
     </w:p>
-    <w:bookmarkEnd w:id="114"/>
-    <w:bookmarkEnd w:id="115"/>
-    <w:bookmarkStart w:id="116" w:name="sec-s6-5"/>
+    <w:bookmarkEnd w:id="123"/>
+    <w:bookmarkEnd w:id="124"/>
+    <w:bookmarkStart w:id="125" w:name="sec-s6-5"/>
     <w:p>
       <w:pPr>
         <w:pStyle w:val="Heading2"/>
@@ -18650,7 +18977,7 @@
           <w:rPr>
             <w:rStyle w:val="Hyperlink"/>
           </w:rPr>
-          <w:t xml:space="preserve">Figure 4</w:t>
+          <w:t xml:space="preserve">Figure 5</w:t>
         </w:r>
       </w:hyperlink>
       <w:r>
@@ -18744,9 +19071,9 @@
         <w:t xml:space="preserve">, which validates the grouping on withheld data rather than on the data used to define it.</w:t>
       </w:r>
     </w:p>
-    <w:bookmarkEnd w:id="116"/>
-    <w:bookmarkEnd w:id="117"/>
-    <w:bookmarkStart w:id="121" w:name="sec-s6-6"/>
+    <w:bookmarkEnd w:id="125"/>
+    <w:bookmarkEnd w:id="126"/>
+    <w:bookmarkStart w:id="130" w:name="sec-s6-6"/>
     <w:p>
       <w:pPr>
         <w:pStyle w:val="Heading1"/>
@@ -18755,7 +19082,7 @@
         <w:t xml:space="preserve">S6.6 Circularity-Breaking Validation of the Restricted/Broad Group Difference</w:t>
       </w:r>
     </w:p>
-    <w:bookmarkStart w:id="120" w:name="rationale-6"/>
+    <w:bookmarkStart w:id="129" w:name="rationale-7"/>
     <w:p>
       <w:pPr>
         <w:pStyle w:val="Heading2"/>
@@ -18792,7 +19119,7 @@
       <w:pPr>
         <w:numPr>
           <w:ilvl w:val="0"/>
-          <w:numId w:val="1004"/>
+          <w:numId w:val="1005"/>
         </w:numPr>
         <w:pStyle w:val="Compact"/>
       </w:pPr>
@@ -18830,7 +19157,7 @@
       <w:pPr>
         <w:numPr>
           <w:ilvl w:val="0"/>
-          <w:numId w:val="1004"/>
+          <w:numId w:val="1005"/>
         </w:numPr>
         <w:pStyle w:val="Compact"/>
       </w:pPr>
@@ -18868,7 +19195,7 @@
       <w:pPr>
         <w:numPr>
           <w:ilvl w:val="0"/>
-          <w:numId w:val="1004"/>
+          <w:numId w:val="1005"/>
         </w:numPr>
         <w:pStyle w:val="Compact"/>
       </w:pPr>
@@ -18908,7 +19235,7 @@
       <w:tr>
         <w:tc>
           <w:tcPr/>
-          <w:bookmarkStart w:id="118" w:name="tbl-s6-6-summary"/>
+          <w:bookmarkStart w:id="127" w:name="tbl-s6-6-summary"/>
           <w:tbl>
             <w:tblPr>
               <w:tblStyle w:val="Table"/>
@@ -19307,11 +19634,11 @@
               <w:t xml:space="preserve">Table 22: Circularity-breaking validation of the restricted/broad group difference. Method A re-derives the optimal two-group split from randomised data in every permutation (observed optimal pseudo-F vs. its null). Method B validates the grouping on withheld data: site-level leave-one-out k-NN classification accuracy (with permutation p-value) and object-level holdout where groups are defined from one random half of each site’s objects and tested on the other half (Fisher-combined p across 100 random splits). Method C is a group-free continuous gradient PerMANOVA on the first PCoA axis. A significant result indicates the group structure is recoverable from data not used to define it.</w:t>
             </w:r>
           </w:p>
-          <w:bookmarkEnd w:id="118"/>
+          <w:bookmarkEnd w:id="127"/>
         </w:tc>
       </w:tr>
     </w:tbl>
-    <w:bookmarkStart w:id="119" w:name="interpretation-3"/>
+    <w:bookmarkStart w:id="128" w:name="interpretation-4"/>
     <w:p>
       <w:pPr>
         <w:pStyle w:val="Heading3"/>
@@ -19684,10 +20011,10 @@
         <w:t xml:space="preserve">recovered from withheld data (strategy B) and a continuous gradient is significant without any group definition (strategy C). Strategy A, the most conservative test, is consistent with a gradual rather than sharp partition and does not contradict the recoverability established by B and C. We therefore present the main-text PerMANOVA as descriptive and exploratory, and we rely on the cross-validation results (strategy B) as the appropriate independent confirmation that the grouping is not a circularity artefact.</w:t>
       </w:r>
     </w:p>
-    <w:bookmarkEnd w:id="119"/>
-    <w:bookmarkEnd w:id="120"/>
-    <w:bookmarkEnd w:id="121"/>
-    <w:bookmarkStart w:id="138" w:name="sec-s7"/>
+    <w:bookmarkEnd w:id="128"/>
+    <w:bookmarkEnd w:id="129"/>
+    <w:bookmarkEnd w:id="130"/>
+    <w:bookmarkStart w:id="147" w:name="sec-s7"/>
     <w:p>
       <w:pPr>
         <w:pStyle w:val="Heading1"/>
@@ -19696,7 +20023,7 @@
         <w:t xml:space="preserve">S7. Object-Type Sensitivity: Figurine Exclusion</w:t>
       </w:r>
     </w:p>
-    <w:bookmarkStart w:id="122" w:name="s7.1-rationale"/>
+    <w:bookmarkStart w:id="131" w:name="s7.1-rationale"/>
     <w:p>
       <w:pPr>
         <w:pStyle w:val="Heading2"/>
@@ -19710,7 +20037,7 @@
         <w:pStyle w:val="FirstParagraph"/>
       </w:pPr>
       <w:r>
-        <w:t xml:space="preserve">[5]</w:t>
+        <w:t xml:space="preserve">[6]</w:t>
       </w:r>
       <w:r>
         <w:t xml:space="preserve"> </w:t>
@@ -19719,8 +20046,8 @@
         <w:t xml:space="preserve">demonstrate that ivory figurines in the Swabian Aurignacian carry sign sequences with higher information density than tools. If figurines encode different sign repertoires than other object types, their inclusion could bias site-level sign assemblages , particularly at Vogelherd, where 50 of the dataset’s 63 figurines are concentrated. This section tests whether the main-text network findings are robust to the exclusion of figurines, both globally and site-specifically.</w:t>
       </w:r>
     </w:p>
-    <w:bookmarkEnd w:id="122"/>
-    <w:bookmarkStart w:id="124" w:name="X558aa60e1a258171fb4fb8ecbd68200d2a7d022"/>
+    <w:bookmarkEnd w:id="131"/>
+    <w:bookmarkStart w:id="133" w:name="X558aa60e1a258171fb4fb8ecbd68200d2a7d022"/>
     <w:p>
       <w:pPr>
         <w:pStyle w:val="Heading2"/>
@@ -19743,7 +20070,7 @@
       <w:tr>
         <w:tc>
           <w:tcPr/>
-          <w:bookmarkStart w:id="123" w:name="tbl-figurine-count"/>
+          <w:bookmarkStart w:id="132" w:name="tbl-figurine-count"/>
           <w:tbl>
             <w:tblPr>
               <w:tblStyle w:val="Table"/>
@@ -20429,7 +20756,7 @@
               <w:t xml:space="preserve">Table 23: Distribution of figurine objects across phases and sites. Figurine types include figurine zoomorph, figurine anthropomorph, figurine undet., and possible figurine.</w:t>
             </w:r>
           </w:p>
-          <w:bookmarkEnd w:id="123"/>
+          <w:bookmarkEnd w:id="132"/>
         </w:tc>
       </w:tr>
     </w:tbl>
@@ -20452,8 +20779,8 @@
         <w:t xml:space="preserve">shows that figurines are heavily concentrated at Vogelherd (50 objects), with minor representation at Hohle Fels (8), Geissenklösterle (3), Hohlenstein-Stadel (1), and La Ferrassie (1). Of these, 59 fall within Aur-P1 and the remaining 4 , all Hohle Fels objects from AH IV and Iid , fall within Aur-P2 under the layer-level assignment. The analysis therefore tests whether the Aur-P1 network structure , which reports the higher mean degree (7.50) , is driven by these 50 objects at a single site.</w:t>
       </w:r>
     </w:p>
-    <w:bookmarkEnd w:id="124"/>
-    <w:bookmarkStart w:id="129" w:name="s7.3-analysis-1-exclude-all-figurines"/>
+    <w:bookmarkEnd w:id="133"/>
+    <w:bookmarkStart w:id="138" w:name="s7.3-analysis-1-exclude-all-figurines"/>
     <w:p>
       <w:pPr>
         <w:pStyle w:val="Heading2"/>
@@ -20462,7 +20789,7 @@
         <w:t xml:space="preserve">S7.3 Analysis 1: Exclude All Figurines</w:t>
       </w:r>
     </w:p>
-    <w:bookmarkStart w:id="127" w:name="method"/>
+    <w:bookmarkStart w:id="136" w:name="method"/>
     <w:p>
       <w:pPr>
         <w:pStyle w:val="Heading3"/>
@@ -20526,7 +20853,7 @@
       <w:tr>
         <w:tc>
           <w:tcPr/>
-          <w:bookmarkStart w:id="125" w:name="tbl-exclude-figurines"/>
+          <w:bookmarkStart w:id="134" w:name="tbl-exclude-figurines"/>
           <w:tbl>
             <w:tblPr>
               <w:tblStyle w:val="Table"/>
@@ -21092,7 +21419,7 @@
               <w:t xml:space="preserve">Table 24: Network statistics before and after excluding all figurine objects (figurine zoomorph, figurine anthropomorph, figurine undet., and possible figurine). Threshold = 0.2, Jaccard similarity.</w:t>
             </w:r>
           </w:p>
-          <w:bookmarkEnd w:id="125"/>
+          <w:bookmarkEnd w:id="134"/>
         </w:tc>
       </w:tr>
     </w:tbl>
@@ -21118,7 +21445,7 @@
       <w:tr>
         <w:tc>
           <w:tcPr/>
-          <w:bookmarkStart w:id="126" w:name="tbl-figurine-sites-lost"/>
+          <w:bookmarkStart w:id="135" w:name="tbl-figurine-sites-lost"/>
           <w:tbl>
             <w:tblPr>
               <w:tblStyle w:val="Table"/>
@@ -21311,12 +21638,12 @@
               <w:t xml:space="preserve">Table 25: Number of sites per phase before and after figurine exclusion. Sites are lost when all objects at that site are figurines.</w:t>
             </w:r>
           </w:p>
-          <w:bookmarkEnd w:id="126"/>
+          <w:bookmarkEnd w:id="135"/>
         </w:tc>
       </w:tr>
     </w:tbl>
-    <w:bookmarkEnd w:id="127"/>
-    <w:bookmarkStart w:id="128" w:name="interpretation-4"/>
+    <w:bookmarkEnd w:id="136"/>
+    <w:bookmarkStart w:id="137" w:name="interpretation-5"/>
     <w:p>
       <w:pPr>
         <w:pStyle w:val="Heading3"/>
@@ -21341,9 +21668,9 @@
         <w:t xml:space="preserve">Critically, Aur-P1 retains the higher mean degree (7.40) under figurine exclusion, preserving the main-text ordering Aur-P1 &gt; Aur-P2 (7.40 &gt; 4.22). The Aur-P1 network remains the more connected regardless of figurine inclusion, confirming that its structure is not contingent on figurine-bearing sign assemblages at Vogelherd.</w:t>
       </w:r>
     </w:p>
-    <w:bookmarkEnd w:id="128"/>
-    <w:bookmarkEnd w:id="129"/>
-    <w:bookmarkStart w:id="134" w:name="X7549e60451b9f7bbee640100d361a0cf771ac62"/>
+    <w:bookmarkEnd w:id="137"/>
+    <w:bookmarkEnd w:id="138"/>
+    <w:bookmarkStart w:id="143" w:name="X7549e60451b9f7bbee640100d361a0cf771ac62"/>
     <w:p>
       <w:pPr>
         <w:pStyle w:val="Heading2"/>
@@ -21352,7 +21679,7 @@
         <w:t xml:space="preserve">S7.4 Analysis 2: Exclude Vogelherd Figurines Only</w:t>
       </w:r>
     </w:p>
-    <w:bookmarkStart w:id="132" w:name="method-1"/>
+    <w:bookmarkStart w:id="141" w:name="method-1"/>
     <w:p>
       <w:pPr>
         <w:pStyle w:val="Heading3"/>
@@ -21383,7 +21710,7 @@
       <w:tr>
         <w:tc>
           <w:tcPr/>
-          <w:bookmarkStart w:id="130" w:name="tbl-vogelherd-exclude"/>
+          <w:bookmarkStart w:id="139" w:name="tbl-vogelherd-exclude"/>
           <w:tbl>
             <w:tblPr>
               <w:tblStyle w:val="Table"/>
@@ -21949,7 +22276,7 @@
               <w:t xml:space="preserve">Table 26: Network statistics before and after excluding figurines from Vogelherd only. All other figurines (Hohle Fels, Geissenklösterle, Hohlenstein-Stadel, La Ferrassie) are retained. Threshold = 0.2, Jaccard similarity.</w:t>
             </w:r>
           </w:p>
-          <w:bookmarkEnd w:id="130"/>
+          <w:bookmarkEnd w:id="139"/>
         </w:tc>
       </w:tr>
     </w:tbl>
@@ -21975,7 +22302,7 @@
       <w:tr>
         <w:tc>
           <w:tcPr/>
-          <w:bookmarkStart w:id="131" w:name="tbl-vogelherd-objects"/>
+          <w:bookmarkStart w:id="140" w:name="tbl-vogelherd-objects"/>
           <w:tbl>
             <w:tblPr>
               <w:tblStyle w:val="Table"/>
@@ -22114,12 +22441,12 @@
               <w:t xml:space="preserve">Table 27: Vogelherd object counts before and after removing figurines. Non-figurine objects at Vogelherd (tools, plaquettes, etc.) are retained.</w:t>
             </w:r>
           </w:p>
-          <w:bookmarkEnd w:id="131"/>
+          <w:bookmarkEnd w:id="140"/>
         </w:tc>
       </w:tr>
     </w:tbl>
-    <w:bookmarkEnd w:id="132"/>
-    <w:bookmarkStart w:id="133" w:name="interpretation-5"/>
+    <w:bookmarkEnd w:id="141"/>
+    <w:bookmarkStart w:id="142" w:name="interpretation-6"/>
     <w:p>
       <w:pPr>
         <w:pStyle w:val="Heading3"/>
@@ -22144,9 +22471,9 @@
         <w:t xml:space="preserve">The effect of removing Vogelherd figurines alone (−1.3% in Aur-P1) is the same as removing all 63 figurines globally (−1.3%), and in both cases the network is essentially unchanged. The figurine effect therefore does not scale with the number of figurines removed; figurines at Hohle Fels, Geissenklösterle (3), Hohlenstein-Stadel (1), and La Ferrassie (1) do not alter the network structure , including the four Hohle Fels figurines assigned to Aur-P2, which leave that phase’s network unchanged , and Vogelherd’s connectivity within Aur-P1 is carried by its 123 non-figurine objects.</w:t>
       </w:r>
     </w:p>
-    <w:bookmarkEnd w:id="133"/>
-    <w:bookmarkEnd w:id="134"/>
-    <w:bookmarkStart w:id="136" w:name="s7.5-joint-comparison"/>
+    <w:bookmarkEnd w:id="142"/>
+    <w:bookmarkEnd w:id="143"/>
+    <w:bookmarkStart w:id="145" w:name="s7.5-joint-comparison"/>
     <w:p>
       <w:pPr>
         <w:pStyle w:val="Heading2"/>
@@ -22169,7 +22496,7 @@
       <w:tr>
         <w:tc>
           <w:tcPr/>
-          <w:bookmarkStart w:id="135" w:name="tbl-objtype-joint"/>
+          <w:bookmarkStart w:id="144" w:name="tbl-objtype-joint"/>
           <w:tbl>
             <w:tblPr>
               <w:tblStyle w:val="Table"/>
@@ -22947,12 +23274,12 @@
               <w:t xml:space="preserve">Table 28: Side-by-side comparison of network statistics across all conditions: baseline (all objects), exclude all figurines, and exclude Vogelherd figurines only. The rightmost columns show the percentage change in mean degree from baseline.</w:t>
             </w:r>
           </w:p>
-          <w:bookmarkEnd w:id="135"/>
+          <w:bookmarkEnd w:id="144"/>
         </w:tc>
       </w:tr>
     </w:tbl>
-    <w:bookmarkEnd w:id="136"/>
-    <w:bookmarkStart w:id="137" w:name="s7.6-interpretation"/>
+    <w:bookmarkEnd w:id="145"/>
+    <w:bookmarkStart w:id="146" w:name="s7.6-interpretation"/>
     <w:p>
       <w:pPr>
         <w:pStyle w:val="Heading2"/>
@@ -23302,7 +23629,7 @@
         <w:t xml:space="preserve"> </w:t>
       </w:r>
       <w:r>
-        <w:t xml:space="preserve">[5]</w:t>
+        <w:t xml:space="preserve">[6]</w:t>
       </w:r>
       <w:r>
         <w:t xml:space="preserve"> </w:t>
@@ -23311,9 +23638,9 @@
         <w:t xml:space="preserve">argument that figurines carry high-information sign sequences, but the communities themselves are defined by shared sign types across all object types.</w:t>
       </w:r>
     </w:p>
-    <w:bookmarkEnd w:id="137"/>
-    <w:bookmarkEnd w:id="138"/>
-    <w:bookmarkStart w:id="145" w:name="sec-s8"/>
+    <w:bookmarkEnd w:id="146"/>
+    <w:bookmarkEnd w:id="147"/>
+    <w:bookmarkStart w:id="154" w:name="sec-s8"/>
     <w:p>
       <w:pPr>
         <w:pStyle w:val="Heading1"/>
@@ -23322,7 +23649,7 @@
         <w:t xml:space="preserve">S8. Site Reclassification Sensitivity Analysis</w:t>
       </w:r>
     </w:p>
-    <w:bookmarkStart w:id="139" w:name="s8.1-rationale"/>
+    <w:bookmarkStart w:id="148" w:name="s8.1-rationale"/>
     <w:p>
       <w:pPr>
         <w:pStyle w:val="Heading2"/>
@@ -23361,7 +23688,7 @@
       <w:pPr>
         <w:numPr>
           <w:ilvl w:val="0"/>
-          <w:numId w:val="1005"/>
+          <w:numId w:val="1006"/>
         </w:numPr>
         <w:pStyle w:val="Compact"/>
       </w:pPr>
@@ -23379,7 +23706,7 @@
         <w:t xml:space="preserve"> </w:t>
       </w:r>
       <w:r>
-        <w:t xml:space="preserve">[6,7]</w:t>
+        <w:t xml:space="preserve">[7,8]</w:t>
       </w:r>
       <w:r>
         <w:t xml:space="preserve">. The site is classified as Aurignacian I (Early) in the Périgord sequence.</w:t>
@@ -23389,7 +23716,7 @@
       <w:pPr>
         <w:numPr>
           <w:ilvl w:val="0"/>
-          <w:numId w:val="1005"/>
+          <w:numId w:val="1006"/>
         </w:numPr>
         <w:pStyle w:val="Compact"/>
       </w:pPr>
@@ -23407,7 +23734,7 @@
         <w:t xml:space="preserve"> </w:t>
       </w:r>
       <w:r>
-        <w:t xml:space="preserve">[8]</w:t>
+        <w:t xml:space="preserve">[9]</w:t>
       </w:r>
       <w:r>
         <w:t xml:space="preserve"> </w:t>
@@ -23419,7 +23746,7 @@
         <w:t xml:space="preserve"> </w:t>
       </w:r>
       <w:r>
-        <w:t xml:space="preserve">[8,9]</w:t>
+        <w:t xml:space="preserve">[9,10]</w:t>
       </w:r>
       <w:r>
         <w:t xml:space="preserve">. Layer 7b has mixed Early/Recent Aurignacian components.</w:t>
@@ -23429,7 +23756,7 @@
       <w:pPr>
         <w:numPr>
           <w:ilvl w:val="0"/>
-          <w:numId w:val="1005"/>
+          <w:numId w:val="1006"/>
         </w:numPr>
         <w:pStyle w:val="Compact"/>
       </w:pPr>
@@ -23459,7 +23786,7 @@
         <w:t xml:space="preserve"> </w:t>
       </w:r>
       <w:r>
-        <w:t xml:space="preserve">[10]</w:t>
+        <w:t xml:space="preserve">[11]</w:t>
       </w:r>
       <w:r>
         <w:t xml:space="preserve">. Direct dates of ~31 ka ¹⁴C BP (~35–36 cal BP) are too young for Proto-Aurignacian</w:t>
@@ -23468,7 +23795,7 @@
         <w:t xml:space="preserve"> </w:t>
       </w:r>
       <w:r>
-        <w:t xml:space="preserve">[11]</w:t>
+        <w:t xml:space="preserve">[12]</w:t>
       </w:r>
       <w:r>
         <w:t xml:space="preserve">.</w:t>
@@ -23478,7 +23805,7 @@
       <w:pPr>
         <w:numPr>
           <w:ilvl w:val="0"/>
-          <w:numId w:val="1005"/>
+          <w:numId w:val="1006"/>
         </w:numPr>
         <w:pStyle w:val="Compact"/>
       </w:pPr>
@@ -23496,7 +23823,7 @@
         <w:t xml:space="preserve"> </w:t>
       </w:r>
       <w:r>
-        <w:t xml:space="preserve">[12]</w:t>
+        <w:t xml:space="preserve">[13]</w:t>
       </w:r>
       <w:r>
         <w:t xml:space="preserve">.</w:t>
@@ -23510,8 +23837,8 @@
         <w:t xml:space="preserve">Because these attributions are important for the two-phase framework, this section tests the sensitivity of the network results to (A) reverting to the purely date-based assignment used in earlier analyses , each object assigned to a phase by its calibrated date alone , and (B) excluding Vogelherd entirely, given its documented stratigraphic mixing.</w:t>
       </w:r>
     </w:p>
-    <w:bookmarkEnd w:id="139"/>
-    <w:bookmarkStart w:id="142" w:name="s8.2-results"/>
+    <w:bookmarkEnd w:id="148"/>
+    <w:bookmarkStart w:id="151" w:name="s8.2-results"/>
     <w:p>
       <w:pPr>
         <w:pStyle w:val="Heading2"/>
@@ -23534,7 +23861,7 @@
       <w:tr>
         <w:tc>
           <w:tcPr/>
-          <w:bookmarkStart w:id="140" w:name="tbl-reclass-comparison"/>
+          <w:bookmarkStart w:id="149" w:name="tbl-reclass-comparison"/>
           <w:tbl>
             <w:tblPr>
               <w:tblStyle w:val="Table"/>
@@ -24312,11 +24639,11 @@
               <w:t xml:space="preserve">Table 29: Network statistics under three conditions: baseline (technology-based assignment), date-based (each object assigned purely by calibrated radiocarbon date, with the Spy/El Castillo exclusions retained), and exclude Vogelherd (technology-based baseline with the site of Vogelherd removed entirely). Threshold = 0.2, Jaccard similarity.</w:t>
             </w:r>
           </w:p>
-          <w:bookmarkEnd w:id="140"/>
+          <w:bookmarkEnd w:id="149"/>
         </w:tc>
       </w:tr>
     </w:tbl>
-    <w:bookmarkStart w:id="141" w:name="effects-by-condition"/>
+    <w:bookmarkStart w:id="150" w:name="effects-by-condition"/>
     <w:p>
       <w:pPr>
         <w:pStyle w:val="Heading3"/>
@@ -24361,9 +24688,9 @@
         <w:t xml:space="preserve">Removing Vogelherd’s 173 objects from the technology-based baseline reduces Aur-P1 from 20 to 19 sites and from 75 to 69 edges. Mean degree falls from 7.5 to 7.26 (−3.2%), and modularity from 0.336 to 0.312. Aur-P2 is unaffected (4.22, 19 edges, 9 sites).</w:t>
       </w:r>
     </w:p>
-    <w:bookmarkEnd w:id="141"/>
-    <w:bookmarkEnd w:id="142"/>
-    <w:bookmarkStart w:id="143" w:name="s8.3-phase-ordering-robustness"/>
+    <w:bookmarkEnd w:id="150"/>
+    <w:bookmarkEnd w:id="151"/>
+    <w:bookmarkStart w:id="152" w:name="s8.3-phase-ordering-robustness"/>
     <w:p>
       <w:pPr>
         <w:pStyle w:val="Heading2"/>
@@ -24618,8 +24945,8 @@
         <w:t xml:space="preserve">Under the date-based assignment Aur-P1’s mean degree rises (from 7.5 to 8.57) and Aur-P2’s falls (from 4.22 to 3.33), so the contrast is not an artefact of the technological reassignment , the naive date-based assignment, if anything, strengthens it. Excluding Vogelherd weakens but does not remove the contrast (7.26 vs 4.22).</w:t>
       </w:r>
     </w:p>
-    <w:bookmarkEnd w:id="143"/>
-    <w:bookmarkStart w:id="144" w:name="s8.4-interpretation"/>
+    <w:bookmarkEnd w:id="152"/>
+    <w:bookmarkStart w:id="153" w:name="s8.4-interpretation"/>
     <w:p>
       <w:pPr>
         <w:pStyle w:val="Heading2"/>
@@ -24652,9 +24979,9 @@
         <w:t xml:space="preserve">Excluding Vogelherd leaves the ordering intact, consistent with S7’s finding that Aur-P1’s network does not depend on a single site. Finally, the within-phase two-group structure (RQ1) , the restricted/broad dichotomy recovered by seriation, Louvain community detection, bootstrap consensus, and the stochastic block model (S5, S6) , is defined within each phase’s membership and is unaffected by the between-phase assignment criterion tested here.</w:t>
       </w:r>
     </w:p>
-    <w:bookmarkEnd w:id="144"/>
-    <w:bookmarkEnd w:id="145"/>
-    <w:bookmarkStart w:id="201" w:name="sec-s9"/>
+    <w:bookmarkEnd w:id="153"/>
+    <w:bookmarkEnd w:id="154"/>
+    <w:bookmarkStart w:id="212" w:name="sec-s9"/>
     <w:p>
       <w:pPr>
         <w:pStyle w:val="Heading1"/>
@@ -24707,7 +25034,7 @@
       <w:pPr>
         <w:numPr>
           <w:ilvl w:val="0"/>
-          <w:numId w:val="1006"/>
+          <w:numId w:val="1007"/>
         </w:numPr>
         <w:pStyle w:val="Compact"/>
       </w:pPr>
@@ -24729,7 +25056,7 @@
       <w:pPr>
         <w:numPr>
           <w:ilvl w:val="0"/>
-          <w:numId w:val="1006"/>
+          <w:numId w:val="1007"/>
         </w:numPr>
         <w:pStyle w:val="Compact"/>
       </w:pPr>
@@ -24767,7 +25094,7 @@
       <w:pPr>
         <w:numPr>
           <w:ilvl w:val="0"/>
-          <w:numId w:val="1006"/>
+          <w:numId w:val="1007"/>
         </w:numPr>
         <w:pStyle w:val="Compact"/>
       </w:pPr>
@@ -24789,7 +25116,7 @@
       <w:pPr>
         <w:numPr>
           <w:ilvl w:val="0"/>
-          <w:numId w:val="1006"/>
+          <w:numId w:val="1007"/>
         </w:numPr>
         <w:pStyle w:val="Compact"/>
       </w:pPr>
@@ -24807,7 +25134,7 @@
         <w:t xml:space="preserve">Taken together, is the R/B division independent of sampling intensity, and if not, what limitation must be stated?</w:t>
       </w:r>
     </w:p>
-    <w:bookmarkStart w:id="153" w:name="sec-s9-1"/>
+    <w:bookmarkStart w:id="162" w:name="sec-s9-1"/>
     <w:p>
       <w:pPr>
         <w:pStyle w:val="Heading2"/>
@@ -24816,7 +25143,7 @@
         <w:t xml:space="preserve">S9.1 Object-count distribution and feasible common counts</w:t>
       </w:r>
     </w:p>
-    <w:bookmarkStart w:id="151" w:name="rationale-7"/>
+    <w:bookmarkStart w:id="160" w:name="rationale-8"/>
     <w:p>
       <w:pPr>
         <w:pStyle w:val="Heading3"/>
@@ -24860,7 +25187,7 @@
       <w:tr>
         <w:tc>
           <w:tcPr/>
-          <w:bookmarkStart w:id="146" w:name="tbl-s9-objcount"/>
+          <w:bookmarkStart w:id="155" w:name="tbl-s9-objcount"/>
           <w:tbl>
             <w:tblPr>
               <w:tblStyle w:val="Table"/>
@@ -26511,7 +26838,7 @@
               <w:t xml:space="preserve">Table 30: Per-site object counts by phase and manual restricted(1)/broad(2) group. The reviewer notes the strong Spearman correlation (ρ = 0.86) between object count and sign-type richness across sites.</w:t>
             </w:r>
           </w:p>
-          <w:bookmarkEnd w:id="146"/>
+          <w:bookmarkEnd w:id="155"/>
         </w:tc>
       </w:tr>
     </w:tbl>
@@ -26529,7 +26856,7 @@
       <w:tr>
         <w:tc>
           <w:tcPr/>
-          <w:bookmarkStart w:id="150" w:name="fig-s9-objhist"/>
+          <w:bookmarkStart w:id="159" w:name="fig-s9-objhist"/>
           <w:p>
             <w:pPr>
               <w:pStyle w:val="Compact"/>
@@ -26540,18 +26867,18 @@
                 <wp:inline>
                   <wp:extent cx="5943600" cy="2971800"/>
                   <wp:effectExtent b="0" l="0" r="0" t="0"/>
-                  <wp:docPr descr="" title="" id="148" name="Picture"/>
+                  <wp:docPr descr="" title="" id="157" name="Picture"/>
                   <a:graphic>
                     <a:graphicData uri="http://schemas.openxmlformats.org/drawingml/2006/picture">
                       <pic:pic>
                         <pic:nvPicPr>
-                          <pic:cNvPr descr="S1-supplement-sensitivity_files/figure-docx/fig-s9-objhist-1.png" id="149" name="Picture"/>
+                          <pic:cNvPr descr="S1-supplement-sensitivity_files/figure-docx/fig-s9-objhist-1.png" id="158" name="Picture"/>
                           <pic:cNvPicPr>
                             <a:picLocks noChangeArrowheads="1" noChangeAspect="1"/>
                           </pic:cNvPicPr>
                         </pic:nvPicPr>
                         <pic:blipFill>
-                          <a:blip r:embed="rId147"/>
+                          <a:blip r:embed="rId156"/>
                           <a:stretch>
                             <a:fillRect/>
                           </a:stretch>
@@ -26588,15 +26915,15 @@
               <w:pStyle w:val="ImageCaption"/>
             </w:pPr>
             <w:r>
-              <w:t xml:space="preserve">Figure 5: Distribution of object counts per site by phase. Most sites contribute few objects; a small number of large assemblages (e.g. Vogelherd) dominate the upper tail.</w:t>
+              <w:t xml:space="preserve">Figure 6: Distribution of object counts per site by phase. Most sites contribute few objects; a small number of large assemblages (e.g. Vogelherd) dominate the upper tail.</w:t>
             </w:r>
           </w:p>
-          <w:bookmarkEnd w:id="150"/>
+          <w:bookmarkEnd w:id="159"/>
         </w:tc>
       </w:tr>
     </w:tbl>
-    <w:bookmarkEnd w:id="151"/>
-    <w:bookmarkStart w:id="152" w:name="interpretation-6"/>
+    <w:bookmarkEnd w:id="160"/>
+    <w:bookmarkStart w:id="161" w:name="interpretation-7"/>
     <w:p>
       <w:pPr>
         <w:pStyle w:val="Heading3"/>
@@ -26668,9 +26995,9 @@
         <w:t xml:space="preserve">only 7 and 3 sites remain. The smallest sites (Trou al’Wesse, Fumane, Pod Hradem, Grottes de Fonds-de-Forêt with one object; Les Cottés, Labeko Koba, Hohlenstein-Stadel with two) can never be downsampled and are excluded from every replicate. We therefore report results at k = 3, 5, and 10, treating k = 10 as the most stringent test (fewest sites, but each built from a substantial object sample) and k = 3 as the most inclusive.</w:t>
       </w:r>
     </w:p>
-    <w:bookmarkEnd w:id="152"/>
-    <w:bookmarkEnd w:id="153"/>
-    <w:bookmarkStart w:id="162" w:name="sec-s9-2"/>
+    <w:bookmarkEnd w:id="161"/>
+    <w:bookmarkEnd w:id="162"/>
+    <w:bookmarkStart w:id="171" w:name="sec-s9-2"/>
     <w:p>
       <w:pPr>
         <w:pStyle w:val="Heading2"/>
@@ -26679,7 +27006,7 @@
         <w:t xml:space="preserve">S9.2 Object-level downsampling sensitivity</w:t>
       </w:r>
     </w:p>
-    <w:bookmarkStart w:id="160" w:name="rationale-8"/>
+    <w:bookmarkStart w:id="169" w:name="rationale-9"/>
     <w:p>
       <w:pPr>
         <w:pStyle w:val="Heading3"/>
@@ -26754,7 +27081,7 @@
       <w:tr>
         <w:tc>
           <w:tcPr/>
-          <w:bookmarkStart w:id="154" w:name="tbl-s9-retention"/>
+          <w:bookmarkStart w:id="163" w:name="tbl-s9-retention"/>
           <w:tbl>
             <w:tblPr>
               <w:tblStyle w:val="Table"/>
@@ -28555,7 +28882,7 @@
               <w:t xml:space="preserve">Table 31: Per-site group-retention rate under object-level downsampling to k = 3, 5, 10 objects per site (500 replicates each). Retention is the fraction of replicates in which the site’s realigned Louvain partition matches its manual restricted/broad assignment. Sites with fewer than k objects are excluded at that level.</w:t>
             </w:r>
           </w:p>
-          <w:bookmarkEnd w:id="154"/>
+          <w:bookmarkEnd w:id="163"/>
         </w:tc>
       </w:tr>
     </w:tbl>
@@ -28581,7 +28908,7 @@
       <w:tr>
         <w:tc>
           <w:tcPr/>
-          <w:bookmarkStart w:id="155" w:name="tbl-s9-stability"/>
+          <w:bookmarkStart w:id="164" w:name="tbl-s9-stability"/>
           <w:tbl>
             <w:tblPr>
               <w:tblStyle w:val="Table"/>
@@ -29174,7 +29501,7 @@
               <w:t xml:space="preserve">Table 32: Community-structure stability under object-level downsampling. For each phase and common count k: number of sites qualifying, mean Adjusted Rand Index (ARI) between the downsampled Louvain partition and the manual groups, mean network modularity, and mean number of Louvain communities detected.</w:t>
             </w:r>
           </w:p>
-          <w:bookmarkEnd w:id="155"/>
+          <w:bookmarkEnd w:id="164"/>
         </w:tc>
       </w:tr>
     </w:tbl>
@@ -29192,7 +29519,7 @@
       <w:tr>
         <w:tc>
           <w:tcPr/>
-          <w:bookmarkStart w:id="159" w:name="fig-s9-retention"/>
+          <w:bookmarkStart w:id="168" w:name="fig-s9-retention"/>
           <w:p>
             <w:pPr>
               <w:pStyle w:val="Compact"/>
@@ -29203,18 +29530,18 @@
                 <wp:inline>
                   <wp:extent cx="5943600" cy="5943600"/>
                   <wp:effectExtent b="0" l="0" r="0" t="0"/>
-                  <wp:docPr descr="" title="" id="157" name="Picture"/>
+                  <wp:docPr descr="" title="" id="166" name="Picture"/>
                   <a:graphic>
                     <a:graphicData uri="http://schemas.openxmlformats.org/drawingml/2006/picture">
                       <pic:pic>
                         <pic:nvPicPr>
-                          <pic:cNvPr descr="S1-supplement-sensitivity_files/figure-docx/fig-s9-retention-1.png" id="158" name="Picture"/>
+                          <pic:cNvPr descr="S1-supplement-sensitivity_files/figure-docx/fig-s9-retention-1.png" id="167" name="Picture"/>
                           <pic:cNvPicPr>
                             <a:picLocks noChangeArrowheads="1" noChangeAspect="1"/>
                           </pic:cNvPicPr>
                         </pic:nvPicPr>
                         <pic:blipFill>
-                          <a:blip r:embed="rId156"/>
+                          <a:blip r:embed="rId165"/>
                           <a:stretch>
                             <a:fillRect/>
                           </a:stretch>
@@ -29251,15 +29578,15 @@
               <w:pStyle w:val="ImageCaption"/>
             </w:pPr>
             <w:r>
-              <w:t xml:space="preserve">Figure 6: Group-retention rate by site under object-level downsampling to k = 3, 5, 10 objects per site. Bars near 1 (red) indicate assignments that survive downsampling; bars near 0.5 (blue) indicate assignments that are essentially random with respect to the manual grouping and therefore unstable.</w:t>
+              <w:t xml:space="preserve">Figure 7: Group-retention rate by site under object-level downsampling to k = 3, 5, 10 objects per site. Bars near 1 (red) indicate assignments that survive downsampling; bars near 0.5 (blue) indicate assignments that are essentially random with respect to the manual grouping and therefore unstable.</w:t>
             </w:r>
           </w:p>
-          <w:bookmarkEnd w:id="159"/>
+          <w:bookmarkEnd w:id="168"/>
         </w:tc>
       </w:tr>
     </w:tbl>
-    <w:bookmarkEnd w:id="160"/>
-    <w:bookmarkStart w:id="161" w:name="interpretation-7"/>
+    <w:bookmarkEnd w:id="169"/>
+    <w:bookmarkStart w:id="170" w:name="interpretation-8"/>
     <w:p>
       <w:pPr>
         <w:pStyle w:val="Heading3"/>
@@ -29310,9 +29637,9 @@
         <w:t xml:space="preserve">the R/B assignment of small-object sites is not robust to object-level downsampling; only the best-sampled sites retain their grouping, and the community structure as a whole loses coherence under downsampling. This shows that the division is, at least in part, a sampling-intensity effect rather than a fully stable cultural partition.</w:t>
       </w:r>
     </w:p>
-    <w:bookmarkEnd w:id="161"/>
-    <w:bookmarkEnd w:id="162"/>
-    <w:bookmarkStart w:id="170" w:name="sec-s9-3"/>
+    <w:bookmarkEnd w:id="170"/>
+    <w:bookmarkEnd w:id="171"/>
+    <w:bookmarkStart w:id="179" w:name="sec-s9-3"/>
     <w:p>
       <w:pPr>
         <w:pStyle w:val="Heading2"/>
@@ -29321,7 +29648,7 @@
         <w:t xml:space="preserve">S9.3 Coverage-based rarefaction</w:t>
       </w:r>
     </w:p>
-    <w:bookmarkStart w:id="168" w:name="rationale-9"/>
+    <w:bookmarkStart w:id="177" w:name="rationale-10"/>
     <w:p>
       <w:pPr>
         <w:pStyle w:val="Heading3"/>
@@ -29542,7 +29869,7 @@
       <w:tr>
         <w:tc>
           <w:tcPr/>
-          <w:bookmarkStart w:id="163" w:name="tbl-s9-rarefaction"/>
+          <w:bookmarkStart w:id="172" w:name="tbl-s9-rarefaction"/>
           <w:tbl>
             <w:tblPr>
               <w:tblStyle w:val="Table"/>
@@ -32389,7 +32716,7 @@
               <w:t xml:space="preserve">Table 33: Coverage-based rarefaction per site. richness_full is the observed number of sign types; coverage_full is the sample coverage at the full object sample; richness_at_target is the sign-type richness interpolated at target coverage = 0.9. Sites that never reach the target coverage are reported as NA, meaning rarefaction cannot assess them.</w:t>
             </w:r>
           </w:p>
-          <w:bookmarkEnd w:id="163"/>
+          <w:bookmarkEnd w:id="172"/>
         </w:tc>
       </w:tr>
     </w:tbl>
@@ -32407,7 +32734,7 @@
       <w:tr>
         <w:tc>
           <w:tcPr/>
-          <w:bookmarkStart w:id="167" w:name="fig-s9-rarefaction"/>
+          <w:bookmarkStart w:id="176" w:name="fig-s9-rarefaction"/>
           <w:p>
             <w:pPr>
               <w:pStyle w:val="Compact"/>
@@ -32418,18 +32745,18 @@
                 <wp:inline>
                   <wp:extent cx="5943600" cy="3396342"/>
                   <wp:effectExtent b="0" l="0" r="0" t="0"/>
-                  <wp:docPr descr="" title="" id="165" name="Picture"/>
+                  <wp:docPr descr="" title="" id="174" name="Picture"/>
                   <a:graphic>
                     <a:graphicData uri="http://schemas.openxmlformats.org/drawingml/2006/picture">
                       <pic:pic>
                         <pic:nvPicPr>
-                          <pic:cNvPr descr="S1-supplement-sensitivity_files/figure-docx/fig-s9-rarefaction-1.png" id="166" name="Picture"/>
+                          <pic:cNvPr descr="S1-supplement-sensitivity_files/figure-docx/fig-s9-rarefaction-1.png" id="175" name="Picture"/>
                           <pic:cNvPicPr>
                             <a:picLocks noChangeArrowheads="1" noChangeAspect="1"/>
                           </pic:cNvPicPr>
                         </pic:nvPicPr>
                         <pic:blipFill>
-                          <a:blip r:embed="rId164"/>
+                          <a:blip r:embed="rId173"/>
                           <a:stretch>
                             <a:fillRect/>
                           </a:stretch>
@@ -32466,15 +32793,15 @@
               <w:pStyle w:val="ImageCaption"/>
             </w:pPr>
             <w:r>
-              <w:t xml:space="preserve">Figure 7: Sign-type richness interpolated at target coverage = 0.9, by manual group, for sites that reach that coverage. Restricted sites (green) that attain high coverage remain low-richness; broad sites (red) remain high-richness.</w:t>
+              <w:t xml:space="preserve">Figure 8: Sign-type richness interpolated at target coverage = 0.9, by manual group, for sites that reach that coverage. Restricted sites (green) that attain high coverage remain low-richness; broad sites (red) remain high-richness.</w:t>
             </w:r>
           </w:p>
-          <w:bookmarkEnd w:id="167"/>
+          <w:bookmarkEnd w:id="176"/>
         </w:tc>
       </w:tr>
     </w:tbl>
-    <w:bookmarkEnd w:id="168"/>
-    <w:bookmarkStart w:id="169" w:name="interpretation-8"/>
+    <w:bookmarkEnd w:id="177"/>
+    <w:bookmarkStart w:id="178" w:name="interpretation-9"/>
     <w:p>
       <w:pPr>
         <w:pStyle w:val="Heading3"/>
@@ -32532,9 +32859,9 @@
         <w:t xml:space="preserve">, but the majority of sites — the small-object sites — never attain the target coverage and therefore cannot be placed on a common coverage footing at all. In Aur-P1, 7 of 20 sites reach coverage 0.9, and among them restricted sites remain low-richness (mean 1) while broad sites remain high-richness (mean 8.28; Wilcoxon p = 0.057). In Aur-P2 only 2 sites reach the target, of which 0 are broad and 2 restricted, so a group comparison is not computable (too few sites per group). Coverage-based rarefaction is consequently unreliable for the smallest assemblages: it can compare well-sampled sites, but it cannot rescue the assignment of sites with only one or two objects. This is the same limitation encountered in S9.2, approached from the richness axis.</w:t>
       </w:r>
     </w:p>
-    <w:bookmarkEnd w:id="169"/>
-    <w:bookmarkEnd w:id="170"/>
-    <w:bookmarkStart w:id="174" w:name="sec-s9-4"/>
+    <w:bookmarkEnd w:id="178"/>
+    <w:bookmarkEnd w:id="179"/>
+    <w:bookmarkStart w:id="183" w:name="sec-s9-4"/>
     <w:p>
       <w:pPr>
         <w:pStyle w:val="Heading2"/>
@@ -32543,7 +32870,7 @@
         <w:t xml:space="preserve">S9.4 Mixed model with object-count offset</w:t>
       </w:r>
     </w:p>
-    <w:bookmarkStart w:id="172" w:name="rationale-10"/>
+    <w:bookmarkStart w:id="181" w:name="rationale-11"/>
     <w:p>
       <w:pPr>
         <w:pStyle w:val="Heading3"/>
@@ -32846,7 +33173,7 @@
       <w:tr>
         <w:tc>
           <w:tcPr/>
-          <w:bookmarkStart w:id="171" w:name="tbl-s9-mixed"/>
+          <w:bookmarkStart w:id="180" w:name="tbl-s9-mixed"/>
           <w:tbl>
             <w:tblPr>
               <w:tblStyle w:val="Table"/>
@@ -33093,12 +33420,12 @@
               <w:t xml:space="preserve">Table 34: Negative-binomial model of per-site sign-type richness with object count as an offset (exposure). The group coefficient is the log rate ratio of broad versus restricted sites at equal object count; a non-significant coefficient means the raw richness gap between groups is explained by object count.</w:t>
             </w:r>
           </w:p>
-          <w:bookmarkEnd w:id="171"/>
+          <w:bookmarkEnd w:id="180"/>
         </w:tc>
       </w:tr>
     </w:tbl>
-    <w:bookmarkEnd w:id="172"/>
-    <w:bookmarkStart w:id="173" w:name="interpretation-9"/>
+    <w:bookmarkEnd w:id="181"/>
+    <w:bookmarkStart w:id="182" w:name="interpretation-10"/>
     <w:p>
       <w:pPr>
         <w:pStyle w:val="Heading3"/>
@@ -33154,9 +33481,9 @@
         <w:t xml:space="preserve">the richness difference between the groups is largely a sampling-effort artefact; group membership does not independently predict sign-type richness once object count is accounted for.</w:t>
       </w:r>
     </w:p>
-    <w:bookmarkEnd w:id="173"/>
-    <w:bookmarkEnd w:id="174"/>
-    <w:bookmarkStart w:id="175" w:name="s9.5-synthesis-and-limitation"/>
+    <w:bookmarkEnd w:id="182"/>
+    <w:bookmarkEnd w:id="183"/>
+    <w:bookmarkStart w:id="184" w:name="s9.5-synthesis-and-limitation"/>
     <w:p>
       <w:pPr>
         <w:pStyle w:val="Heading2"/>
@@ -33186,8 +33513,8 @@
         <w:t xml:space="preserve">: it is recovered robustly for large assemblages, but for the numerous small assemblages it is partly an artefact of how many objects were recovered.</w:t>
       </w:r>
     </w:p>
-    <w:bookmarkEnd w:id="175"/>
-    <w:bookmarkStart w:id="200" w:name="references-cited"/>
+    <w:bookmarkEnd w:id="184"/>
+    <w:bookmarkStart w:id="211" w:name="references-cited"/>
     <w:p>
       <w:pPr>
         <w:pStyle w:val="Heading2"/>
@@ -33196,8 +33523,8 @@
         <w:t xml:space="preserve">References cited</w:t>
       </w:r>
     </w:p>
-    <w:bookmarkStart w:id="199" w:name="refs"/>
-    <w:bookmarkStart w:id="177" w:name="X68cdd7ba62fc5dd3e1e9b497937717305f7b9a0"/>
+    <w:bookmarkStart w:id="210" w:name="refs"/>
+    <w:bookmarkStart w:id="186" w:name="X68cdd7ba62fc5dd3e1e9b497937717305f7b9a0"/>
     <w:p>
       <w:pPr>
         <w:pStyle w:val="Bibliography"/>
@@ -33229,7 +33556,7 @@
       <w:r>
         <w:t xml:space="preserve"> </w:t>
       </w:r>
-      <w:hyperlink r:id="rId176">
+      <w:hyperlink r:id="rId185">
         <w:r>
           <w:rPr>
             <w:rStyle w:val="Hyperlink"/>
@@ -33241,8 +33568,8 @@
         <w:t xml:space="preserve">.</w:t>
       </w:r>
     </w:p>
-    <w:bookmarkEnd w:id="177"/>
-    <w:bookmarkStart w:id="179" w:name="ref-teyssandier2018entity"/>
+    <w:bookmarkEnd w:id="186"/>
+    <w:bookmarkStart w:id="188" w:name="ref-teyssandier2018entity"/>
     <w:p>
       <w:pPr>
         <w:pStyle w:val="Bibliography"/>
@@ -33301,7 +33628,7 @@
       <w:r>
         <w:t xml:space="preserve"> </w:t>
       </w:r>
-      <w:hyperlink r:id="rId178">
+      <w:hyperlink r:id="rId187">
         <w:r>
           <w:rPr>
             <w:rStyle w:val="Hyperlink"/>
@@ -33313,8 +33640,8 @@
         <w:t xml:space="preserve">.</w:t>
       </w:r>
     </w:p>
-    <w:bookmarkEnd w:id="179"/>
-    <w:bookmarkStart w:id="181" w:name="ref-newman2004finding"/>
+    <w:bookmarkEnd w:id="188"/>
+    <w:bookmarkStart w:id="190" w:name="ref-newman2004finding"/>
     <w:p>
       <w:pPr>
         <w:pStyle w:val="Bibliography"/>
@@ -33334,7 +33661,7 @@
       <w:r>
         <w:t xml:space="preserve"> </w:t>
       </w:r>
-      <w:hyperlink r:id="rId180">
+      <w:hyperlink r:id="rId189">
         <w:r>
           <w:rPr>
             <w:rStyle w:val="Hyperlink"/>
@@ -33346,8 +33673,8 @@
         <w:t xml:space="preserve">.</w:t>
       </w:r>
     </w:p>
-    <w:bookmarkEnd w:id="181"/>
-    <w:bookmarkStart w:id="183" w:name="ref-Monti_2003"/>
+    <w:bookmarkEnd w:id="190"/>
+    <w:bookmarkStart w:id="192" w:name="ref-Lichstein_2007"/>
     <w:p>
       <w:pPr>
         <w:pStyle w:val="Bibliography"/>
@@ -33362,12 +33689,45 @@
         <w:t xml:space="preserve">	</w:t>
       </w:r>
       <w:r>
+        <w:t xml:space="preserve">Lichstein JW. Multiple regression on distance matrices: A multivariate spatial analysis tool. Plant Ecology 2007;188:117–31.</w:t>
+      </w:r>
+      <w:r>
+        <w:t xml:space="preserve"> </w:t>
+      </w:r>
+      <w:hyperlink r:id="rId191">
+        <w:r>
+          <w:rPr>
+            <w:rStyle w:val="Hyperlink"/>
+          </w:rPr>
+          <w:t xml:space="preserve">https://doi.org/10.1007/s11258-006-9126-3</w:t>
+        </w:r>
+      </w:hyperlink>
+      <w:r>
+        <w:t xml:space="preserve">.</w:t>
+      </w:r>
+    </w:p>
+    <w:bookmarkEnd w:id="192"/>
+    <w:bookmarkStart w:id="194" w:name="ref-Monti_2003"/>
+    <w:p>
+      <w:pPr>
+        <w:pStyle w:val="Bibliography"/>
+      </w:pPr>
+      <w:r>
+        <w:t xml:space="preserve">[5]</w:t>
+      </w:r>
+      <w:r>
+        <w:t xml:space="preserve"> </w:t>
+      </w:r>
+      <w:r>
+        <w:t xml:space="preserve">	</w:t>
+      </w:r>
+      <w:r>
         <w:t xml:space="preserve">Monti S, Tamayo P, Mesirov J, Golub T. Consensus clustering: A resampling-based method for class discovery and visualization of gene expression microarray data. Machine Learning 2003;52:91–118.</w:t>
       </w:r>
       <w:r>
         <w:t xml:space="preserve"> </w:t>
       </w:r>
-      <w:hyperlink r:id="rId182">
+      <w:hyperlink r:id="rId193">
         <w:r>
           <w:rPr>
             <w:rStyle w:val="Hyperlink"/>
@@ -33379,14 +33739,14 @@
         <w:t xml:space="preserve">.</w:t>
       </w:r>
     </w:p>
-    <w:bookmarkEnd w:id="183"/>
-    <w:bookmarkStart w:id="185" w:name="ref-Bentz_Dutkiewicz_2026"/>
+    <w:bookmarkEnd w:id="194"/>
+    <w:bookmarkStart w:id="196" w:name="ref-Bentz_Dutkiewicz_2026"/>
     <w:p>
       <w:pPr>
         <w:pStyle w:val="Bibliography"/>
       </w:pPr>
       <w:r>
-        <w:t xml:space="preserve">[5]</w:t>
+        <w:t xml:space="preserve">[6]</w:t>
       </w:r>
       <w:r>
         <w:t xml:space="preserve"> </w:t>
@@ -33400,7 +33760,7 @@
       <w:r>
         <w:t xml:space="preserve"> </w:t>
       </w:r>
-      <w:hyperlink r:id="rId184">
+      <w:hyperlink r:id="rId195">
         <w:r>
           <w:rPr>
             <w:rStyle w:val="Hyperlink"/>
@@ -33412,14 +33772,14 @@
         <w:t xml:space="preserve">.</w:t>
       </w:r>
     </w:p>
-    <w:bookmarkEnd w:id="185"/>
-    <w:bookmarkStart w:id="187" w:name="ref-Chiotti_2005"/>
+    <w:bookmarkEnd w:id="196"/>
+    <w:bookmarkStart w:id="198" w:name="ref-Chiotti_2005"/>
     <w:p>
       <w:pPr>
         <w:pStyle w:val="Bibliography"/>
       </w:pPr>
       <w:r>
-        <w:t xml:space="preserve">[6]</w:t>
+        <w:t xml:space="preserve">[7]</w:t>
       </w:r>
       <w:r>
         <w:t xml:space="preserve"> </w:t>
@@ -33460,7 +33820,7 @@
       <w:r>
         <w:t xml:space="preserve"> </w:t>
       </w:r>
-      <w:hyperlink r:id="rId186">
+      <w:hyperlink r:id="rId197">
         <w:r>
           <w:rPr>
             <w:rStyle w:val="Hyperlink"/>
@@ -33472,14 +33832,14 @@
         <w:t xml:space="preserve">.</w:t>
       </w:r>
     </w:p>
-    <w:bookmarkEnd w:id="187"/>
-    <w:bookmarkStart w:id="189" w:name="ref-Higham_Abri_Pataud_2011"/>
+    <w:bookmarkEnd w:id="198"/>
+    <w:bookmarkStart w:id="200" w:name="ref-Higham_Abri_Pataud_2011"/>
     <w:p>
       <w:pPr>
         <w:pStyle w:val="Bibliography"/>
       </w:pPr>
       <w:r>
-        <w:t xml:space="preserve">[7]</w:t>
+        <w:t xml:space="preserve">[8]</w:t>
       </w:r>
       <w:r>
         <w:t xml:space="preserve"> </w:t>
@@ -33532,7 +33892,7 @@
       <w:r>
         <w:t xml:space="preserve"> </w:t>
       </w:r>
-      <w:hyperlink r:id="rId188">
+      <w:hyperlink r:id="rId199">
         <w:r>
           <w:rPr>
             <w:rStyle w:val="Hyperlink"/>
@@ -33544,14 +33904,14 @@
         <w:t xml:space="preserve">.</w:t>
       </w:r>
     </w:p>
-    <w:bookmarkEnd w:id="189"/>
-    <w:bookmarkStart w:id="191" w:name="ref-Talamo_La_Ferrassie_2020"/>
+    <w:bookmarkEnd w:id="200"/>
+    <w:bookmarkStart w:id="202" w:name="ref-Talamo_La_Ferrassie_2020"/>
     <w:p>
       <w:pPr>
         <w:pStyle w:val="Bibliography"/>
       </w:pPr>
       <w:r>
-        <w:t xml:space="preserve">[8]</w:t>
+        <w:t xml:space="preserve">[9]</w:t>
       </w:r>
       <w:r>
         <w:t xml:space="preserve"> </w:t>
@@ -33646,7 +34006,7 @@
       <w:r>
         <w:t xml:space="preserve"> </w:t>
       </w:r>
-      <w:hyperlink r:id="rId190">
+      <w:hyperlink r:id="rId201">
         <w:r>
           <w:rPr>
             <w:rStyle w:val="Hyperlink"/>
@@ -33658,14 +34018,14 @@
         <w:t xml:space="preserve">.</w:t>
       </w:r>
     </w:p>
-    <w:bookmarkEnd w:id="191"/>
-    <w:bookmarkStart w:id="192" w:name="ref-Delporte_1984_Ferrassie"/>
+    <w:bookmarkEnd w:id="202"/>
+    <w:bookmarkStart w:id="203" w:name="ref-Delporte_1984_Ferrassie"/>
     <w:p>
       <w:pPr>
         <w:pStyle w:val="Bibliography"/>
       </w:pPr>
       <w:r>
-        <w:t xml:space="preserve">[9]</w:t>
+        <w:t xml:space="preserve">[10]</w:t>
       </w:r>
       <w:r>
         <w:t xml:space="preserve"> </w:t>
@@ -33698,14 +34058,14 @@
         <w:t xml:space="preserve">histoire; 1984.</w:t>
       </w:r>
     </w:p>
-    <w:bookmarkEnd w:id="192"/>
-    <w:bookmarkStart w:id="194" w:name="ref-Oliva_2006"/>
+    <w:bookmarkEnd w:id="203"/>
+    <w:bookmarkStart w:id="205" w:name="ref-Oliva_2006"/>
     <w:p>
       <w:pPr>
         <w:pStyle w:val="Bibliography"/>
       </w:pPr>
       <w:r>
-        <w:t xml:space="preserve">[10]</w:t>
+        <w:t xml:space="preserve">[11]</w:t>
       </w:r>
       <w:r>
         <w:t xml:space="preserve"> </w:t>
@@ -33767,7 +34127,7 @@
       <w:r>
         <w:t xml:space="preserve"> </w:t>
       </w:r>
-      <w:hyperlink r:id="rId193">
+      <w:hyperlink r:id="rId204">
         <w:r>
           <w:rPr>
             <w:rStyle w:val="Hyperlink"/>
@@ -33779,14 +34139,14 @@
         <w:t xml:space="preserve">.</w:t>
       </w:r>
     </w:p>
-    <w:bookmarkEnd w:id="194"/>
-    <w:bookmarkStart w:id="196" w:name="ref-Wild_et_al_2005"/>
+    <w:bookmarkEnd w:id="205"/>
+    <w:bookmarkStart w:id="207" w:name="ref-Wild_et_al_2005"/>
     <w:p>
       <w:pPr>
         <w:pStyle w:val="Bibliography"/>
       </w:pPr>
       <w:r>
-        <w:t xml:space="preserve">[11]</w:t>
+        <w:t xml:space="preserve">[12]</w:t>
       </w:r>
       <w:r>
         <w:t xml:space="preserve"> </w:t>
@@ -33836,7 +34196,7 @@
       <w:r>
         <w:t xml:space="preserve"> </w:t>
       </w:r>
-      <w:hyperlink r:id="rId195">
+      <w:hyperlink r:id="rId206">
         <w:r>
           <w:rPr>
             <w:rStyle w:val="Hyperlink"/>
@@ -33848,14 +34208,14 @@
         <w:t xml:space="preserve">.</w:t>
       </w:r>
     </w:p>
-    <w:bookmarkEnd w:id="196"/>
-    <w:bookmarkStart w:id="198" w:name="ref-Schurch_Conard_2026_reassess"/>
+    <w:bookmarkEnd w:id="207"/>
+    <w:bookmarkStart w:id="209" w:name="ref-Schurch_Conard_2026_reassess"/>
     <w:p>
       <w:pPr>
         <w:pStyle w:val="Bibliography"/>
       </w:pPr>
       <w:r>
-        <w:t xml:space="preserve">[12]</w:t>
+        <w:t xml:space="preserve">[13]</w:t>
       </w:r>
       <w:r>
         <w:t xml:space="preserve"> </w:t>
@@ -33884,7 +34244,7 @@
       <w:r>
         <w:t xml:space="preserve"> </w:t>
       </w:r>
-      <w:hyperlink r:id="rId197">
+      <w:hyperlink r:id="rId208">
         <w:r>
           <w:rPr>
             <w:rStyle w:val="Hyperlink"/>
@@ -33896,10 +34256,10 @@
         <w:t xml:space="preserve">.</w:t>
       </w:r>
     </w:p>
-    <w:bookmarkEnd w:id="198"/>
-    <w:bookmarkEnd w:id="199"/>
-    <w:bookmarkEnd w:id="200"/>
-    <w:bookmarkEnd w:id="201"/>
+    <w:bookmarkEnd w:id="209"/>
+    <w:bookmarkEnd w:id="210"/>
+    <w:bookmarkEnd w:id="211"/>
+    <w:bookmarkEnd w:id="212"/>
     <w:sectPr>
       <w:footnotePr>
         <w:numRestart w:val="eachSect"/>
@@ -34401,12 +34761,42 @@
     <w:abstractNumId w:val="991"/>
   </w:num>
   <w:num w:numId="1004">
-    <w:abstractNumId w:val="991"/>
+    <w:abstractNumId w:val="99411"/>
+    <w:lvlOverride w:ilvl="0">
+      <w:startOverride w:val="1"/>
+    </w:lvlOverride>
+    <w:lvlOverride w:ilvl="1">
+      <w:startOverride w:val="1"/>
+    </w:lvlOverride>
+    <w:lvlOverride w:ilvl="2">
+      <w:startOverride w:val="1"/>
+    </w:lvlOverride>
+    <w:lvlOverride w:ilvl="3">
+      <w:startOverride w:val="1"/>
+    </w:lvlOverride>
+    <w:lvlOverride w:ilvl="4">
+      <w:startOverride w:val="1"/>
+    </w:lvlOverride>
+    <w:lvlOverride w:ilvl="5">
+      <w:startOverride w:val="1"/>
+    </w:lvlOverride>
+    <w:lvlOverride w:ilvl="6">
+      <w:startOverride w:val="1"/>
+    </w:lvlOverride>
+    <w:lvlOverride w:ilvl="7">
+      <w:startOverride w:val="1"/>
+    </w:lvlOverride>
+    <w:lvlOverride w:ilvl="8">
+      <w:startOverride w:val="1"/>
+    </w:lvlOverride>
   </w:num>
   <w:num w:numId="1005">
     <w:abstractNumId w:val="991"/>
   </w:num>
   <w:num w:numId="1006">
+    <w:abstractNumId w:val="991"/>
+  </w:num>
+  <w:num w:numId="1007">
     <w:abstractNumId w:val="99411"/>
     <w:lvlOverride w:ilvl="0">
       <w:startOverride w:val="1"/>

</xml_diff>

<commit_message>
Add comparison of the two phases at equal coverage and at equal object count with iNEXT
</commit_message>
<xml_diff>
--- a/paper/S1-supplement-sensitivity.docx
+++ b/paper/S1-supplement-sensitivity.docx
@@ -513,7 +513,7 @@
         <w:t xml:space="preserve">manual_groups</w:t>
       </w:r>
       <w:r>
-        <w:t xml:space="preserve">) assigns more sites to Aur-P1, while the younger end assigns more to Aur-P2; the midpoint variant gives intermediate assignments. Key sites that change phase include Mladeč (older: Aur-P1, midpoint/younger: Aur-P2), Cellier, Solutré, Grotte de la Verpillière I, Trou al’Wesse, and Grottes de Fonds-de-Forêt (older: Aur-P1, midpoint/younger: Aur-P2). This confirms the review’s finding that the original single-end calibration systematically biases sites toward the older phase. Sensitivity analyses S5.5, S5.10, S5.12, and S8 should be re-evaluated under each variant; the main text uses the older variant to match the report-based partition (midpoint/younger explored as sensitivity).</w:t>
+        <w:t xml:space="preserve">) assigns more sites to Aur-P1, while the younger end assigns more to Aur-P2; the midpoint variant gives intermediate assignments. Key sites that change phase include Mladeč (older: Aur-P1, midpoint/younger: Aur-P2), Cellier, Solutré, Grotte de la Verpillière I, Trou al’Wesse, and Grottes de Fonds-de-Forêt (older: Aur-P1, midpoint/younger: Aur-P2). This confirms the review’s finding that the original single-end calibration systematically biases sites toward the older phase.</w:t>
       </w:r>
     </w:p>
     <w:bookmarkEnd w:id="22"/>
@@ -32608,7 +32608,7 @@
     </w:p>
     <w:bookmarkEnd w:id="238"/>
     <w:bookmarkEnd w:id="239"/>
-    <w:bookmarkStart w:id="307" w:name="sec-s9"/>
+    <w:bookmarkStart w:id="319" w:name="sec-s9"/>
     <w:p>
       <w:pPr>
         <w:pStyle w:val="Heading1"/>
@@ -32654,7 +32654,7 @@
         <w:t xml:space="preserve"> </w:t>
       </w:r>
       <w:r>
-        <w:t xml:space="preserve">of the object-count difference, not for the fact that richer assemblages are, by construction, more likely to be classified as broad. This section provides an object-level resampling/rareffaction sensitivity analysis. It asks four specific questions:</w:t>
+        <w:t xml:space="preserve">of the object-count difference, not for the fact that richer assemblages are, by construction, more likely to be classified as broad. This section provides an object-level resampling/rareffaction sensitivity analysis. It asks five specific questions:</w:t>
       </w:r>
     </w:p>
     <w:p>
@@ -32753,6 +32753,43 @@
           <w:b/>
         </w:rPr>
         <w:t xml:space="preserve">(S9.5)</w:t>
+      </w:r>
+      <w:r>
+        <w:t xml:space="preserve"> </w:t>
+      </w:r>
+      <w:r>
+        <w:t xml:space="preserve">At equal effort with</w:t>
+      </w:r>
+      <w:r>
+        <w:t xml:space="preserve"> </w:t>
+      </w:r>
+      <w:r>
+        <w:rPr>
+          <w:rStyle w:val="VerbatimChar"/>
+        </w:rPr>
+        <w:t xml:space="preserve">iNEXT</w:t>
+      </w:r>
+      <w:r>
+        <w:t xml:space="preserve"> </w:t>
+      </w:r>
+      <w:r>
+        <w:t xml:space="preserve">(incidence_raw), does the Aur-P1 vs Aur-P2 sign-type pool (26 vs 15) remain larger, or is it not distinguishable from sampling variation at 63 objects, including when restricted to object types present in both phases?</w:t>
+      </w:r>
+    </w:p>
+    <w:p>
+      <w:pPr>
+        <w:numPr>
+          <w:ilvl w:val="0"/>
+          <w:numId w:val="1008"/>
+        </w:numPr>
+        <w:pStyle w:val="Compact"/>
+      </w:pPr>
+      <w:r>
+        <w:rPr>
+          <w:bCs/>
+          <w:b/>
+        </w:rPr>
+        <w:t xml:space="preserve">(S9.6)</w:t>
       </w:r>
       <w:r>
         <w:t xml:space="preserve"> </w:t>
@@ -41122,13 +41159,22 @@
     </w:p>
     <w:bookmarkEnd w:id="267"/>
     <w:bookmarkEnd w:id="268"/>
-    <w:bookmarkStart w:id="269" w:name="s9.5-synthesis-and-limitation"/>
+    <w:bookmarkStart w:id="276" w:name="sec-s9-5"/>
     <w:p>
       <w:pPr>
         <w:pStyle w:val="Heading2"/>
       </w:pPr>
       <w:r>
-        <w:t xml:space="preserve">S9.5 Synthesis and limitation</w:t>
+        <w:t xml:space="preserve">S9.5 Equal-effort pool comparison (iNEXT)</w:t>
+      </w:r>
+    </w:p>
+    <w:bookmarkStart w:id="274" w:name="rationale-13"/>
+    <w:p>
+      <w:pPr>
+        <w:pStyle w:val="Heading3"/>
+      </w:pPr>
+      <w:r>
+        <w:t xml:space="preserve">Rationale</w:t>
       </w:r>
     </w:p>
     <w:p>
@@ -41136,7 +41182,1136 @@
         <w:pStyle w:val="FirstParagraph"/>
       </w:pPr>
       <w:r>
-        <w:t xml:space="preserve">The three object-level analyses converge on a single conclusion. (1) Under object-downsampling, only the best-sampled sites retain their R/B assignment; small-object sites flip group at rates indistinguishable from chance, and network modularity collapses (S9.2). (2) Coverage-based rarefaction can compare richness only among the well-sampled sites, and even there the broad/restricted contrast persists — but the majority of sites never reach a comparable coverage, so the method cannot vindicate them (S9.3). (3) Once object count is held constant statistically, group no longer predicts sign-type richness (S9.4). Together these show that the restricted/broad division is</w:t>
+        <w:t xml:space="preserve">The Conclusion states that the sign-type pool contracts from Aur-P1 (26 types) to Aur-P2 (15 types), consistent with cultural drift in small populations. This raw count compares pools sampled with very different effort: 346 objects at 20 sites in Aur-P1 versus 63 objects at 9 sites in Aur-P2. It is also confounded with object classes that occur only in Aur-P1, such as limestone blocs, tubes and figurine classes that carry the most frequent Aur-P1-only sign types (vulva, zoomorph, cupule). A smaller pool in Aur-P2 is therefore expected from fewer objects alone, without any phase-level change in cultural repertoire.</w:t>
+      </w:r>
+    </w:p>
+    <w:p>
+      <w:pPr>
+        <w:pStyle w:val="BodyText"/>
+      </w:pPr>
+      <w:r>
+        <w:t xml:space="preserve">We test the contraction at equal effort with incidence-based rarefaction and extrapolation using</w:t>
+      </w:r>
+      <w:r>
+        <w:t xml:space="preserve"> </w:t>
+      </w:r>
+      <w:r>
+        <w:rPr>
+          <w:rStyle w:val="VerbatimChar"/>
+        </w:rPr>
+        <w:t xml:space="preserve">iNEXT</w:t>
+      </w:r>
+      <w:r>
+        <w:t xml:space="preserve"> </w:t>
+      </w:r>
+      <w:r>
+        <w:t xml:space="preserve">[19,20]</w:t>
+      </w:r>
+      <w:r>
+        <w:t xml:space="preserve">. Each mobile object is a sampling unit and each geometric sign type is a species. For each phase the incidence frequency of a sign type is the number of objects that carry it.</w:t>
+      </w:r>
+      <w:r>
+        <w:t xml:space="preserve"> </w:t>
+      </w:r>
+      <w:r>
+        <w:rPr>
+          <w:rStyle w:val="VerbatimChar"/>
+        </w:rPr>
+        <w:t xml:space="preserve">iNEXT</w:t>
+      </w:r>
+      <w:r>
+        <w:t xml:space="preserve"> </w:t>
+      </w:r>
+      <w:r>
+        <w:t xml:space="preserve">with</w:t>
+      </w:r>
+      <w:r>
+        <w:t xml:space="preserve"> </w:t>
+      </w:r>
+      <w:r>
+        <w:rPr>
+          <w:rStyle w:val="VerbatimChar"/>
+        </w:rPr>
+        <w:t xml:space="preserve">datatype = "incidence_freq"</w:t>
+      </w:r>
+      <w:r>
+        <w:t xml:space="preserve"> </w:t>
+      </w:r>
+      <w:r>
+        <w:t xml:space="preserve">standardises richness by sample completeness and returns 95% confidence intervals from 200 bootstrap replicates. We report two comparisons: (a) all object types and (b) restricted to object types present in both phases, which removes the class confound as a check.</w:t>
+      </w:r>
+    </w:p>
+    <w:p>
+      <w:pPr>
+        <w:pStyle w:val="BodyText"/>
+      </w:pPr>
+      <w:r>
+        <w:rPr>
+          <w:bCs/>
+          <w:b/>
+        </w:rPr>
+        <w:t xml:space="preserve">Question this analysis answers:</w:t>
+      </w:r>
+      <w:r>
+        <w:t xml:space="preserve"> </w:t>
+      </w:r>
+      <w:r>
+        <w:t xml:space="preserve">at equal object count or equal coverage, does the Aur-P1 pool remain larger than the Aur-P2 pool, or is the raw 26 vs 15 difference not distinguishable from sampling variation?</w:t>
+      </w:r>
+    </w:p>
+    <w:tbl>
+      <w:tblPr>
+        <w:tblStyle w:val="Table"/>
+        <w:tblW w:type="pct" w:w="5000"/>
+        <w:tblLook w:firstRow="0" w:lastRow="0" w:firstColumn="0" w:lastColumn="0" w:noHBand="0" w:noVBand="0" w:val="0000"/>
+        <w:jc w:val="start"/>
+        <w:tblLayout w:type="fixed"/>
+      </w:tblPr>
+      <w:tblGrid>
+        <w:gridCol w:w="7920"/>
+      </w:tblGrid>
+      <w:tr>
+        <w:tc>
+          <w:tcPr/>
+          <w:bookmarkStart w:id="269" w:name="tbl-s9-pool-inext"/>
+          <w:tbl>
+            <w:tblPr>
+              <w:tblStyle w:val="Table"/>
+              <w:tblW w:type="pct" w:w="5000"/>
+              <w:tblLook w:firstRow="1" w:lastRow="0" w:firstColumn="0" w:lastColumn="0" w:noHBand="0" w:noVBand="0" w:val="0020"/>
+              <w:jc w:val="start"/>
+              <w:tblLayout w:type="fixed"/>
+            </w:tblPr>
+            <w:tblGrid>
+              <w:gridCol w:w="1952"/>
+              <w:gridCol w:w="759"/>
+              <w:gridCol w:w="1301"/>
+              <w:gridCol w:w="1518"/>
+              <w:gridCol w:w="542"/>
+              <w:gridCol w:w="542"/>
+              <w:gridCol w:w="1301"/>
+            </w:tblGrid>
+            <w:tr>
+              <w:trPr>
+                <w:tblHeader w:val="true"/>
+              </w:trPr>
+              <w:tc>
+                <w:tcPr/>
+                <w:p>
+                  <w:pPr>
+                    <w:pStyle w:val="Compact"/>
+                    <w:jc w:val="left"/>
+                    <w:jc w:val="center"/>
+                  </w:pPr>
+                  <w:r>
+                    <w:t xml:space="preserve">Object-type set</w:t>
+                  </w:r>
+                </w:p>
+              </w:tc>
+              <w:tc>
+                <w:tcPr/>
+                <w:p>
+                  <w:pPr>
+                    <w:pStyle w:val="Compact"/>
+                    <w:jc w:val="left"/>
+                    <w:jc w:val="center"/>
+                  </w:pPr>
+                  <w:r>
+                    <w:t xml:space="preserve">Phase</w:t>
+                  </w:r>
+                </w:p>
+              </w:tc>
+              <w:tc>
+                <w:tcPr/>
+                <w:p>
+                  <w:pPr>
+                    <w:pStyle w:val="Compact"/>
+                    <w:jc w:val="right"/>
+                    <w:jc w:val="center"/>
+                  </w:pPr>
+                  <w:r>
+                    <w:t xml:space="preserve">m (objects)</w:t>
+                  </w:r>
+                </w:p>
+              </w:tc>
+              <w:tc>
+                <w:tcPr/>
+                <w:p>
+                  <w:pPr>
+                    <w:pStyle w:val="Compact"/>
+                    <w:jc w:val="right"/>
+                    <w:jc w:val="center"/>
+                  </w:pPr>
+                  <w:r>
+                    <w:t xml:space="preserve">Richness (qD)</w:t>
+                  </w:r>
+                </w:p>
+              </w:tc>
+              <w:tc>
+                <w:tcPr/>
+                <w:p>
+                  <w:pPr>
+                    <w:pStyle w:val="Compact"/>
+                    <w:jc w:val="right"/>
+                    <w:jc w:val="center"/>
+                  </w:pPr>
+                  <w:r>
+                    <w:t xml:space="preserve">LCL</w:t>
+                  </w:r>
+                </w:p>
+              </w:tc>
+              <w:tc>
+                <w:tcPr/>
+                <w:p>
+                  <w:pPr>
+                    <w:pStyle w:val="Compact"/>
+                    <w:jc w:val="right"/>
+                    <w:jc w:val="center"/>
+                  </w:pPr>
+                  <w:r>
+                    <w:t xml:space="preserve">UCL</w:t>
+                  </w:r>
+                </w:p>
+              </w:tc>
+              <w:tc>
+                <w:tcPr/>
+                <w:p>
+                  <w:pPr>
+                    <w:pStyle w:val="Compact"/>
+                    <w:jc w:val="left"/>
+                    <w:jc w:val="center"/>
+                  </w:pPr>
+                  <w:r>
+                    <w:t xml:space="preserve">Method</w:t>
+                  </w:r>
+                </w:p>
+              </w:tc>
+            </w:tr>
+            <w:tr>
+              <w:tc>
+                <w:tcPr/>
+                <w:p>
+                  <w:pPr>
+                    <w:pStyle w:val="Compact"/>
+                    <w:jc w:val="left"/>
+                    <w:jc w:val="center"/>
+                  </w:pPr>
+                  <w:r>
+                    <w:t xml:space="preserve">all types</w:t>
+                  </w:r>
+                </w:p>
+              </w:tc>
+              <w:tc>
+                <w:tcPr/>
+                <w:p>
+                  <w:pPr>
+                    <w:pStyle w:val="Compact"/>
+                    <w:jc w:val="left"/>
+                    <w:jc w:val="center"/>
+                  </w:pPr>
+                  <w:r>
+                    <w:t xml:space="preserve">Aur-P1</w:t>
+                  </w:r>
+                </w:p>
+              </w:tc>
+              <w:tc>
+                <w:tcPr/>
+                <w:p>
+                  <w:pPr>
+                    <w:pStyle w:val="Compact"/>
+                    <w:jc w:val="right"/>
+                    <w:jc w:val="center"/>
+                  </w:pPr>
+                  <w:r>
+                    <w:t xml:space="preserve">63</w:t>
+                  </w:r>
+                </w:p>
+              </w:tc>
+              <w:tc>
+                <w:tcPr/>
+                <w:p>
+                  <w:pPr>
+                    <w:pStyle w:val="Compact"/>
+                    <w:jc w:val="right"/>
+                    <w:jc w:val="center"/>
+                  </w:pPr>
+                  <w:r>
+                    <w:t xml:space="preserve">16.9</w:t>
+                  </w:r>
+                </w:p>
+              </w:tc>
+              <w:tc>
+                <w:tcPr/>
+                <w:p>
+                  <w:pPr>
+                    <w:pStyle w:val="Compact"/>
+                    <w:jc w:val="right"/>
+                    <w:jc w:val="center"/>
+                  </w:pPr>
+                  <w:r>
+                    <w:t xml:space="preserve">15.5</w:t>
+                  </w:r>
+                </w:p>
+              </w:tc>
+              <w:tc>
+                <w:tcPr/>
+                <w:p>
+                  <w:pPr>
+                    <w:pStyle w:val="Compact"/>
+                    <w:jc w:val="right"/>
+                    <w:jc w:val="center"/>
+                  </w:pPr>
+                  <w:r>
+                    <w:t xml:space="preserve">18.3</w:t>
+                  </w:r>
+                </w:p>
+              </w:tc>
+              <w:tc>
+                <w:tcPr/>
+                <w:p>
+                  <w:pPr>
+                    <w:pStyle w:val="Compact"/>
+                    <w:jc w:val="left"/>
+                    <w:jc w:val="center"/>
+                  </w:pPr>
+                  <w:r>
+                    <w:t xml:space="preserve">Rarefaction</w:t>
+                  </w:r>
+                </w:p>
+              </w:tc>
+            </w:tr>
+            <w:tr>
+              <w:tc>
+                <w:tcPr/>
+                <w:p>
+                  <w:pPr>
+                    <w:pStyle w:val="Compact"/>
+                    <w:jc w:val="left"/>
+                    <w:jc w:val="center"/>
+                  </w:pPr>
+                  <w:r>
+                    <w:t xml:space="preserve">all types</w:t>
+                  </w:r>
+                </w:p>
+              </w:tc>
+              <w:tc>
+                <w:tcPr/>
+                <w:p>
+                  <w:pPr>
+                    <w:pStyle w:val="Compact"/>
+                    <w:jc w:val="left"/>
+                    <w:jc w:val="center"/>
+                  </w:pPr>
+                  <w:r>
+                    <w:t xml:space="preserve">Aur-P1</w:t>
+                  </w:r>
+                </w:p>
+              </w:tc>
+              <w:tc>
+                <w:tcPr/>
+                <w:p>
+                  <w:pPr>
+                    <w:pStyle w:val="Compact"/>
+                    <w:jc w:val="right"/>
+                    <w:jc w:val="center"/>
+                  </w:pPr>
+                  <w:r>
+                    <w:t xml:space="preserve">346</w:t>
+                  </w:r>
+                </w:p>
+              </w:tc>
+              <w:tc>
+                <w:tcPr/>
+                <w:p>
+                  <w:pPr>
+                    <w:pStyle w:val="Compact"/>
+                    <w:jc w:val="right"/>
+                    <w:jc w:val="center"/>
+                  </w:pPr>
+                  <w:r>
+                    <w:t xml:space="preserve">26.0</w:t>
+                  </w:r>
+                </w:p>
+              </w:tc>
+              <w:tc>
+                <w:tcPr/>
+                <w:p>
+                  <w:pPr>
+                    <w:pStyle w:val="Compact"/>
+                    <w:jc w:val="right"/>
+                    <w:jc w:val="center"/>
+                  </w:pPr>
+                  <w:r>
+                    <w:t xml:space="preserve">NA</w:t>
+                  </w:r>
+                </w:p>
+              </w:tc>
+              <w:tc>
+                <w:tcPr/>
+                <w:p>
+                  <w:pPr>
+                    <w:pStyle w:val="Compact"/>
+                    <w:jc w:val="right"/>
+                    <w:jc w:val="center"/>
+                  </w:pPr>
+                  <w:r>
+                    <w:t xml:space="preserve">NA</w:t>
+                  </w:r>
+                </w:p>
+              </w:tc>
+              <w:tc>
+                <w:tcPr/>
+                <w:p>
+                  <w:pPr>
+                    <w:pStyle w:val="Compact"/>
+                    <w:jc w:val="left"/>
+                    <w:jc w:val="center"/>
+                  </w:pPr>
+                  <w:r>
+                    <w:t xml:space="preserve">Observed</w:t>
+                  </w:r>
+                </w:p>
+              </w:tc>
+            </w:tr>
+            <w:tr>
+              <w:tc>
+                <w:tcPr/>
+                <w:p>
+                  <w:pPr>
+                    <w:pStyle w:val="Compact"/>
+                    <w:jc w:val="left"/>
+                    <w:jc w:val="center"/>
+                  </w:pPr>
+                  <w:r>
+                    <w:t xml:space="preserve">all types</w:t>
+                  </w:r>
+                </w:p>
+              </w:tc>
+              <w:tc>
+                <w:tcPr/>
+                <w:p>
+                  <w:pPr>
+                    <w:pStyle w:val="Compact"/>
+                    <w:jc w:val="left"/>
+                    <w:jc w:val="center"/>
+                  </w:pPr>
+                  <w:r>
+                    <w:t xml:space="preserve">Aur-P2</w:t>
+                  </w:r>
+                </w:p>
+              </w:tc>
+              <w:tc>
+                <w:tcPr/>
+                <w:p>
+                  <w:pPr>
+                    <w:pStyle w:val="Compact"/>
+                    <w:jc w:val="right"/>
+                    <w:jc w:val="center"/>
+                  </w:pPr>
+                  <w:r>
+                    <w:t xml:space="preserve">63</w:t>
+                  </w:r>
+                </w:p>
+              </w:tc>
+              <w:tc>
+                <w:tcPr/>
+                <w:p>
+                  <w:pPr>
+                    <w:pStyle w:val="Compact"/>
+                    <w:jc w:val="right"/>
+                    <w:jc w:val="center"/>
+                  </w:pPr>
+                  <w:r>
+                    <w:t xml:space="preserve">15.0</w:t>
+                  </w:r>
+                </w:p>
+              </w:tc>
+              <w:tc>
+                <w:tcPr/>
+                <w:p>
+                  <w:pPr>
+                    <w:pStyle w:val="Compact"/>
+                    <w:jc w:val="right"/>
+                    <w:jc w:val="center"/>
+                  </w:pPr>
+                  <w:r>
+                    <w:t xml:space="preserve">11.5</w:t>
+                  </w:r>
+                </w:p>
+              </w:tc>
+              <w:tc>
+                <w:tcPr/>
+                <w:p>
+                  <w:pPr>
+                    <w:pStyle w:val="Compact"/>
+                    <w:jc w:val="right"/>
+                    <w:jc w:val="center"/>
+                  </w:pPr>
+                  <w:r>
+                    <w:t xml:space="preserve">18.5</w:t>
+                  </w:r>
+                </w:p>
+              </w:tc>
+              <w:tc>
+                <w:tcPr/>
+                <w:p>
+                  <w:pPr>
+                    <w:pStyle w:val="Compact"/>
+                    <w:jc w:val="left"/>
+                    <w:jc w:val="center"/>
+                  </w:pPr>
+                  <w:r>
+                    <w:t xml:space="preserve">Observed</w:t>
+                  </w:r>
+                </w:p>
+              </w:tc>
+            </w:tr>
+            <w:tr>
+              <w:tc>
+                <w:tcPr/>
+                <w:p>
+                  <w:pPr>
+                    <w:pStyle w:val="Compact"/>
+                    <w:jc w:val="left"/>
+                    <w:jc w:val="center"/>
+                  </w:pPr>
+                  <w:r>
+                    <w:t xml:space="preserve">all types</w:t>
+                  </w:r>
+                </w:p>
+              </w:tc>
+              <w:tc>
+                <w:tcPr/>
+                <w:p>
+                  <w:pPr>
+                    <w:pStyle w:val="Compact"/>
+                    <w:jc w:val="left"/>
+                    <w:jc w:val="center"/>
+                  </w:pPr>
+                  <w:r>
+                    <w:t xml:space="preserve">Aur-P2</w:t>
+                  </w:r>
+                </w:p>
+              </w:tc>
+              <w:tc>
+                <w:tcPr/>
+                <w:p>
+                  <w:pPr>
+                    <w:pStyle w:val="Compact"/>
+                    <w:jc w:val="right"/>
+                    <w:jc w:val="center"/>
+                  </w:pPr>
+                  <w:r>
+                    <w:t xml:space="preserve">63</w:t>
+                  </w:r>
+                </w:p>
+              </w:tc>
+              <w:tc>
+                <w:tcPr/>
+                <w:p>
+                  <w:pPr>
+                    <w:pStyle w:val="Compact"/>
+                    <w:jc w:val="right"/>
+                    <w:jc w:val="center"/>
+                  </w:pPr>
+                  <w:r>
+                    <w:t xml:space="preserve">15.0</w:t>
+                  </w:r>
+                </w:p>
+              </w:tc>
+              <w:tc>
+                <w:tcPr/>
+                <w:p>
+                  <w:pPr>
+                    <w:pStyle w:val="Compact"/>
+                    <w:jc w:val="right"/>
+                    <w:jc w:val="center"/>
+                  </w:pPr>
+                  <w:r>
+                    <w:t xml:space="preserve">NA</w:t>
+                  </w:r>
+                </w:p>
+              </w:tc>
+              <w:tc>
+                <w:tcPr/>
+                <w:p>
+                  <w:pPr>
+                    <w:pStyle w:val="Compact"/>
+                    <w:jc w:val="right"/>
+                    <w:jc w:val="center"/>
+                  </w:pPr>
+                  <w:r>
+                    <w:t xml:space="preserve">NA</w:t>
+                  </w:r>
+                </w:p>
+              </w:tc>
+              <w:tc>
+                <w:tcPr/>
+                <w:p>
+                  <w:pPr>
+                    <w:pStyle w:val="Compact"/>
+                    <w:jc w:val="left"/>
+                    <w:jc w:val="center"/>
+                  </w:pPr>
+                  <w:r>
+                    <w:t xml:space="preserve">Observed</w:t>
+                  </w:r>
+                </w:p>
+              </w:tc>
+            </w:tr>
+            <w:tr>
+              <w:tc>
+                <w:tcPr/>
+                <w:p>
+                  <w:pPr>
+                    <w:pStyle w:val="Compact"/>
+                    <w:jc w:val="left"/>
+                    <w:jc w:val="center"/>
+                  </w:pPr>
+                  <w:r>
+                    <w:t xml:space="preserve">shared types only</w:t>
+                  </w:r>
+                </w:p>
+              </w:tc>
+              <w:tc>
+                <w:tcPr/>
+                <w:p>
+                  <w:pPr>
+                    <w:pStyle w:val="Compact"/>
+                    <w:jc w:val="left"/>
+                    <w:jc w:val="center"/>
+                  </w:pPr>
+                  <w:r>
+                    <w:t xml:space="preserve">Aur-P1</w:t>
+                  </w:r>
+                </w:p>
+              </w:tc>
+              <w:tc>
+                <w:tcPr/>
+                <w:p>
+                  <w:pPr>
+                    <w:pStyle w:val="Compact"/>
+                    <w:jc w:val="right"/>
+                    <w:jc w:val="center"/>
+                  </w:pPr>
+                  <w:r>
+                    <w:t xml:space="preserve">63</w:t>
+                  </w:r>
+                </w:p>
+              </w:tc>
+              <w:tc>
+                <w:tcPr/>
+                <w:p>
+                  <w:pPr>
+                    <w:pStyle w:val="Compact"/>
+                    <w:jc w:val="right"/>
+                    <w:jc w:val="center"/>
+                  </w:pPr>
+                  <w:r>
+                    <w:t xml:space="preserve">15.4</w:t>
+                  </w:r>
+                </w:p>
+              </w:tc>
+              <w:tc>
+                <w:tcPr/>
+                <w:p>
+                  <w:pPr>
+                    <w:pStyle w:val="Compact"/>
+                    <w:jc w:val="right"/>
+                    <w:jc w:val="center"/>
+                  </w:pPr>
+                  <w:r>
+                    <w:t xml:space="preserve">13.6</w:t>
+                  </w:r>
+                </w:p>
+              </w:tc>
+              <w:tc>
+                <w:tcPr/>
+                <w:p>
+                  <w:pPr>
+                    <w:pStyle w:val="Compact"/>
+                    <w:jc w:val="right"/>
+                    <w:jc w:val="center"/>
+                  </w:pPr>
+                  <w:r>
+                    <w:t xml:space="preserve">17.1</w:t>
+                  </w:r>
+                </w:p>
+              </w:tc>
+              <w:tc>
+                <w:tcPr/>
+                <w:p>
+                  <w:pPr>
+                    <w:pStyle w:val="Compact"/>
+                    <w:jc w:val="left"/>
+                    <w:jc w:val="center"/>
+                  </w:pPr>
+                  <w:r>
+                    <w:t xml:space="preserve">Rarefaction</w:t>
+                  </w:r>
+                </w:p>
+              </w:tc>
+            </w:tr>
+            <w:tr>
+              <w:tc>
+                <w:tcPr/>
+                <w:p>
+                  <w:pPr>
+                    <w:pStyle w:val="Compact"/>
+                    <w:jc w:val="left"/>
+                    <w:jc w:val="center"/>
+                  </w:pPr>
+                  <w:r>
+                    <w:t xml:space="preserve">shared types only</w:t>
+                  </w:r>
+                </w:p>
+              </w:tc>
+              <w:tc>
+                <w:tcPr/>
+                <w:p>
+                  <w:pPr>
+                    <w:pStyle w:val="Compact"/>
+                    <w:jc w:val="left"/>
+                    <w:jc w:val="center"/>
+                  </w:pPr>
+                  <w:r>
+                    <w:t xml:space="preserve">Aur-P1</w:t>
+                  </w:r>
+                </w:p>
+              </w:tc>
+              <w:tc>
+                <w:tcPr/>
+                <w:p>
+                  <w:pPr>
+                    <w:pStyle w:val="Compact"/>
+                    <w:jc w:val="right"/>
+                    <w:jc w:val="center"/>
+                  </w:pPr>
+                  <w:r>
+                    <w:t xml:space="preserve">220</w:t>
+                  </w:r>
+                </w:p>
+              </w:tc>
+              <w:tc>
+                <w:tcPr/>
+                <w:p>
+                  <w:pPr>
+                    <w:pStyle w:val="Compact"/>
+                    <w:jc w:val="right"/>
+                    <w:jc w:val="center"/>
+                  </w:pPr>
+                  <w:r>
+                    <w:t xml:space="preserve">22.0</w:t>
+                  </w:r>
+                </w:p>
+              </w:tc>
+              <w:tc>
+                <w:tcPr/>
+                <w:p>
+                  <w:pPr>
+                    <w:pStyle w:val="Compact"/>
+                    <w:jc w:val="right"/>
+                    <w:jc w:val="center"/>
+                  </w:pPr>
+                  <w:r>
+                    <w:t xml:space="preserve">NA</w:t>
+                  </w:r>
+                </w:p>
+              </w:tc>
+              <w:tc>
+                <w:tcPr/>
+                <w:p>
+                  <w:pPr>
+                    <w:pStyle w:val="Compact"/>
+                    <w:jc w:val="right"/>
+                    <w:jc w:val="center"/>
+                  </w:pPr>
+                  <w:r>
+                    <w:t xml:space="preserve">NA</w:t>
+                  </w:r>
+                </w:p>
+              </w:tc>
+              <w:tc>
+                <w:tcPr/>
+                <w:p>
+                  <w:pPr>
+                    <w:pStyle w:val="Compact"/>
+                    <w:jc w:val="left"/>
+                    <w:jc w:val="center"/>
+                  </w:pPr>
+                  <w:r>
+                    <w:t xml:space="preserve">Observed</w:t>
+                  </w:r>
+                </w:p>
+              </w:tc>
+            </w:tr>
+            <w:tr>
+              <w:tc>
+                <w:tcPr/>
+                <w:p>
+                  <w:pPr>
+                    <w:pStyle w:val="Compact"/>
+                    <w:jc w:val="left"/>
+                    <w:jc w:val="center"/>
+                  </w:pPr>
+                  <w:r>
+                    <w:t xml:space="preserve">shared types only</w:t>
+                  </w:r>
+                </w:p>
+              </w:tc>
+              <w:tc>
+                <w:tcPr/>
+                <w:p>
+                  <w:pPr>
+                    <w:pStyle w:val="Compact"/>
+                    <w:jc w:val="left"/>
+                    <w:jc w:val="center"/>
+                  </w:pPr>
+                  <w:r>
+                    <w:t xml:space="preserve">Aur-P2</w:t>
+                  </w:r>
+                </w:p>
+              </w:tc>
+              <w:tc>
+                <w:tcPr/>
+                <w:p>
+                  <w:pPr>
+                    <w:pStyle w:val="Compact"/>
+                    <w:jc w:val="right"/>
+                    <w:jc w:val="center"/>
+                  </w:pPr>
+                  <w:r>
+                    <w:t xml:space="preserve">63</w:t>
+                  </w:r>
+                </w:p>
+              </w:tc>
+              <w:tc>
+                <w:tcPr/>
+                <w:p>
+                  <w:pPr>
+                    <w:pStyle w:val="Compact"/>
+                    <w:jc w:val="right"/>
+                    <w:jc w:val="center"/>
+                  </w:pPr>
+                  <w:r>
+                    <w:t xml:space="preserve">15.0</w:t>
+                  </w:r>
+                </w:p>
+              </w:tc>
+              <w:tc>
+                <w:tcPr/>
+                <w:p>
+                  <w:pPr>
+                    <w:pStyle w:val="Compact"/>
+                    <w:jc w:val="right"/>
+                    <w:jc w:val="center"/>
+                  </w:pPr>
+                  <w:r>
+                    <w:t xml:space="preserve">11.3</w:t>
+                  </w:r>
+                </w:p>
+              </w:tc>
+              <w:tc>
+                <w:tcPr/>
+                <w:p>
+                  <w:pPr>
+                    <w:pStyle w:val="Compact"/>
+                    <w:jc w:val="right"/>
+                    <w:jc w:val="center"/>
+                  </w:pPr>
+                  <w:r>
+                    <w:t xml:space="preserve">18.7</w:t>
+                  </w:r>
+                </w:p>
+              </w:tc>
+              <w:tc>
+                <w:tcPr/>
+                <w:p>
+                  <w:pPr>
+                    <w:pStyle w:val="Compact"/>
+                    <w:jc w:val="left"/>
+                    <w:jc w:val="center"/>
+                  </w:pPr>
+                  <w:r>
+                    <w:t xml:space="preserve">Observed</w:t>
+                  </w:r>
+                </w:p>
+              </w:tc>
+            </w:tr>
+            <w:tr>
+              <w:tc>
+                <w:tcPr/>
+                <w:p>
+                  <w:pPr>
+                    <w:pStyle w:val="Compact"/>
+                    <w:jc w:val="left"/>
+                    <w:jc w:val="center"/>
+                  </w:pPr>
+                  <w:r>
+                    <w:t xml:space="preserve">shared types only</w:t>
+                  </w:r>
+                </w:p>
+              </w:tc>
+              <w:tc>
+                <w:tcPr/>
+                <w:p>
+                  <w:pPr>
+                    <w:pStyle w:val="Compact"/>
+                    <w:jc w:val="left"/>
+                    <w:jc w:val="center"/>
+                  </w:pPr>
+                  <w:r>
+                    <w:t xml:space="preserve">Aur-P2</w:t>
+                  </w:r>
+                </w:p>
+              </w:tc>
+              <w:tc>
+                <w:tcPr/>
+                <w:p>
+                  <w:pPr>
+                    <w:pStyle w:val="Compact"/>
+                    <w:jc w:val="right"/>
+                    <w:jc w:val="center"/>
+                  </w:pPr>
+                  <w:r>
+                    <w:t xml:space="preserve">63</w:t>
+                  </w:r>
+                </w:p>
+              </w:tc>
+              <w:tc>
+                <w:tcPr/>
+                <w:p>
+                  <w:pPr>
+                    <w:pStyle w:val="Compact"/>
+                    <w:jc w:val="right"/>
+                    <w:jc w:val="center"/>
+                  </w:pPr>
+                  <w:r>
+                    <w:t xml:space="preserve">15.0</w:t>
+                  </w:r>
+                </w:p>
+              </w:tc>
+              <w:tc>
+                <w:tcPr/>
+                <w:p>
+                  <w:pPr>
+                    <w:pStyle w:val="Compact"/>
+                    <w:jc w:val="right"/>
+                    <w:jc w:val="center"/>
+                  </w:pPr>
+                  <w:r>
+                    <w:t xml:space="preserve">NA</w:t>
+                  </w:r>
+                </w:p>
+              </w:tc>
+              <w:tc>
+                <w:tcPr/>
+                <w:p>
+                  <w:pPr>
+                    <w:pStyle w:val="Compact"/>
+                    <w:jc w:val="right"/>
+                    <w:jc w:val="center"/>
+                  </w:pPr>
+                  <w:r>
+                    <w:t xml:space="preserve">NA</w:t>
+                  </w:r>
+                </w:p>
+              </w:tc>
+              <w:tc>
+                <w:tcPr/>
+                <w:p>
+                  <w:pPr>
+                    <w:pStyle w:val="Compact"/>
+                    <w:jc w:val="left"/>
+                    <w:jc w:val="center"/>
+                  </w:pPr>
+                  <w:r>
+                    <w:t xml:space="preserve">Observed</w:t>
+                  </w:r>
+                </w:p>
+              </w:tc>
+            </w:tr>
+          </w:tbl>
+          <w:p>
+            <w:pPr>
+              <w:jc w:val="center"/>
+            </w:pPr>
+            <w:pPr>
+              <w:jc w:val="start"/>
+              <w:spacing w:before="200"/>
+              <w:pStyle w:val="ImageCaption"/>
+            </w:pPr>
+            <w:r>
+              <w:t xml:space="preserve">Table 39: Equal-effort sign-type pool comparison with iNEXT (incidence_freq, q = 0, 200 bootstraps). Observed pools are 26 types (Aur-P1, 346 objects) and 15 types (Aur-P2, 63 objects). Rarefied Aur-P1 to 63 objects and extrapolated Aur-P2 are shown with 95% confidence intervals; a second set restricts to object types present in both phases (shared types only).</w:t>
+            </w:r>
+          </w:p>
+          <w:bookmarkEnd w:id="269"/>
+        </w:tc>
+      </w:tr>
+    </w:tbl>
+    <w:tbl>
+      <w:tblPr>
+        <w:tblStyle w:val="Table"/>
+        <w:tblW w:type="pct" w:w="5000"/>
+        <w:tblLook w:firstRow="0" w:lastRow="0" w:firstColumn="0" w:lastColumn="0" w:noHBand="0" w:noVBand="0" w:val="0000"/>
+        <w:jc w:val="start"/>
+        <w:tblLayout w:type="fixed"/>
+      </w:tblPr>
+      <w:tblGrid>
+        <w:gridCol w:w="7920"/>
+      </w:tblGrid>
+      <w:tr>
+        <w:tc>
+          <w:tcPr/>
+          <w:bookmarkStart w:id="273" w:name="fig-s9-pool-inext"/>
+          <w:p>
+            <w:pPr>
+              <w:pStyle w:val="Compact"/>
+              <w:jc w:val="center"/>
+            </w:pPr>
+            <w:r>
+              <w:drawing>
+                <wp:inline>
+                  <wp:extent cx="5943600" cy="3566160"/>
+                  <wp:effectExtent b="0" l="0" r="0" t="0"/>
+                  <wp:docPr descr="" title="" id="271" name="Picture"/>
+                  <a:graphic>
+                    <a:graphicData uri="http://schemas.openxmlformats.org/drawingml/2006/picture">
+                      <pic:pic>
+                        <pic:nvPicPr>
+                          <pic:cNvPr descr="S1-supplement-sensitivity_files/figure-docx/fig-s9-pool-inext-1.png" id="272" name="Picture"/>
+                          <pic:cNvPicPr>
+                            <a:picLocks noChangeArrowheads="1" noChangeAspect="1"/>
+                          </pic:cNvPicPr>
+                        </pic:nvPicPr>
+                        <pic:blipFill>
+                          <a:blip r:embed="rId270"/>
+                          <a:stretch>
+                            <a:fillRect/>
+                          </a:stretch>
+                        </pic:blipFill>
+                        <pic:spPr bwMode="auto">
+                          <a:xfrm>
+                            <a:off x="0" y="0"/>
+                            <a:ext cx="5943600" cy="3566160"/>
+                          </a:xfrm>
+                          <a:prstGeom prst="rect">
+                            <a:avLst/>
+                          </a:prstGeom>
+                          <a:noFill/>
+                          <a:ln w="9525">
+                            <a:noFill/>
+                            <a:headEnd/>
+                            <a:tailEnd/>
+                          </a:ln>
+                        </pic:spPr>
+                      </pic:pic>
+                    </a:graphicData>
+                  </a:graphic>
+                </wp:inline>
+              </w:drawing>
+            </w:r>
+          </w:p>
+          <w:p>
+            <w:pPr>
+              <w:jc w:val="center"/>
+            </w:pPr>
+            <w:pPr>
+              <w:jc w:val="start"/>
+              <w:spacing w:before="200"/>
+              <w:pStyle w:val="ImageCaption"/>
+            </w:pPr>
+            <w:r>
+              <w:t xml:space="preserve">Figure 9: iNEXT rarefaction/extrapolation curves for sign-type richness (Hill number q = 0) by phase. Solid segment is rarefaction, dashed is extrapolation; shading is 95% confidence band (200 bootstraps). Vertical line marks 63 objects (Aur-P2 sample size) where Aur-P1 is rarefied. All types (left) and shared types only (right) are shown.</w:t>
+            </w:r>
+          </w:p>
+          <w:bookmarkEnd w:id="273"/>
+        </w:tc>
+      </w:tr>
+    </w:tbl>
+    <w:bookmarkEnd w:id="274"/>
+    <w:bookmarkStart w:id="275" w:name="interpretation-12"/>
+    <w:p>
+      <w:pPr>
+        <w:pStyle w:val="Heading3"/>
+      </w:pPr>
+      <w:r>
+        <w:t xml:space="preserve">Interpretation</w:t>
+      </w:r>
+    </w:p>
+    <w:p>
+      <w:pPr>
+        <w:pStyle w:val="FirstParagraph"/>
+      </w:pPr>
+      <w:r>
+        <w:rPr>
+          <w:bCs/>
+          <w:b/>
+        </w:rPr>
+        <w:t xml:space="preserve">Question: does the raw 26 vs 15 pool contraction survive equal effort?</w:t>
+      </w:r>
+      <w:r>
+        <w:t xml:space="preserve"> </w:t>
+      </w:r>
+      <w:r>
+        <w:t xml:space="preserve">No. When Aur-P1 is rarefied to 63 objects, its expected richness drops into the range 16.9 types (95% CI 15.5–18.3), which overlaps the Aur-P2 observed pool of 15 types. The Aur-P2 95% interval extended to the same effort likewise overlaps. This reproduces the reviewer’s direct resampling of 63 objects from the 346 Aur-P1 objects (expected 16.7, interval 13–20). The phase coefficient in S9.4 at equal object count is also non-significant (rate ratio 1.27, p = 0.462 in the reviewer’s re-run).</w:t>
+      </w:r>
+    </w:p>
+    <w:p>
+      <w:pPr>
+        <w:pStyle w:val="BodyText"/>
+      </w:pPr>
+      <w:r>
+        <w:t xml:space="preserve">When the comparison is restricted to object types present in both phases, the overlap remains (15.4 vs 15), so limestone blocs, tubes and figurines do not create the effect.</w:t>
+      </w:r>
+    </w:p>
+    <w:p>
+      <w:pPr>
+        <w:pStyle w:val="BodyText"/>
+      </w:pPr>
+      <w:r>
+        <w:rPr>
+          <w:bCs/>
+          <w:b/>
+        </w:rPr>
+        <w:t xml:space="preserve">Answer:</w:t>
+      </w:r>
+      <w:r>
+        <w:t xml:space="preserve"> </w:t>
+      </w:r>
+      <w:r>
+        <w:t xml:space="preserve">the raw pool difference is not distinguishable from sampling variation at equal object count or equal coverage. The raw 26 vs 15 count reflects 346 vs 63 objects and phase-specific object classes, not a demonstrated phase-level contraction. The diversity-pool paragraphs in the Discussion and Conclusion that call this the most robust finding should be rewritten to the not distinguishable from form and the sample-difference caveat stated.</w:t>
+      </w:r>
+    </w:p>
+    <w:bookmarkEnd w:id="275"/>
+    <w:bookmarkEnd w:id="276"/>
+    <w:bookmarkStart w:id="277" w:name="sec-s9-6"/>
+    <w:p>
+      <w:pPr>
+        <w:pStyle w:val="Heading2"/>
+      </w:pPr>
+      <w:r>
+        <w:t xml:space="preserve">S9.6 Synthesis and limitation</w:t>
+      </w:r>
+    </w:p>
+    <w:p>
+      <w:pPr>
+        <w:pStyle w:val="FirstParagraph"/>
+      </w:pPr>
+      <w:r>
+        <w:t xml:space="preserve">The four object-level analyses converge on a single conclusion. (1) Under object-downsampling, only the best-sampled sites retain their R/B assignment; small-object sites flip group at rates indistinguishable from chance, and network modularity collapses (S9.2). (2) Coverage-based rarefaction can compare richness only among the well-sampled sites, and even there the broad/restricted contrast persists — but the majority of sites never reach a comparable coverage, so the method cannot vindicate them (S9.3). (3) Once object count is held constant statistically, group no longer predicts sign-type richness (S9.4). (4) At equal effort with</w:t>
+      </w:r>
+      <w:r>
+        <w:t xml:space="preserve"> </w:t>
+      </w:r>
+      <w:r>
+        <w:rPr>
+          <w:rStyle w:val="VerbatimChar"/>
+        </w:rPr>
+        <w:t xml:space="preserve">iNEXT</w:t>
+      </w:r>
+      <w:r>
+        <w:t xml:space="preserve">, the Aur-P1 vs Aur-P2 sign-type pool difference lies inside sampling variation, even when restricted to shared object types (S9.5). Together these show that the restricted/broad division is</w:t>
       </w:r>
       <w:r>
         <w:t xml:space="preserve"> </w:t>
@@ -41149,11 +42324,11 @@
         <w:t xml:space="preserve">not fully independent of sampling intensity</w:t>
       </w:r>
       <w:r>
-        <w:t xml:space="preserve">: it is recovered robustly for large assemblages, but for the numerous small assemblages it is partly an artefact of how many objects were recovered.</w:t>
+        <w:t xml:space="preserve">: it is recovered robustly for large assemblages, but for the numerous small assemblages it is partly an artefact of how many objects were recovered, and the raw 26 vs 15 pool contraction does not survive equal-effort standardisation.</w:t>
       </w:r>
     </w:p>
-    <w:bookmarkEnd w:id="269"/>
-    <w:bookmarkStart w:id="306" w:name="references-cited"/>
+    <w:bookmarkEnd w:id="277"/>
+    <w:bookmarkStart w:id="318" w:name="references-cited"/>
     <w:p>
       <w:pPr>
         <w:pStyle w:val="Heading2"/>
@@ -41162,8 +42337,8 @@
         <w:t xml:space="preserve">References cited</w:t>
       </w:r>
     </w:p>
-    <w:bookmarkStart w:id="305" w:name="refs"/>
-    <w:bookmarkStart w:id="271" w:name="X68cdd7ba62fc5dd3e1e9b497937717305f7b9a0"/>
+    <w:bookmarkStart w:id="317" w:name="refs"/>
+    <w:bookmarkStart w:id="279" w:name="X68cdd7ba62fc5dd3e1e9b497937717305f7b9a0"/>
     <w:p>
       <w:pPr>
         <w:pStyle w:val="Bibliography"/>
@@ -41195,7 +42370,7 @@
       <w:r>
         <w:t xml:space="preserve"> </w:t>
       </w:r>
-      <w:hyperlink r:id="rId270">
+      <w:hyperlink r:id="rId278">
         <w:r>
           <w:rPr>
             <w:rStyle w:val="Hyperlink"/>
@@ -41207,8 +42382,8 @@
         <w:t xml:space="preserve">.</w:t>
       </w:r>
     </w:p>
-    <w:bookmarkEnd w:id="271"/>
-    <w:bookmarkStart w:id="273" w:name="ref-teyssandier2018entity"/>
+    <w:bookmarkEnd w:id="279"/>
+    <w:bookmarkStart w:id="281" w:name="ref-teyssandier2018entity"/>
     <w:p>
       <w:pPr>
         <w:pStyle w:val="Bibliography"/>
@@ -41267,7 +42442,7 @@
       <w:r>
         <w:t xml:space="preserve"> </w:t>
       </w:r>
-      <w:hyperlink r:id="rId272">
+      <w:hyperlink r:id="rId280">
         <w:r>
           <w:rPr>
             <w:rStyle w:val="Hyperlink"/>
@@ -41279,8 +42454,8 @@
         <w:t xml:space="preserve">.</w:t>
       </w:r>
     </w:p>
-    <w:bookmarkEnd w:id="273"/>
-    <w:bookmarkStart w:id="275" w:name="ref-Blondel_2008"/>
+    <w:bookmarkEnd w:id="281"/>
+    <w:bookmarkStart w:id="283" w:name="ref-Blondel_2008"/>
     <w:p>
       <w:pPr>
         <w:pStyle w:val="Bibliography"/>
@@ -41300,7 +42475,7 @@
       <w:r>
         <w:t xml:space="preserve"> </w:t>
       </w:r>
-      <w:hyperlink r:id="rId274">
+      <w:hyperlink r:id="rId282">
         <w:r>
           <w:rPr>
             <w:rStyle w:val="Hyperlink"/>
@@ -41312,8 +42487,8 @@
         <w:t xml:space="preserve">.</w:t>
       </w:r>
     </w:p>
-    <w:bookmarkEnd w:id="275"/>
-    <w:bookmarkStart w:id="277" w:name="ref-newman2004finding"/>
+    <w:bookmarkEnd w:id="283"/>
+    <w:bookmarkStart w:id="285" w:name="ref-newman2004finding"/>
     <w:p>
       <w:pPr>
         <w:pStyle w:val="Bibliography"/>
@@ -41333,7 +42508,7 @@
       <w:r>
         <w:t xml:space="preserve"> </w:t>
       </w:r>
-      <w:hyperlink r:id="rId276">
+      <w:hyperlink r:id="rId284">
         <w:r>
           <w:rPr>
             <w:rStyle w:val="Hyperlink"/>
@@ -41345,8 +42520,8 @@
         <w:t xml:space="preserve">.</w:t>
       </w:r>
     </w:p>
-    <w:bookmarkEnd w:id="277"/>
-    <w:bookmarkStart w:id="279" w:name="ref-Lichstein_2007"/>
+    <w:bookmarkEnd w:id="285"/>
+    <w:bookmarkStart w:id="287" w:name="ref-Lichstein_2007"/>
     <w:p>
       <w:pPr>
         <w:pStyle w:val="Bibliography"/>
@@ -41366,7 +42541,7 @@
       <w:r>
         <w:t xml:space="preserve"> </w:t>
       </w:r>
-      <w:hyperlink r:id="rId278">
+      <w:hyperlink r:id="rId286">
         <w:r>
           <w:rPr>
             <w:rStyle w:val="Hyperlink"/>
@@ -41378,8 +42553,8 @@
         <w:t xml:space="preserve">.</w:t>
       </w:r>
     </w:p>
-    <w:bookmarkEnd w:id="279"/>
-    <w:bookmarkStart w:id="281" w:name="ref-Goslee_Urban_2007"/>
+    <w:bookmarkEnd w:id="287"/>
+    <w:bookmarkStart w:id="289" w:name="ref-Goslee_Urban_2007"/>
     <w:p>
       <w:pPr>
         <w:pStyle w:val="Bibliography"/>
@@ -41411,7 +42586,7 @@
       <w:r>
         <w:t xml:space="preserve"> </w:t>
       </w:r>
-      <w:hyperlink r:id="rId280">
+      <w:hyperlink r:id="rId288">
         <w:r>
           <w:rPr>
             <w:rStyle w:val="Hyperlink"/>
@@ -41423,8 +42598,8 @@
         <w:t xml:space="preserve">.</w:t>
       </w:r>
     </w:p>
-    <w:bookmarkEnd w:id="281"/>
-    <w:bookmarkStart w:id="283" w:name="ref-Monti_2003"/>
+    <w:bookmarkEnd w:id="289"/>
+    <w:bookmarkStart w:id="291" w:name="ref-Monti_2003"/>
     <w:p>
       <w:pPr>
         <w:pStyle w:val="Bibliography"/>
@@ -41444,7 +42619,7 @@
       <w:r>
         <w:t xml:space="preserve"> </w:t>
       </w:r>
-      <w:hyperlink r:id="rId282">
+      <w:hyperlink r:id="rId290">
         <w:r>
           <w:rPr>
             <w:rStyle w:val="Hyperlink"/>
@@ -41456,8 +42631,8 @@
         <w:t xml:space="preserve">.</w:t>
       </w:r>
     </w:p>
-    <w:bookmarkEnd w:id="283"/>
-    <w:bookmarkStart w:id="285" w:name="ref-Leger_2016"/>
+    <w:bookmarkEnd w:id="291"/>
+    <w:bookmarkStart w:id="293" w:name="ref-Leger_2016"/>
     <w:p>
       <w:pPr>
         <w:pStyle w:val="Bibliography"/>
@@ -41486,7 +42661,7 @@
       <w:r>
         <w:t xml:space="preserve"> </w:t>
       </w:r>
-      <w:hyperlink r:id="rId284">
+      <w:hyperlink r:id="rId292">
         <w:r>
           <w:rPr>
             <w:rStyle w:val="Hyperlink"/>
@@ -41498,8 +42673,8 @@
         <w:t xml:space="preserve">.</w:t>
       </w:r>
     </w:p>
-    <w:bookmarkEnd w:id="285"/>
-    <w:bookmarkStart w:id="287" w:name="ref-Hubert_Arabie_1985"/>
+    <w:bookmarkEnd w:id="293"/>
+    <w:bookmarkStart w:id="295" w:name="ref-Hubert_Arabie_1985"/>
     <w:p>
       <w:pPr>
         <w:pStyle w:val="Bibliography"/>
@@ -41519,7 +42694,7 @@
       <w:r>
         <w:t xml:space="preserve"> </w:t>
       </w:r>
-      <w:hyperlink r:id="rId286">
+      <w:hyperlink r:id="rId294">
         <w:r>
           <w:rPr>
             <w:rStyle w:val="Hyperlink"/>
@@ -41531,8 +42706,8 @@
         <w:t xml:space="preserve">.</w:t>
       </w:r>
     </w:p>
-    <w:bookmarkEnd w:id="287"/>
-    <w:bookmarkStart w:id="289" w:name="ref-Bentz_Dutkiewicz_2026"/>
+    <w:bookmarkEnd w:id="295"/>
+    <w:bookmarkStart w:id="297" w:name="ref-Bentz_Dutkiewicz_2026"/>
     <w:p>
       <w:pPr>
         <w:pStyle w:val="Bibliography"/>
@@ -41552,7 +42727,7 @@
       <w:r>
         <w:t xml:space="preserve"> </w:t>
       </w:r>
-      <w:hyperlink r:id="rId288">
+      <w:hyperlink r:id="rId296">
         <w:r>
           <w:rPr>
             <w:rStyle w:val="Hyperlink"/>
@@ -41564,8 +42739,8 @@
         <w:t xml:space="preserve">.</w:t>
       </w:r>
     </w:p>
-    <w:bookmarkEnd w:id="289"/>
-    <w:bookmarkStart w:id="291" w:name="ref-Chiotti_2005"/>
+    <w:bookmarkEnd w:id="297"/>
+    <w:bookmarkStart w:id="299" w:name="ref-Chiotti_2005"/>
     <w:p>
       <w:pPr>
         <w:pStyle w:val="Bibliography"/>
@@ -41612,7 +42787,7 @@
       <w:r>
         <w:t xml:space="preserve"> </w:t>
       </w:r>
-      <w:hyperlink r:id="rId290">
+      <w:hyperlink r:id="rId298">
         <w:r>
           <w:rPr>
             <w:rStyle w:val="Hyperlink"/>
@@ -41624,8 +42799,8 @@
         <w:t xml:space="preserve">.</w:t>
       </w:r>
     </w:p>
-    <w:bookmarkEnd w:id="291"/>
-    <w:bookmarkStart w:id="293" w:name="ref-Higham_Abri_Pataud_2011"/>
+    <w:bookmarkEnd w:id="299"/>
+    <w:bookmarkStart w:id="301" w:name="ref-Higham_Abri_Pataud_2011"/>
     <w:p>
       <w:pPr>
         <w:pStyle w:val="Bibliography"/>
@@ -41684,7 +42859,7 @@
       <w:r>
         <w:t xml:space="preserve"> </w:t>
       </w:r>
-      <w:hyperlink r:id="rId292">
+      <w:hyperlink r:id="rId300">
         <w:r>
           <w:rPr>
             <w:rStyle w:val="Hyperlink"/>
@@ -41696,8 +42871,8 @@
         <w:t xml:space="preserve">.</w:t>
       </w:r>
     </w:p>
-    <w:bookmarkEnd w:id="293"/>
-    <w:bookmarkStart w:id="295" w:name="ref-Talamo_La_Ferrassie_2020"/>
+    <w:bookmarkEnd w:id="301"/>
+    <w:bookmarkStart w:id="303" w:name="ref-Talamo_La_Ferrassie_2020"/>
     <w:p>
       <w:pPr>
         <w:pStyle w:val="Bibliography"/>
@@ -41798,7 +42973,7 @@
       <w:r>
         <w:t xml:space="preserve"> </w:t>
       </w:r>
-      <w:hyperlink r:id="rId294">
+      <w:hyperlink r:id="rId302">
         <w:r>
           <w:rPr>
             <w:rStyle w:val="Hyperlink"/>
@@ -41810,8 +42985,8 @@
         <w:t xml:space="preserve">.</w:t>
       </w:r>
     </w:p>
-    <w:bookmarkEnd w:id="295"/>
-    <w:bookmarkStart w:id="296" w:name="ref-Delporte_1984_Ferrassie"/>
+    <w:bookmarkEnd w:id="303"/>
+    <w:bookmarkStart w:id="304" w:name="ref-Delporte_1984_Ferrassie"/>
     <w:p>
       <w:pPr>
         <w:pStyle w:val="Bibliography"/>
@@ -41850,8 +43025,8 @@
         <w:t xml:space="preserve">histoire; 1984.</w:t>
       </w:r>
     </w:p>
-    <w:bookmarkEnd w:id="296"/>
-    <w:bookmarkStart w:id="298" w:name="ref-Oliva_2006"/>
+    <w:bookmarkEnd w:id="304"/>
+    <w:bookmarkStart w:id="306" w:name="ref-Oliva_2006"/>
     <w:p>
       <w:pPr>
         <w:pStyle w:val="Bibliography"/>
@@ -41919,7 +43094,7 @@
       <w:r>
         <w:t xml:space="preserve"> </w:t>
       </w:r>
-      <w:hyperlink r:id="rId297">
+      <w:hyperlink r:id="rId305">
         <w:r>
           <w:rPr>
             <w:rStyle w:val="Hyperlink"/>
@@ -41931,8 +43106,8 @@
         <w:t xml:space="preserve">.</w:t>
       </w:r>
     </w:p>
-    <w:bookmarkEnd w:id="298"/>
-    <w:bookmarkStart w:id="300" w:name="ref-Wild_et_al_2005"/>
+    <w:bookmarkEnd w:id="306"/>
+    <w:bookmarkStart w:id="308" w:name="ref-Wild_et_al_2005"/>
     <w:p>
       <w:pPr>
         <w:pStyle w:val="Bibliography"/>
@@ -41988,7 +43163,7 @@
       <w:r>
         <w:t xml:space="preserve"> </w:t>
       </w:r>
-      <w:hyperlink r:id="rId299">
+      <w:hyperlink r:id="rId307">
         <w:r>
           <w:rPr>
             <w:rStyle w:val="Hyperlink"/>
@@ -42000,8 +43175,8 @@
         <w:t xml:space="preserve">.</w:t>
       </w:r>
     </w:p>
-    <w:bookmarkEnd w:id="300"/>
-    <w:bookmarkStart w:id="302" w:name="ref-Schurch_Conard_2026_reassess"/>
+    <w:bookmarkEnd w:id="308"/>
+    <w:bookmarkStart w:id="310" w:name="ref-Schurch_Conard_2026_reassess"/>
     <w:p>
       <w:pPr>
         <w:pStyle w:val="Bibliography"/>
@@ -42036,7 +43211,7 @@
       <w:r>
         <w:t xml:space="preserve"> </w:t>
       </w:r>
-      <w:hyperlink r:id="rId301">
+      <w:hyperlink r:id="rId309">
         <w:r>
           <w:rPr>
             <w:rStyle w:val="Hyperlink"/>
@@ -42048,8 +43223,8 @@
         <w:t xml:space="preserve">.</w:t>
       </w:r>
     </w:p>
-    <w:bookmarkEnd w:id="302"/>
-    <w:bookmarkStart w:id="304" w:name="ref-Venables_Ripley_2002"/>
+    <w:bookmarkEnd w:id="310"/>
+    <w:bookmarkStart w:id="312" w:name="ref-Venables_Ripley_2002"/>
     <w:p>
       <w:pPr>
         <w:pStyle w:val="Bibliography"/>
@@ -42069,7 +43244,7 @@
       <w:r>
         <w:t xml:space="preserve"> </w:t>
       </w:r>
-      <w:hyperlink r:id="rId303">
+      <w:hyperlink r:id="rId311">
         <w:r>
           <w:rPr>
             <w:rStyle w:val="Hyperlink"/>
@@ -42081,10 +43256,106 @@
         <w:t xml:space="preserve">.</w:t>
       </w:r>
     </w:p>
-    <w:bookmarkEnd w:id="304"/>
-    <w:bookmarkEnd w:id="305"/>
-    <w:bookmarkEnd w:id="306"/>
-    <w:bookmarkEnd w:id="307"/>
+    <w:bookmarkEnd w:id="312"/>
+    <w:bookmarkStart w:id="314" w:name="ref-Chao_Jost_2012"/>
+    <w:p>
+      <w:pPr>
+        <w:pStyle w:val="Bibliography"/>
+      </w:pPr>
+      <w:r>
+        <w:t xml:space="preserve">[19]</w:t>
+      </w:r>
+      <w:r>
+        <w:t xml:space="preserve"> </w:t>
+      </w:r>
+      <w:r>
+        <w:t xml:space="preserve">	</w:t>
+      </w:r>
+      <w:r>
+        <w:t xml:space="preserve">Chao A, Jost L. Coverage-based rarefaction and extrapolation: Standardizing samples by completeness rather than size. Ecology 2012;93:2533–47.</w:t>
+      </w:r>
+      <w:r>
+        <w:t xml:space="preserve"> </w:t>
+      </w:r>
+      <w:hyperlink r:id="rId313">
+        <w:r>
+          <w:rPr>
+            <w:rStyle w:val="Hyperlink"/>
+          </w:rPr>
+          <w:t xml:space="preserve">https://doi.org/10.1890/11-1952.1</w:t>
+        </w:r>
+      </w:hyperlink>
+      <w:r>
+        <w:t xml:space="preserve">.</w:t>
+      </w:r>
+    </w:p>
+    <w:bookmarkEnd w:id="314"/>
+    <w:bookmarkStart w:id="316" w:name="ref-Hsieh_Ma_Chao_2016"/>
+    <w:p>
+      <w:pPr>
+        <w:pStyle w:val="Bibliography"/>
+      </w:pPr>
+      <w:r>
+        <w:t xml:space="preserve">[20]</w:t>
+      </w:r>
+      <w:r>
+        <w:t xml:space="preserve"> </w:t>
+      </w:r>
+      <w:r>
+        <w:t xml:space="preserve">	</w:t>
+      </w:r>
+      <w:r>
+        <w:t xml:space="preserve">Hsieh TC, Ma KH, Chao A.</w:t>
+      </w:r>
+      <w:r>
+        <w:t xml:space="preserve"> </w:t>
+      </w:r>
+      <w:r>
+        <w:t xml:space="preserve">iNEXT</w:t>
+      </w:r>
+      <w:r>
+        <w:t xml:space="preserve">: An</w:t>
+      </w:r>
+      <w:r>
+        <w:t xml:space="preserve"> </w:t>
+      </w:r>
+      <w:r>
+        <w:t xml:space="preserve">R</w:t>
+      </w:r>
+      <w:r>
+        <w:t xml:space="preserve"> </w:t>
+      </w:r>
+      <w:r>
+        <w:t xml:space="preserve">package for rarefaction and extrapolation of species diversity (</w:t>
+      </w:r>
+      <w:r>
+        <w:t xml:space="preserve">Hill</w:t>
+      </w:r>
+      <w:r>
+        <w:t xml:space="preserve"> </w:t>
+      </w:r>
+      <w:r>
+        <w:t xml:space="preserve">numbers). Methods in Ecology and Evolution 2016;7:1451–6.</w:t>
+      </w:r>
+      <w:r>
+        <w:t xml:space="preserve"> </w:t>
+      </w:r>
+      <w:hyperlink r:id="rId315">
+        <w:r>
+          <w:rPr>
+            <w:rStyle w:val="Hyperlink"/>
+          </w:rPr>
+          <w:t xml:space="preserve">https://doi.org/10.1111/2041-210X.12613</w:t>
+        </w:r>
+      </w:hyperlink>
+      <w:r>
+        <w:t xml:space="preserve">.</w:t>
+      </w:r>
+    </w:p>
+    <w:bookmarkEnd w:id="316"/>
+    <w:bookmarkEnd w:id="317"/>
+    <w:bookmarkEnd w:id="318"/>
+    <w:bookmarkEnd w:id="319"/>
     <w:sectPr>
       <w:footnotePr>
         <w:numRestart w:val="eachSect"/>

</xml_diff>

<commit_message>
deal with several validation statistics being inflated or tautological
</commit_message>
<xml_diff>
--- a/paper/S1-supplement-sensitivity.docx
+++ b/paper/S1-supplement-sensitivity.docx
@@ -541,64 +541,7 @@
         <w:pStyle w:val="FirstParagraph"/>
       </w:pPr>
       <w:r>
-        <w:t xml:space="preserve">The main text (</w:t>
-      </w:r>
-      <w:r>
-        <w:rPr>
-          <w:rStyle w:val="VerbatimChar"/>
-        </w:rPr>
-        <w:t xml:space="preserve">paper.qmd:257</w:t>
-      </w:r>
-      <w:r>
-        <w:t xml:space="preserve">) reports the raw SignBase size and the retained sample with inline R code (e.g. retained objects at retained sites), listing the eight archaeologically excluded sites by reason with</w:t>
-      </w:r>
-      <w:r>
-        <w:t xml:space="preserve"> </w:t>
-      </w:r>
-      <w:r>
-        <w:rPr>
-          <w:rStyle w:val="VerbatimChar"/>
-        </w:rPr>
-        <w:t xml:space="preserve">e.g.</w:t>
-      </w:r>
-      <w:r>
-        <w:t xml:space="preserve"> </w:t>
-      </w:r>
-      <w:r>
-        <w:t xml:space="preserve">and pointing to S2 for the full site table. All numbers are inline R, no hard-coding. This section mirrors that logic for the date-parsing step, which otherwise has no disclosure in the main text. It uses the same CSV (</w:t>
-      </w:r>
-      <w:r>
-        <w:rPr>
-          <w:rStyle w:val="VerbatimChar"/>
-        </w:rPr>
-        <w:t xml:space="preserve">data/signBase_Version1.0.csv</w:t>
-      </w:r>
-      <w:r>
-        <w:t xml:space="preserve">) and the same filter (</w:t>
-      </w:r>
-      <w:r>
-        <w:rPr>
-          <w:rStyle w:val="VerbatimChar"/>
-        </w:rPr>
-        <w:t xml:space="preserve">clean_signbase(date_variant="older")</w:t>
-      </w:r>
-      <w:r>
-        <w:t xml:space="preserve"> </w:t>
-      </w:r>
-      <w:r>
-        <w:t xml:space="preserve">at</w:t>
-      </w:r>
-      <w:r>
-        <w:t xml:space="preserve"> </w:t>
-      </w:r>
-      <w:r>
-        <w:rPr>
-          <w:rStyle w:val="VerbatimChar"/>
-        </w:rPr>
-        <w:t xml:space="preserve">functions.R:78-86</w:t>
-      </w:r>
-      <w:r>
-        <w:t xml:space="preserve">, which requires a plus/minus sign to extract an error), only partitioned earlier to enumerate what date parsing removes. S2 remains the canonical site list for phase assignments.</w:t>
+        <w:t xml:space="preserve">This section expands on the site rejection details notes in the main text.</w:t>
       </w:r>
     </w:p>
     <w:bookmarkEnd w:id="24"/>
@@ -664,64 +607,7 @@
         <w:t xml:space="preserve">clean_signbase()</w:t>
       </w:r>
       <w:r>
-        <w:t xml:space="preserve">) at 64 sites. After removing the eight sites listed in the main text, 496 signed objects at 57 sites remain. A further 27 sites carrying 58 signed objects are lost at the date-parsing step and do not enter phase assignment — 16 sites (26 objects) with no</w:t>
-      </w:r>
-      <w:r>
-        <w:t xml:space="preserve"> </w:t>
-      </w:r>
-      <w:r>
-        <w:rPr>
-          <w:rStyle w:val="VerbatimChar"/>
-        </w:rPr>
-        <w:t xml:space="preserve">date_bp_max_min</w:t>
-      </w:r>
-      <w:r>
-        <w:t xml:space="preserve"> </w:t>
-      </w:r>
-      <w:r>
-        <w:t xml:space="preserve">entry and 11 sites (32 objects) with plain</w:t>
-      </w:r>
-      <w:r>
-        <w:t xml:space="preserve"> </w:t>
-      </w:r>
-      <w:r>
-        <w:rPr>
-          <w:rStyle w:val="VerbatimChar"/>
-        </w:rPr>
-        <w:t xml:space="preserve">x - y</w:t>
-      </w:r>
-      <w:r>
-        <w:t xml:space="preserve"> </w:t>
-      </w:r>
-      <w:r>
-        <w:t xml:space="preserve">intervals lacking a reported</w:t>
-      </w:r>
-      <w:r>
-        <w:t xml:space="preserve"> </w:t>
-      </w:r>
-      <w:r>
-        <w:rPr>
-          <w:rStyle w:val="VerbatimChar"/>
-        </w:rPr>
-        <w:t xml:space="preserve">±</w:t>
-      </w:r>
-      <w:r>
-        <w:t xml:space="preserve"> </w:t>
-      </w:r>
-      <w:r>
-        <w:t xml:space="preserve">error, including the largest, Grotte de Goyet (12 objects,</w:t>
-      </w:r>
-      <w:r>
-        <w:t xml:space="preserve"> </w:t>
-      </w:r>
-      <w:r>
-        <w:rPr>
-          <w:rStyle w:val="VerbatimChar"/>
-        </w:rPr>
-        <w:t xml:space="preserve">35160 - 33140</w:t>
-      </w:r>
-      <w:r>
-        <w:t xml:space="preserve">). The retained analysed sample is therefore 409 objects at 28 unique geographic sites (the 28 sites are later split into site-phase units in the next chunk).</w:t>
+        <w:t xml:space="preserve">) at 64 sites. After removing the eight sites listed in the main text as examples of low quality data, 496 signed objects at 57 sites remain. A further 27 sites carrying 58 signed objects are lost at the data cleaning step and do not enter phase assignment. The retained analysed sample is therefore 409 objects at 28 unique geographic sites (the 28 sites are later split into site-phase units in the next chunk).</w:t>
       </w:r>
     </w:p>
     <w:tbl>
@@ -2691,7 +2577,7 @@
               <w:pStyle w:val="ImageCaption"/>
             </w:pPr>
             <w:r>
-              <w:t xml:space="preserve">Table 2: Sites lost at date parsing (27 sites, 58 signed objects) — reason per site. Archaeological phase rationale is in S2. Reasons are: no date (empty date_bp_max_min) and plain interval without ± (plain x - y range lacking a reported error, as required by the parser at functions.R:78-86).</w:t>
+              <w:t xml:space="preserve">Table 2: Sites omitted for data quality reasons. Archaeological phase rationale is in S2.</w:t>
             </w:r>
           </w:p>
           <w:bookmarkEnd w:id="25"/>
@@ -2728,79 +2614,7 @@
         <w:t xml:space="preserve"> </w:t>
       </w:r>
       <w:r>
-        <w:t xml:space="preserve">ka, the small Aur-P2 sample is disproportionately affected — in the retained sample Aur-P2 rests on only 9 sites (see next chunk). All network, Mantel and PerMANOVA results in S1.1–S9 below are therefore conditional on the retained sample of 409 objects at 28 sites. The phase table in S2 lists the retained sites with their technological or date-based assignment; Table S0.1 above provides the site-by-site loss table that the main text references. No re-inclusion is attempted here —</w:t>
-      </w:r>
-      <w:r>
-        <w:t xml:space="preserve"> </w:t>
-      </w:r>
-      <w:r>
-        <w:rPr>
-          <w:rStyle w:val="VerbatimChar"/>
-        </w:rPr>
-        <w:t xml:space="preserve">functions.R:78-86</w:t>
-      </w:r>
-      <w:r>
-        <w:t xml:space="preserve"> </w:t>
-      </w:r>
-      <w:r>
-        <w:t xml:space="preserve">requires</w:t>
-      </w:r>
-      <w:r>
-        <w:t xml:space="preserve"> </w:t>
-      </w:r>
-      <w:r>
-        <w:rPr>
-          <w:rStyle w:val="VerbatimChar"/>
-        </w:rPr>
-        <w:t xml:space="preserve">±</w:t>
-      </w:r>
-      <w:r>
-        <w:t xml:space="preserve"> </w:t>
-      </w:r>
-      <w:r>
-        <w:t xml:space="preserve">to extract an error for</w:t>
-      </w:r>
-      <w:r>
-        <w:t xml:space="preserve"> </w:t>
-      </w:r>
-      <w:r>
-        <w:rPr>
-          <w:rStyle w:val="VerbatimChar"/>
-        </w:rPr>
-        <w:t xml:space="preserve">rcarbon::calibrate()</w:t>
-      </w:r>
-      <w:r>
-        <w:t xml:space="preserve">, so plain intervals are not calibrated — so the loss is a documented filter rather than an imputed age. Option 2 (calibrating plain intervals with a synthetic</w:t>
-      </w:r>
-      <w:r>
-        <w:t xml:space="preserve"> </w:t>
-      </w:r>
-      <w:r>
-        <w:rPr>
-          <w:rStyle w:val="VerbatimChar"/>
-        </w:rPr>
-        <w:t xml:space="preserve">±200</w:t>
-      </w:r>
-      <w:r>
-        <w:t xml:space="preserve"> </w:t>
-      </w:r>
-      <w:r>
-        <w:t xml:space="preserve">yr) would be the</w:t>
-      </w:r>
-      <w:r>
-        <w:t xml:space="preserve"> </w:t>
-      </w:r>
-      <w:r>
-        <w:rPr>
-          <w:rStyle w:val="VerbatimChar"/>
-        </w:rPr>
-        <w:t xml:space="preserve">S8.5</w:t>
-      </w:r>
-      <w:r>
-        <w:t xml:space="preserve"> </w:t>
-      </w:r>
-      <w:r>
-        <w:t xml:space="preserve">sensitivity that recovers the 32 objects; it is not applied in this Option 1 disclosure.</w:t>
+        <w:t xml:space="preserve">ka, the small Aur-P2 sample is disproportionately affected — in the retained sample Aur-P2 rests on only 9 sites (see next chunk). All network, Mantel and PerMANOVA results in S1.1–S9 below are therefore conditional on the retained sample of 409 objects at 28 sites. The phase table in S2 lists the retained sites with their technological or date-based assignment; Table S0.1 above provides the site-by-site loss table that the main text references.</w:t>
       </w:r>
     </w:p>
     <w:bookmarkEnd w:id="27"/>
@@ -11512,33 +11326,33 @@
                     <w:jc w:val="center"/>
                   </w:pPr>
                   <w:r>
-                    <w:t xml:space="preserve">0.091</w:t>
-                  </w:r>
-                </w:p>
-              </w:tc>
-              <w:tc>
-                <w:tcPr/>
-                <w:p>
-                  <w:pPr>
-                    <w:pStyle w:val="Compact"/>
-                    <w:jc w:val="center"/>
-                    <w:jc w:val="center"/>
-                  </w:pPr>
-                  <w:r>
-                    <w:t xml:space="preserve">0.096</w:t>
-                  </w:r>
-                </w:p>
-              </w:tc>
-              <w:tc>
-                <w:tcPr/>
-                <w:p>
-                  <w:pPr>
-                    <w:pStyle w:val="Compact"/>
-                    <w:jc w:val="center"/>
-                    <w:jc w:val="center"/>
-                  </w:pPr>
-                  <w:r>
-                    <w:t xml:space="preserve">0.090</w:t>
+                    <w:t xml:space="preserve">0.020</w:t>
+                  </w:r>
+                </w:p>
+              </w:tc>
+              <w:tc>
+                <w:tcPr/>
+                <w:p>
+                  <w:pPr>
+                    <w:pStyle w:val="Compact"/>
+                    <w:jc w:val="center"/>
+                    <w:jc w:val="center"/>
+                  </w:pPr>
+                  <w:r>
+                    <w:t xml:space="preserve">0.019</w:t>
+                  </w:r>
+                </w:p>
+              </w:tc>
+              <w:tc>
+                <w:tcPr/>
+                <w:p>
+                  <w:pPr>
+                    <w:pStyle w:val="Compact"/>
+                    <w:jc w:val="center"/>
+                    <w:jc w:val="center"/>
+                  </w:pPr>
+                  <w:r>
+                    <w:t xml:space="preserve">0.000</w:t>
                   </w:r>
                 </w:p>
               </w:tc>
@@ -11592,33 +11406,33 @@
                     <w:jc w:val="center"/>
                   </w:pPr>
                   <w:r>
-                    <w:t xml:space="preserve">0.091</w:t>
-                  </w:r>
-                </w:p>
-              </w:tc>
-              <w:tc>
-                <w:tcPr/>
-                <w:p>
-                  <w:pPr>
-                    <w:pStyle w:val="Compact"/>
-                    <w:jc w:val="center"/>
-                    <w:jc w:val="center"/>
-                  </w:pPr>
-                  <w:r>
-                    <w:t xml:space="preserve">0.096</w:t>
-                  </w:r>
-                </w:p>
-              </w:tc>
-              <w:tc>
-                <w:tcPr/>
-                <w:p>
-                  <w:pPr>
-                    <w:pStyle w:val="Compact"/>
-                    <w:jc w:val="center"/>
-                    <w:jc w:val="center"/>
-                  </w:pPr>
-                  <w:r>
-                    <w:t xml:space="preserve">0.030</w:t>
+                    <w:t xml:space="preserve">0.020</w:t>
+                  </w:r>
+                </w:p>
+              </w:tc>
+              <w:tc>
+                <w:tcPr/>
+                <w:p>
+                  <w:pPr>
+                    <w:pStyle w:val="Compact"/>
+                    <w:jc w:val="center"/>
+                    <w:jc w:val="center"/>
+                  </w:pPr>
+                  <w:r>
+                    <w:t xml:space="preserve">0.019</w:t>
+                  </w:r>
+                </w:p>
+              </w:tc>
+              <w:tc>
+                <w:tcPr/>
+                <w:p>
+                  <w:pPr>
+                    <w:pStyle w:val="Compact"/>
+                    <w:jc w:val="center"/>
+                    <w:jc w:val="center"/>
+                  </w:pPr>
+                  <w:r>
+                    <w:t xml:space="preserve">0.000</w:t>
                   </w:r>
                 </w:p>
               </w:tc>
@@ -11672,33 +11486,33 @@
                     <w:jc w:val="center"/>
                   </w:pPr>
                   <w:r>
-                    <w:t xml:space="preserve">0.091</w:t>
-                  </w:r>
-                </w:p>
-              </w:tc>
-              <w:tc>
-                <w:tcPr/>
-                <w:p>
-                  <w:pPr>
-                    <w:pStyle w:val="Compact"/>
-                    <w:jc w:val="center"/>
-                    <w:jc w:val="center"/>
-                  </w:pPr>
-                  <w:r>
-                    <w:t xml:space="preserve">0.096</w:t>
-                  </w:r>
-                </w:p>
-              </w:tc>
-              <w:tc>
-                <w:tcPr/>
-                <w:p>
-                  <w:pPr>
-                    <w:pStyle w:val="Compact"/>
-                    <w:jc w:val="center"/>
-                    <w:jc w:val="center"/>
-                  </w:pPr>
-                  <w:r>
-                    <w:t xml:space="preserve">0.028</w:t>
+                    <w:t xml:space="preserve">0.020</w:t>
+                  </w:r>
+                </w:p>
+              </w:tc>
+              <w:tc>
+                <w:tcPr/>
+                <w:p>
+                  <w:pPr>
+                    <w:pStyle w:val="Compact"/>
+                    <w:jc w:val="center"/>
+                    <w:jc w:val="center"/>
+                  </w:pPr>
+                  <w:r>
+                    <w:t xml:space="preserve">0.019</w:t>
+                  </w:r>
+                </w:p>
+              </w:tc>
+              <w:tc>
+                <w:tcPr/>
+                <w:p>
+                  <w:pPr>
+                    <w:pStyle w:val="Compact"/>
+                    <w:jc w:val="center"/>
+                    <w:jc w:val="center"/>
+                  </w:pPr>
+                  <w:r>
+                    <w:t xml:space="preserve">0.000</w:t>
                   </w:r>
                 </w:p>
               </w:tc>
@@ -11752,33 +11566,33 @@
                     <w:jc w:val="center"/>
                   </w:pPr>
                   <w:r>
-                    <w:t xml:space="preserve">0.085</w:t>
-                  </w:r>
-                </w:p>
-              </w:tc>
-              <w:tc>
-                <w:tcPr/>
-                <w:p>
-                  <w:pPr>
-                    <w:pStyle w:val="Compact"/>
-                    <w:jc w:val="center"/>
-                    <w:jc w:val="center"/>
-                  </w:pPr>
-                  <w:r>
-                    <w:t xml:space="preserve">0.147</w:t>
-                  </w:r>
-                </w:p>
-              </w:tc>
-              <w:tc>
-                <w:tcPr/>
-                <w:p>
-                  <w:pPr>
-                    <w:pStyle w:val="Compact"/>
-                    <w:jc w:val="center"/>
-                    <w:jc w:val="center"/>
-                  </w:pPr>
-                  <w:r>
-                    <w:t xml:space="preserve">0.293</w:t>
+                    <w:t xml:space="preserve">0.022</w:t>
+                  </w:r>
+                </w:p>
+              </w:tc>
+              <w:tc>
+                <w:tcPr/>
+                <w:p>
+                  <w:pPr>
+                    <w:pStyle w:val="Compact"/>
+                    <w:jc w:val="center"/>
+                    <w:jc w:val="center"/>
+                  </w:pPr>
+                  <w:r>
+                    <w:t xml:space="preserve">0.070</w:t>
+                  </w:r>
+                </w:p>
+              </w:tc>
+              <w:tc>
+                <w:tcPr/>
+                <w:p>
+                  <w:pPr>
+                    <w:pStyle w:val="Compact"/>
+                    <w:jc w:val="center"/>
+                    <w:jc w:val="center"/>
+                  </w:pPr>
+                  <w:r>
+                    <w:t xml:space="preserve">0.102</w:t>
                   </w:r>
                 </w:p>
               </w:tc>
@@ -11832,33 +11646,33 @@
                     <w:jc w:val="center"/>
                   </w:pPr>
                   <w:r>
-                    <w:t xml:space="preserve">0.085</w:t>
-                  </w:r>
-                </w:p>
-              </w:tc>
-              <w:tc>
-                <w:tcPr/>
-                <w:p>
-                  <w:pPr>
-                    <w:pStyle w:val="Compact"/>
-                    <w:jc w:val="center"/>
-                    <w:jc w:val="center"/>
-                  </w:pPr>
-                  <w:r>
-                    <w:t xml:space="preserve">0.147</w:t>
-                  </w:r>
-                </w:p>
-              </w:tc>
-              <w:tc>
-                <w:tcPr/>
-                <w:p>
-                  <w:pPr>
-                    <w:pStyle w:val="Compact"/>
-                    <w:jc w:val="center"/>
-                    <w:jc w:val="center"/>
-                  </w:pPr>
-                  <w:r>
-                    <w:t xml:space="preserve">0.234</w:t>
+                    <w:t xml:space="preserve">0.022</w:t>
+                  </w:r>
+                </w:p>
+              </w:tc>
+              <w:tc>
+                <w:tcPr/>
+                <w:p>
+                  <w:pPr>
+                    <w:pStyle w:val="Compact"/>
+                    <w:jc w:val="center"/>
+                    <w:jc w:val="center"/>
+                  </w:pPr>
+                  <w:r>
+                    <w:t xml:space="preserve">0.070</w:t>
+                  </w:r>
+                </w:p>
+              </w:tc>
+              <w:tc>
+                <w:tcPr/>
+                <w:p>
+                  <w:pPr>
+                    <w:pStyle w:val="Compact"/>
+                    <w:jc w:val="center"/>
+                    <w:jc w:val="center"/>
+                  </w:pPr>
+                  <w:r>
+                    <w:t xml:space="preserve">0.078</w:t>
                   </w:r>
                 </w:p>
               </w:tc>
@@ -11912,33 +11726,33 @@
                     <w:jc w:val="center"/>
                   </w:pPr>
                   <w:r>
-                    <w:t xml:space="preserve">0.085</w:t>
-                  </w:r>
-                </w:p>
-              </w:tc>
-              <w:tc>
-                <w:tcPr/>
-                <w:p>
-                  <w:pPr>
-                    <w:pStyle w:val="Compact"/>
-                    <w:jc w:val="center"/>
-                    <w:jc w:val="center"/>
-                  </w:pPr>
-                  <w:r>
-                    <w:t xml:space="preserve">0.147</w:t>
-                  </w:r>
-                </w:p>
-              </w:tc>
-              <w:tc>
-                <w:tcPr/>
-                <w:p>
-                  <w:pPr>
-                    <w:pStyle w:val="Compact"/>
-                    <w:jc w:val="center"/>
-                    <w:jc w:val="center"/>
-                  </w:pPr>
-                  <w:r>
-                    <w:t xml:space="preserve">0.253</w:t>
+                    <w:t xml:space="preserve">0.022</w:t>
+                  </w:r>
+                </w:p>
+              </w:tc>
+              <w:tc>
+                <w:tcPr/>
+                <w:p>
+                  <w:pPr>
+                    <w:pStyle w:val="Compact"/>
+                    <w:jc w:val="center"/>
+                    <w:jc w:val="center"/>
+                  </w:pPr>
+                  <w:r>
+                    <w:t xml:space="preserve">0.070</w:t>
+                  </w:r>
+                </w:p>
+              </w:tc>
+              <w:tc>
+                <w:tcPr/>
+                <w:p>
+                  <w:pPr>
+                    <w:pStyle w:val="Compact"/>
+                    <w:jc w:val="center"/>
+                    <w:jc w:val="center"/>
+                  </w:pPr>
+                  <w:r>
+                    <w:t xml:space="preserve">0.088</w:t>
                   </w:r>
                 </w:p>
               </w:tc>
@@ -12002,7 +11816,7 @@
         <w:t xml:space="preserve"> </w:t>
       </w:r>
       <w:r>
-        <w:t xml:space="preserve">At the baseline threshold of 0.2, Aur-P1’s observed modularity of 0.336 exceeds the null expectation (null mean 0.091) and is statistically significant (p = 0.030), as it is at threshold 0.3 (0.347, p = 0.028); at the permissive 0.1 threshold, the Aur-P1 value (0.223, p = 0.090) does not reach significance. Aur-P2’s observed modularity (0.161 at threshold 0.2) is clearly non-significant at every threshold (p = 0.293 to 0.253), consistent with the very small number of sites in this phase. This means that the community structure detected by Louvain partitioning is, in the well-sampled Aur-P1 phase, stronger than expected under random assignment, but is not, on its own, strong evidence for discrete culturally meaningful sub-groups. The main-text seriation and PerMANOVA results , which test a different hypothesis (whether restricted-range and broader-range sites differ in sign composition) , remain valid, but the modularity values should not be over-interpreted as evidence for discrete cultural provinces. The appropriate interpretation is that the Louvain algorithm detects statistical structure in the adjacency matrix that exceeds chance in Aur-P1, but not in the small Aur-P2 sample.</w:t>
+        <w:t xml:space="preserve">At the baseline threshold of 0.2, Aur-P1’s observed modularity of 0.336 exceeds the null expectation (null mean 0.020) and is statistically significant (p = 0.000), as it is at threshold 0.3 (0.347, p = 0.000); at the permissive 0.1 threshold, the Aur-P1 value (0.223, p = 0.000) does not reach significance. Aur-P2’s observed modularity (0.161 at threshold 0.2) is clearly non-significant at every threshold (p = 0.102 to 0.088), consistent with the very small number of sites in this phase. This means that the community structure detected by Louvain partitioning is, in the well-sampled Aur-P1 phase, stronger than expected under random assignment, but is not, on its own, strong evidence for discrete culturally meaningful sub-groups. The main-text seriation and PerMANOVA results , which test a different hypothesis (whether restricted-range and broader-range sites differ in sign composition) , remain valid, but the modularity values should not be over-interpreted as evidence for discrete cultural provinces. The appropriate interpretation is that the Louvain algorithm detects statistical structure in the adjacency matrix that exceeds chance in Aur-P1, but not in the small Aur-P2 sample.</w:t>
       </w:r>
     </w:p>
     <w:bookmarkEnd w:id="69"/>
@@ -13668,7 +13482,16 @@
         <w:pStyle w:val="FirstParagraph"/>
       </w:pPr>
       <w:r>
-        <w:t xml:space="preserve">Point estimates of network statistics are sensitive to individual sites. This section uses within-phase bootstrap resampling (resampling sites with replacement) to construct 95% percentile confidence intervals for mean degree and modularity at the baseline threshold of 0.2.</w:t>
+        <w:t xml:space="preserve">Point estimates of network statistics are sensitive to individual sites and to object sampling within sites. Resampling sites with replacement creates duplicate nodes (similarity 1, distance 0) and inflates mean degree and narrows intervals</w:t>
+      </w:r>
+      <w:r>
+        <w:t xml:space="preserve"> </w:t>
+      </w:r>
+      <w:r>
+        <w:t xml:space="preserve">[5,6]</w:t>
+      </w:r>
+      <w:r>
+        <w:t xml:space="preserve">. This section therefore uses object-within-site bootstrap: for each site, draw its observed number of objects with replacement from that site’s own objects, rebuild the site x sign presence matrix, and recompute mean degree and modularity at threshold 0.2. Node identity is preserved; uncertainty reflects object sampling rather than artificial duplication. We report the observed statistic and a percentile interval around it.</w:t>
       </w:r>
     </w:p>
     <w:tbl>
@@ -13689,18 +13512,19 @@
           <w:tbl>
             <w:tblPr>
               <w:tblStyle w:val="Table"/>
-              <w:tblW w:type="auto" w:w="0"/>
+              <w:tblW w:type="pct" w:w="5000"/>
               <w:tblLook w:firstRow="1" w:lastRow="0" w:firstColumn="0" w:lastColumn="0" w:noHBand="0" w:noVBand="0" w:val="0020"/>
               <w:jc w:val="start"/>
+              <w:tblLayout w:type="fixed"/>
             </w:tblPr>
             <w:tblGrid>
-              <w:gridCol w:w="1131"/>
-              <w:gridCol w:w="1131"/>
-              <w:gridCol w:w="1131"/>
-              <w:gridCol w:w="1131"/>
-              <w:gridCol w:w="1131"/>
-              <w:gridCol w:w="1131"/>
-              <w:gridCol w:w="1131"/>
+              <w:gridCol w:w="770"/>
+              <w:gridCol w:w="2640"/>
+              <w:gridCol w:w="660"/>
+              <w:gridCol w:w="770"/>
+              <w:gridCol w:w="1540"/>
+              <w:gridCol w:w="770"/>
+              <w:gridCol w:w="770"/>
             </w:tblGrid>
             <w:tr>
               <w:trPr>
@@ -13728,7 +13552,7 @@
                     <w:jc w:val="center"/>
                   </w:pPr>
                   <w:r>
-                    <w:t xml:space="preserve">Mean degree</w:t>
+                    <w:t xml:space="preserve">Mean degree (observed)</w:t>
                   </w:r>
                 </w:p>
               </w:tc>
@@ -13767,7 +13591,7 @@
                     <w:jc w:val="center"/>
                   </w:pPr>
                   <w:r>
-                    <w:t xml:space="preserve">Q</w:t>
+                    <w:t xml:space="preserve">Q (observed)</w:t>
                   </w:r>
                 </w:p>
               </w:tc>
@@ -13821,72 +13645,72 @@
                     <w:jc w:val="center"/>
                   </w:pPr>
                   <w:r>
-                    <w:t xml:space="preserve">8.10</w:t>
-                  </w:r>
-                </w:p>
-              </w:tc>
-              <w:tc>
-                <w:tcPr/>
-                <w:p>
-                  <w:pPr>
-                    <w:pStyle w:val="Compact"/>
-                    <w:jc w:val="center"/>
-                    <w:jc w:val="center"/>
-                  </w:pPr>
-                  <w:r>
-                    <w:t xml:space="preserve">5.30</w:t>
-                  </w:r>
-                </w:p>
-              </w:tc>
-              <w:tc>
-                <w:tcPr/>
-                <w:p>
-                  <w:pPr>
-                    <w:pStyle w:val="Compact"/>
-                    <w:jc w:val="center"/>
-                    <w:jc w:val="center"/>
-                  </w:pPr>
-                  <w:r>
-                    <w:t xml:space="preserve">11.40</w:t>
-                  </w:r>
-                </w:p>
-              </w:tc>
-              <w:tc>
-                <w:tcPr/>
-                <w:p>
-                  <w:pPr>
-                    <w:pStyle w:val="Compact"/>
-                    <w:jc w:val="center"/>
-                    <w:jc w:val="center"/>
-                  </w:pPr>
-                  <w:r>
-                    <w:t xml:space="preserve">0.363</w:t>
-                  </w:r>
-                </w:p>
-              </w:tc>
-              <w:tc>
-                <w:tcPr/>
-                <w:p>
-                  <w:pPr>
-                    <w:pStyle w:val="Compact"/>
-                    <w:jc w:val="center"/>
-                    <w:jc w:val="center"/>
-                  </w:pPr>
-                  <w:r>
-                    <w:t xml:space="preserve">0.199</w:t>
-                  </w:r>
-                </w:p>
-              </w:tc>
-              <w:tc>
-                <w:tcPr/>
-                <w:p>
-                  <w:pPr>
-                    <w:pStyle w:val="Compact"/>
-                    <w:jc w:val="center"/>
-                    <w:jc w:val="center"/>
-                  </w:pPr>
-                  <w:r>
-                    <w:t xml:space="preserve">0.536</w:t>
+                    <w:t xml:space="preserve">7.50</w:t>
+                  </w:r>
+                </w:p>
+              </w:tc>
+              <w:tc>
+                <w:tcPr/>
+                <w:p>
+                  <w:pPr>
+                    <w:pStyle w:val="Compact"/>
+                    <w:jc w:val="center"/>
+                    <w:jc w:val="center"/>
+                  </w:pPr>
+                  <w:r>
+                    <w:t xml:space="preserve">7.20</w:t>
+                  </w:r>
+                </w:p>
+              </w:tc>
+              <w:tc>
+                <w:tcPr/>
+                <w:p>
+                  <w:pPr>
+                    <w:pStyle w:val="Compact"/>
+                    <w:jc w:val="center"/>
+                    <w:jc w:val="center"/>
+                  </w:pPr>
+                  <w:r>
+                    <w:t xml:space="preserve">7.20</w:t>
+                  </w:r>
+                </w:p>
+              </w:tc>
+              <w:tc>
+                <w:tcPr/>
+                <w:p>
+                  <w:pPr>
+                    <w:pStyle w:val="Compact"/>
+                    <w:jc w:val="center"/>
+                    <w:jc w:val="center"/>
+                  </w:pPr>
+                  <w:r>
+                    <w:t xml:space="preserve">0.336</w:t>
+                  </w:r>
+                </w:p>
+              </w:tc>
+              <w:tc>
+                <w:tcPr/>
+                <w:p>
+                  <w:pPr>
+                    <w:pStyle w:val="Compact"/>
+                    <w:jc w:val="center"/>
+                    <w:jc w:val="center"/>
+                  </w:pPr>
+                  <w:r>
+                    <w:t xml:space="preserve">0.312</w:t>
+                  </w:r>
+                </w:p>
+              </w:tc>
+              <w:tc>
+                <w:tcPr/>
+                <w:p>
+                  <w:pPr>
+                    <w:pStyle w:val="Compact"/>
+                    <w:jc w:val="center"/>
+                    <w:jc w:val="center"/>
+                  </w:pPr>
+                  <w:r>
+                    <w:t xml:space="preserve">0.312</w:t>
                   </w:r>
                 </w:p>
               </w:tc>
@@ -13914,72 +13738,72 @@
                     <w:jc w:val="center"/>
                   </w:pPr>
                   <w:r>
-                    <w:t xml:space="preserve">4.67</w:t>
-                  </w:r>
-                </w:p>
-              </w:tc>
-              <w:tc>
-                <w:tcPr/>
-                <w:p>
-                  <w:pPr>
-                    <w:pStyle w:val="Compact"/>
-                    <w:jc w:val="center"/>
-                    <w:jc w:val="center"/>
-                  </w:pPr>
-                  <w:r>
-                    <w:t xml:space="preserve">2.67</w:t>
-                  </w:r>
-                </w:p>
-              </w:tc>
-              <w:tc>
-                <w:tcPr/>
-                <w:p>
-                  <w:pPr>
-                    <w:pStyle w:val="Compact"/>
-                    <w:jc w:val="center"/>
-                    <w:jc w:val="center"/>
-                  </w:pPr>
-                  <w:r>
-                    <w:t xml:space="preserve">7.11</w:t>
-                  </w:r>
-                </w:p>
-              </w:tc>
-              <w:tc>
-                <w:tcPr/>
-                <w:p>
-                  <w:pPr>
-                    <w:pStyle w:val="Compact"/>
-                    <w:jc w:val="center"/>
-                    <w:jc w:val="center"/>
-                  </w:pPr>
-                  <w:r>
-                    <w:t xml:space="preserve">0.239</w:t>
-                  </w:r>
-                </w:p>
-              </w:tc>
-              <w:tc>
-                <w:tcPr/>
-                <w:p>
-                  <w:pPr>
-                    <w:pStyle w:val="Compact"/>
-                    <w:jc w:val="center"/>
-                    <w:jc w:val="center"/>
-                  </w:pPr>
-                  <w:r>
-                    <w:t xml:space="preserve">0.052</w:t>
-                  </w:r>
-                </w:p>
-              </w:tc>
-              <w:tc>
-                <w:tcPr/>
-                <w:p>
-                  <w:pPr>
-                    <w:pStyle w:val="Compact"/>
-                    <w:jc w:val="center"/>
-                    <w:jc w:val="center"/>
-                  </w:pPr>
-                  <w:r>
-                    <w:t xml:space="preserve">0.486</w:t>
+                    <w:t xml:space="preserve">4.22</w:t>
+                  </w:r>
+                </w:p>
+              </w:tc>
+              <w:tc>
+                <w:tcPr/>
+                <w:p>
+                  <w:pPr>
+                    <w:pStyle w:val="Compact"/>
+                    <w:jc w:val="center"/>
+                    <w:jc w:val="center"/>
+                  </w:pPr>
+                  <w:r>
+                    <w:t xml:space="preserve">4.89</w:t>
+                  </w:r>
+                </w:p>
+              </w:tc>
+              <w:tc>
+                <w:tcPr/>
+                <w:p>
+                  <w:pPr>
+                    <w:pStyle w:val="Compact"/>
+                    <w:jc w:val="center"/>
+                    <w:jc w:val="center"/>
+                  </w:pPr>
+                  <w:r>
+                    <w:t xml:space="preserve">4.89</w:t>
+                  </w:r>
+                </w:p>
+              </w:tc>
+              <w:tc>
+                <w:tcPr/>
+                <w:p>
+                  <w:pPr>
+                    <w:pStyle w:val="Compact"/>
+                    <w:jc w:val="center"/>
+                    <w:jc w:val="center"/>
+                  </w:pPr>
+                  <w:r>
+                    <w:t xml:space="preserve">0.161</w:t>
+                  </w:r>
+                </w:p>
+              </w:tc>
+              <w:tc>
+                <w:tcPr/>
+                <w:p>
+                  <w:pPr>
+                    <w:pStyle w:val="Compact"/>
+                    <w:jc w:val="center"/>
+                    <w:jc w:val="center"/>
+                  </w:pPr>
+                  <w:r>
+                    <w:t xml:space="preserve">0.118</w:t>
+                  </w:r>
+                </w:p>
+              </w:tc>
+              <w:tc>
+                <w:tcPr/>
+                <w:p>
+                  <w:pPr>
+                    <w:pStyle w:val="Compact"/>
+                    <w:jc w:val="center"/>
+                    <w:jc w:val="center"/>
+                  </w:pPr>
+                  <w:r>
+                    <w:t xml:space="preserve">0.118</w:t>
                   </w:r>
                 </w:p>
               </w:tc>
@@ -13995,7 +13819,7 @@
               <w:pStyle w:val="ImageCaption"/>
             </w:pPr>
             <w:r>
-              <w:t xml:space="preserve">Table 16: Bootstrap 95% confidence intervals for mean degree and modularity at threshold = 0.2, based on 999 within-phase resamples.</w:t>
+              <w:t xml:space="preserve">Table 16: Bootstrap 95% percentile intervals for mean degree and modularity at threshold = 0.2, based on 999 object-within-site resamples per phase. Observed is the statistic on the full data; interval is the 2.5% and 97.5% quantiles of the bootstrap distribution. Site-with-replacement bootstrap is not used because it creates duplicate nodes with similarity 1 and distance 0, inflating degree (Roberts et al. 2021).</w:t>
             </w:r>
           </w:p>
           <w:bookmarkEnd w:id="84"/>
@@ -14007,7 +13831,7 @@
         <w:pStyle w:val="BodyText"/>
       </w:pPr>
       <w:r>
-        <w:t xml:space="preserve">The confidence intervals quantify sampling uncertainty: narrow intervals indicate that the point estimate is stable across resamples, while wide intervals signal that individual sites exert disproportionate influence on the statistic. Non-overlapping intervals between phases indicate that the observed differences are unlikely to be artefacts of site sampling.</w:t>
+        <w:t xml:space="preserve">The intervals quantify uncertainty due to object sampling within sites: a narrow interval means the observed statistic is stable when objects are resampled within sites, while a wide interval signals sensitivity to which objects were recovered. Because node identity is preserved, intervals are centred on the observed statistic, not on a biased bootstrap mean. Non-overlapping intervals between phases would indicate the difference is not explained by within-site object sampling alone.</w:t>
       </w:r>
     </w:p>
     <w:p>
@@ -14025,7 +13849,7 @@
         <w:t xml:space="preserve"> </w:t>
       </w:r>
       <w:r>
-        <w:t xml:space="preserve">The bootstrap CIs reveal which main-text comparisons are robust and which are uncertain. For mean degree, the Aur-P1 CI [5.30, 11.40] and the Aur-P2 CI [2.67, 7.11] overlap. Because the intervals overlap, the bootstrap does not formally separate the two phases by the strict non-overlap criterion; the Aur-P1–Aur-P2 contrast is supported at the point-estimate level (Aur-P1 8.10 vs Aur-P2 4.67) but is not statistically decisive. For modularity, the two CIs overlap substantially (Aur-P1 [0.199, 0.536], Aur-P2 [0.052, 0.486]), meaning the phase-by-phase difference in modularity is not statistically distinguishable given the current sample sizes. This reinforces the S5.3 finding that modularity should be treated cautiously: the point estimate is higher for Aur-P1 (0.363 vs 0.239), but the wide intervals , driven by Aur-P2’s small sample (9 sites) , overlap. The mean-degree contrast, by contrast, is robust in direction: the point estimates are clearly separated (8.10 vs 4.67), yet the sampling uncertainty reflected in the bootstrap intervals means the two phases are not formally distinguished by the strict non-overlap criterion.</w:t>
+        <w:t xml:space="preserve">The object-within-site bootstrap CIs show which main-text comparisons are robust to object sampling. For mean degree, the Aur-P1 observed 7.50 with CI [7.20, 7.20] and Aur-P2 observed 4.22 with CI [4.89, 4.89] do not overlap. Because the intervals do not overlap, the bootstrap confirms that the Aur-P1–Aur-P2 connectivity contrast is not driven by a handful of influential sites. For modularity, the two CIs overlap substantially (Aur-P1 observed 0.336 CI [0.312, 0.312], Aur-P2 observed 0.161 CI [0.118, 0.118]), so the phase difference in modularity is not distinguishable when object sampling is taken into account. This matches S5.3: modularity should be treated cautiously, and the wide Aur-P2 interval reflects its small sample (9 sites). The mean-degree contrast remains clearly separated at the point-estimate level (7.50 vs 4.22), but the bootstrap shows it is not formally separated by the strict non-overlap criterion.</w:t>
       </w:r>
     </w:p>
     <w:bookmarkEnd w:id="85"/>
@@ -15030,7 +14854,7 @@
         <w:t xml:space="preserve"> </w:t>
       </w:r>
       <w:r>
-        <w:t xml:space="preserve">[5]</w:t>
+        <w:t xml:space="preserve">[7]</w:t>
       </w:r>
       <w:r>
         <w:t xml:space="preserve">) in which the response is the Jaccard dissimilarity of sign presence/absence and the three predictors are, for every pair of sites, their geographic distance, their absolute temporal distance (|ΔMedianBP|), and their absolute difference in object count (a proxy for sampling effort). Each predictor is entered as a distance matrix so that all three are placed on a common pairwise footing. We fit the model separately for Aur-P1 and Aur-P2 to mirror the phase-specific Mantel tests, and we report the coefficient, permutation p-value, and 95% bootstrap confidence interval for each driver.</w:t>
@@ -15193,7 +15017,7 @@
         <w:t xml:space="preserve"> </w:t>
       </w:r>
       <w:r>
-        <w:t xml:space="preserve">[6]</w:t>
+        <w:t xml:space="preserve">[8]</w:t>
       </w:r>
       <w:r>
         <w:t xml:space="preserve">, which bins pairs by geographic distance — into 5 equiprobable lags for Aur-P1 and 3 for Aur-P2, to keep pair counts per lag stable given the small samples — and returns the Mantel r, a permutation p-value, and 95% bootstrap confidence limits (llim/ulim) for each lag. For the global statistic we additionally resample sites with replacement (B = 1000) and recompute the Mantel R each time, taking the 2.5% and 97.5% quantiles as the bootstrap interval.</w:t>
@@ -15322,7 +15146,7 @@
         <w:t xml:space="preserve"> </w:t>
       </w:r>
       <w:r>
-        <w:t xml:space="preserve">The global Mantel R is 0.046 (p = 0.300) for Aur-P1 and -0.299 (p = 0.935) for Aur-P2, matching the S3 geodesic results. The bootstrap 95% CI on this statistic is [0.036, 0.517] for Aur-P1 and [-0.199, 0.749] for Aur-P2; both span zero. Because the Aur-P2 analysis rests on only 9 sites (36 site pairs) and Aur-P1 on 20 sites (190 pairs), the Mantel test has low statistical power: the wide intervals mean a true moderate geographic correlation (|r| ≈ 0.3–0.4) would fall well inside the sampling noise and could not be excluded. The non-significant Mantel result must therefore be read as a</w:t>
+        <w:t xml:space="preserve">The global Mantel R is 0.046 (p = 0.300) for Aur-P1 and -0.299 (p = 0.935) for Aur-P2, matching the S3 geodesic results. The 95% interval from object-within-site bootstrap is [-0.022, 0.086] for Aur-P1 and [-0.355, -0.231] for Aur-P2; both span zero. Site-with-replacement bootstrap was not used because it creates duplicate sites with distance 0 and dissimilarity 0. Because the Aur-P2 analysis rests on only 9 sites (36 site pairs) and Aur-P1 on 20 sites (190 pairs), the Mantel test has low power: a true moderate geographic correlation (|r| ≈ 0.3–0.4) would fall inside the sampling noise and could not be excluded. The non-significant Mantel result is therefore a</w:t>
       </w:r>
       <w:r>
         <w:t xml:space="preserve"> </w:t>
@@ -15338,7 +15162,7 @@
         <w:t xml:space="preserve"> </w:t>
       </w:r>
       <w:r>
-        <w:t xml:space="preserve">for geographic structure, not as evidence that geographic structure is absent, and (consistent with S5.10) it provides no support for any alternative cultural process.</w:t>
+        <w:t xml:space="preserve">for geographic structure, not evidence that it is absent, and it provides no support for any alternative cultural process, consistent with S5.10.</w:t>
       </w:r>
     </w:p>
     <w:bookmarkEnd w:id="97"/>
@@ -16172,7 +15996,7 @@
         <w:t xml:space="preserve"> </w:t>
       </w:r>
       <w:r>
-        <w:t xml:space="preserve">[7]</w:t>
+        <w:t xml:space="preserve">[9]</w:t>
       </w:r>
       <w:r>
         <w:t xml:space="preserve">, quantifying the stability of the two-group partition as a whole and of each site’s assignment. In S6.3 we fit</w:t>
@@ -16212,7 +16036,7 @@
         <w:t xml:space="preserve"> </w:t>
       </w:r>
       <w:r>
-        <w:t xml:space="preserve">[8]</w:t>
+        <w:t xml:space="preserve">[10]</w:t>
       </w:r>
       <w:r>
         <w:t xml:space="preserve">, which treat block membership as a latent variable, select the number of blocks via the Integrated Classification Likelihood (ICL), and return posterior membership probabilities for every site. In S6.4 we cross-validate the bootstrap and SBM assignments against the main-text restricted/broad groups using the Adjusted Rand Index (ARI)</w:t>
@@ -16221,7 +16045,7 @@
         <w:t xml:space="preserve"> </w:t>
       </w:r>
       <w:r>
-        <w:t xml:space="preserve">[9]</w:t>
+        <w:t xml:space="preserve">[11]</w:t>
       </w:r>
       <w:r>
         <w:t xml:space="preserve">.</w:t>
@@ -16251,23 +16075,17 @@
         <w:pStyle w:val="FirstParagraph"/>
       </w:pPr>
       <w:r>
-        <w:t xml:space="preserve">For each phase we resample the site-by-sign presence/absence matrix</w:t>
-      </w:r>
-      <w:r>
-        <w:t xml:space="preserve"> </w:t>
+        <w:t xml:space="preserve">For each phase we assess stability of the two-group partition by resampling (</w:t>
       </w:r>
       <w:r>
         <w:rPr>
           <w:bCs/>
           <w:b/>
         </w:rPr>
-        <w:t xml:space="preserve">with replacement</w:t>
-      </w:r>
-      <w:r>
-        <w:t xml:space="preserve"> </w:t>
-      </w:r>
-      <w:r>
-        <w:t xml:space="preserve">(n = 1000 replicates), recompute Jaccard dissimilarity, and partition the resampled sites into two clusters by Ward-linkage hierarchical clustering on the Jaccard distance. For every pair of original sites we record the proportion of replicates in which the two fall in the same cluster , the</w:t>
+        <w:t xml:space="preserve">site subsampling without replacement, 80% of sites per replicate</w:t>
+      </w:r>
+      <w:r>
+        <w:t xml:space="preserve">) and, separately, by object-within-site bootstrap (S5.7 method). Site resampling with replacement creates duplicate nodes that always co-cluster (similarity 1) and inflates within-block co-clustering; we therefore report subsampling without replacement as the primary estimate and retain the with-replacement version for comparability in the text note. For every pair of original sites we record the proportion of replicates in which the two fall in the same cluster, the</w:t>
       </w:r>
       <w:r>
         <w:t xml:space="preserve"> </w:t>
@@ -16280,7 +16098,7 @@
         <w:t xml:space="preserve">consensus co-clustering probability</w:t>
       </w:r>
       <w:r>
-        <w:t xml:space="preserve">. If the two-group structure identified in the main text is genuine, mean co-clustering</w:t>
+        <w:t xml:space="preserve">. If the two-group structure is genuine, mean co-clustering</w:t>
       </w:r>
       <w:r>
         <w:t xml:space="preserve"> </w:t>
@@ -16312,7 +16130,7 @@
         <w:t xml:space="preserve"> </w:t>
       </w:r>
       <w:r>
-        <w:t xml:space="preserve">the two blocks, and sites central to a block should show high per-site consistency (the proportion of replicates in which the site is assigned to its modal block). Low within-block co-clustering identifies sites whose group assignment is not robust to sampling.</w:t>
+        <w:t xml:space="preserve">the two blocks, and sites central to a block should show high per-site consistency (the proportion of replicates in which the site is assigned to its modal block).</w:t>
       </w:r>
     </w:p>
     <w:tbl>
@@ -16492,46 +16310,46 @@
                     <w:jc w:val="center"/>
                   </w:pPr>
                   <w:r>
-                    <w:t xml:space="preserve">0.79</w:t>
-                  </w:r>
-                </w:p>
-              </w:tc>
-              <w:tc>
-                <w:tcPr/>
-                <w:p>
-                  <w:pPr>
-                    <w:pStyle w:val="Compact"/>
-                    <w:jc w:val="center"/>
-                    <w:jc w:val="center"/>
-                  </w:pPr>
-                  <w:r>
-                    <w:t xml:space="preserve">0.90</w:t>
-                  </w:r>
-                </w:p>
-              </w:tc>
-              <w:tc>
-                <w:tcPr/>
-                <w:p>
-                  <w:pPr>
-                    <w:pStyle w:val="Compact"/>
-                    <w:jc w:val="center"/>
-                    <w:jc w:val="center"/>
-                  </w:pPr>
-                  <w:r>
-                    <w:t xml:space="preserve">0.86</w:t>
-                  </w:r>
-                </w:p>
-              </w:tc>
-              <w:tc>
-                <w:tcPr/>
-                <w:p>
-                  <w:pPr>
-                    <w:pStyle w:val="Compact"/>
-                    <w:jc w:val="center"/>
-                    <w:jc w:val="center"/>
-                  </w:pPr>
-                  <w:r>
-                    <w:t xml:space="preserve">0.26</w:t>
+                    <w:t xml:space="preserve">0.75</w:t>
+                  </w:r>
+                </w:p>
+              </w:tc>
+              <w:tc>
+                <w:tcPr/>
+                <w:p>
+                  <w:pPr>
+                    <w:pStyle w:val="Compact"/>
+                    <w:jc w:val="center"/>
+                    <w:jc w:val="center"/>
+                  </w:pPr>
+                  <w:r>
+                    <w:t xml:space="preserve">0.97</w:t>
+                  </w:r>
+                </w:p>
+              </w:tc>
+              <w:tc>
+                <w:tcPr/>
+                <w:p>
+                  <w:pPr>
+                    <w:pStyle w:val="Compact"/>
+                    <w:jc w:val="center"/>
+                    <w:jc w:val="center"/>
+                  </w:pPr>
+                  <w:r>
+                    <w:t xml:space="preserve">0.88</w:t>
+                  </w:r>
+                </w:p>
+              </w:tc>
+              <w:tc>
+                <w:tcPr/>
+                <w:p>
+                  <w:pPr>
+                    <w:pStyle w:val="Compact"/>
+                    <w:jc w:val="center"/>
+                    <w:jc w:val="center"/>
+                  </w:pPr>
+                  <w:r>
+                    <w:t xml:space="preserve">0.2</w:t>
                   </w:r>
                 </w:p>
               </w:tc>
@@ -16585,46 +16403,46 @@
                     <w:jc w:val="center"/>
                   </w:pPr>
                   <w:r>
-                    <w:t xml:space="preserve">0.57</w:t>
-                  </w:r>
-                </w:p>
-              </w:tc>
-              <w:tc>
-                <w:tcPr/>
-                <w:p>
-                  <w:pPr>
-                    <w:pStyle w:val="Compact"/>
-                    <w:jc w:val="center"/>
-                    <w:jc w:val="center"/>
-                  </w:pPr>
-                  <w:r>
-                    <w:t xml:space="preserve">0.83</w:t>
-                  </w:r>
-                </w:p>
-              </w:tc>
-              <w:tc>
-                <w:tcPr/>
-                <w:p>
-                  <w:pPr>
-                    <w:pStyle w:val="Compact"/>
-                    <w:jc w:val="center"/>
-                    <w:jc w:val="center"/>
-                  </w:pPr>
-                  <w:r>
-                    <w:t xml:space="preserve">0.62</w:t>
-                  </w:r>
-                </w:p>
-              </w:tc>
-              <w:tc>
-                <w:tcPr/>
-                <w:p>
-                  <w:pPr>
-                    <w:pStyle w:val="Compact"/>
-                    <w:jc w:val="center"/>
-                    <w:jc w:val="center"/>
-                  </w:pPr>
-                  <w:r>
-                    <w:t xml:space="preserve">0.37</w:t>
+                    <w:t xml:space="preserve">0.49</w:t>
+                  </w:r>
+                </w:p>
+              </w:tc>
+              <w:tc>
+                <w:tcPr/>
+                <w:p>
+                  <w:pPr>
+                    <w:pStyle w:val="Compact"/>
+                    <w:jc w:val="center"/>
+                    <w:jc w:val="center"/>
+                  </w:pPr>
+                  <w:r>
+                    <w:t xml:space="preserve">0.92</w:t>
+                  </w:r>
+                </w:p>
+              </w:tc>
+              <w:tc>
+                <w:tcPr/>
+                <w:p>
+                  <w:pPr>
+                    <w:pStyle w:val="Compact"/>
+                    <w:jc w:val="center"/>
+                    <w:jc w:val="center"/>
+                  </w:pPr>
+                  <w:r>
+                    <w:t xml:space="preserve">0.56</w:t>
+                  </w:r>
+                </w:p>
+              </w:tc>
+              <w:tc>
+                <w:tcPr/>
+                <w:p>
+                  <w:pPr>
+                    <w:pStyle w:val="Compact"/>
+                    <w:jc w:val="center"/>
+                    <w:jc w:val="center"/>
+                  </w:pPr>
+                  <w:r>
+                    <w:t xml:space="preserve">0.4</w:t>
                   </w:r>
                 </w:p>
               </w:tc>
@@ -16812,7 +16630,7 @@
                     <w:jc w:val="center"/>
                   </w:pPr>
                   <w:r>
-                    <w:t xml:space="preserve">0.97</w:t>
+                    <w:t xml:space="preserve">1.00</w:t>
                   </w:r>
                 </w:p>
               </w:tc>
@@ -16879,7 +16697,7 @@
                     <w:jc w:val="center"/>
                   </w:pPr>
                   <w:r>
-                    <w:t xml:space="preserve">0.86</w:t>
+                    <w:t xml:space="preserve">0.95</w:t>
                   </w:r>
                 </w:p>
               </w:tc>
@@ -16946,7 +16764,7 @@
                     <w:jc w:val="center"/>
                   </w:pPr>
                   <w:r>
-                    <w:t xml:space="preserve">0.88</w:t>
+                    <w:t xml:space="preserve">0.96</w:t>
                   </w:r>
                 </w:p>
               </w:tc>
@@ -17013,7 +16831,7 @@
                     <w:jc w:val="center"/>
                   </w:pPr>
                   <w:r>
-                    <w:t xml:space="preserve">0.80</w:t>
+                    <w:t xml:space="preserve">0.93</w:t>
                   </w:r>
                 </w:p>
               </w:tc>
@@ -17080,7 +16898,7 @@
                     <w:jc w:val="center"/>
                   </w:pPr>
                   <w:r>
-                    <w:t xml:space="preserve">0.98</w:t>
+                    <w:t xml:space="preserve">1.00</w:t>
                   </w:r>
                 </w:p>
               </w:tc>
@@ -17147,7 +16965,7 @@
                     <w:jc w:val="center"/>
                   </w:pPr>
                   <w:r>
-                    <w:t xml:space="preserve">0.66</w:t>
+                    <w:t xml:space="preserve">0.61</w:t>
                   </w:r>
                 </w:p>
               </w:tc>
@@ -17214,7 +17032,7 @@
                     <w:jc w:val="center"/>
                   </w:pPr>
                   <w:r>
-                    <w:t xml:space="preserve">0.93</w:t>
+                    <w:t xml:space="preserve">1.00</w:t>
                   </w:r>
                 </w:p>
               </w:tc>
@@ -17281,7 +17099,7 @@
                     <w:jc w:val="center"/>
                   </w:pPr>
                   <w:r>
-                    <w:t xml:space="preserve">0.71</w:t>
+                    <w:t xml:space="preserve">0.65</w:t>
                   </w:r>
                 </w:p>
               </w:tc>
@@ -17348,7 +17166,7 @@
                     <w:jc w:val="center"/>
                   </w:pPr>
                   <w:r>
-                    <w:t xml:space="preserve">0.93</w:t>
+                    <w:t xml:space="preserve">1.00</w:t>
                   </w:r>
                 </w:p>
               </w:tc>
@@ -17415,7 +17233,7 @@
                     <w:jc w:val="center"/>
                   </w:pPr>
                   <w:r>
-                    <w:t xml:space="preserve">0.97</w:t>
+                    <w:t xml:space="preserve">1.00</w:t>
                   </w:r>
                 </w:p>
               </w:tc>
@@ -17482,7 +17300,7 @@
                     <w:jc w:val="center"/>
                   </w:pPr>
                   <w:r>
-                    <w:t xml:space="preserve">0.96</w:t>
+                    <w:t xml:space="preserve">1.00</w:t>
                   </w:r>
                 </w:p>
               </w:tc>
@@ -17549,7 +17367,7 @@
                     <w:jc w:val="center"/>
                   </w:pPr>
                   <w:r>
-                    <w:t xml:space="preserve">0.72</w:t>
+                    <w:t xml:space="preserve">0.65</w:t>
                   </w:r>
                 </w:p>
               </w:tc>
@@ -17616,7 +17434,7 @@
                     <w:jc w:val="center"/>
                   </w:pPr>
                   <w:r>
-                    <w:t xml:space="preserve">0.88</w:t>
+                    <w:t xml:space="preserve">0.97</w:t>
                   </w:r>
                 </w:p>
               </w:tc>
@@ -17670,20 +17488,20 @@
                     <w:jc w:val="center"/>
                   </w:pPr>
                   <w:r>
-                    <w:t xml:space="preserve">1</w:t>
-                  </w:r>
-                </w:p>
-              </w:tc>
-              <w:tc>
-                <w:tcPr/>
-                <w:p>
-                  <w:pPr>
-                    <w:pStyle w:val="Compact"/>
-                    <w:jc w:val="center"/>
-                    <w:jc w:val="center"/>
-                  </w:pPr>
-                  <w:r>
-                    <w:t xml:space="preserve">0.51</w:t>
+                    <w:t xml:space="preserve">2</w:t>
+                  </w:r>
+                </w:p>
+              </w:tc>
+              <w:tc>
+                <w:tcPr/>
+                <w:p>
+                  <w:pPr>
+                    <w:pStyle w:val="Compact"/>
+                    <w:jc w:val="center"/>
+                    <w:jc w:val="center"/>
+                  </w:pPr>
+                  <w:r>
+                    <w:t xml:space="preserve">0.52</w:t>
                   </w:r>
                 </w:p>
               </w:tc>
@@ -17750,7 +17568,7 @@
                     <w:jc w:val="center"/>
                   </w:pPr>
                   <w:r>
-                    <w:t xml:space="preserve">0.92</w:t>
+                    <w:t xml:space="preserve">1.00</w:t>
                   </w:r>
                 </w:p>
               </w:tc>
@@ -17817,7 +17635,7 @@
                     <w:jc w:val="center"/>
                   </w:pPr>
                   <w:r>
-                    <w:t xml:space="preserve">0.97</w:t>
+                    <w:t xml:space="preserve">1.00</w:t>
                   </w:r>
                 </w:p>
               </w:tc>
@@ -17884,7 +17702,7 @@
                     <w:jc w:val="center"/>
                   </w:pPr>
                   <w:r>
-                    <w:t xml:space="preserve">0.98</w:t>
+                    <w:t xml:space="preserve">1.00</w:t>
                   </w:r>
                 </w:p>
               </w:tc>
@@ -17951,7 +17769,7 @@
                     <w:jc w:val="center"/>
                   </w:pPr>
                   <w:r>
-                    <w:t xml:space="preserve">0.86</w:t>
+                    <w:t xml:space="preserve">0.95</w:t>
                   </w:r>
                 </w:p>
               </w:tc>
@@ -18018,7 +17836,7 @@
                     <w:jc w:val="center"/>
                   </w:pPr>
                   <w:r>
-                    <w:t xml:space="preserve">0.86</w:t>
+                    <w:t xml:space="preserve">1.00</w:t>
                   </w:r>
                 </w:p>
               </w:tc>
@@ -18085,7 +17903,7 @@
                     <w:jc w:val="center"/>
                   </w:pPr>
                   <w:r>
-                    <w:t xml:space="preserve">0.94</w:t>
+                    <w:t xml:space="preserve">1.00</w:t>
                   </w:r>
                 </w:p>
               </w:tc>
@@ -18152,7 +17970,7 @@
                     <w:jc w:val="center"/>
                   </w:pPr>
                   <w:r>
-                    <w:t xml:space="preserve">0.63</w:t>
+                    <w:t xml:space="preserve">0.58</w:t>
                   </w:r>
                 </w:p>
               </w:tc>
@@ -18219,7 +18037,7 @@
                     <w:jc w:val="center"/>
                   </w:pPr>
                   <w:r>
-                    <w:t xml:space="preserve">0.78</w:t>
+                    <w:t xml:space="preserve">0.83</w:t>
                   </w:r>
                 </w:p>
               </w:tc>
@@ -18286,7 +18104,7 @@
                     <w:jc w:val="center"/>
                   </w:pPr>
                   <w:r>
-                    <w:t xml:space="preserve">0.83</w:t>
+                    <w:t xml:space="preserve">0.81</w:t>
                   </w:r>
                 </w:p>
               </w:tc>
@@ -18353,7 +18171,7 @@
                     <w:jc w:val="center"/>
                   </w:pPr>
                   <w:r>
-                    <w:t xml:space="preserve">0.97</w:t>
+                    <w:t xml:space="preserve">0.98</w:t>
                   </w:r>
                 </w:p>
               </w:tc>
@@ -18420,7 +18238,7 @@
                     <w:jc w:val="center"/>
                   </w:pPr>
                   <w:r>
-                    <w:t xml:space="preserve">0.65</w:t>
+                    <w:t xml:space="preserve">0.82</w:t>
                   </w:r>
                 </w:p>
               </w:tc>
@@ -18487,7 +18305,7 @@
                     <w:jc w:val="center"/>
                   </w:pPr>
                   <w:r>
-                    <w:t xml:space="preserve">0.76</w:t>
+                    <w:t xml:space="preserve">0.84</w:t>
                   </w:r>
                 </w:p>
               </w:tc>
@@ -18554,7 +18372,7 @@
                     <w:jc w:val="center"/>
                   </w:pPr>
                   <w:r>
-                    <w:t xml:space="preserve">0.97</w:t>
+                    <w:t xml:space="preserve">0.98</w:t>
                   </w:r>
                 </w:p>
               </w:tc>
@@ -18621,7 +18439,7 @@
                     <w:jc w:val="center"/>
                   </w:pPr>
                   <w:r>
-                    <w:t xml:space="preserve">0.82</w:t>
+                    <w:t xml:space="preserve">0.81</w:t>
                   </w:r>
                 </w:p>
               </w:tc>
@@ -18688,7 +18506,7 @@
                     <w:jc w:val="center"/>
                   </w:pPr>
                   <w:r>
-                    <w:t xml:space="preserve">0.81</w:t>
+                    <w:t xml:space="preserve">0.94</w:t>
                   </w:r>
                 </w:p>
               </w:tc>
@@ -18835,7 +18653,7 @@
         <w:t xml:space="preserve">Aur-P1</w:t>
       </w:r>
       <w:r>
-        <w:t xml:space="preserve">, mean within-block co-clustering is 0.79 for the restricted-range block and 0.9 for the broader-range block, against 0.26 across the two blocks , a strong signal that both groups are internally coherent and sharply separated. In</w:t>
+        <w:t xml:space="preserve">, mean within-block co-clustering is 0.75 for the restricted-range block and 0.97 for the broader-range block, against 0.2 across the two blocks , a strong signal that both groups are internally coherent and sharply separated. In</w:t>
       </w:r>
       <w:r>
         <w:t xml:space="preserve"> </w:t>
@@ -18848,7 +18666,7 @@
         <w:t xml:space="preserve">Aur-P2</w:t>
       </w:r>
       <w:r>
-        <w:t xml:space="preserve">, the pattern is 0.57 within the restricted block and 0.83 within the broader block, against 0.37 across the blocks.</w:t>
+        <w:t xml:space="preserve">, the pattern is 0.49 within the restricted block and 0.92 within the broader block, against 0.4 across the blocks.</w:t>
       </w:r>
     </w:p>
     <w:p>
@@ -28551,7 +28369,7 @@
                     <w:jc w:val="center"/>
                   </w:pPr>
                   <w:r>
-                    <w:t xml:space="preserve">1.00</w:t>
+                    <w:t xml:space="preserve">0.80</w:t>
                   </w:r>
                 </w:p>
               </w:tc>
@@ -28577,7 +28395,7 @@
                     <w:jc w:val="center"/>
                   </w:pPr>
                   <w:r>
-                    <w:t xml:space="preserve">0.7</w:t>
+                    <w:t xml:space="preserve">0.71</w:t>
                   </w:r>
                 </w:p>
               </w:tc>
@@ -28631,7 +28449,7 @@
                     <w:jc w:val="center"/>
                   </w:pPr>
                   <w:r>
-                    <w:t xml:space="preserve">0.0</w:t>
+                    <w:t xml:space="preserve">0.00</w:t>
                   </w:r>
                 </w:p>
               </w:tc>
@@ -28727,7 +28545,7 @@
         <w:t xml:space="preserve"> </w:t>
       </w:r>
       <w:r>
-        <w:t xml:space="preserve">The ARI between the manual restricted/broad assignment and the bootstrap modal blocks is 1 in Aur-P1 and 0.22 in Aur-P2 (</w:t>
+        <w:t xml:space="preserve">The ARI between the manual restricted/broad assignment and the bootstrap modal blocks is 0.8 in Aur-P1 and 0.22 in Aur-P2 (</w:t>
       </w:r>
       <w:hyperlink w:anchor="tbl-s6-ari">
         <w:r>
@@ -29040,7 +28858,7 @@
         <w:t xml:space="preserve"> </w:t>
       </w:r>
       <w:r>
-        <w:t xml:space="preserve">instead of asserting discrete groups, sign composition is regressed on a continuous ordination axis, testing for a gradient rather than a partition.</w:t>
+        <w:t xml:space="preserve">instead of asserting discrete groups, sign composition is regressed on continuous predictors that are independent of the distance matrix (log object count and site richness). Regressing the Jaccard dissimilarity on its own first PCoA axis is tautological and not used here; a valid gradient test must use a predictor not derived from the same matrix.</w:t>
       </w:r>
     </w:p>
     <w:p>
@@ -29048,7 +28866,25 @@
         <w:pStyle w:val="FirstParagraph"/>
       </w:pPr>
       <w:r>
-        <w:t xml:space="preserve">All three are exploratory companions to, not replacements for, the main-text PerMANOVA, which we present as descriptive rather than confirmatory.</w:t>
+        <w:t xml:space="preserve">All three are exploratory companions to, not replacements for, the main-text PerMANOVA, which we present as descriptive rather than confirmatory, framed as selective inference on data-adaptive groups</w:t>
+      </w:r>
+      <w:r>
+        <w:t xml:space="preserve"> </w:t>
+      </w:r>
+      <w:r>
+        <w:t xml:space="preserve">[12,13]</w:t>
+      </w:r>
+      <w:r>
+        <w:t xml:space="preserve">. P-values from 100 dependent splits are reported as median p, proportion significant, and Brown’s method for dependent p-values</w:t>
+      </w:r>
+      <w:r>
+        <w:t xml:space="preserve"> </w:t>
+      </w:r>
+      <w:r>
+        <w:t xml:space="preserve">[14,15]</w:t>
+      </w:r>
+      <w:r>
+        <w:t xml:space="preserve">, not Fisher’s method which assumes independence. Jaccard results are shown alongside Simpson turnover (which removes the richness-nestedness component) because the richness median split is tautological under Jaccard.</w:t>
       </w:r>
     </w:p>
     <w:tbl>
@@ -29069,14 +28905,15 @@
           <w:tbl>
             <w:tblPr>
               <w:tblStyle w:val="Table"/>
-              <w:tblW w:type="auto" w:w="0"/>
+              <w:tblW w:type="pct" w:w="5000"/>
               <w:tblLook w:firstRow="1" w:lastRow="0" w:firstColumn="0" w:lastColumn="0" w:noHBand="0" w:noVBand="0" w:val="0020"/>
               <w:jc w:val="start"/>
+              <w:tblLayout w:type="fixed"/>
             </w:tblPr>
             <w:tblGrid>
-              <w:gridCol w:w="2640"/>
-              <w:gridCol w:w="2640"/>
-              <w:gridCol w:w="2640"/>
+              <w:gridCol w:w="3285"/>
+              <w:gridCol w:w="1769"/>
+              <w:gridCol w:w="2864"/>
             </w:tblGrid>
             <w:tr>
               <w:trPr>
@@ -29214,7 +29051,7 @@
                     <w:jc w:val="center"/>
                   </w:pPr>
                   <w:r>
-                    <w:t xml:space="preserve">B: LOOCV site classification (P1)</w:t>
+                    <w:t xml:space="preserve">B-i: LOOCV site classification (P1)</w:t>
                   </w:r>
                 </w:p>
               </w:tc>
@@ -29255,7 +29092,7 @@
                     <w:jc w:val="center"/>
                   </w:pPr>
                   <w:r>
-                    <w:t xml:space="preserve">B: LOOCV site classification (P2)</w:t>
+                    <w:t xml:space="preserve">B-i: LOOCV site classification (P2)</w:t>
                   </w:r>
                 </w:p>
               </w:tc>
@@ -29296,33 +29133,33 @@
                     <w:jc w:val="center"/>
                   </w:pPr>
                   <w:r>
-                    <w:t xml:space="preserve">B: Object-half holdout (P1)</w:t>
-                  </w:r>
-                </w:p>
-              </w:tc>
-              <w:tc>
-                <w:tcPr/>
-                <w:p>
-                  <w:pPr>
-                    <w:pStyle w:val="Compact"/>
-                    <w:jc w:val="left"/>
-                    <w:jc w:val="center"/>
-                  </w:pPr>
-                  <w:r>
-                    <w:t xml:space="preserve">50% splits sig</w:t>
-                  </w:r>
-                </w:p>
-              </w:tc>
-              <w:tc>
-                <w:tcPr/>
-                <w:p>
-                  <w:pPr>
-                    <w:pStyle w:val="Compact"/>
-                    <w:jc w:val="center"/>
-                    <w:jc w:val="center"/>
-                  </w:pPr>
-                  <w:r>
-                    <w:t xml:space="preserve">&lt;2e-16</w:t>
+                    <w:t xml:space="preserve">B-ii: Object-half holdout Jaccard (P1)</w:t>
+                  </w:r>
+                </w:p>
+              </w:tc>
+              <w:tc>
+                <w:tcPr/>
+                <w:p>
+                  <w:pPr>
+                    <w:pStyle w:val="Compact"/>
+                    <w:jc w:val="left"/>
+                    <w:jc w:val="center"/>
+                  </w:pPr>
+                  <w:r>
+                    <w:t xml:space="preserve">50% sig, med p=0.049</w:t>
+                  </w:r>
+                </w:p>
+              </w:tc>
+              <w:tc>
+                <w:tcPr/>
+                <w:p>
+                  <w:pPr>
+                    <w:pStyle w:val="Compact"/>
+                    <w:jc w:val="center"/>
+                    <w:jc w:val="center"/>
+                  </w:pPr>
+                  <w:r>
+                    <w:t xml:space="preserve">Brown &lt;2e-16 (Fisher &lt;2e-16)</w:t>
                   </w:r>
                 </w:p>
               </w:tc>
@@ -29337,33 +29174,33 @@
                     <w:jc w:val="center"/>
                   </w:pPr>
                   <w:r>
-                    <w:t xml:space="preserve">B: Object-half holdout (P2)</w:t>
-                  </w:r>
-                </w:p>
-              </w:tc>
-              <w:tc>
-                <w:tcPr/>
-                <w:p>
-                  <w:pPr>
-                    <w:pStyle w:val="Compact"/>
-                    <w:jc w:val="left"/>
-                    <w:jc w:val="center"/>
-                  </w:pPr>
-                  <w:r>
-                    <w:t xml:space="preserve">0% splits sig</w:t>
-                  </w:r>
-                </w:p>
-              </w:tc>
-              <w:tc>
-                <w:tcPr/>
-                <w:p>
-                  <w:pPr>
-                    <w:pStyle w:val="Compact"/>
-                    <w:jc w:val="center"/>
-                    <w:jc w:val="center"/>
-                  </w:pPr>
-                  <w:r>
-                    <w:t xml:space="preserve">6.58e-10</w:t>
+                    <w:t xml:space="preserve">B-ii: Object-half holdout Jaccard (P2)</w:t>
+                  </w:r>
+                </w:p>
+              </w:tc>
+              <w:tc>
+                <w:tcPr/>
+                <w:p>
+                  <w:pPr>
+                    <w:pStyle w:val="Compact"/>
+                    <w:jc w:val="left"/>
+                    <w:jc w:val="center"/>
+                  </w:pPr>
+                  <w:r>
+                    <w:t xml:space="preserve">0% sig, med p=0.119</w:t>
+                  </w:r>
+                </w:p>
+              </w:tc>
+              <w:tc>
+                <w:tcPr/>
+                <w:p>
+                  <w:pPr>
+                    <w:pStyle w:val="Compact"/>
+                    <w:jc w:val="center"/>
+                    <w:jc w:val="center"/>
+                  </w:pPr>
+                  <w:r>
+                    <w:t xml:space="preserve">Brown 2.08e-10 (Fisher 6.58e-10)</w:t>
                   </w:r>
                 </w:p>
               </w:tc>
@@ -29378,33 +29215,33 @@
                     <w:jc w:val="center"/>
                   </w:pPr>
                   <w:r>
-                    <w:t xml:space="preserve">C: Gradient PerMANOVA (P1)</w:t>
-                  </w:r>
-                </w:p>
-              </w:tc>
-              <w:tc>
-                <w:tcPr/>
-                <w:p>
-                  <w:pPr>
-                    <w:pStyle w:val="Compact"/>
-                    <w:jc w:val="left"/>
-                    <w:jc w:val="center"/>
-                  </w:pPr>
-                  <w:r>
-                    <w:t xml:space="preserve">R2 = 0.312</w:t>
-                  </w:r>
-                </w:p>
-              </w:tc>
-              <w:tc>
-                <w:tcPr/>
-                <w:p>
-                  <w:pPr>
-                    <w:pStyle w:val="Compact"/>
-                    <w:jc w:val="center"/>
-                    <w:jc w:val="center"/>
-                  </w:pPr>
-                  <w:r>
-                    <w:t xml:space="preserve">0.001</w:t>
+                    <w:t xml:space="preserve">B-ii: Object-half holdout Simpson (P1)</w:t>
+                  </w:r>
+                </w:p>
+              </w:tc>
+              <w:tc>
+                <w:tcPr/>
+                <w:p>
+                  <w:pPr>
+                    <w:pStyle w:val="Compact"/>
+                    <w:jc w:val="left"/>
+                    <w:jc w:val="center"/>
+                  </w:pPr>
+                  <w:r>
+                    <w:t xml:space="preserve">0% sig, med p=0.97</w:t>
+                  </w:r>
+                </w:p>
+              </w:tc>
+              <w:tc>
+                <w:tcPr/>
+                <w:p>
+                  <w:pPr>
+                    <w:pStyle w:val="Compact"/>
+                    <w:jc w:val="center"/>
+                    <w:jc w:val="center"/>
+                  </w:pPr>
+                  <w:r>
+                    <w:t xml:space="preserve">Brown 1</w:t>
                   </w:r>
                 </w:p>
               </w:tc>
@@ -29419,20 +29256,61 @@
                     <w:jc w:val="center"/>
                   </w:pPr>
                   <w:r>
-                    <w:t xml:space="preserve">C: Gradient PerMANOVA (P2)</w:t>
-                  </w:r>
-                </w:p>
-              </w:tc>
-              <w:tc>
-                <w:tcPr/>
-                <w:p>
-                  <w:pPr>
-                    <w:pStyle w:val="Compact"/>
-                    <w:jc w:val="left"/>
-                    <w:jc w:val="center"/>
-                  </w:pPr>
-                  <w:r>
-                    <w:t xml:space="preserve">R2 = 0.439</w:t>
+                    <w:t xml:space="preserve">B-ii: Object-half holdout Simpson (P2)</w:t>
+                  </w:r>
+                </w:p>
+              </w:tc>
+              <w:tc>
+                <w:tcPr/>
+                <w:p>
+                  <w:pPr>
+                    <w:pStyle w:val="Compact"/>
+                    <w:jc w:val="left"/>
+                    <w:jc w:val="center"/>
+                  </w:pPr>
+                  <w:r>
+                    <w:t xml:space="preserve">0% sig, med p=0.9</w:t>
+                  </w:r>
+                </w:p>
+              </w:tc>
+              <w:tc>
+                <w:tcPr/>
+                <w:p>
+                  <w:pPr>
+                    <w:pStyle w:val="Compact"/>
+                    <w:jc w:val="center"/>
+                    <w:jc w:val="center"/>
+                  </w:pPr>
+                  <w:r>
+                    <w:t xml:space="preserve">Brown 1</w:t>
+                  </w:r>
+                </w:p>
+              </w:tc>
+            </w:tr>
+            <w:tr>
+              <w:tc>
+                <w:tcPr/>
+                <w:p>
+                  <w:pPr>
+                    <w:pStyle w:val="Compact"/>
+                    <w:jc w:val="left"/>
+                    <w:jc w:val="center"/>
+                  </w:pPr>
+                  <w:r>
+                    <w:t xml:space="preserve">C: Gradient log(nobjects) (P1)</w:t>
+                  </w:r>
+                </w:p>
+              </w:tc>
+              <w:tc>
+                <w:tcPr/>
+                <w:p>
+                  <w:pPr>
+                    <w:pStyle w:val="Compact"/>
+                    <w:jc w:val="left"/>
+                    <w:jc w:val="center"/>
+                  </w:pPr>
+                  <w:r>
+                    <w:t xml:space="preserve">R2=0.187</w:t>
                   </w:r>
                 </w:p>
               </w:tc>
@@ -29446,6 +29324,129 @@
                   </w:pPr>
                   <w:r>
                     <w:t xml:space="preserve">0.001</w:t>
+                  </w:r>
+                </w:p>
+              </w:tc>
+            </w:tr>
+            <w:tr>
+              <w:tc>
+                <w:tcPr/>
+                <w:p>
+                  <w:pPr>
+                    <w:pStyle w:val="Compact"/>
+                    <w:jc w:val="left"/>
+                    <w:jc w:val="center"/>
+                  </w:pPr>
+                  <w:r>
+                    <w:t xml:space="preserve">C: Gradient log(nobjects) (P2)</w:t>
+                  </w:r>
+                </w:p>
+              </w:tc>
+              <w:tc>
+                <w:tcPr/>
+                <w:p>
+                  <w:pPr>
+                    <w:pStyle w:val="Compact"/>
+                    <w:jc w:val="left"/>
+                    <w:jc w:val="center"/>
+                  </w:pPr>
+                  <w:r>
+                    <w:t xml:space="preserve">R2=0.128</w:t>
+                  </w:r>
+                </w:p>
+              </w:tc>
+              <w:tc>
+                <w:tcPr/>
+                <w:p>
+                  <w:pPr>
+                    <w:pStyle w:val="Compact"/>
+                    <w:jc w:val="center"/>
+                    <w:jc w:val="center"/>
+                  </w:pPr>
+                  <w:r>
+                    <w:t xml:space="preserve">0.428</w:t>
+                  </w:r>
+                </w:p>
+              </w:tc>
+            </w:tr>
+            <w:tr>
+              <w:tc>
+                <w:tcPr/>
+                <w:p>
+                  <w:pPr>
+                    <w:pStyle w:val="Compact"/>
+                    <w:jc w:val="left"/>
+                    <w:jc w:val="center"/>
+                  </w:pPr>
+                  <w:r>
+                    <w:t xml:space="preserve">C: Gradient richness (P1)</w:t>
+                  </w:r>
+                </w:p>
+              </w:tc>
+              <w:tc>
+                <w:tcPr/>
+                <w:p>
+                  <w:pPr>
+                    <w:pStyle w:val="Compact"/>
+                    <w:jc w:val="left"/>
+                    <w:jc w:val="center"/>
+                  </w:pPr>
+                  <w:r>
+                    <w:t xml:space="preserve">R2=0.207</w:t>
+                  </w:r>
+                </w:p>
+              </w:tc>
+              <w:tc>
+                <w:tcPr/>
+                <w:p>
+                  <w:pPr>
+                    <w:pStyle w:val="Compact"/>
+                    <w:jc w:val="center"/>
+                    <w:jc w:val="center"/>
+                  </w:pPr>
+                  <w:r>
+                    <w:t xml:space="preserve">0.001</w:t>
+                  </w:r>
+                </w:p>
+              </w:tc>
+            </w:tr>
+            <w:tr>
+              <w:tc>
+                <w:tcPr/>
+                <w:p>
+                  <w:pPr>
+                    <w:pStyle w:val="Compact"/>
+                    <w:jc w:val="left"/>
+                    <w:jc w:val="center"/>
+                  </w:pPr>
+                  <w:r>
+                    <w:t xml:space="preserve">C: Gradient richness (P2)</w:t>
+                  </w:r>
+                </w:p>
+              </w:tc>
+              <w:tc>
+                <w:tcPr/>
+                <w:p>
+                  <w:pPr>
+                    <w:pStyle w:val="Compact"/>
+                    <w:jc w:val="left"/>
+                    <w:jc w:val="center"/>
+                  </w:pPr>
+                  <w:r>
+                    <w:t xml:space="preserve">R2=0.272</w:t>
+                  </w:r>
+                </w:p>
+              </w:tc>
+              <w:tc>
+                <w:tcPr/>
+                <w:p>
+                  <w:pPr>
+                    <w:pStyle w:val="Compact"/>
+                    <w:jc w:val="center"/>
+                    <w:jc w:val="center"/>
+                  </w:pPr>
+                  <w:r>
+                    <w:t xml:space="preserve">0.038</w:t>
                   </w:r>
                 </w:p>
               </w:tc>
@@ -29461,7 +29462,7 @@
               <w:pStyle w:val="ImageCaption"/>
             </w:pPr>
             <w:r>
-              <w:t xml:space="preserve">Table 25: Circularity-breaking validation of the restricted/broad group difference. Method A re-derives the optimal two-group split from randomised data in every permutation (observed optimal pseudo-F vs. its null). Method B validates the grouping on withheld data: site-level leave-one-out k-NN classification accuracy (with permutation p-value) and object-level holdout where groups are defined from one random half of each site’s objects and tested on the other half (Fisher-combined p across 100 random splits). Method C is a group-free continuous gradient PerMANOVA on the first PCoA axis. A significant result indicates the group structure is recoverable from data not used to define it.</w:t>
+              <w:t xml:space="preserve">Table 25: Circularity-breaking validation of the restricted/broad group difference. Method A re-derives the optimal two-group split from randomised data (Curveball null). Method B validates on withheld data: (B-i) site-level leave-one-out k-NN classification (label smoothness check, not independent validation; permutation p) and (B-ii) object-level holdout where groups are defined from one random half of each site’s objects and tested on the other half. B-ii reports median p, proportion significant, and Brown’s method for dependent p-values with Fisher p for reference; Jaccard and Simpson turnover versions are shown because the richness median split is tautological under Jaccard. Method C is group-free gradient PerMANOVA on predictors independent of the distance matrix (log object count, richness); PCoA-axis result is not used as validation. A significant B-ii Brown p indicates recoverability from independent objects.</w:t>
             </w:r>
           </w:p>
           <w:bookmarkEnd w:id="216"/>
@@ -29628,13 +29629,13 @@
           <w:iCs/>
           <w:i/>
         </w:rPr>
-        <w:t xml:space="preserve">Site level (B-i):</w:t>
+        <w:t xml:space="preserve">Site level (B-i) — label smoothness, not independent validation:</w:t>
       </w:r>
       <w:r>
         <w:t xml:space="preserve"> </w:t>
       </w:r>
       <w:r>
-        <w:t xml:space="preserve">Can a held-out site’s restricted/broad label be predicted from a classifier trained only on the other sites?</w:t>
+        <w:t xml:space="preserve">Can a held-out site’s label be predicted from other sites using the same Jaccard structure that produced the labels? This is expected to succeed when labels vary smoothly with composition; it does not demonstrate that a discrete partition exists independently of the distance matrix used to create it.</w:t>
       </w:r>
       <w:r>
         <w:t xml:space="preserve"> </w:t>
@@ -29656,7 +29657,29 @@
         <w:t xml:space="preserve"> </w:t>
       </w:r>
       <w:r>
-        <w:t xml:space="preserve">Yes. Leave-one-site-out classification recovers the manual label for 100% of Aur-P1 sites (95% CI 0.83–1, permutation p = 0.001) and 89% of Aur-P2 sites (permutation p = 0.028). A site’s group is therefore predictable from a classifier trained on the</w:t>
+        <w:t xml:space="preserve">Leave-one-site-out k=1 NN recovers the manual label for 100% of Aur-P1 sites (95% CI 0.83–1, permutation p = 0.001) and 89% of Aur-P2 sites (permutation p = 0.028). This shows the seriation-derived labels are smooth on the Jaccard graph. Because the graph and the labels were derived from the same matrix, we do not treat this as independent confirmation of a discrete partition; the appropriate independent test is B-ii, which uses disjoint objects.</w:t>
+      </w:r>
+      <w:r>
+        <w:t xml:space="preserve"> </w:t>
+      </w:r>
+      <w:r>
+        <w:t xml:space="preserve">-</w:t>
+      </w:r>
+      <w:r>
+        <w:t xml:space="preserve"> </w:t>
+      </w:r>
+      <w:r>
+        <w:rPr>
+          <w:iCs/>
+          <w:i/>
+        </w:rPr>
+        <w:t xml:space="preserve">Object level (B-ii) — independent validation on disjoint objects:</w:t>
+      </w:r>
+      <w:r>
+        <w:t xml:space="preserve"> </w:t>
+      </w:r>
+      <w:r>
+        <w:t xml:space="preserve">When the two-group rule is learned from one random half of each site’s objects and tested, by PerMANOVA, on the</w:t>
       </w:r>
       <w:r>
         <w:t xml:space="preserve"> </w:t>
@@ -29672,7 +29695,7 @@
         <w:t xml:space="preserve"> </w:t>
       </w:r>
       <w:r>
-        <w:t xml:space="preserve">sites, so the assignment is not an artefact of fitting all sites simultaneously.</w:t>
+        <w:t xml:space="preserve">half, is the held-out contrast still significant? We report median p, proportion of splits with p &lt; 0.05, and Brown’s method for dependent p-values (Fisher p is shown only for reference). The richness median split is tautological under Jaccard, which separates rich from poor by construction, so Simpson turnover is shown alongside Jaccard.</w:t>
       </w:r>
       <w:r>
         <w:t xml:space="preserve"> </w:t>
@@ -29688,13 +29711,19 @@
           <w:iCs/>
           <w:i/>
         </w:rPr>
-        <w:t xml:space="preserve">Object level (B-ii):</w:t>
+        <w:t xml:space="preserve">Answer (Jaccard):</w:t>
       </w:r>
       <w:r>
         <w:t xml:space="preserve"> </w:t>
       </w:r>
       <w:r>
-        <w:t xml:space="preserve">When the two-group rule is learned from one random half of each site’s objects and tested, by PerMANOVA, on the</w:t>
+        <w:t xml:space="preserve">Aur-P1 median p = 0.049 with 50% of 100 splits significant; Brown p = &lt;2e-16 (Fisher p = &lt;2e-16). Aur-P2 median p = 0.119 with 0% significant; Brown p = 2.08e-10 (Fisher p = 6.58e-10). Both use 16 (Aur-P1) and 5 (Aur-P2) of the total sites with at least two objects; Aur-P2 individual splits have low power.</w:t>
+      </w:r>
+      <w:r>
+        <w:t xml:space="preserve"> </w:t>
+      </w:r>
+      <w:r>
+        <w:t xml:space="preserve">-</w:t>
       </w:r>
       <w:r>
         <w:t xml:space="preserve"> </w:t>
@@ -29704,13 +29733,37 @@
           <w:iCs/>
           <w:i/>
         </w:rPr>
-        <w:t xml:space="preserve">other</w:t>
+        <w:t xml:space="preserve">Answer (Simpson turnover, nestedness-robust):</w:t>
       </w:r>
       <w:r>
         <w:t xml:space="preserve"> </w:t>
       </w:r>
       <w:r>
-        <w:t xml:space="preserve">half, is the held-out contrast still significant?</w:t>
+        <w:t xml:space="preserve">Aur-P1 median p = 0.97 with 0% significant; Brown p = 1. Aur-P2 median p = 0.9 with 0% significant; Brown p = 1. The Simpson version asks whether compositional turnover, beyond richness nesting, survives the holdout; p-values are higher than Jaccard, as expected.</w:t>
+      </w:r>
+      <w:r>
+        <w:t xml:space="preserve"> </w:t>
+      </w:r>
+      <w:r>
+        <w:t xml:space="preserve">This shows whether the grouping, as defined by a richness rule, generalises to independent objects. The original PerMANOVA, using every object to both define and test the groups, could not establish this.</w:t>
+      </w:r>
+    </w:p>
+    <w:p>
+      <w:pPr>
+        <w:pStyle w:val="BodyText"/>
+      </w:pPr>
+      <w:r>
+        <w:rPr>
+          <w:bCs/>
+          <w:b/>
+        </w:rPr>
+        <w:t xml:space="preserve">Question 3 (strategy C):</w:t>
+      </w:r>
+      <w:r>
+        <w:t xml:space="preserve"> </w:t>
+      </w:r>
+      <w:r>
+        <w:t xml:space="preserve">If we abandon the discrete partition and ask whether sign composition varies continuously with predictors that are independent of the distance matrix, is that gradient significant? Regressing Jaccard dissimilarity on its own first PCoA axis is significant by construction and is not used as validation.</w:t>
       </w:r>
       <w:r>
         <w:t xml:space="preserve"> </w:t>
@@ -29732,20 +29785,7 @@
         <w:t xml:space="preserve"> </w:t>
       </w:r>
       <w:r>
-        <w:t xml:space="preserve">Yes for Aur-P1: the held-out PerMANOVA is significant in the large majority of random splits (50% of 100; Fisher-combined p = &lt;2e-16), using 16 of 20 sites that have enough objects for splitting. For Aur-P2 the combined evidence is likewise significant (Fisher-combined p = 6.6e-10), although only 5 of 9 Aur-P2 sites have two or more objects, so each individual split has low power (few splits clear p &lt; 0.05 on their own) and the conclusion for Aur-P2 rests on the combined test rather than any single split. This shows the grouping is stable across</w:t>
-      </w:r>
-      <w:r>
-        <w:t xml:space="preserve"> </w:t>
-      </w:r>
-      <w:r>
-        <w:rPr>
-          <w:iCs/>
-          <w:i/>
-        </w:rPr>
-        <w:t xml:space="preserve">disjoint sets of objects</w:t>
-      </w:r>
-      <w:r>
-        <w:t xml:space="preserve">, which the original PerMANOVA, using every object to both define and test the groups, could not establish.</w:t>
+        <w:t xml:space="preserve">For log object count: Aur-P1 R² = 0.187, p = 0.001; Aur-P2 R² = 0.128, p = 0.428. For richness: Aur-P1 R² = 0.207, p = 0.001; Aur-P2 R² = 0.272, p = 0.038. These tests use predictors (log(nobjects), richness) that are not derived from the Jaccard matrix, so a significant result indicates a compositional gradient linked to sampling effort or richness, not a tautology. The PCoA-axis version is shown only to illustrate its tautological nature.</w:t>
       </w:r>
     </w:p>
     <w:p>
@@ -29757,53 +29797,13 @@
           <w:bCs/>
           <w:b/>
         </w:rPr>
-        <w:t xml:space="preserve">Question 3 (strategy C):</w:t>
+        <w:t xml:space="preserve">Summary.</w:t>
       </w:r>
       <w:r>
         <w:t xml:space="preserve"> </w:t>
       </w:r>
       <w:r>
-        <w:t xml:space="preserve">If we abandon the discrete two-group partition entirely and instead ask whether sign composition varies continuously along the main compositional axis, is that gradient significant?</w:t>
-      </w:r>
-      <w:r>
-        <w:t xml:space="preserve"> </w:t>
-      </w:r>
-      <w:r>
-        <w:t xml:space="preserve">-</w:t>
-      </w:r>
-      <w:r>
-        <w:t xml:space="preserve"> </w:t>
-      </w:r>
-      <w:r>
-        <w:rPr>
-          <w:iCs/>
-          <w:i/>
-        </w:rPr>
-        <w:t xml:space="preserve">Answer:</w:t>
-      </w:r>
-      <w:r>
-        <w:t xml:space="preserve"> </w:t>
-      </w:r>
-      <w:r>
-        <w:t xml:space="preserve">Yes. A group-free gradient PerMANOVA regressing sign composition on the continuous first ordination axis is significant in both phases (Aur-P1: R² = 0.312, p = 0.001; Aur-P2: R² = 0.439, p = 0.001). Even without asserting discrete groups, a compositional gradient explains a significant fraction of the variation.</w:t>
-      </w:r>
-    </w:p>
-    <w:p>
-      <w:pPr>
-        <w:pStyle w:val="BodyText"/>
-      </w:pPr>
-      <w:r>
-        <w:rPr>
-          <w:bCs/>
-          <w:b/>
-        </w:rPr>
-        <w:t xml:space="preserve">Summary.</w:t>
-      </w:r>
-      <w:r>
-        <w:t xml:space="preserve"> </w:t>
-      </w:r>
-      <w:r>
-        <w:t xml:space="preserve">Strategies B and C provide the strongest evidence that the restricted/broad contrast is not a circularity artefact: the grouping is recovered from withheld data (strategy B) and a continuous gradient is significant without any group definition (strategy C). Strategy A, the most conservative test, is consistent with a gradual rather than sharp partition and does not contradict the recoverability established by B and C. We therefore present the main-text PerMANOVA as descriptive and exploratory, and we rely on the cross-validation results (strategy B) as the appropriate independent confirmation that the grouping is not a circularity artefact.</w:t>
+        <w:t xml:space="preserve">Strategy B-ii (object-half holdout) provides the appropriate independent validation because it tests the grouping on disjoint objects and reports dependence-aware statistics (median p, proportion significant, Brown p) with Jaccard and Simpson turnover. Strategy B-i (LOOCV) shows the labels are smooth on the Jaccard graph but, because graph and labels share the same distance matrix, we do not treat it as independent confirmation of a discrete partition. Strategy C is valid only when the predictor is independent of the distance matrix; the PCoA-axis version is significant by construction. Strategy A, the most stringent richness-preserving null, is not significant and indicates the contrast is a gradient partly explained by marginal richness. Together these support presenting the main-text PerMANOVA as descriptive and the restricted/broad contrast as a recoverable gradient, strong for well-sampled sites and provisional for small ones.</w:t>
       </w:r>
       <w:r>
         <w:t xml:space="preserve"> </w:t>
@@ -29828,7 +29828,7 @@
         <w:pStyle w:val="FirstParagraph"/>
       </w:pPr>
       <w:r>
-        <w:t xml:space="preserve">[10]</w:t>
+        <w:t xml:space="preserve">[16]</w:t>
       </w:r>
       <w:r>
         <w:t xml:space="preserve"> </w:t>
@@ -33485,7 +33485,7 @@
         <w:t xml:space="preserve"> </w:t>
       </w:r>
       <w:r>
-        <w:t xml:space="preserve">[10]</w:t>
+        <w:t xml:space="preserve">[16]</w:t>
       </w:r>
       <w:r>
         <w:t xml:space="preserve"> </w:t>
@@ -33562,7 +33562,7 @@
         <w:t xml:space="preserve"> </w:t>
       </w:r>
       <w:r>
-        <w:t xml:space="preserve">[11,12]</w:t>
+        <w:t xml:space="preserve">[17,18]</w:t>
       </w:r>
       <w:r>
         <w:t xml:space="preserve">. The site is classified as Aurignacian I (Early) in the Périgord sequence.</w:t>
@@ -33590,7 +33590,7 @@
         <w:t xml:space="preserve"> </w:t>
       </w:r>
       <w:r>
-        <w:t xml:space="preserve">[13]</w:t>
+        <w:t xml:space="preserve">[19]</w:t>
       </w:r>
       <w:r>
         <w:t xml:space="preserve"> </w:t>
@@ -33602,7 +33602,7 @@
         <w:t xml:space="preserve"> </w:t>
       </w:r>
       <w:r>
-        <w:t xml:space="preserve">[13,14]</w:t>
+        <w:t xml:space="preserve">[19,20]</w:t>
       </w:r>
       <w:r>
         <w:t xml:space="preserve">. Layer 7b has mixed Early/Recent Aurignacian components.</w:t>
@@ -33642,7 +33642,7 @@
         <w:t xml:space="preserve"> </w:t>
       </w:r>
       <w:r>
-        <w:t xml:space="preserve">[15]</w:t>
+        <w:t xml:space="preserve">[21]</w:t>
       </w:r>
       <w:r>
         <w:t xml:space="preserve">. Direct dates of ~31 ka ¹⁴C BP (~35–36 cal BP) are too young for Proto-Aurignacian</w:t>
@@ -33651,7 +33651,7 @@
         <w:t xml:space="preserve"> </w:t>
       </w:r>
       <w:r>
-        <w:t xml:space="preserve">[16]</w:t>
+        <w:t xml:space="preserve">[22]</w:t>
       </w:r>
       <w:r>
         <w:t xml:space="preserve">.</w:t>
@@ -33679,7 +33679,7 @@
         <w:t xml:space="preserve"> </w:t>
       </w:r>
       <w:r>
-        <w:t xml:space="preserve">[17]</w:t>
+        <w:t xml:space="preserve">[23]</w:t>
       </w:r>
       <w:r>
         <w:t xml:space="preserve">.</w:t>
@@ -34529,7 +34529,7 @@
         <w:t xml:space="preserve"> </w:t>
       </w:r>
       <w:r>
-        <w:t xml:space="preserve">[16]</w:t>
+        <w:t xml:space="preserve">[22]</w:t>
       </w:r>
       <w:r>
         <w:t xml:space="preserve">. Hohle Fels and Vogelherd are split across the phases by object date: 20 of 49 Hohle Fels objects and 160 of 173 Vogelherd objects remain in Aur-P1, and 29 and 13 objects , those calibrated to ~32 ka BP or younger , move to Aur-P2. The date-based assignment therefore fragments long-occupied sites whose assemblages span the phase boundary, which is precisely the failure mode the technology-based attribution is designed to avoid. Under this assignment Aur-P1 grows to 20 sites and 80 edges (mean degree 8), while Aur-P2 , now missing Mladeč but containing 42 young-dated objects from Hohle Fels and Vogelherd , has 10 sites and 18 edges (mean degree 3.6).</w:t>
@@ -34895,7 +34895,7 @@
     </w:p>
     <w:bookmarkEnd w:id="243"/>
     <w:bookmarkEnd w:id="244"/>
-    <w:bookmarkStart w:id="330" w:name="sec-s9"/>
+    <w:bookmarkStart w:id="342" w:name="sec-s9"/>
     <w:p>
       <w:pPr>
         <w:pStyle w:val="Heading1"/>
@@ -39686,7 +39686,7 @@
         <w:t xml:space="preserve"> </w:t>
       </w:r>
       <w:r>
-        <w:t xml:space="preserve">[18,19]</w:t>
+        <w:t xml:space="preserve">[24,25]</w:t>
       </w:r>
       <w:r>
         <w:t xml:space="preserve">. For each site we estimate its sign-type richness at a target coverage of 0.9 (a standard</w:t>
@@ -39737,7 +39737,7 @@
         <w:t xml:space="preserve"> </w:t>
       </w:r>
       <w:r>
-        <w:t xml:space="preserve">[20]</w:t>
+        <w:t xml:space="preserve">[26]</w:t>
       </w:r>
       <w:r>
         <w:t xml:space="preserve">. Sites with fewer than three objects, failed fits, or targets reachable only by extrapolating beyond twice the observed sample cannot be placed on a common coverage footing; for these we report Chao and Jost’s analytic incidence-coverage estimator with object-resampling bootstrap intervals and a Chao2 asymptotic-richness estimate as a fallback quantity, with the reason recorded per site. We then compare restricted and broad sites at that equal coverage.</w:t>
@@ -45208,7 +45208,7 @@
         <w:t xml:space="preserve"> </w:t>
       </w:r>
       <w:r>
-        <w:t xml:space="preserve">[19]</w:t>
+        <w:t xml:space="preserve">[25]</w:t>
       </w:r>
       <w:r>
         <w:t xml:space="preserve">, so under an offset a site with 1 object and 1 sign type has a</w:t>
@@ -45235,7 +45235,7 @@
         <w:t xml:space="preserve"> </w:t>
       </w:r>
       <w:r>
-        <w:t xml:space="preserve">[21]</w:t>
+        <w:t xml:space="preserve">[27]</w:t>
       </w:r>
       <w:r>
         <w:t xml:space="preserve"> </w:t>
@@ -46005,7 +46005,7 @@
         <w:t xml:space="preserve"> </w:t>
       </w:r>
       <w:r>
-        <w:t xml:space="preserve">[18,20]</w:t>
+        <w:t xml:space="preserve">[24,26]</w:t>
       </w:r>
       <w:r>
         <w:t xml:space="preserve">. Each mobile object is a sampling unit and each geometric sign type is a species. For each phase the incidence frequency of a sign type is the number of objects that carry it.</w:t>
@@ -48090,7 +48090,7 @@
     </w:p>
     <w:bookmarkEnd w:id="285"/>
     <w:bookmarkEnd w:id="286"/>
-    <w:bookmarkStart w:id="329" w:name="references-cited"/>
+    <w:bookmarkStart w:id="341" w:name="references-cited"/>
     <w:p>
       <w:pPr>
         <w:pStyle w:val="Heading2"/>
@@ -48099,7 +48099,7 @@
         <w:t xml:space="preserve">References cited</w:t>
       </w:r>
     </w:p>
-    <w:bookmarkStart w:id="328" w:name="refs"/>
+    <w:bookmarkStart w:id="340" w:name="refs"/>
     <w:bookmarkStart w:id="288" w:name="X68cdd7ba62fc5dd3e1e9b497937717305f7b9a0"/>
     <w:p>
       <w:pPr>
@@ -48283,7 +48283,7 @@
       </w:r>
     </w:p>
     <w:bookmarkEnd w:id="294"/>
-    <w:bookmarkStart w:id="296" w:name="ref-Lichstein_2007"/>
+    <w:bookmarkStart w:id="296" w:name="ref-Roberts_2021"/>
     <w:p>
       <w:pPr>
         <w:pStyle w:val="Bibliography"/>
@@ -48298,12 +48298,78 @@
         <w:t xml:space="preserve">	</w:t>
       </w:r>
       <w:r>
+        <w:t xml:space="preserve">Roberts JM, Yin Y, Dorshorst E, Peeples MA, Mills BJ. Assessing the performance of the bootstrap in simulated assemblage networks. Social Networks 2021;65:98–109.</w:t>
+      </w:r>
+      <w:r>
+        <w:t xml:space="preserve"> </w:t>
+      </w:r>
+      <w:hyperlink r:id="rId295">
+        <w:r>
+          <w:rPr>
+            <w:rStyle w:val="Hyperlink"/>
+          </w:rPr>
+          <w:t xml:space="preserve">https://doi.org/10.1016/j.socnet.2020.11.005</w:t>
+        </w:r>
+      </w:hyperlink>
+      <w:r>
+        <w:t xml:space="preserve">.</w:t>
+      </w:r>
+    </w:p>
+    <w:bookmarkEnd w:id="296"/>
+    <w:bookmarkStart w:id="298" w:name="ref-Clarke_Rothery_Raybould_2002"/>
+    <w:p>
+      <w:pPr>
+        <w:pStyle w:val="Bibliography"/>
+      </w:pPr>
+      <w:r>
+        <w:t xml:space="preserve">[6]</w:t>
+      </w:r>
+      <w:r>
+        <w:t xml:space="preserve"> </w:t>
+      </w:r>
+      <w:r>
+        <w:t xml:space="preserve">	</w:t>
+      </w:r>
+      <w:r>
+        <w:t xml:space="preserve">Clarke RT, Rothery P, Raybould AF. Confidence limits for regression relationships between distance matrices: Estimating gene flow with distance. Journal of Agricultural, Biological and Environmental Statistics 2002;7:239–56.</w:t>
+      </w:r>
+      <w:r>
+        <w:t xml:space="preserve"> </w:t>
+      </w:r>
+      <w:hyperlink r:id="rId297">
+        <w:r>
+          <w:rPr>
+            <w:rStyle w:val="Hyperlink"/>
+          </w:rPr>
+          <w:t xml:space="preserve">https://doi.org/10.1198/108571102320</w:t>
+        </w:r>
+      </w:hyperlink>
+      <w:r>
+        <w:t xml:space="preserve">.</w:t>
+      </w:r>
+    </w:p>
+    <w:bookmarkEnd w:id="298"/>
+    <w:bookmarkStart w:id="300" w:name="ref-Lichstein_2007"/>
+    <w:p>
+      <w:pPr>
+        <w:pStyle w:val="Bibliography"/>
+      </w:pPr>
+      <w:r>
+        <w:t xml:space="preserve">[7]</w:t>
+      </w:r>
+      <w:r>
+        <w:t xml:space="preserve"> </w:t>
+      </w:r>
+      <w:r>
+        <w:t xml:space="preserve">	</w:t>
+      </w:r>
+      <w:r>
         <w:t xml:space="preserve">Lichstein JW. Multiple regression on distance matrices: A multivariate spatial analysis tool. Plant Ecology 2007;188:117–31.</w:t>
       </w:r>
       <w:r>
         <w:t xml:space="preserve"> </w:t>
       </w:r>
-      <w:hyperlink r:id="rId295">
+      <w:hyperlink r:id="rId299">
         <w:r>
           <w:rPr>
             <w:rStyle w:val="Hyperlink"/>
@@ -48315,14 +48381,14 @@
         <w:t xml:space="preserve">.</w:t>
       </w:r>
     </w:p>
-    <w:bookmarkEnd w:id="296"/>
-    <w:bookmarkStart w:id="298" w:name="ref-Goslee_Urban_2007"/>
+    <w:bookmarkEnd w:id="300"/>
+    <w:bookmarkStart w:id="302" w:name="ref-Goslee_Urban_2007"/>
     <w:p>
       <w:pPr>
         <w:pStyle w:val="Bibliography"/>
       </w:pPr>
       <w:r>
-        <w:t xml:space="preserve">[6]</w:t>
+        <w:t xml:space="preserve">[8]</w:t>
       </w:r>
       <w:r>
         <w:t xml:space="preserve"> </w:t>
@@ -48348,7 +48414,7 @@
       <w:r>
         <w:t xml:space="preserve"> </w:t>
       </w:r>
-      <w:hyperlink r:id="rId297">
+      <w:hyperlink r:id="rId301">
         <w:r>
           <w:rPr>
             <w:rStyle w:val="Hyperlink"/>
@@ -48360,14 +48426,14 @@
         <w:t xml:space="preserve">.</w:t>
       </w:r>
     </w:p>
-    <w:bookmarkEnd w:id="298"/>
-    <w:bookmarkStart w:id="300" w:name="ref-Monti_2003"/>
+    <w:bookmarkEnd w:id="302"/>
+    <w:bookmarkStart w:id="304" w:name="ref-Monti_2003"/>
     <w:p>
       <w:pPr>
         <w:pStyle w:val="Bibliography"/>
       </w:pPr>
       <w:r>
-        <w:t xml:space="preserve">[7]</w:t>
+        <w:t xml:space="preserve">[9]</w:t>
       </w:r>
       <w:r>
         <w:t xml:space="preserve"> </w:t>
@@ -48381,7 +48447,7 @@
       <w:r>
         <w:t xml:space="preserve"> </w:t>
       </w:r>
-      <w:hyperlink r:id="rId299">
+      <w:hyperlink r:id="rId303">
         <w:r>
           <w:rPr>
             <w:rStyle w:val="Hyperlink"/>
@@ -48393,14 +48459,14 @@
         <w:t xml:space="preserve">.</w:t>
       </w:r>
     </w:p>
-    <w:bookmarkEnd w:id="300"/>
-    <w:bookmarkStart w:id="302" w:name="ref-Leger_2016"/>
+    <w:bookmarkEnd w:id="304"/>
+    <w:bookmarkStart w:id="306" w:name="ref-Leger_2016"/>
     <w:p>
       <w:pPr>
         <w:pStyle w:val="Bibliography"/>
       </w:pPr>
       <w:r>
-        <w:t xml:space="preserve">[8]</w:t>
+        <w:t xml:space="preserve">[10]</w:t>
       </w:r>
       <w:r>
         <w:t xml:space="preserve"> </w:t>
@@ -48423,7 +48489,7 @@
       <w:r>
         <w:t xml:space="preserve"> </w:t>
       </w:r>
-      <w:hyperlink r:id="rId301">
+      <w:hyperlink r:id="rId305">
         <w:r>
           <w:rPr>
             <w:rStyle w:val="Hyperlink"/>
@@ -48435,14 +48501,14 @@
         <w:t xml:space="preserve">.</w:t>
       </w:r>
     </w:p>
-    <w:bookmarkEnd w:id="302"/>
-    <w:bookmarkStart w:id="304" w:name="ref-Hubert_Arabie_1985"/>
+    <w:bookmarkEnd w:id="306"/>
+    <w:bookmarkStart w:id="308" w:name="ref-Hubert_Arabie_1985"/>
     <w:p>
       <w:pPr>
         <w:pStyle w:val="Bibliography"/>
       </w:pPr>
       <w:r>
-        <w:t xml:space="preserve">[9]</w:t>
+        <w:t xml:space="preserve">[11]</w:t>
       </w:r>
       <w:r>
         <w:t xml:space="preserve"> </w:t>
@@ -48456,7 +48522,7 @@
       <w:r>
         <w:t xml:space="preserve"> </w:t>
       </w:r>
-      <w:hyperlink r:id="rId303">
+      <w:hyperlink r:id="rId307">
         <w:r>
           <w:rPr>
             <w:rStyle w:val="Hyperlink"/>
@@ -48468,14 +48534,14 @@
         <w:t xml:space="preserve">.</w:t>
       </w:r>
     </w:p>
-    <w:bookmarkEnd w:id="304"/>
-    <w:bookmarkStart w:id="306" w:name="ref-Bentz_Dutkiewicz_2026"/>
+    <w:bookmarkEnd w:id="308"/>
+    <w:bookmarkStart w:id="310" w:name="ref-Gao_Bien_Witten_2022"/>
     <w:p>
       <w:pPr>
         <w:pStyle w:val="Bibliography"/>
       </w:pPr>
       <w:r>
-        <w:t xml:space="preserve">[10]</w:t>
+        <w:t xml:space="preserve">[12]</w:t>
       </w:r>
       <w:r>
         <w:t xml:space="preserve"> </w:t>
@@ -48484,12 +48550,198 @@
         <w:t xml:space="preserve">	</w:t>
       </w:r>
       <w:r>
+        <w:t xml:space="preserve">Gao LL, Bien J, Witten D. Selective inference for</w:t>
+      </w:r>
+      <w:r>
+        <w:t xml:space="preserve"> </w:t>
+      </w:r>
+      <w:r>
+        <w:t xml:space="preserve">Hierarchical</w:t>
+      </w:r>
+      <w:r>
+        <w:t xml:space="preserve"> </w:t>
+      </w:r>
+      <w:r>
+        <w:t xml:space="preserve">clustering. Journal of the American Statistical Association 2023;118:2590–603.</w:t>
+      </w:r>
+      <w:r>
+        <w:t xml:space="preserve"> </w:t>
+      </w:r>
+      <w:hyperlink r:id="rId309">
+        <w:r>
+          <w:rPr>
+            <w:rStyle w:val="Hyperlink"/>
+          </w:rPr>
+          <w:t xml:space="preserve">https://doi.org/10.1080/01621459.2022.2116331</w:t>
+        </w:r>
+      </w:hyperlink>
+      <w:r>
+        <w:t xml:space="preserve">.</w:t>
+      </w:r>
+    </w:p>
+    <w:bookmarkEnd w:id="310"/>
+    <w:bookmarkStart w:id="312" w:name="ref-Neufeld_2024"/>
+    <w:p>
+      <w:pPr>
+        <w:pStyle w:val="Bibliography"/>
+      </w:pPr>
+      <w:r>
+        <w:t xml:space="preserve">[13]</w:t>
+      </w:r>
+      <w:r>
+        <w:t xml:space="preserve"> </w:t>
+      </w:r>
+      <w:r>
+        <w:t xml:space="preserve">	</w:t>
+      </w:r>
+      <w:r>
+        <w:t xml:space="preserve">Neufeld A, Gao LL, Popp J, Battle A, Witten D. Inference after latent variable estimation for single-cell</w:t>
+      </w:r>
+      <w:r>
+        <w:t xml:space="preserve"> </w:t>
+      </w:r>
+      <w:r>
+        <w:t xml:space="preserve">RNA</w:t>
+      </w:r>
+      <w:r>
+        <w:t xml:space="preserve"> </w:t>
+      </w:r>
+      <w:r>
+        <w:t xml:space="preserve">sequencing data. Biostatistics 2024;25:270–87.</w:t>
+      </w:r>
+      <w:r>
+        <w:t xml:space="preserve"> </w:t>
+      </w:r>
+      <w:hyperlink r:id="rId311">
+        <w:r>
+          <w:rPr>
+            <w:rStyle w:val="Hyperlink"/>
+          </w:rPr>
+          <w:t xml:space="preserve">https://doi.org/10.1093/biostatistics/kxac047</w:t>
+        </w:r>
+      </w:hyperlink>
+      <w:r>
+        <w:t xml:space="preserve">.</w:t>
+      </w:r>
+    </w:p>
+    <w:bookmarkEnd w:id="312"/>
+    <w:bookmarkStart w:id="314" w:name="ref-Brown_1975"/>
+    <w:p>
+      <w:pPr>
+        <w:pStyle w:val="Bibliography"/>
+      </w:pPr>
+      <w:r>
+        <w:t xml:space="preserve">[14]</w:t>
+      </w:r>
+      <w:r>
+        <w:t xml:space="preserve"> </w:t>
+      </w:r>
+      <w:r>
+        <w:t xml:space="preserve">	</w:t>
+      </w:r>
+      <w:r>
+        <w:t xml:space="preserve">Brown MB. 400:</w:t>
+      </w:r>
+      <w:r>
+        <w:t xml:space="preserve"> </w:t>
+      </w:r>
+      <w:r>
+        <w:t xml:space="preserve">A</w:t>
+      </w:r>
+      <w:r>
+        <w:t xml:space="preserve"> </w:t>
+      </w:r>
+      <w:r>
+        <w:t xml:space="preserve">method for combining non-independent, one-sided tests of significance. Biometrics 1975;31:987–92.</w:t>
+      </w:r>
+      <w:r>
+        <w:t xml:space="preserve"> </w:t>
+      </w:r>
+      <w:hyperlink r:id="rId313">
+        <w:r>
+          <w:rPr>
+            <w:rStyle w:val="Hyperlink"/>
+          </w:rPr>
+          <w:t xml:space="preserve">https://doi.org/10.2307/2529826</w:t>
+        </w:r>
+      </w:hyperlink>
+      <w:r>
+        <w:t xml:space="preserve">.</w:t>
+      </w:r>
+    </w:p>
+    <w:bookmarkEnd w:id="314"/>
+    <w:bookmarkStart w:id="316" w:name="ref-Poole_2016"/>
+    <w:p>
+      <w:pPr>
+        <w:pStyle w:val="Bibliography"/>
+      </w:pPr>
+      <w:r>
+        <w:t xml:space="preserve">[15]</w:t>
+      </w:r>
+      <w:r>
+        <w:t xml:space="preserve"> </w:t>
+      </w:r>
+      <w:r>
+        <w:t xml:space="preserve">	</w:t>
+      </w:r>
+      <w:r>
+        <w:t xml:space="preserve">Poole W, Gibbs DL, Shmulevich I, Bernard B, Knijnenburg TA. Combining dependent</w:t>
+      </w:r>
+      <w:r>
+        <w:t xml:space="preserve"> </w:t>
+      </w:r>
+      <w:r>
+        <w:t xml:space="preserve">P</w:t>
+      </w:r>
+      <w:r>
+        <w:t xml:space="preserve">-values with an empirical adaptation of</w:t>
+      </w:r>
+      <w:r>
+        <w:t xml:space="preserve"> </w:t>
+      </w:r>
+      <w:r>
+        <w:t xml:space="preserve">Brown</w:t>
+      </w:r>
+      <w:r>
+        <w:t xml:space="preserve">’s method. Bioinformatics 2016;32:i430–6.</w:t>
+      </w:r>
+      <w:r>
+        <w:t xml:space="preserve"> </w:t>
+      </w:r>
+      <w:hyperlink r:id="rId315">
+        <w:r>
+          <w:rPr>
+            <w:rStyle w:val="Hyperlink"/>
+          </w:rPr>
+          <w:t xml:space="preserve">https://doi.org/10.1093/bioinformatics/btw438</w:t>
+        </w:r>
+      </w:hyperlink>
+      <w:r>
+        <w:t xml:space="preserve">.</w:t>
+      </w:r>
+    </w:p>
+    <w:bookmarkEnd w:id="316"/>
+    <w:bookmarkStart w:id="318" w:name="ref-Bentz_Dutkiewicz_2026"/>
+    <w:p>
+      <w:pPr>
+        <w:pStyle w:val="Bibliography"/>
+      </w:pPr>
+      <w:r>
+        <w:t xml:space="preserve">[16]</w:t>
+      </w:r>
+      <w:r>
+        <w:t xml:space="preserve"> </w:t>
+      </w:r>
+      <w:r>
+        <w:t xml:space="preserve">	</w:t>
+      </w:r>
+      <w:r>
         <w:t xml:space="preserve">Bentz C, Dutkiewicz E. Humans 40,000 y ago developed a system of conventional signs. Proceedings of the National Academy of Sciences 2026;123:e2520385123.</w:t>
       </w:r>
       <w:r>
         <w:t xml:space="preserve"> </w:t>
       </w:r>
-      <w:hyperlink r:id="rId305">
+      <w:hyperlink r:id="rId317">
         <w:r>
           <w:rPr>
             <w:rStyle w:val="Hyperlink"/>
@@ -48501,14 +48753,14 @@
         <w:t xml:space="preserve">.</w:t>
       </w:r>
     </w:p>
-    <w:bookmarkEnd w:id="306"/>
-    <w:bookmarkStart w:id="308" w:name="ref-Chiotti_2005"/>
+    <w:bookmarkEnd w:id="318"/>
+    <w:bookmarkStart w:id="320" w:name="ref-Chiotti_2005"/>
     <w:p>
       <w:pPr>
         <w:pStyle w:val="Bibliography"/>
       </w:pPr>
       <w:r>
-        <w:t xml:space="preserve">[11]</w:t>
+        <w:t xml:space="preserve">[17]</w:t>
       </w:r>
       <w:r>
         <w:t xml:space="preserve"> </w:t>
@@ -48549,7 +48801,7 @@
       <w:r>
         <w:t xml:space="preserve"> </w:t>
       </w:r>
-      <w:hyperlink r:id="rId307">
+      <w:hyperlink r:id="rId319">
         <w:r>
           <w:rPr>
             <w:rStyle w:val="Hyperlink"/>
@@ -48561,14 +48813,14 @@
         <w:t xml:space="preserve">.</w:t>
       </w:r>
     </w:p>
-    <w:bookmarkEnd w:id="308"/>
-    <w:bookmarkStart w:id="310" w:name="ref-Higham_Abri_Pataud_2011"/>
+    <w:bookmarkEnd w:id="320"/>
+    <w:bookmarkStart w:id="322" w:name="ref-Higham_Abri_Pataud_2011"/>
     <w:p>
       <w:pPr>
         <w:pStyle w:val="Bibliography"/>
       </w:pPr>
       <w:r>
-        <w:t xml:space="preserve">[12]</w:t>
+        <w:t xml:space="preserve">[18]</w:t>
       </w:r>
       <w:r>
         <w:t xml:space="preserve"> </w:t>
@@ -48621,7 +48873,7 @@
       <w:r>
         <w:t xml:space="preserve"> </w:t>
       </w:r>
-      <w:hyperlink r:id="rId309">
+      <w:hyperlink r:id="rId321">
         <w:r>
           <w:rPr>
             <w:rStyle w:val="Hyperlink"/>
@@ -48633,14 +48885,14 @@
         <w:t xml:space="preserve">.</w:t>
       </w:r>
     </w:p>
-    <w:bookmarkEnd w:id="310"/>
-    <w:bookmarkStart w:id="312" w:name="ref-Talamo_La_Ferrassie_2020"/>
+    <w:bookmarkEnd w:id="322"/>
+    <w:bookmarkStart w:id="324" w:name="ref-Talamo_La_Ferrassie_2020"/>
     <w:p>
       <w:pPr>
         <w:pStyle w:val="Bibliography"/>
       </w:pPr>
       <w:r>
-        <w:t xml:space="preserve">[13]</w:t>
+        <w:t xml:space="preserve">[19]</w:t>
       </w:r>
       <w:r>
         <w:t xml:space="preserve"> </w:t>
@@ -48735,7 +48987,7 @@
       <w:r>
         <w:t xml:space="preserve"> </w:t>
       </w:r>
-      <w:hyperlink r:id="rId311">
+      <w:hyperlink r:id="rId323">
         <w:r>
           <w:rPr>
             <w:rStyle w:val="Hyperlink"/>
@@ -48747,14 +48999,14 @@
         <w:t xml:space="preserve">.</w:t>
       </w:r>
     </w:p>
-    <w:bookmarkEnd w:id="312"/>
-    <w:bookmarkStart w:id="313" w:name="ref-Delporte_1984_Ferrassie"/>
+    <w:bookmarkEnd w:id="324"/>
+    <w:bookmarkStart w:id="325" w:name="ref-Delporte_1984_Ferrassie"/>
     <w:p>
       <w:pPr>
         <w:pStyle w:val="Bibliography"/>
       </w:pPr>
       <w:r>
-        <w:t xml:space="preserve">[14]</w:t>
+        <w:t xml:space="preserve">[20]</w:t>
       </w:r>
       <w:r>
         <w:t xml:space="preserve"> </w:t>
@@ -48787,14 +49039,14 @@
         <w:t xml:space="preserve">histoire; 1984.</w:t>
       </w:r>
     </w:p>
-    <w:bookmarkEnd w:id="313"/>
-    <w:bookmarkStart w:id="315" w:name="ref-Oliva_2006"/>
+    <w:bookmarkEnd w:id="325"/>
+    <w:bookmarkStart w:id="327" w:name="ref-Oliva_2006"/>
     <w:p>
       <w:pPr>
         <w:pStyle w:val="Bibliography"/>
       </w:pPr>
       <w:r>
-        <w:t xml:space="preserve">[15]</w:t>
+        <w:t xml:space="preserve">[21]</w:t>
       </w:r>
       <w:r>
         <w:t xml:space="preserve"> </w:t>
@@ -48856,7 +49108,7 @@
       <w:r>
         <w:t xml:space="preserve"> </w:t>
       </w:r>
-      <w:hyperlink r:id="rId314">
+      <w:hyperlink r:id="rId326">
         <w:r>
           <w:rPr>
             <w:rStyle w:val="Hyperlink"/>
@@ -48868,14 +49120,14 @@
         <w:t xml:space="preserve">.</w:t>
       </w:r>
     </w:p>
-    <w:bookmarkEnd w:id="315"/>
-    <w:bookmarkStart w:id="317" w:name="ref-Wild_et_al_2005"/>
+    <w:bookmarkEnd w:id="327"/>
+    <w:bookmarkStart w:id="329" w:name="ref-Wild_et_al_2005"/>
     <w:p>
       <w:pPr>
         <w:pStyle w:val="Bibliography"/>
       </w:pPr>
       <w:r>
-        <w:t xml:space="preserve">[16]</w:t>
+        <w:t xml:space="preserve">[22]</w:t>
       </w:r>
       <w:r>
         <w:t xml:space="preserve"> </w:t>
@@ -48925,7 +49177,7 @@
       <w:r>
         <w:t xml:space="preserve"> </w:t>
       </w:r>
-      <w:hyperlink r:id="rId316">
+      <w:hyperlink r:id="rId328">
         <w:r>
           <w:rPr>
             <w:rStyle w:val="Hyperlink"/>
@@ -48937,14 +49189,14 @@
         <w:t xml:space="preserve">.</w:t>
       </w:r>
     </w:p>
-    <w:bookmarkEnd w:id="317"/>
-    <w:bookmarkStart w:id="319" w:name="ref-Schurch_Conard_2026_reassess"/>
+    <w:bookmarkEnd w:id="329"/>
+    <w:bookmarkStart w:id="331" w:name="ref-Schurch_Conard_2026_reassess"/>
     <w:p>
       <w:pPr>
         <w:pStyle w:val="Bibliography"/>
       </w:pPr>
       <w:r>
-        <w:t xml:space="preserve">[17]</w:t>
+        <w:t xml:space="preserve">[23]</w:t>
       </w:r>
       <w:r>
         <w:t xml:space="preserve"> </w:t>
@@ -48973,7 +49225,7 @@
       <w:r>
         <w:t xml:space="preserve"> </w:t>
       </w:r>
-      <w:hyperlink r:id="rId318">
+      <w:hyperlink r:id="rId330">
         <w:r>
           <w:rPr>
             <w:rStyle w:val="Hyperlink"/>
@@ -48985,14 +49237,14 @@
         <w:t xml:space="preserve">.</w:t>
       </w:r>
     </w:p>
-    <w:bookmarkEnd w:id="319"/>
-    <w:bookmarkStart w:id="321" w:name="ref-Chao_Jost_2012"/>
+    <w:bookmarkEnd w:id="331"/>
+    <w:bookmarkStart w:id="333" w:name="ref-Chao_Jost_2012"/>
     <w:p>
       <w:pPr>
         <w:pStyle w:val="Bibliography"/>
       </w:pPr>
       <w:r>
-        <w:t xml:space="preserve">[18]</w:t>
+        <w:t xml:space="preserve">[24]</w:t>
       </w:r>
       <w:r>
         <w:t xml:space="preserve"> </w:t>
@@ -49006,7 +49258,7 @@
       <w:r>
         <w:t xml:space="preserve"> </w:t>
       </w:r>
-      <w:hyperlink r:id="rId320">
+      <w:hyperlink r:id="rId332">
         <w:r>
           <w:rPr>
             <w:rStyle w:val="Hyperlink"/>
@@ -49018,14 +49270,14 @@
         <w:t xml:space="preserve">.</w:t>
       </w:r>
     </w:p>
-    <w:bookmarkEnd w:id="321"/>
-    <w:bookmarkStart w:id="323" w:name="ref-Gotelli_Colwell_2001"/>
+    <w:bookmarkEnd w:id="333"/>
+    <w:bookmarkStart w:id="335" w:name="ref-Gotelli_Colwell_2001"/>
     <w:p>
       <w:pPr>
         <w:pStyle w:val="Bibliography"/>
       </w:pPr>
       <w:r>
-        <w:t xml:space="preserve">[19]</w:t>
+        <w:t xml:space="preserve">[25]</w:t>
       </w:r>
       <w:r>
         <w:t xml:space="preserve"> </w:t>
@@ -49039,7 +49291,7 @@
       <w:r>
         <w:t xml:space="preserve"> </w:t>
       </w:r>
-      <w:hyperlink r:id="rId322">
+      <w:hyperlink r:id="rId334">
         <w:r>
           <w:rPr>
             <w:rStyle w:val="Hyperlink"/>
@@ -49051,14 +49303,14 @@
         <w:t xml:space="preserve">.</w:t>
       </w:r>
     </w:p>
-    <w:bookmarkEnd w:id="323"/>
-    <w:bookmarkStart w:id="325" w:name="ref-Hsieh_Ma_Chao_2016"/>
+    <w:bookmarkEnd w:id="335"/>
+    <w:bookmarkStart w:id="337" w:name="ref-Hsieh_Ma_Chao_2016"/>
     <w:p>
       <w:pPr>
         <w:pStyle w:val="Bibliography"/>
       </w:pPr>
       <w:r>
-        <w:t xml:space="preserve">[20]</w:t>
+        <w:t xml:space="preserve">[26]</w:t>
       </w:r>
       <w:r>
         <w:t xml:space="preserve"> </w:t>
@@ -49102,7 +49354,7 @@
       <w:r>
         <w:t xml:space="preserve"> </w:t>
       </w:r>
-      <w:hyperlink r:id="rId324">
+      <w:hyperlink r:id="rId336">
         <w:r>
           <w:rPr>
             <w:rStyle w:val="Hyperlink"/>
@@ -49114,14 +49366,14 @@
         <w:t xml:space="preserve">.</w:t>
       </w:r>
     </w:p>
-    <w:bookmarkEnd w:id="325"/>
-    <w:bookmarkStart w:id="327" w:name="ref-Venables_Ripley_2002"/>
+    <w:bookmarkEnd w:id="337"/>
+    <w:bookmarkStart w:id="339" w:name="ref-Venables_Ripley_2002"/>
     <w:p>
       <w:pPr>
         <w:pStyle w:val="Bibliography"/>
       </w:pPr>
       <w:r>
-        <w:t xml:space="preserve">[21]</w:t>
+        <w:t xml:space="preserve">[27]</w:t>
       </w:r>
       <w:r>
         <w:t xml:space="preserve"> </w:t>
@@ -49135,7 +49387,7 @@
       <w:r>
         <w:t xml:space="preserve"> </w:t>
       </w:r>
-      <w:hyperlink r:id="rId326">
+      <w:hyperlink r:id="rId338">
         <w:r>
           <w:rPr>
             <w:rStyle w:val="Hyperlink"/>
@@ -49147,10 +49399,10 @@
         <w:t xml:space="preserve">.</w:t>
       </w:r>
     </w:p>
-    <w:bookmarkEnd w:id="327"/>
-    <w:bookmarkEnd w:id="328"/>
-    <w:bookmarkEnd w:id="329"/>
-    <w:bookmarkEnd w:id="330"/>
+    <w:bookmarkEnd w:id="339"/>
+    <w:bookmarkEnd w:id="340"/>
+    <w:bookmarkEnd w:id="341"/>
+    <w:bookmarkEnd w:id="342"/>
     <w:sectPr>
       <w:footnotePr>
         <w:numRestart w:val="eachSect"/>

</xml_diff>

<commit_message>
fix some refs, add text on geographic grouping not found
</commit_message>
<xml_diff>
--- a/paper/S1-supplement-sensitivity.docx
+++ b/paper/S1-supplement-sensitivity.docx
@@ -43148,19 +43148,19 @@
               <w:tblLayout w:type="fixed"/>
             </w:tblPr>
             <w:tblGrid>
-              <w:gridCol w:w="288"/>
-              <w:gridCol w:w="1113"/>
-              <w:gridCol w:w="453"/>
-              <w:gridCol w:w="330"/>
-              <w:gridCol w:w="660"/>
-              <w:gridCol w:w="660"/>
-              <w:gridCol w:w="330"/>
-              <w:gridCol w:w="330"/>
-              <w:gridCol w:w="783"/>
-              <w:gridCol w:w="288"/>
-              <w:gridCol w:w="288"/>
-              <w:gridCol w:w="247"/>
-              <w:gridCol w:w="2145"/>
+              <w:gridCol w:w="285"/>
+              <w:gridCol w:w="1102"/>
+              <w:gridCol w:w="449"/>
+              <w:gridCol w:w="326"/>
+              <w:gridCol w:w="653"/>
+              <w:gridCol w:w="653"/>
+              <w:gridCol w:w="326"/>
+              <w:gridCol w:w="326"/>
+              <w:gridCol w:w="857"/>
+              <w:gridCol w:w="285"/>
+              <w:gridCol w:w="285"/>
+              <w:gridCol w:w="244"/>
+              <w:gridCol w:w="2122"/>
             </w:tblGrid>
             <w:tr>
               <w:trPr>
@@ -43279,29 +43279,7 @@
                     <w:jc w:val="center"/>
                   </w:pPr>
                   <w:r>
-                    <w:t xml:space="preserve">Richness</w:t>
-                  </w:r>
-                  <w:r>
-                    <w:t xml:space="preserve"> </w:t>
-                  </w:r>
-                  <w:r>
-                    <w:t xml:space="preserve">[</w:t>
-                  </w:r>
-                  <w:r>
-                    <w:rPr>
-                      <w:bCs/>
-                      <w:b/>
-                    </w:rPr>
-                    <w:t xml:space="preserve">0.9?</w:t>
-                  </w:r>
-                  <w:r>
-                    <w:t xml:space="preserve">]</w:t>
-                  </w:r>
-                  <w:r>
-                    <w:t xml:space="preserve"> </w:t>
-                  </w:r>
-                  <w:r>
-                    <w:t xml:space="preserve">cov.</w:t>
+                    <w:t xml:space="preserve">Richness at 0.9 cov.</w:t>
                   </w:r>
                 </w:p>
               </w:tc>
@@ -51694,7 +51672,7 @@
         <w:t xml:space="preserve">	</w:t>
       </w:r>
       <w:r>
-        <w:t xml:space="preserve">Clarke RT, Rothery P, Raybould AF. Confidence limits for regression relationships between distance matrices: Estimating gene flow with distance. Journal of Agricultural, Biological and Environmental Statistics 2002;7:239–56.</w:t>
+        <w:t xml:space="preserve">Clarke RT, Rothery P, Raybould AF. Confidence limits for regression relationships between distance matrices: Estimating gene flow with distance. Journal of Agricultural, Biological, and Environmental Statistics 2002;7:361–72.</w:t>
       </w:r>
       <w:r>
         <w:t xml:space="preserve"> </w:t>
@@ -51925,7 +51903,7 @@
         <w:t xml:space="preserve"> </w:t>
       </w:r>
       <w:r>
-        <w:t xml:space="preserve">clustering. Journal of the American Statistical Association 2023;118:2590–603.</w:t>
+        <w:t xml:space="preserve">clustering. Journal of the American Statistical Association 2022;119:332–42.</w:t>
       </w:r>
       <w:r>
         <w:t xml:space="preserve"> </w:t>

</xml_diff>

<commit_message>
Fixed duplicate emission of ggplots in S1
</commit_message>
<xml_diff>
--- a/paper/S1-supplement-sensitivity.docx
+++ b/paper/S1-supplement-sensitivity.docx
@@ -15933,7 +15933,7 @@
     <w:bookmarkEnd w:id="102"/>
     <w:bookmarkEnd w:id="103"/>
     <w:bookmarkEnd w:id="104"/>
-    <w:bookmarkStart w:id="117" w:name="sec-s5-13"/>
+    <w:bookmarkStart w:id="113" w:name="sec-s5-13"/>
     <w:p>
       <w:pPr>
         <w:pStyle w:val="Heading1"/>
@@ -15942,7 +15942,7 @@
         <w:t xml:space="preserve">S5.13 Objective Regional Grouping Exploration: Geography-First, Then Ask Do Signs Differ</w:t>
       </w:r>
     </w:p>
-    <w:bookmarkStart w:id="115" w:name="rationale-6"/>
+    <w:bookmarkStart w:id="111" w:name="rationale-6"/>
     <w:p>
       <w:pPr>
         <w:pStyle w:val="Heading3"/>
@@ -18577,87 +18577,7 @@
       <w:tr>
         <w:tc>
           <w:tcPr/>
-          <w:bookmarkStart w:id="110" w:name="fig-s513-region-map-1"/>
-          <w:p>
-            <w:pPr>
-              <w:pStyle w:val="Compact"/>
-              <w:jc w:val="center"/>
-            </w:pPr>
-            <w:r>
-              <w:drawing>
-                <wp:inline>
-                  <wp:extent cx="5943600" cy="4457700"/>
-                  <wp:effectExtent b="0" l="0" r="0" t="0"/>
-                  <wp:docPr descr="" title="" id="108" name="Picture"/>
-                  <a:graphic>
-                    <a:graphicData uri="http://schemas.openxmlformats.org/drawingml/2006/picture">
-                      <pic:pic>
-                        <pic:nvPicPr>
-                          <pic:cNvPr descr="S1-supplement-sensitivity_files/figure-docx/fig-s513-region-map-1.png" id="109" name="Picture"/>
-                          <pic:cNvPicPr>
-                            <a:picLocks noChangeArrowheads="1" noChangeAspect="1"/>
-                          </pic:cNvPicPr>
-                        </pic:nvPicPr>
-                        <pic:blipFill>
-                          <a:blip r:embed="rId107"/>
-                          <a:stretch>
-                            <a:fillRect/>
-                          </a:stretch>
-                        </pic:blipFill>
-                        <pic:spPr bwMode="auto">
-                          <a:xfrm>
-                            <a:off x="0" y="0"/>
-                            <a:ext cx="5943600" cy="4457700"/>
-                          </a:xfrm>
-                          <a:prstGeom prst="rect">
-                            <a:avLst/>
-                          </a:prstGeom>
-                          <a:noFill/>
-                          <a:ln w="9525">
-                            <a:noFill/>
-                            <a:headEnd/>
-                            <a:tailEnd/>
-                          </a:ln>
-                        </pic:spPr>
-                      </pic:pic>
-                    </a:graphicData>
-                  </a:graphic>
-                </wp:inline>
-              </w:drawing>
-            </w:r>
-          </w:p>
-          <w:p>
-            <w:pPr>
-              <w:jc w:val="center"/>
-            </w:pPr>
-            <w:pPr>
-              <w:jc w:val="start"/>
-              <w:spacing w:before="200"/>
-              <w:pStyle w:val="ImageCaption"/>
-            </w:pPr>
-            <w:r>
-              <w:t xml:space="preserve">Figure 5: Objective geographic regions discovered by PAM on geodesic distances (primary, k=2). Sites coloured by region; Jaccard sign data not used. West vs Central (Aur-P1) partitions the Dordogne vs Swabian research blocks.</w:t>
-            </w:r>
-          </w:p>
-          <w:bookmarkEnd w:id="110"/>
-        </w:tc>
-      </w:tr>
-    </w:tbl>
-    <w:tbl>
-      <w:tblPr>
-        <w:tblStyle w:val="Table"/>
-        <w:tblW w:type="pct" w:w="5000"/>
-        <w:tblLook w:firstRow="0" w:lastRow="0" w:firstColumn="0" w:lastColumn="0" w:noHBand="0" w:noVBand="0" w:val="0000"/>
-        <w:jc w:val="start"/>
-        <w:tblLayout w:type="fixed"/>
-      </w:tblPr>
-      <w:tblGrid>
-        <w:gridCol w:w="7920"/>
-      </w:tblGrid>
-      <w:tr>
-        <w:tc>
-          <w:tcPr/>
-          <w:bookmarkStart w:id="114" w:name="fig-s513-region-map-2"/>
+          <w:bookmarkStart w:id="110" w:name="fig-s513-region-map"/>
           <w:p>
             <w:pPr>
               <w:pStyle w:val="Compact"/>
@@ -18668,18 +18588,18 @@
                 <wp:inline>
                   <wp:extent cx="5943600" cy="4457699"/>
                   <wp:effectExtent b="0" l="0" r="0" t="0"/>
-                  <wp:docPr descr="" title="" id="112" name="Picture"/>
+                  <wp:docPr descr="" title="" id="108" name="Picture"/>
                   <a:graphic>
                     <a:graphicData uri="http://schemas.openxmlformats.org/drawingml/2006/picture">
                       <pic:pic>
                         <pic:nvPicPr>
-                          <pic:cNvPr descr="../figures/s513-region-map.png" id="113" name="Picture"/>
+                          <pic:cNvPr descr="../figures/s513-region-map.png" id="109" name="Picture"/>
                           <pic:cNvPicPr>
                             <a:picLocks noChangeArrowheads="1" noChangeAspect="1"/>
                           </pic:cNvPicPr>
                         </pic:nvPicPr>
                         <pic:blipFill>
-                          <a:blip r:embed="rId111"/>
+                          <a:blip r:embed="rId107"/>
                           <a:stretch>
                             <a:fillRect/>
                           </a:stretch>
@@ -18716,15 +18636,15 @@
               <w:pStyle w:val="ImageCaption"/>
             </w:pPr>
             <w:r>
-              <w:t xml:space="preserve">Figure 6: Objective geographic regions discovered by PAM on geodesic distances (primary, k=2). Sites coloured by region; Jaccard sign data not used. West vs Central (Aur-P1) partitions the Dordogne vs Swabian research blocks.</w:t>
+              <w:t xml:space="preserve">Figure 5: Objective geographic regions discovered by PAM on geodesic distances (primary, k=2). Sites coloured by region; Jaccard sign data not used. West vs Central (Aur-P1) partitions the Dordogne vs Swabian research blocks.</w:t>
             </w:r>
           </w:p>
-          <w:bookmarkEnd w:id="114"/>
+          <w:bookmarkEnd w:id="110"/>
         </w:tc>
       </w:tr>
     </w:tbl>
-    <w:bookmarkEnd w:id="115"/>
-    <w:bookmarkStart w:id="116" w:name="interpretation-2"/>
+    <w:bookmarkEnd w:id="111"/>
+    <w:bookmarkStart w:id="112" w:name="interpretation-2"/>
     <w:p>
       <w:pPr>
         <w:pStyle w:val="Heading3"/>
@@ -19285,9 +19205,9 @@
         <w:t xml:space="preserve">terms) uses permutations with caution; per Boemke et al. 2023, the Aur-P1 geography signal coincides with research intensity (German ivory — 225/346 objects — versus French limestone blocs) rather than a past cultural groups.</w:t>
       </w:r>
     </w:p>
-    <w:bookmarkEnd w:id="116"/>
-    <w:bookmarkEnd w:id="117"/>
-    <w:bookmarkStart w:id="228" w:name="sec-s6"/>
+    <w:bookmarkEnd w:id="112"/>
+    <w:bookmarkEnd w:id="113"/>
+    <w:bookmarkStart w:id="224" w:name="sec-s6"/>
     <w:p>
       <w:pPr>
         <w:pStyle w:val="Heading1"/>
@@ -19296,7 +19216,7 @@
         <w:t xml:space="preserve">S6. Robustness of the Two-Group Structure: Bootstrap Consensus and Stochastic Block Models</w:t>
       </w:r>
     </w:p>
-    <w:bookmarkStart w:id="118" w:name="sec-s6-1"/>
+    <w:bookmarkStart w:id="114" w:name="sec-s6-1"/>
     <w:p>
       <w:pPr>
         <w:pStyle w:val="Heading2"/>
@@ -19405,8 +19325,8 @@
         <w:t xml:space="preserve">.</w:t>
       </w:r>
     </w:p>
-    <w:bookmarkEnd w:id="118"/>
-    <w:bookmarkStart w:id="127" w:name="sec-s6-2"/>
+    <w:bookmarkEnd w:id="114"/>
+    <w:bookmarkStart w:id="123" w:name="sec-s6-2"/>
     <w:p>
       <w:pPr>
         <w:pStyle w:val="Heading2"/>
@@ -19415,7 +19335,7 @@
         <w:t xml:space="preserve">S6.2 Bootstrap Consensus Analysis</w:t>
       </w:r>
     </w:p>
-    <w:bookmarkStart w:id="125" w:name="rationale-7"/>
+    <w:bookmarkStart w:id="121" w:name="rationale-7"/>
     <w:p>
       <w:pPr>
         <w:pStyle w:val="Heading3"/>
@@ -19501,7 +19421,7 @@
       <w:tr>
         <w:tc>
           <w:tcPr/>
-          <w:bookmarkStart w:id="119" w:name="tbl-bootstrap-summary"/>
+          <w:bookmarkStart w:id="115" w:name="tbl-bootstrap-summary"/>
           <w:tbl>
             <w:tblPr>
               <w:tblStyle w:val="Table"/>
@@ -19815,7 +19735,7 @@
               <w:t xml:space="preserve">Table 22: Bootstrap consensus co-clustering within and across the main-text restricted/broad blocks, by phase (n = 1000 resamples). Within-restricted and Within-broad are the mean co-clustering probabilities among site pairs belonging to the same main-text block; Across is the mean co-clustering probability for pairs in different blocks. If the two-group structure is genuine, within-block values should substantially exceed the across-block value.</w:t>
             </w:r>
           </w:p>
-          <w:bookmarkEnd w:id="119"/>
+          <w:bookmarkEnd w:id="115"/>
         </w:tc>
       </w:tr>
     </w:tbl>
@@ -19841,7 +19761,7 @@
       <w:tr>
         <w:tc>
           <w:tcPr/>
-          <w:bookmarkStart w:id="120" w:name="tbl-bootstrap-sites"/>
+          <w:bookmarkStart w:id="116" w:name="tbl-bootstrap-sites"/>
           <w:tbl>
             <w:tblPr>
               <w:tblStyle w:val="Table"/>
@@ -21879,7 +21799,7 @@
               <w:t xml:space="preserve">Table 23: Per-site bootstrap consistency: proportion of 1000 resamples in which each site is assigned to its modal (most frequent) block. Consistency near 1 indicates robust assignment; values near 0.5 indicate sites whose group membership flips across resamples.</w:t>
             </w:r>
           </w:p>
-          <w:bookmarkEnd w:id="120"/>
+          <w:bookmarkEnd w:id="116"/>
         </w:tc>
       </w:tr>
     </w:tbl>
@@ -21897,7 +21817,7 @@
       <w:tr>
         <w:tc>
           <w:tcPr/>
-          <w:bookmarkStart w:id="124" w:name="fig-bootstrap-consensus"/>
+          <w:bookmarkStart w:id="120" w:name="fig-bootstrap-consensus"/>
           <w:p>
             <w:pPr>
               <w:pStyle w:val="Compact"/>
@@ -21908,18 +21828,18 @@
                 <wp:inline>
                   <wp:extent cx="5943600" cy="6604000"/>
                   <wp:effectExtent b="0" l="0" r="0" t="0"/>
-                  <wp:docPr descr="" title="" id="122" name="Picture"/>
+                  <wp:docPr descr="" title="" id="118" name="Picture"/>
                   <a:graphic>
                     <a:graphicData uri="http://schemas.openxmlformats.org/drawingml/2006/picture">
                       <pic:pic>
                         <pic:nvPicPr>
-                          <pic:cNvPr descr="../figures/bootstrap-consensus-plot.png" id="123" name="Picture"/>
+                          <pic:cNvPr descr="../figures/bootstrap-consensus-plot.png" id="119" name="Picture"/>
                           <pic:cNvPicPr>
                             <a:picLocks noChangeArrowheads="1" noChangeAspect="1"/>
                           </pic:cNvPicPr>
                         </pic:nvPicPr>
                         <pic:blipFill>
-                          <a:blip r:embed="rId121"/>
+                          <a:blip r:embed="rId117"/>
                           <a:stretch>
                             <a:fillRect/>
                           </a:stretch>
@@ -21956,15 +21876,15 @@
               <w:pStyle w:val="ImageCaption"/>
             </w:pPr>
             <w:r>
-              <w:t xml:space="preserve">Figure 7: Consensus co-clustering matrices from 1000 bootstrap resamples of sites within each phase. Cell colour encodes the probability that two sites fall in the same cluster across resamples (1 = always together, 0 = never). Rows and columns are ordered by hierarchical clustering of the consensus matrix. Strong diagonal blocks indicate sites that reliably co-cluster; pale blocks indicate fuzzy, sampling-dependent membership.</w:t>
+              <w:t xml:space="preserve">Figure 6: Consensus co-clustering matrices from 1000 bootstrap resamples of sites within each phase. Cell colour encodes the probability that two sites fall in the same cluster across resamples (1 = always together, 0 = never). Rows and columns are ordered by hierarchical clustering of the consensus matrix. Strong diagonal blocks indicate sites that reliably co-cluster; pale blocks indicate fuzzy, sampling-dependent membership.</w:t>
             </w:r>
           </w:p>
-          <w:bookmarkEnd w:id="124"/>
+          <w:bookmarkEnd w:id="120"/>
         </w:tc>
       </w:tr>
     </w:tbl>
-    <w:bookmarkEnd w:id="125"/>
-    <w:bookmarkStart w:id="126" w:name="interpretation-3"/>
+    <w:bookmarkEnd w:id="121"/>
+    <w:bookmarkStart w:id="122" w:name="interpretation-3"/>
     <w:p>
       <w:pPr>
         <w:pStyle w:val="Heading3"/>
@@ -22076,7 +21996,7 @@
           <w:rPr>
             <w:rStyle w:val="Hyperlink"/>
           </w:rPr>
-          <w:t xml:space="preserve">Figure 7</w:t>
+          <w:t xml:space="preserve">Figure 6</w:t>
         </w:r>
       </w:hyperlink>
       <w:r>
@@ -22134,9 +22054,9 @@
         <w:t xml:space="preserve">.</w:t>
       </w:r>
     </w:p>
-    <w:bookmarkEnd w:id="126"/>
-    <w:bookmarkEnd w:id="127"/>
-    <w:bookmarkStart w:id="222" w:name="sec-s6-3"/>
+    <w:bookmarkEnd w:id="122"/>
+    <w:bookmarkEnd w:id="123"/>
+    <w:bookmarkStart w:id="218" w:name="sec-s6-3"/>
     <w:p>
       <w:pPr>
         <w:pStyle w:val="Heading2"/>
@@ -22145,7 +22065,7 @@
         <w:t xml:space="preserve">S6.3 Stochastic Block Models</w:t>
       </w:r>
     </w:p>
-    <w:bookmarkStart w:id="220" w:name="rationale-8"/>
+    <w:bookmarkStart w:id="216" w:name="rationale-8"/>
     <w:p>
       <w:pPr>
         <w:pStyle w:val="Heading3"/>
@@ -22261,18 +22181,18 @@
           <wp:inline>
             <wp:extent cx="5943600" cy="4754880"/>
             <wp:effectExtent b="0" l="0" r="0" t="0"/>
-            <wp:docPr descr="" title="" id="129" name="Picture"/>
+            <wp:docPr descr="" title="" id="125" name="Picture"/>
             <a:graphic>
               <a:graphicData uri="http://schemas.openxmlformats.org/drawingml/2006/picture">
                 <pic:pic>
                   <pic:nvPicPr>
-                    <pic:cNvPr descr="S1-supplement-sensitivity_files/figure-docx/s6-sbm-compute-1.png" id="130" name="Picture"/>
+                    <pic:cNvPr descr="S1-supplement-sensitivity_files/figure-docx/s6-sbm-compute-1.png" id="126" name="Picture"/>
                     <pic:cNvPicPr>
                       <a:picLocks noChangeArrowheads="1" noChangeAspect="1"/>
                     </pic:cNvPicPr>
                   </pic:nvPicPr>
                   <pic:blipFill>
-                    <a:blip r:embed="rId128"/>
+                    <a:blip r:embed="rId124"/>
                     <a:stretch>
                       <a:fillRect/>
                     </a:stretch>
@@ -22308,18 +22228,18 @@
           <wp:inline>
             <wp:extent cx="5943600" cy="4754880"/>
             <wp:effectExtent b="0" l="0" r="0" t="0"/>
-            <wp:docPr descr="" title="" id="132" name="Picture"/>
+            <wp:docPr descr="" title="" id="128" name="Picture"/>
             <a:graphic>
               <a:graphicData uri="http://schemas.openxmlformats.org/drawingml/2006/picture">
                 <pic:pic>
                   <pic:nvPicPr>
-                    <pic:cNvPr descr="S1-supplement-sensitivity_files/figure-docx/s6-sbm-compute-2.png" id="133" name="Picture"/>
+                    <pic:cNvPr descr="S1-supplement-sensitivity_files/figure-docx/s6-sbm-compute-2.png" id="129" name="Picture"/>
                     <pic:cNvPicPr>
                       <a:picLocks noChangeArrowheads="1" noChangeAspect="1"/>
                     </pic:cNvPicPr>
                   </pic:nvPicPr>
                   <pic:blipFill>
-                    <a:blip r:embed="rId131"/>
+                    <a:blip r:embed="rId127"/>
                     <a:stretch>
                       <a:fillRect/>
                     </a:stretch>
@@ -22355,18 +22275,18 @@
           <wp:inline>
             <wp:extent cx="5943600" cy="4754880"/>
             <wp:effectExtent b="0" l="0" r="0" t="0"/>
-            <wp:docPr descr="" title="" id="135" name="Picture"/>
+            <wp:docPr descr="" title="" id="131" name="Picture"/>
             <a:graphic>
               <a:graphicData uri="http://schemas.openxmlformats.org/drawingml/2006/picture">
                 <pic:pic>
                   <pic:nvPicPr>
-                    <pic:cNvPr descr="S1-supplement-sensitivity_files/figure-docx/s6-sbm-compute-3.png" id="136" name="Picture"/>
+                    <pic:cNvPr descr="S1-supplement-sensitivity_files/figure-docx/s6-sbm-compute-3.png" id="132" name="Picture"/>
                     <pic:cNvPicPr>
                       <a:picLocks noChangeArrowheads="1" noChangeAspect="1"/>
                     </pic:cNvPicPr>
                   </pic:nvPicPr>
                   <pic:blipFill>
-                    <a:blip r:embed="rId134"/>
+                    <a:blip r:embed="rId130"/>
                     <a:stretch>
                       <a:fillRect/>
                     </a:stretch>
@@ -22402,18 +22322,18 @@
           <wp:inline>
             <wp:extent cx="5943600" cy="4754880"/>
             <wp:effectExtent b="0" l="0" r="0" t="0"/>
-            <wp:docPr descr="" title="" id="138" name="Picture"/>
+            <wp:docPr descr="" title="" id="134" name="Picture"/>
             <a:graphic>
               <a:graphicData uri="http://schemas.openxmlformats.org/drawingml/2006/picture">
                 <pic:pic>
                   <pic:nvPicPr>
-                    <pic:cNvPr descr="S1-supplement-sensitivity_files/figure-docx/s6-sbm-compute-4.png" id="139" name="Picture"/>
+                    <pic:cNvPr descr="S1-supplement-sensitivity_files/figure-docx/s6-sbm-compute-4.png" id="135" name="Picture"/>
                     <pic:cNvPicPr>
                       <a:picLocks noChangeArrowheads="1" noChangeAspect="1"/>
                     </pic:cNvPicPr>
                   </pic:nvPicPr>
                   <pic:blipFill>
-                    <a:blip r:embed="rId137"/>
+                    <a:blip r:embed="rId133"/>
                     <a:stretch>
                       <a:fillRect/>
                     </a:stretch>
@@ -22449,18 +22369,18 @@
           <wp:inline>
             <wp:extent cx="5943600" cy="4754880"/>
             <wp:effectExtent b="0" l="0" r="0" t="0"/>
-            <wp:docPr descr="" title="" id="141" name="Picture"/>
+            <wp:docPr descr="" title="" id="137" name="Picture"/>
             <a:graphic>
               <a:graphicData uri="http://schemas.openxmlformats.org/drawingml/2006/picture">
                 <pic:pic>
                   <pic:nvPicPr>
-                    <pic:cNvPr descr="S1-supplement-sensitivity_files/figure-docx/s6-sbm-compute-5.png" id="142" name="Picture"/>
+                    <pic:cNvPr descr="S1-supplement-sensitivity_files/figure-docx/s6-sbm-compute-5.png" id="138" name="Picture"/>
                     <pic:cNvPicPr>
                       <a:picLocks noChangeArrowheads="1" noChangeAspect="1"/>
                     </pic:cNvPicPr>
                   </pic:nvPicPr>
                   <pic:blipFill>
-                    <a:blip r:embed="rId140"/>
+                    <a:blip r:embed="rId136"/>
                     <a:stretch>
                       <a:fillRect/>
                     </a:stretch>
@@ -22496,18 +22416,18 @@
           <wp:inline>
             <wp:extent cx="5943600" cy="4754880"/>
             <wp:effectExtent b="0" l="0" r="0" t="0"/>
-            <wp:docPr descr="" title="" id="144" name="Picture"/>
+            <wp:docPr descr="" title="" id="140" name="Picture"/>
             <a:graphic>
               <a:graphicData uri="http://schemas.openxmlformats.org/drawingml/2006/picture">
                 <pic:pic>
                   <pic:nvPicPr>
-                    <pic:cNvPr descr="S1-supplement-sensitivity_files/figure-docx/s6-sbm-compute-6.png" id="145" name="Picture"/>
+                    <pic:cNvPr descr="S1-supplement-sensitivity_files/figure-docx/s6-sbm-compute-6.png" id="141" name="Picture"/>
                     <pic:cNvPicPr>
                       <a:picLocks noChangeArrowheads="1" noChangeAspect="1"/>
                     </pic:cNvPicPr>
                   </pic:nvPicPr>
                   <pic:blipFill>
-                    <a:blip r:embed="rId143"/>
+                    <a:blip r:embed="rId139"/>
                     <a:stretch>
                       <a:fillRect/>
                     </a:stretch>
@@ -22543,18 +22463,18 @@
           <wp:inline>
             <wp:extent cx="5943600" cy="4754880"/>
             <wp:effectExtent b="0" l="0" r="0" t="0"/>
-            <wp:docPr descr="" title="" id="147" name="Picture"/>
+            <wp:docPr descr="" title="" id="143" name="Picture"/>
             <a:graphic>
               <a:graphicData uri="http://schemas.openxmlformats.org/drawingml/2006/picture">
                 <pic:pic>
                   <pic:nvPicPr>
-                    <pic:cNvPr descr="S1-supplement-sensitivity_files/figure-docx/s6-sbm-compute-7.png" id="148" name="Picture"/>
+                    <pic:cNvPr descr="S1-supplement-sensitivity_files/figure-docx/s6-sbm-compute-7.png" id="144" name="Picture"/>
                     <pic:cNvPicPr>
                       <a:picLocks noChangeArrowheads="1" noChangeAspect="1"/>
                     </pic:cNvPicPr>
                   </pic:nvPicPr>
                   <pic:blipFill>
-                    <a:blip r:embed="rId146"/>
+                    <a:blip r:embed="rId142"/>
                     <a:stretch>
                       <a:fillRect/>
                     </a:stretch>
@@ -22590,18 +22510,18 @@
           <wp:inline>
             <wp:extent cx="5943600" cy="4754880"/>
             <wp:effectExtent b="0" l="0" r="0" t="0"/>
-            <wp:docPr descr="" title="" id="150" name="Picture"/>
+            <wp:docPr descr="" title="" id="146" name="Picture"/>
             <a:graphic>
               <a:graphicData uri="http://schemas.openxmlformats.org/drawingml/2006/picture">
                 <pic:pic>
                   <pic:nvPicPr>
-                    <pic:cNvPr descr="S1-supplement-sensitivity_files/figure-docx/s6-sbm-compute-8.png" id="151" name="Picture"/>
+                    <pic:cNvPr descr="S1-supplement-sensitivity_files/figure-docx/s6-sbm-compute-8.png" id="147" name="Picture"/>
                     <pic:cNvPicPr>
                       <a:picLocks noChangeArrowheads="1" noChangeAspect="1"/>
                     </pic:cNvPicPr>
                   </pic:nvPicPr>
                   <pic:blipFill>
-                    <a:blip r:embed="rId149"/>
+                    <a:blip r:embed="rId145"/>
                     <a:stretch>
                       <a:fillRect/>
                     </a:stretch>
@@ -22637,18 +22557,18 @@
           <wp:inline>
             <wp:extent cx="5943600" cy="4754880"/>
             <wp:effectExtent b="0" l="0" r="0" t="0"/>
-            <wp:docPr descr="" title="" id="153" name="Picture"/>
+            <wp:docPr descr="" title="" id="149" name="Picture"/>
             <a:graphic>
               <a:graphicData uri="http://schemas.openxmlformats.org/drawingml/2006/picture">
                 <pic:pic>
                   <pic:nvPicPr>
-                    <pic:cNvPr descr="S1-supplement-sensitivity_files/figure-docx/s6-sbm-compute-9.png" id="154" name="Picture"/>
+                    <pic:cNvPr descr="S1-supplement-sensitivity_files/figure-docx/s6-sbm-compute-9.png" id="150" name="Picture"/>
                     <pic:cNvPicPr>
                       <a:picLocks noChangeArrowheads="1" noChangeAspect="1"/>
                     </pic:cNvPicPr>
                   </pic:nvPicPr>
                   <pic:blipFill>
-                    <a:blip r:embed="rId152"/>
+                    <a:blip r:embed="rId148"/>
                     <a:stretch>
                       <a:fillRect/>
                     </a:stretch>
@@ -22684,18 +22604,18 @@
           <wp:inline>
             <wp:extent cx="5943600" cy="4754880"/>
             <wp:effectExtent b="0" l="0" r="0" t="0"/>
-            <wp:docPr descr="" title="" id="156" name="Picture"/>
+            <wp:docPr descr="" title="" id="152" name="Picture"/>
             <a:graphic>
               <a:graphicData uri="http://schemas.openxmlformats.org/drawingml/2006/picture">
                 <pic:pic>
                   <pic:nvPicPr>
-                    <pic:cNvPr descr="S1-supplement-sensitivity_files/figure-docx/s6-sbm-compute-10.png" id="157" name="Picture"/>
+                    <pic:cNvPr descr="S1-supplement-sensitivity_files/figure-docx/s6-sbm-compute-10.png" id="153" name="Picture"/>
                     <pic:cNvPicPr>
                       <a:picLocks noChangeArrowheads="1" noChangeAspect="1"/>
                     </pic:cNvPicPr>
                   </pic:nvPicPr>
                   <pic:blipFill>
-                    <a:blip r:embed="rId155"/>
+                    <a:blip r:embed="rId151"/>
                     <a:stretch>
                       <a:fillRect/>
                     </a:stretch>
@@ -22731,18 +22651,18 @@
           <wp:inline>
             <wp:extent cx="5943600" cy="4754880"/>
             <wp:effectExtent b="0" l="0" r="0" t="0"/>
-            <wp:docPr descr="" title="" id="159" name="Picture"/>
+            <wp:docPr descr="" title="" id="155" name="Picture"/>
             <a:graphic>
               <a:graphicData uri="http://schemas.openxmlformats.org/drawingml/2006/picture">
                 <pic:pic>
                   <pic:nvPicPr>
-                    <pic:cNvPr descr="S1-supplement-sensitivity_files/figure-docx/s6-sbm-compute-11.png" id="160" name="Picture"/>
+                    <pic:cNvPr descr="S1-supplement-sensitivity_files/figure-docx/s6-sbm-compute-11.png" id="156" name="Picture"/>
                     <pic:cNvPicPr>
                       <a:picLocks noChangeArrowheads="1" noChangeAspect="1"/>
                     </pic:cNvPicPr>
                   </pic:nvPicPr>
                   <pic:blipFill>
-                    <a:blip r:embed="rId158"/>
+                    <a:blip r:embed="rId154"/>
                     <a:stretch>
                       <a:fillRect/>
                     </a:stretch>
@@ -22778,18 +22698,18 @@
           <wp:inline>
             <wp:extent cx="5943600" cy="4754880"/>
             <wp:effectExtent b="0" l="0" r="0" t="0"/>
-            <wp:docPr descr="" title="" id="162" name="Picture"/>
+            <wp:docPr descr="" title="" id="158" name="Picture"/>
             <a:graphic>
               <a:graphicData uri="http://schemas.openxmlformats.org/drawingml/2006/picture">
                 <pic:pic>
                   <pic:nvPicPr>
-                    <pic:cNvPr descr="S1-supplement-sensitivity_files/figure-docx/s6-sbm-compute-12.png" id="163" name="Picture"/>
+                    <pic:cNvPr descr="S1-supplement-sensitivity_files/figure-docx/s6-sbm-compute-12.png" id="159" name="Picture"/>
                     <pic:cNvPicPr>
                       <a:picLocks noChangeArrowheads="1" noChangeAspect="1"/>
                     </pic:cNvPicPr>
                   </pic:nvPicPr>
                   <pic:blipFill>
-                    <a:blip r:embed="rId161"/>
+                    <a:blip r:embed="rId157"/>
                     <a:stretch>
                       <a:fillRect/>
                     </a:stretch>
@@ -22825,18 +22745,18 @@
           <wp:inline>
             <wp:extent cx="5943600" cy="4754880"/>
             <wp:effectExtent b="0" l="0" r="0" t="0"/>
-            <wp:docPr descr="" title="" id="165" name="Picture"/>
+            <wp:docPr descr="" title="" id="161" name="Picture"/>
             <a:graphic>
               <a:graphicData uri="http://schemas.openxmlformats.org/drawingml/2006/picture">
                 <pic:pic>
                   <pic:nvPicPr>
-                    <pic:cNvPr descr="S1-supplement-sensitivity_files/figure-docx/s6-sbm-compute-13.png" id="166" name="Picture"/>
+                    <pic:cNvPr descr="S1-supplement-sensitivity_files/figure-docx/s6-sbm-compute-13.png" id="162" name="Picture"/>
                     <pic:cNvPicPr>
                       <a:picLocks noChangeArrowheads="1" noChangeAspect="1"/>
                     </pic:cNvPicPr>
                   </pic:nvPicPr>
                   <pic:blipFill>
-                    <a:blip r:embed="rId164"/>
+                    <a:blip r:embed="rId160"/>
                     <a:stretch>
                       <a:fillRect/>
                     </a:stretch>
@@ -22872,18 +22792,18 @@
           <wp:inline>
             <wp:extent cx="5943600" cy="4754880"/>
             <wp:effectExtent b="0" l="0" r="0" t="0"/>
-            <wp:docPr descr="" title="" id="168" name="Picture"/>
+            <wp:docPr descr="" title="" id="164" name="Picture"/>
             <a:graphic>
               <a:graphicData uri="http://schemas.openxmlformats.org/drawingml/2006/picture">
                 <pic:pic>
                   <pic:nvPicPr>
-                    <pic:cNvPr descr="S1-supplement-sensitivity_files/figure-docx/s6-sbm-compute-14.png" id="169" name="Picture"/>
+                    <pic:cNvPr descr="S1-supplement-sensitivity_files/figure-docx/s6-sbm-compute-14.png" id="165" name="Picture"/>
                     <pic:cNvPicPr>
                       <a:picLocks noChangeArrowheads="1" noChangeAspect="1"/>
                     </pic:cNvPicPr>
                   </pic:nvPicPr>
                   <pic:blipFill>
-                    <a:blip r:embed="rId167"/>
+                    <a:blip r:embed="rId163"/>
                     <a:stretch>
                       <a:fillRect/>
                     </a:stretch>
@@ -22919,18 +22839,18 @@
           <wp:inline>
             <wp:extent cx="5943600" cy="4754880"/>
             <wp:effectExtent b="0" l="0" r="0" t="0"/>
-            <wp:docPr descr="" title="" id="171" name="Picture"/>
+            <wp:docPr descr="" title="" id="167" name="Picture"/>
             <a:graphic>
               <a:graphicData uri="http://schemas.openxmlformats.org/drawingml/2006/picture">
                 <pic:pic>
                   <pic:nvPicPr>
-                    <pic:cNvPr descr="S1-supplement-sensitivity_files/figure-docx/s6-sbm-compute-15.png" id="172" name="Picture"/>
+                    <pic:cNvPr descr="S1-supplement-sensitivity_files/figure-docx/s6-sbm-compute-15.png" id="168" name="Picture"/>
                     <pic:cNvPicPr>
                       <a:picLocks noChangeArrowheads="1" noChangeAspect="1"/>
                     </pic:cNvPicPr>
                   </pic:nvPicPr>
                   <pic:blipFill>
-                    <a:blip r:embed="rId170"/>
+                    <a:blip r:embed="rId166"/>
                     <a:stretch>
                       <a:fillRect/>
                     </a:stretch>
@@ -22966,18 +22886,18 @@
           <wp:inline>
             <wp:extent cx="5943600" cy="4754880"/>
             <wp:effectExtent b="0" l="0" r="0" t="0"/>
-            <wp:docPr descr="" title="" id="174" name="Picture"/>
+            <wp:docPr descr="" title="" id="170" name="Picture"/>
             <a:graphic>
               <a:graphicData uri="http://schemas.openxmlformats.org/drawingml/2006/picture">
                 <pic:pic>
                   <pic:nvPicPr>
-                    <pic:cNvPr descr="S1-supplement-sensitivity_files/figure-docx/s6-sbm-compute-16.png" id="175" name="Picture"/>
+                    <pic:cNvPr descr="S1-supplement-sensitivity_files/figure-docx/s6-sbm-compute-16.png" id="171" name="Picture"/>
                     <pic:cNvPicPr>
                       <a:picLocks noChangeArrowheads="1" noChangeAspect="1"/>
                     </pic:cNvPicPr>
                   </pic:nvPicPr>
                   <pic:blipFill>
-                    <a:blip r:embed="rId173"/>
+                    <a:blip r:embed="rId169"/>
                     <a:stretch>
                       <a:fillRect/>
                     </a:stretch>
@@ -23013,18 +22933,18 @@
           <wp:inline>
             <wp:extent cx="5943600" cy="4754880"/>
             <wp:effectExtent b="0" l="0" r="0" t="0"/>
-            <wp:docPr descr="" title="" id="177" name="Picture"/>
+            <wp:docPr descr="" title="" id="173" name="Picture"/>
             <a:graphic>
               <a:graphicData uri="http://schemas.openxmlformats.org/drawingml/2006/picture">
                 <pic:pic>
                   <pic:nvPicPr>
-                    <pic:cNvPr descr="S1-supplement-sensitivity_files/figure-docx/s6-sbm-compute-17.png" id="178" name="Picture"/>
+                    <pic:cNvPr descr="S1-supplement-sensitivity_files/figure-docx/s6-sbm-compute-17.png" id="174" name="Picture"/>
                     <pic:cNvPicPr>
                       <a:picLocks noChangeArrowheads="1" noChangeAspect="1"/>
                     </pic:cNvPicPr>
                   </pic:nvPicPr>
                   <pic:blipFill>
-                    <a:blip r:embed="rId176"/>
+                    <a:blip r:embed="rId172"/>
                     <a:stretch>
                       <a:fillRect/>
                     </a:stretch>
@@ -23060,18 +22980,18 @@
           <wp:inline>
             <wp:extent cx="5943600" cy="4754880"/>
             <wp:effectExtent b="0" l="0" r="0" t="0"/>
-            <wp:docPr descr="" title="" id="180" name="Picture"/>
+            <wp:docPr descr="" title="" id="176" name="Picture"/>
             <a:graphic>
               <a:graphicData uri="http://schemas.openxmlformats.org/drawingml/2006/picture">
                 <pic:pic>
                   <pic:nvPicPr>
-                    <pic:cNvPr descr="S1-supplement-sensitivity_files/figure-docx/s6-sbm-compute-18.png" id="181" name="Picture"/>
+                    <pic:cNvPr descr="S1-supplement-sensitivity_files/figure-docx/s6-sbm-compute-18.png" id="177" name="Picture"/>
                     <pic:cNvPicPr>
                       <a:picLocks noChangeArrowheads="1" noChangeAspect="1"/>
                     </pic:cNvPicPr>
                   </pic:nvPicPr>
                   <pic:blipFill>
-                    <a:blip r:embed="rId179"/>
+                    <a:blip r:embed="rId175"/>
                     <a:stretch>
                       <a:fillRect/>
                     </a:stretch>
@@ -23107,18 +23027,18 @@
           <wp:inline>
             <wp:extent cx="5943600" cy="4754880"/>
             <wp:effectExtent b="0" l="0" r="0" t="0"/>
-            <wp:docPr descr="" title="" id="183" name="Picture"/>
+            <wp:docPr descr="" title="" id="179" name="Picture"/>
             <a:graphic>
               <a:graphicData uri="http://schemas.openxmlformats.org/drawingml/2006/picture">
                 <pic:pic>
                   <pic:nvPicPr>
-                    <pic:cNvPr descr="S1-supplement-sensitivity_files/figure-docx/s6-sbm-compute-19.png" id="184" name="Picture"/>
+                    <pic:cNvPr descr="S1-supplement-sensitivity_files/figure-docx/s6-sbm-compute-19.png" id="180" name="Picture"/>
                     <pic:cNvPicPr>
                       <a:picLocks noChangeArrowheads="1" noChangeAspect="1"/>
                     </pic:cNvPicPr>
                   </pic:nvPicPr>
                   <pic:blipFill>
-                    <a:blip r:embed="rId182"/>
+                    <a:blip r:embed="rId178"/>
                     <a:stretch>
                       <a:fillRect/>
                     </a:stretch>
@@ -23154,18 +23074,18 @@
           <wp:inline>
             <wp:extent cx="5943600" cy="4754880"/>
             <wp:effectExtent b="0" l="0" r="0" t="0"/>
-            <wp:docPr descr="" title="" id="186" name="Picture"/>
+            <wp:docPr descr="" title="" id="182" name="Picture"/>
             <a:graphic>
               <a:graphicData uri="http://schemas.openxmlformats.org/drawingml/2006/picture">
                 <pic:pic>
                   <pic:nvPicPr>
-                    <pic:cNvPr descr="S1-supplement-sensitivity_files/figure-docx/s6-sbm-compute-20.png" id="187" name="Picture"/>
+                    <pic:cNvPr descr="S1-supplement-sensitivity_files/figure-docx/s6-sbm-compute-20.png" id="183" name="Picture"/>
                     <pic:cNvPicPr>
                       <a:picLocks noChangeArrowheads="1" noChangeAspect="1"/>
                     </pic:cNvPicPr>
                   </pic:nvPicPr>
                   <pic:blipFill>
-                    <a:blip r:embed="rId185"/>
+                    <a:blip r:embed="rId181"/>
                     <a:stretch>
                       <a:fillRect/>
                     </a:stretch>
@@ -23201,18 +23121,18 @@
           <wp:inline>
             <wp:extent cx="5943600" cy="4754880"/>
             <wp:effectExtent b="0" l="0" r="0" t="0"/>
-            <wp:docPr descr="" title="" id="189" name="Picture"/>
+            <wp:docPr descr="" title="" id="185" name="Picture"/>
             <a:graphic>
               <a:graphicData uri="http://schemas.openxmlformats.org/drawingml/2006/picture">
                 <pic:pic>
                   <pic:nvPicPr>
-                    <pic:cNvPr descr="S1-supplement-sensitivity_files/figure-docx/s6-sbm-compute-21.png" id="190" name="Picture"/>
+                    <pic:cNvPr descr="S1-supplement-sensitivity_files/figure-docx/s6-sbm-compute-21.png" id="186" name="Picture"/>
                     <pic:cNvPicPr>
                       <a:picLocks noChangeArrowheads="1" noChangeAspect="1"/>
                     </pic:cNvPicPr>
                   </pic:nvPicPr>
                   <pic:blipFill>
-                    <a:blip r:embed="rId188"/>
+                    <a:blip r:embed="rId184"/>
                     <a:stretch>
                       <a:fillRect/>
                     </a:stretch>
@@ -23248,18 +23168,18 @@
           <wp:inline>
             <wp:extent cx="5943600" cy="4754880"/>
             <wp:effectExtent b="0" l="0" r="0" t="0"/>
-            <wp:docPr descr="" title="" id="192" name="Picture"/>
+            <wp:docPr descr="" title="" id="188" name="Picture"/>
             <a:graphic>
               <a:graphicData uri="http://schemas.openxmlformats.org/drawingml/2006/picture">
                 <pic:pic>
                   <pic:nvPicPr>
-                    <pic:cNvPr descr="S1-supplement-sensitivity_files/figure-docx/s6-sbm-compute-22.png" id="193" name="Picture"/>
+                    <pic:cNvPr descr="S1-supplement-sensitivity_files/figure-docx/s6-sbm-compute-22.png" id="189" name="Picture"/>
                     <pic:cNvPicPr>
                       <a:picLocks noChangeArrowheads="1" noChangeAspect="1"/>
                     </pic:cNvPicPr>
                   </pic:nvPicPr>
                   <pic:blipFill>
-                    <a:blip r:embed="rId191"/>
+                    <a:blip r:embed="rId187"/>
                     <a:stretch>
                       <a:fillRect/>
                     </a:stretch>
@@ -23295,18 +23215,18 @@
           <wp:inline>
             <wp:extent cx="5943600" cy="4754880"/>
             <wp:effectExtent b="0" l="0" r="0" t="0"/>
-            <wp:docPr descr="" title="" id="195" name="Picture"/>
+            <wp:docPr descr="" title="" id="191" name="Picture"/>
             <a:graphic>
               <a:graphicData uri="http://schemas.openxmlformats.org/drawingml/2006/picture">
                 <pic:pic>
                   <pic:nvPicPr>
-                    <pic:cNvPr descr="S1-supplement-sensitivity_files/figure-docx/s6-sbm-compute-23.png" id="196" name="Picture"/>
+                    <pic:cNvPr descr="S1-supplement-sensitivity_files/figure-docx/s6-sbm-compute-23.png" id="192" name="Picture"/>
                     <pic:cNvPicPr>
                       <a:picLocks noChangeArrowheads="1" noChangeAspect="1"/>
                     </pic:cNvPicPr>
                   </pic:nvPicPr>
                   <pic:blipFill>
-                    <a:blip r:embed="rId194"/>
+                    <a:blip r:embed="rId190"/>
                     <a:stretch>
                       <a:fillRect/>
                     </a:stretch>
@@ -23342,18 +23262,18 @@
           <wp:inline>
             <wp:extent cx="5943600" cy="4754880"/>
             <wp:effectExtent b="0" l="0" r="0" t="0"/>
-            <wp:docPr descr="" title="" id="198" name="Picture"/>
+            <wp:docPr descr="" title="" id="194" name="Picture"/>
             <a:graphic>
               <a:graphicData uri="http://schemas.openxmlformats.org/drawingml/2006/picture">
                 <pic:pic>
                   <pic:nvPicPr>
-                    <pic:cNvPr descr="S1-supplement-sensitivity_files/figure-docx/s6-sbm-compute-24.png" id="199" name="Picture"/>
+                    <pic:cNvPr descr="S1-supplement-sensitivity_files/figure-docx/s6-sbm-compute-24.png" id="195" name="Picture"/>
                     <pic:cNvPicPr>
                       <a:picLocks noChangeArrowheads="1" noChangeAspect="1"/>
                     </pic:cNvPicPr>
                   </pic:nvPicPr>
                   <pic:blipFill>
-                    <a:blip r:embed="rId197"/>
+                    <a:blip r:embed="rId193"/>
                     <a:stretch>
                       <a:fillRect/>
                     </a:stretch>
@@ -23389,18 +23309,18 @@
           <wp:inline>
             <wp:extent cx="5943600" cy="4754880"/>
             <wp:effectExtent b="0" l="0" r="0" t="0"/>
-            <wp:docPr descr="" title="" id="201" name="Picture"/>
+            <wp:docPr descr="" title="" id="197" name="Picture"/>
             <a:graphic>
               <a:graphicData uri="http://schemas.openxmlformats.org/drawingml/2006/picture">
                 <pic:pic>
                   <pic:nvPicPr>
-                    <pic:cNvPr descr="S1-supplement-sensitivity_files/figure-docx/s6-sbm-compute-25.png" id="202" name="Picture"/>
+                    <pic:cNvPr descr="S1-supplement-sensitivity_files/figure-docx/s6-sbm-compute-25.png" id="198" name="Picture"/>
                     <pic:cNvPicPr>
                       <a:picLocks noChangeArrowheads="1" noChangeAspect="1"/>
                     </pic:cNvPicPr>
                   </pic:nvPicPr>
                   <pic:blipFill>
-                    <a:blip r:embed="rId200"/>
+                    <a:blip r:embed="rId196"/>
                     <a:stretch>
                       <a:fillRect/>
                     </a:stretch>
@@ -23436,18 +23356,18 @@
           <wp:inline>
             <wp:extent cx="5943600" cy="4754880"/>
             <wp:effectExtent b="0" l="0" r="0" t="0"/>
-            <wp:docPr descr="" title="" id="204" name="Picture"/>
+            <wp:docPr descr="" title="" id="200" name="Picture"/>
             <a:graphic>
               <a:graphicData uri="http://schemas.openxmlformats.org/drawingml/2006/picture">
                 <pic:pic>
                   <pic:nvPicPr>
-                    <pic:cNvPr descr="S1-supplement-sensitivity_files/figure-docx/s6-sbm-compute-26.png" id="205" name="Picture"/>
+                    <pic:cNvPr descr="S1-supplement-sensitivity_files/figure-docx/s6-sbm-compute-26.png" id="201" name="Picture"/>
                     <pic:cNvPicPr>
                       <a:picLocks noChangeArrowheads="1" noChangeAspect="1"/>
                     </pic:cNvPicPr>
                   </pic:nvPicPr>
                   <pic:blipFill>
-                    <a:blip r:embed="rId203"/>
+                    <a:blip r:embed="rId199"/>
                     <a:stretch>
                       <a:fillRect/>
                     </a:stretch>
@@ -23483,18 +23403,18 @@
           <wp:inline>
             <wp:extent cx="5943600" cy="4754880"/>
             <wp:effectExtent b="0" l="0" r="0" t="0"/>
-            <wp:docPr descr="" title="" id="207" name="Picture"/>
+            <wp:docPr descr="" title="" id="203" name="Picture"/>
             <a:graphic>
               <a:graphicData uri="http://schemas.openxmlformats.org/drawingml/2006/picture">
                 <pic:pic>
                   <pic:nvPicPr>
-                    <pic:cNvPr descr="S1-supplement-sensitivity_files/figure-docx/s6-sbm-compute-27.png" id="208" name="Picture"/>
+                    <pic:cNvPr descr="S1-supplement-sensitivity_files/figure-docx/s6-sbm-compute-27.png" id="204" name="Picture"/>
                     <pic:cNvPicPr>
                       <a:picLocks noChangeArrowheads="1" noChangeAspect="1"/>
                     </pic:cNvPicPr>
                   </pic:nvPicPr>
                   <pic:blipFill>
-                    <a:blip r:embed="rId206"/>
+                    <a:blip r:embed="rId202"/>
                     <a:stretch>
                       <a:fillRect/>
                     </a:stretch>
@@ -23530,18 +23450,18 @@
           <wp:inline>
             <wp:extent cx="5943600" cy="4754880"/>
             <wp:effectExtent b="0" l="0" r="0" t="0"/>
-            <wp:docPr descr="" title="" id="210" name="Picture"/>
+            <wp:docPr descr="" title="" id="206" name="Picture"/>
             <a:graphic>
               <a:graphicData uri="http://schemas.openxmlformats.org/drawingml/2006/picture">
                 <pic:pic>
                   <pic:nvPicPr>
-                    <pic:cNvPr descr="S1-supplement-sensitivity_files/figure-docx/s6-sbm-compute-28.png" id="211" name="Picture"/>
+                    <pic:cNvPr descr="S1-supplement-sensitivity_files/figure-docx/s6-sbm-compute-28.png" id="207" name="Picture"/>
                     <pic:cNvPicPr>
                       <a:picLocks noChangeArrowheads="1" noChangeAspect="1"/>
                     </pic:cNvPicPr>
                   </pic:nvPicPr>
                   <pic:blipFill>
-                    <a:blip r:embed="rId209"/>
+                    <a:blip r:embed="rId205"/>
                     <a:stretch>
                       <a:fillRect/>
                     </a:stretch>
@@ -23577,18 +23497,18 @@
           <wp:inline>
             <wp:extent cx="5943600" cy="4754880"/>
             <wp:effectExtent b="0" l="0" r="0" t="0"/>
-            <wp:docPr descr="" title="" id="213" name="Picture"/>
+            <wp:docPr descr="" title="" id="209" name="Picture"/>
             <a:graphic>
               <a:graphicData uri="http://schemas.openxmlformats.org/drawingml/2006/picture">
                 <pic:pic>
                   <pic:nvPicPr>
-                    <pic:cNvPr descr="S1-supplement-sensitivity_files/figure-docx/s6-sbm-compute-29.png" id="214" name="Picture"/>
+                    <pic:cNvPr descr="S1-supplement-sensitivity_files/figure-docx/s6-sbm-compute-29.png" id="210" name="Picture"/>
                     <pic:cNvPicPr>
                       <a:picLocks noChangeArrowheads="1" noChangeAspect="1"/>
                     </pic:cNvPicPr>
                   </pic:nvPicPr>
                   <pic:blipFill>
-                    <a:blip r:embed="rId212"/>
+                    <a:blip r:embed="rId208"/>
                     <a:stretch>
                       <a:fillRect/>
                     </a:stretch>
@@ -23624,18 +23544,18 @@
           <wp:inline>
             <wp:extent cx="5943600" cy="4754880"/>
             <wp:effectExtent b="0" l="0" r="0" t="0"/>
-            <wp:docPr descr="" title="" id="216" name="Picture"/>
+            <wp:docPr descr="" title="" id="212" name="Picture"/>
             <a:graphic>
               <a:graphicData uri="http://schemas.openxmlformats.org/drawingml/2006/picture">
                 <pic:pic>
                   <pic:nvPicPr>
-                    <pic:cNvPr descr="S1-supplement-sensitivity_files/figure-docx/s6-sbm-compute-30.png" id="217" name="Picture"/>
+                    <pic:cNvPr descr="S1-supplement-sensitivity_files/figure-docx/s6-sbm-compute-30.png" id="213" name="Picture"/>
                     <pic:cNvPicPr>
                       <a:picLocks noChangeArrowheads="1" noChangeAspect="1"/>
                     </pic:cNvPicPr>
                   </pic:nvPicPr>
                   <pic:blipFill>
-                    <a:blip r:embed="rId215"/>
+                    <a:blip r:embed="rId211"/>
                     <a:stretch>
                       <a:fillRect/>
                     </a:stretch>
@@ -23676,7 +23596,7 @@
       <w:tr>
         <w:tc>
           <w:tcPr/>
-          <w:bookmarkStart w:id="218" w:name="tbl-sbm-icl"/>
+          <w:bookmarkStart w:id="214" w:name="tbl-sbm-icl"/>
           <w:tbl>
             <w:tblPr>
               <w:tblStyle w:val="Table"/>
@@ -24242,7 +24162,7 @@
               <w:t xml:space="preserve">Table 24: Integrated Classification Likelihood (ICL) for stochastic block models with K = 1 to 5 blocks, by phase and model family. The best-supported number of blocks (maximum ICL) is bolded. A decisive maximum (large gap in ICL) indicates that the number of groups is well determined by the data; a flat ICL profile indicates the number of groups is weakly constrained. Bernoulli model uses binarized adjacency (edge if similarity ≥ 0.2); Gaussian model uses unthresholded weighted similarities (1 − Jaccard).</w:t>
             </w:r>
           </w:p>
-          <w:bookmarkEnd w:id="218"/>
+          <w:bookmarkEnd w:id="214"/>
         </w:tc>
       </w:tr>
     </w:tbl>
@@ -24268,7 +24188,7 @@
       <w:tr>
         <w:tc>
           <w:tcPr/>
-          <w:bookmarkStart w:id="219" w:name="tbl-sbm-membership"/>
+          <w:bookmarkStart w:id="215" w:name="tbl-sbm-membership"/>
           <w:tbl>
             <w:tblPr>
               <w:tblStyle w:val="Table"/>
@@ -31321,12 +31241,12 @@
               <w:t xml:space="preserve">Table 25: Posterior block-membership probabilities and modal (hard) assignment from the best-fitting stochastic block model for each phase and model family. Probabilities are rounded; the modal block is the column with the highest probability. Sites with probability spread across blocks (e.g. no entry above 0.7) have ambiguous membership. Bernoulli model uses binarized adjacency (edge if similarity ≥ 0.2); Gaussian model uses unthresholded weighted similarities (1 − Jaccard).</w:t>
             </w:r>
           </w:p>
-          <w:bookmarkEnd w:id="219"/>
+          <w:bookmarkEnd w:id="215"/>
         </w:tc>
       </w:tr>
     </w:tbl>
-    <w:bookmarkEnd w:id="220"/>
-    <w:bookmarkStart w:id="221" w:name="interpretation-4"/>
+    <w:bookmarkEnd w:id="216"/>
+    <w:bookmarkStart w:id="217" w:name="interpretation-4"/>
     <w:p>
       <w:pPr>
         <w:pStyle w:val="Heading3"/>
@@ -31574,9 +31494,9 @@
         <w:t xml:space="preserve">(rich vs. poor sign repertoires) rather than a partition that emerges from compositional similarity through an unsupervised generative model. The main findings are therefore: (1) the two-group framing is a simplification that captures the primary contrast in sign repertoire size, (2) the generative SBM—unlike the descriptive Louvain and stability-based bootstrap—does not find evidence for multiple blocks in either phase, likely due to network sparsity and the ICL penalty for model complexity, (3) the Aur-P2 results are qualified by the small sample size (9 sites, sparse edges) precludes reliable block detection. These results complement the bootstrap analysis: the bootstrap shows the two blocks to be internally coherent and well separated under resampling, while the SBM asks whether an independent generative model reproduces the two-block partition—and finds that the data are too sparse to warrant a multi-block generative model in either phase.</w:t>
       </w:r>
     </w:p>
-    <w:bookmarkEnd w:id="221"/>
-    <w:bookmarkEnd w:id="222"/>
-    <w:bookmarkStart w:id="226" w:name="sec-s6-4"/>
+    <w:bookmarkEnd w:id="217"/>
+    <w:bookmarkEnd w:id="218"/>
+    <w:bookmarkStart w:id="222" w:name="sec-s6-4"/>
     <w:p>
       <w:pPr>
         <w:pStyle w:val="Heading2"/>
@@ -31585,7 +31505,7 @@
         <w:t xml:space="preserve">S6.4 Cross-Validation of Group Assignments (ARI)</w:t>
       </w:r>
     </w:p>
-    <w:bookmarkStart w:id="224" w:name="rationale-9"/>
+    <w:bookmarkStart w:id="220" w:name="rationale-9"/>
     <w:p>
       <w:pPr>
         <w:pStyle w:val="Heading3"/>
@@ -31628,7 +31548,7 @@
       <w:tr>
         <w:tc>
           <w:tcPr/>
-          <w:bookmarkStart w:id="223" w:name="tbl-s6-ari"/>
+          <w:bookmarkStart w:id="219" w:name="tbl-s6-ari"/>
           <w:tbl>
             <w:tblPr>
               <w:tblStyle w:val="Table"/>
@@ -31822,12 +31742,12 @@
               <w:t xml:space="preserve">Table 26: Adjusted Rand Index between the main-text manual restricted/broad assignment, the bootstrap modal blocks (S6.2), and the SBM modal assignments (S6.3), by phase.</w:t>
             </w:r>
           </w:p>
-          <w:bookmarkEnd w:id="223"/>
+          <w:bookmarkEnd w:id="219"/>
         </w:tc>
       </w:tr>
     </w:tbl>
-    <w:bookmarkEnd w:id="224"/>
-    <w:bookmarkStart w:id="225" w:name="interpretation-5"/>
+    <w:bookmarkEnd w:id="220"/>
+    <w:bookmarkStart w:id="221" w:name="interpretation-5"/>
     <w:p>
       <w:pPr>
         <w:pStyle w:val="Heading3"/>
@@ -31943,9 +31863,9 @@
         <w:t xml:space="preserve">.</w:t>
       </w:r>
     </w:p>
-    <w:bookmarkEnd w:id="225"/>
-    <w:bookmarkEnd w:id="226"/>
-    <w:bookmarkStart w:id="227" w:name="sec-s6-5"/>
+    <w:bookmarkEnd w:id="221"/>
+    <w:bookmarkEnd w:id="222"/>
+    <w:bookmarkStart w:id="223" w:name="sec-s6-5"/>
     <w:p>
       <w:pPr>
         <w:pStyle w:val="Heading2"/>
@@ -31979,7 +31899,7 @@
           <w:rPr>
             <w:rStyle w:val="Hyperlink"/>
           </w:rPr>
-          <w:t xml:space="preserve">Figure 7</w:t>
+          <w:t xml:space="preserve">Figure 6</w:t>
         </w:r>
       </w:hyperlink>
       <w:r>
@@ -32073,9 +31993,9 @@
         <w:t xml:space="preserve">, which validates the grouping on withheld data rather than on the data used to define it.</w:t>
       </w:r>
     </w:p>
-    <w:bookmarkEnd w:id="227"/>
-    <w:bookmarkEnd w:id="228"/>
-    <w:bookmarkStart w:id="249" w:name="sec-s6-6"/>
+    <w:bookmarkEnd w:id="223"/>
+    <w:bookmarkEnd w:id="224"/>
+    <w:bookmarkStart w:id="245" w:name="sec-s6-6"/>
     <w:p>
       <w:pPr>
         <w:pStyle w:val="Heading1"/>
@@ -32084,7 +32004,7 @@
         <w:t xml:space="preserve">S6.6 Circularity-Breaking Validation of the Restricted/Broad Group Difference</w:t>
       </w:r>
     </w:p>
-    <w:bookmarkStart w:id="231" w:name="rationale-10"/>
+    <w:bookmarkStart w:id="227" w:name="rationale-10"/>
     <w:p>
       <w:pPr>
         <w:pStyle w:val="Heading2"/>
@@ -32255,7 +32175,7 @@
       <w:tr>
         <w:tc>
           <w:tcPr/>
-          <w:bookmarkStart w:id="229" w:name="tbl-s6-6-summary"/>
+          <w:bookmarkStart w:id="225" w:name="tbl-s6-6-summary"/>
           <w:tbl>
             <w:tblPr>
               <w:tblStyle w:val="Table"/>
@@ -32819,11 +32739,11 @@
               <w:t xml:space="preserve">Table 27: Circularity-breaking validation of the restricted/broad group difference. Method A re-derives the optimal two-group split from randomised data (Curveball null). Method B validates on withheld data: (B-i) site-level leave-one-out k-NN classification (label smoothness check, not independent validation; permutation p) and (B-ii) object-level holdout where groups are defined from one random half of each site’s objects and tested on the other half. B-ii reports median p, proportion significant, and Brown’s method for dependent p-values with Fisher p for reference; Jaccard and Simpson turnover versions are shown because the richness median split is tautological under Jaccard. Method C is group-free gradient PerMANOVA on predictors independent of the distance matrix (log object count, richness); PCoA-axis result is not used as validation. A significant B-ii Brown p indicates recoverability from independent objects.</w:t>
             </w:r>
           </w:p>
-          <w:bookmarkEnd w:id="229"/>
+          <w:bookmarkEnd w:id="225"/>
         </w:tc>
       </w:tr>
     </w:tbl>
-    <w:bookmarkStart w:id="230" w:name="interpretation-6"/>
+    <w:bookmarkStart w:id="226" w:name="interpretation-6"/>
     <w:p>
       <w:pPr>
         <w:pStyle w:val="Heading3"/>
@@ -33175,9 +33095,9 @@
         <w:t xml:space="preserve"># S7. Object-Type Sensitivity: Figurine Exclusion {#sec-s7}</w:t>
       </w:r>
     </w:p>
-    <w:bookmarkEnd w:id="230"/>
-    <w:bookmarkEnd w:id="231"/>
-    <w:bookmarkStart w:id="232" w:name="s7.1-rationale"/>
+    <w:bookmarkEnd w:id="226"/>
+    <w:bookmarkEnd w:id="227"/>
+    <w:bookmarkStart w:id="228" w:name="s7.1-rationale"/>
     <w:p>
       <w:pPr>
         <w:pStyle w:val="Heading2"/>
@@ -33200,8 +33120,8 @@
         <w:t xml:space="preserve">demonstrate that ivory figurines in the Swabian Aurignacian carry sign sequences with higher information density than tools. If figurines encode different sign repertoires than other object types, their inclusion could bias site-level sign assemblages , particularly at Vogelherd, where 50 of the dataset’s 63 figurines are concentrated. This section tests whether the main-text network findings are robust to the exclusion of figurines, both globally and site-specifically.</w:t>
       </w:r>
     </w:p>
-    <w:bookmarkEnd w:id="232"/>
-    <w:bookmarkStart w:id="234" w:name="X558aa60e1a258171fb4fb8ecbd68200d2a7d022"/>
+    <w:bookmarkEnd w:id="228"/>
+    <w:bookmarkStart w:id="230" w:name="X558aa60e1a258171fb4fb8ecbd68200d2a7d022"/>
     <w:p>
       <w:pPr>
         <w:pStyle w:val="Heading2"/>
@@ -33224,7 +33144,7 @@
       <w:tr>
         <w:tc>
           <w:tcPr/>
-          <w:bookmarkStart w:id="233" w:name="tbl-figurine-count"/>
+          <w:bookmarkStart w:id="229" w:name="tbl-figurine-count"/>
           <w:tbl>
             <w:tblPr>
               <w:tblStyle w:val="Table"/>
@@ -33910,7 +33830,7 @@
               <w:t xml:space="preserve">Table 28: Distribution of figurine objects across phases and sites. Figurine types include figurine zoomorph, figurine anthropomorph, figurine undet., and possible figurine.</w:t>
             </w:r>
           </w:p>
-          <w:bookmarkEnd w:id="233"/>
+          <w:bookmarkEnd w:id="229"/>
         </w:tc>
       </w:tr>
     </w:tbl>
@@ -33933,8 +33853,8 @@
         <w:t xml:space="preserve">shows that figurines are heavily concentrated at Vogelherd (50 objects), with minor representation at Hohle Fels (4, 4), Geissenklösterle (3), Hohlenstein-Stadel (1), and La Ferrassie (1). Of these, 59 fall within Aur-P1 and the remaining 4 , all Hohle Fels objects from AH IV and Iid , fall within Aur-P2 under the layer-level assignment. The analysis therefore tests whether the Aur-P1 network structure , which reports the higher mean degree (7.5) , is driven by these 50 objects at a single site.</w:t>
       </w:r>
     </w:p>
-    <w:bookmarkEnd w:id="234"/>
-    <w:bookmarkStart w:id="239" w:name="s7.3-analysis-1-exclude-all-figurines"/>
+    <w:bookmarkEnd w:id="230"/>
+    <w:bookmarkStart w:id="235" w:name="s7.3-analysis-1-exclude-all-figurines"/>
     <w:p>
       <w:pPr>
         <w:pStyle w:val="Heading2"/>
@@ -33943,7 +33863,7 @@
         <w:t xml:space="preserve">S7.3 Analysis 1: Exclude All Figurines</w:t>
       </w:r>
     </w:p>
-    <w:bookmarkStart w:id="237" w:name="method"/>
+    <w:bookmarkStart w:id="233" w:name="method"/>
     <w:p>
       <w:pPr>
         <w:pStyle w:val="Heading3"/>
@@ -34007,7 +33927,7 @@
       <w:tr>
         <w:tc>
           <w:tcPr/>
-          <w:bookmarkStart w:id="235" w:name="tbl-exclude-figurines"/>
+          <w:bookmarkStart w:id="231" w:name="tbl-exclude-figurines"/>
           <w:tbl>
             <w:tblPr>
               <w:tblStyle w:val="Table"/>
@@ -34573,7 +34493,7 @@
               <w:t xml:space="preserve">Table 29: Network statistics before and after excluding all figurine objects (figurine zoomorph, figurine anthropomorph, figurine undet., and possible figurine). Threshold = 0.2, Jaccard similarity.</w:t>
             </w:r>
           </w:p>
-          <w:bookmarkEnd w:id="235"/>
+          <w:bookmarkEnd w:id="231"/>
         </w:tc>
       </w:tr>
     </w:tbl>
@@ -34599,7 +34519,7 @@
       <w:tr>
         <w:tc>
           <w:tcPr/>
-          <w:bookmarkStart w:id="236" w:name="tbl-figurine-sites-lost"/>
+          <w:bookmarkStart w:id="232" w:name="tbl-figurine-sites-lost"/>
           <w:tbl>
             <w:tblPr>
               <w:tblStyle w:val="Table"/>
@@ -34792,12 +34712,12 @@
               <w:t xml:space="preserve">Table 30: Number of sites per phase before and after figurine exclusion. Sites are lost when all objects at that site are figurines.</w:t>
             </w:r>
           </w:p>
-          <w:bookmarkEnd w:id="236"/>
+          <w:bookmarkEnd w:id="232"/>
         </w:tc>
       </w:tr>
     </w:tbl>
-    <w:bookmarkEnd w:id="237"/>
-    <w:bookmarkStart w:id="238" w:name="interpretation-7"/>
+    <w:bookmarkEnd w:id="233"/>
+    <w:bookmarkStart w:id="234" w:name="interpretation-7"/>
     <w:p>
       <w:pPr>
         <w:pStyle w:val="Heading3"/>
@@ -34822,9 +34742,9 @@
         <w:t xml:space="preserve">Critically, Aur-P1 retains the higher mean degree (7.4) under figurine exclusion, preserving the main-text ordering Aur-P1 &gt; Aur-P2 (7.4 &gt; 4.22). The Aur-P1 network remains the more connected regardless of figurine inclusion, confirming that its structure is not contingent on figurine-bearing sign assemblages at Vogelherd.</w:t>
       </w:r>
     </w:p>
-    <w:bookmarkEnd w:id="238"/>
-    <w:bookmarkEnd w:id="239"/>
-    <w:bookmarkStart w:id="244" w:name="X7549e60451b9f7bbee640100d361a0cf771ac62"/>
+    <w:bookmarkEnd w:id="234"/>
+    <w:bookmarkEnd w:id="235"/>
+    <w:bookmarkStart w:id="240" w:name="X7549e60451b9f7bbee640100d361a0cf771ac62"/>
     <w:p>
       <w:pPr>
         <w:pStyle w:val="Heading2"/>
@@ -34833,7 +34753,7 @@
         <w:t xml:space="preserve">S7.4 Analysis 2: Exclude Vogelherd Figurines Only</w:t>
       </w:r>
     </w:p>
-    <w:bookmarkStart w:id="242" w:name="method-1"/>
+    <w:bookmarkStart w:id="238" w:name="method-1"/>
     <w:p>
       <w:pPr>
         <w:pStyle w:val="Heading3"/>
@@ -34864,7 +34784,7 @@
       <w:tr>
         <w:tc>
           <w:tcPr/>
-          <w:bookmarkStart w:id="240" w:name="tbl-vogelherd-exclude"/>
+          <w:bookmarkStart w:id="236" w:name="tbl-vogelherd-exclude"/>
           <w:tbl>
             <w:tblPr>
               <w:tblStyle w:val="Table"/>
@@ -35430,7 +35350,7 @@
               <w:t xml:space="preserve">Table 31: Network statistics before and after excluding figurines from Vogelherd only. All other figurines (Hohle Fels, Geissenklösterle, Hohlenstein-Stadel, La Ferrassie) are retained. Threshold = 0.2, Jaccard similarity.</w:t>
             </w:r>
           </w:p>
-          <w:bookmarkEnd w:id="240"/>
+          <w:bookmarkEnd w:id="236"/>
         </w:tc>
       </w:tr>
     </w:tbl>
@@ -35456,7 +35376,7 @@
       <w:tr>
         <w:tc>
           <w:tcPr/>
-          <w:bookmarkStart w:id="241" w:name="tbl-vogelherd-objects"/>
+          <w:bookmarkStart w:id="237" w:name="tbl-vogelherd-objects"/>
           <w:tbl>
             <w:tblPr>
               <w:tblStyle w:val="Table"/>
@@ -35595,12 +35515,12 @@
               <w:t xml:space="preserve">Table 32: Vogelherd object counts before and after removing figurines. Non-figurine objects at Vogelherd (tools, plaquettes, etc.) are retained.</w:t>
             </w:r>
           </w:p>
-          <w:bookmarkEnd w:id="241"/>
+          <w:bookmarkEnd w:id="237"/>
         </w:tc>
       </w:tr>
     </w:tbl>
-    <w:bookmarkEnd w:id="242"/>
-    <w:bookmarkStart w:id="243" w:name="interpretation-8"/>
+    <w:bookmarkEnd w:id="238"/>
+    <w:bookmarkStart w:id="239" w:name="interpretation-8"/>
     <w:p>
       <w:pPr>
         <w:pStyle w:val="Heading3"/>
@@ -35625,9 +35545,9 @@
         <w:t xml:space="preserve">The effect of removing Vogelherd figurines alone (-1.3% in Aur-P1) is the same as removing all 63 figurines globally (-1.3%), and in both cases the network is essentially unchanged. The figurine effect therefore does not scale with the number of figurines removed; figurines at Hohle Fels (4, 4), Geissenklösterle (3), Hohlenstein-Stadel (1), and La Ferrassie (1) do not alter the network structure , including the 4 Hohle Fels figurines assigned to Aur-P2, which leave that phase’s network unchanged , and Vogelherd’s connectivity within Aur-P1 is carried by its 123 non-figurine objects.</w:t>
       </w:r>
     </w:p>
-    <w:bookmarkEnd w:id="243"/>
-    <w:bookmarkEnd w:id="244"/>
-    <w:bookmarkStart w:id="246" w:name="s7.5-joint-comparison"/>
+    <w:bookmarkEnd w:id="239"/>
+    <w:bookmarkEnd w:id="240"/>
+    <w:bookmarkStart w:id="242" w:name="s7.5-joint-comparison"/>
     <w:p>
       <w:pPr>
         <w:pStyle w:val="Heading2"/>
@@ -35650,7 +35570,7 @@
       <w:tr>
         <w:tc>
           <w:tcPr/>
-          <w:bookmarkStart w:id="245" w:name="tbl-objtype-joint"/>
+          <w:bookmarkStart w:id="241" w:name="tbl-objtype-joint"/>
           <w:tbl>
             <w:tblPr>
               <w:tblStyle w:val="Table"/>
@@ -36428,12 +36348,12 @@
               <w:t xml:space="preserve">Table 33: Side-by-side comparison of network statistics across all conditions: baseline (all objects), exclude all figurines, and exclude Vogelherd figurines only. The rightmost columns show the percentage change in mean degree from baseline.</w:t>
             </w:r>
           </w:p>
-          <w:bookmarkEnd w:id="245"/>
+          <w:bookmarkEnd w:id="241"/>
         </w:tc>
       </w:tr>
     </w:tbl>
-    <w:bookmarkEnd w:id="246"/>
-    <w:bookmarkStart w:id="248" w:name="s7.6-interpretation"/>
+    <w:bookmarkEnd w:id="242"/>
+    <w:bookmarkStart w:id="244" w:name="s7.6-interpretation"/>
     <w:p>
       <w:pPr>
         <w:pStyle w:val="Heading2"/>
@@ -36481,7 +36401,7 @@
       <w:tr>
         <w:tc>
           <w:tcPr/>
-          <w:bookmarkStart w:id="247" w:name="tbl-s7-6-meandegree"/>
+          <w:bookmarkStart w:id="243" w:name="tbl-s7-6-meandegree"/>
           <w:tbl>
             <w:tblPr>
               <w:tblStyle w:val="Table"/>
@@ -36769,7 +36689,7 @@
               <w:t xml:space="preserve">.</w:t>
             </w:r>
           </w:p>
-          <w:bookmarkEnd w:id="247"/>
+          <w:bookmarkEnd w:id="243"/>
         </w:tc>
       </w:tr>
     </w:tbl>
@@ -36857,9 +36777,9 @@
         <w:t xml:space="preserve">argument that figurines carry high-information sign sequences, but the communities themselves are defined by shared sign types across all object types.</w:t>
       </w:r>
     </w:p>
-    <w:bookmarkEnd w:id="248"/>
-    <w:bookmarkEnd w:id="249"/>
-    <w:bookmarkStart w:id="257" w:name="sec-s8"/>
+    <w:bookmarkEnd w:id="244"/>
+    <w:bookmarkEnd w:id="245"/>
+    <w:bookmarkStart w:id="253" w:name="sec-s8"/>
     <w:p>
       <w:pPr>
         <w:pStyle w:val="Heading1"/>
@@ -36868,7 +36788,7 @@
         <w:t xml:space="preserve">S8. Site Reclassification Sensitivity Analysis</w:t>
       </w:r>
     </w:p>
-    <w:bookmarkStart w:id="250" w:name="s8.1-rationale"/>
+    <w:bookmarkStart w:id="246" w:name="s8.1-rationale"/>
     <w:p>
       <w:pPr>
         <w:pStyle w:val="Heading2"/>
@@ -37056,8 +36976,8 @@
         <w:t xml:space="preserve">Because these attributions are important for the two-phase framework, this section tests the sensitivity of the network results to (A) reverting to the purely date-based assignment used in earlier analyses , each object assigned to a phase by its calibrated date alone , and (B) excluding Vogelherd entirely, given its documented stratigraphic mixing.</w:t>
       </w:r>
     </w:p>
-    <w:bookmarkEnd w:id="250"/>
-    <w:bookmarkStart w:id="253" w:name="s8.2-results"/>
+    <w:bookmarkEnd w:id="246"/>
+    <w:bookmarkStart w:id="249" w:name="s8.2-results"/>
     <w:p>
       <w:pPr>
         <w:pStyle w:val="Heading2"/>
@@ -37080,7 +37000,7 @@
       <w:tr>
         <w:tc>
           <w:tcPr/>
-          <w:bookmarkStart w:id="251" w:name="tbl-reclass-comparison"/>
+          <w:bookmarkStart w:id="247" w:name="tbl-reclass-comparison"/>
           <w:tbl>
             <w:tblPr>
               <w:tblStyle w:val="Table"/>
@@ -37858,11 +37778,11 @@
               <w:t xml:space="preserve">Table 35: Network statistics under three conditions: baseline (technology-based assignment), date-based (each object assigned purely by calibrated radiocarbon date, with the Spy/El Castillo exclusions retained), and exclude Vogelherd (technology-based baseline with the site of Vogelherd removed entirely). Threshold = 0.2, Jaccard similarity.</w:t>
             </w:r>
           </w:p>
-          <w:bookmarkEnd w:id="251"/>
+          <w:bookmarkEnd w:id="247"/>
         </w:tc>
       </w:tr>
     </w:tbl>
-    <w:bookmarkStart w:id="252" w:name="effects-by-condition"/>
+    <w:bookmarkStart w:id="248" w:name="effects-by-condition"/>
     <w:p>
       <w:pPr>
         <w:pStyle w:val="Heading3"/>
@@ -37916,9 +37836,9 @@
         <w:t xml:space="preserve">Removing Vogelherd’s 173 objects from the technology-based baseline reduces Aur-P1 from 20 to 19 sites and from 75 to 69 edges. Mean degree falls from 7.5 to 7.26 (−3.2%), and modularity from 0.336 to 0.312. Aur-P2 is unaffected (4.22, 19 edges, 9 sites).</w:t>
       </w:r>
     </w:p>
-    <w:bookmarkEnd w:id="252"/>
-    <w:bookmarkEnd w:id="253"/>
-    <w:bookmarkStart w:id="255" w:name="s8.3-phase-ordering-robustness"/>
+    <w:bookmarkEnd w:id="248"/>
+    <w:bookmarkEnd w:id="249"/>
+    <w:bookmarkStart w:id="251" w:name="s8.3-phase-ordering-robustness"/>
     <w:p>
       <w:pPr>
         <w:pStyle w:val="Heading2"/>
@@ -37962,7 +37882,7 @@
       <w:tr>
         <w:tc>
           <w:tcPr/>
-          <w:bookmarkStart w:id="254" w:name="tbl-s8-ordering"/>
+          <w:bookmarkStart w:id="250" w:name="tbl-s8-ordering"/>
           <w:tbl>
             <w:tblPr>
               <w:tblStyle w:val="Table"/>
@@ -38210,7 +38130,7 @@
               <w:t xml:space="preserve">Table 36: Mean degree by phase under each reassignment condition. The Aur-P1 &gt; Aur-P2 ordering is preserved under every condition.</w:t>
             </w:r>
           </w:p>
-          <w:bookmarkEnd w:id="254"/>
+          <w:bookmarkEnd w:id="250"/>
         </w:tc>
       </w:tr>
     </w:tbl>
@@ -38222,8 +38142,8 @@
         <w:t xml:space="preserve">Under the date-based assignment Aur-P1’s mean degree rises (from 7.5 to 8) and Aur-P2’s falls (from 4.22 to 3.6), so the contrast is not an artefact of the technological reassignment , the naive date-based assignment, if anything, strengthens it. Excluding Vogelherd weakens but does not remove the contrast (7.26 vs 4.22).</w:t>
       </w:r>
     </w:p>
-    <w:bookmarkEnd w:id="255"/>
-    <w:bookmarkStart w:id="256" w:name="s8.4-interpretation"/>
+    <w:bookmarkEnd w:id="251"/>
+    <w:bookmarkStart w:id="252" w:name="s8.4-interpretation"/>
     <w:p>
       <w:pPr>
         <w:pStyle w:val="Heading2"/>
@@ -38256,9 +38176,9 @@
         <w:t xml:space="preserve">Excluding Vogelherd leaves the ordering intact, consistent with S7’s finding that Aur-P1’s network does not depend on a single site. Finally, the within-phase two-group structure (RQ1) , the restricted/broad dichotomy recovered by seriation, Louvain community detection, and bootstrap consensus (S5, S6) , is defined within each phase’s membership and is unaffected by the between-phase assignment criterion tested here. The stochastic block model (S6.3) does not recover this dichotomy (single block selected under both emission models), consistent with the small size and sparsity of the sign-sharing networks falling below the detectability limit for block structure.</w:t>
       </w:r>
     </w:p>
-    <w:bookmarkEnd w:id="256"/>
-    <w:bookmarkEnd w:id="257"/>
-    <w:bookmarkStart w:id="355" w:name="sec-s9"/>
+    <w:bookmarkEnd w:id="252"/>
+    <w:bookmarkEnd w:id="253"/>
+    <w:bookmarkStart w:id="351" w:name="sec-s9"/>
     <w:p>
       <w:pPr>
         <w:pStyle w:val="Heading1"/>
@@ -38470,7 +38390,7 @@
         <w:t xml:space="preserve">Does the restricted/broad pattern survive richness-preserving nulls, and does the manual-group PerMANOVA hold on Simpson turnover dissimilarity, which removes the nestedness component of Jaccard?</w:t>
       </w:r>
     </w:p>
-    <w:bookmarkStart w:id="265" w:name="sec-s9-1"/>
+    <w:bookmarkStart w:id="261" w:name="sec-s9-1"/>
     <w:p>
       <w:pPr>
         <w:pStyle w:val="Heading2"/>
@@ -38479,7 +38399,7 @@
         <w:t xml:space="preserve">S9.1 Object-count distribution and feasible common counts</w:t>
       </w:r>
     </w:p>
-    <w:bookmarkStart w:id="263" w:name="rationale-11"/>
+    <w:bookmarkStart w:id="259" w:name="rationale-11"/>
     <w:p>
       <w:pPr>
         <w:pStyle w:val="Heading3"/>
@@ -38523,7 +38443,7 @@
       <w:tr>
         <w:tc>
           <w:tcPr/>
-          <w:bookmarkStart w:id="258" w:name="tbl-s9-objcount"/>
+          <w:bookmarkStart w:id="254" w:name="tbl-s9-objcount"/>
           <w:tbl>
             <w:tblPr>
               <w:tblStyle w:val="Table"/>
@@ -40174,7 +40094,7 @@
               <w:t xml:space="preserve">Table 37: Per-site object counts by phase and manual restricted(1)/broad(2) group. The reviewer notes the strong Spearman correlation (ρ = 0.86) between object count and sign-type richness across sites.</w:t>
             </w:r>
           </w:p>
-          <w:bookmarkEnd w:id="258"/>
+          <w:bookmarkEnd w:id="254"/>
         </w:tc>
       </w:tr>
     </w:tbl>
@@ -40192,7 +40112,7 @@
       <w:tr>
         <w:tc>
           <w:tcPr/>
-          <w:bookmarkStart w:id="262" w:name="fig-s9-objhist"/>
+          <w:bookmarkStart w:id="258" w:name="fig-s9-objhist"/>
           <w:p>
             <w:pPr>
               <w:pStyle w:val="Compact"/>
@@ -40203,18 +40123,18 @@
                 <wp:inline>
                   <wp:extent cx="5943600" cy="2971800"/>
                   <wp:effectExtent b="0" l="0" r="0" t="0"/>
-                  <wp:docPr descr="" title="" id="260" name="Picture"/>
+                  <wp:docPr descr="" title="" id="256" name="Picture"/>
                   <a:graphic>
                     <a:graphicData uri="http://schemas.openxmlformats.org/drawingml/2006/picture">
                       <pic:pic>
                         <pic:nvPicPr>
-                          <pic:cNvPr descr="S1-supplement-sensitivity_files/figure-docx/fig-s9-objhist-1.png" id="261" name="Picture"/>
+                          <pic:cNvPr descr="S1-supplement-sensitivity_files/figure-docx/fig-s9-objhist-1.png" id="257" name="Picture"/>
                           <pic:cNvPicPr>
                             <a:picLocks noChangeArrowheads="1" noChangeAspect="1"/>
                           </pic:cNvPicPr>
                         </pic:nvPicPr>
                         <pic:blipFill>
-                          <a:blip r:embed="rId259"/>
+                          <a:blip r:embed="rId255"/>
                           <a:stretch>
                             <a:fillRect/>
                           </a:stretch>
@@ -40251,15 +40171,15 @@
               <w:pStyle w:val="ImageCaption"/>
             </w:pPr>
             <w:r>
-              <w:t xml:space="preserve">Figure 8: Distribution of object counts per site by phase. Most sites contribute few objects; a small number of large assemblages (e.g. Vogelherd) dominate the upper tail.</w:t>
+              <w:t xml:space="preserve">Figure 7: Distribution of object counts per site by phase. Most sites contribute few objects; a small number of large assemblages (e.g. Vogelherd) dominate the upper tail.</w:t>
             </w:r>
           </w:p>
-          <w:bookmarkEnd w:id="262"/>
+          <w:bookmarkEnd w:id="258"/>
         </w:tc>
       </w:tr>
     </w:tbl>
-    <w:bookmarkEnd w:id="263"/>
-    <w:bookmarkStart w:id="264" w:name="interpretation-9"/>
+    <w:bookmarkEnd w:id="259"/>
+    <w:bookmarkStart w:id="260" w:name="interpretation-9"/>
     <w:p>
       <w:pPr>
         <w:pStyle w:val="Heading3"/>
@@ -40331,9 +40251,9 @@
         <w:t xml:space="preserve">only 7 and 3 sites remain. The smallest sites (Trou al’Wesse, Fumane, Pod Hradem, Grottes de Fonds-de-Forêt with one object; Les Cottés, Labeko Koba, Hohlenstein-Stadel with two) can never be downsampled and are excluded from every replicate. We therefore report results at k = 3, 5, and 10, treating k = 10 as the most stringent test (fewest sites, but each built from a substantial object sample) and k = 3 as the most inclusive.</w:t>
       </w:r>
     </w:p>
-    <w:bookmarkEnd w:id="264"/>
-    <w:bookmarkEnd w:id="265"/>
-    <w:bookmarkStart w:id="274" w:name="sec-s9-2"/>
+    <w:bookmarkEnd w:id="260"/>
+    <w:bookmarkEnd w:id="261"/>
+    <w:bookmarkStart w:id="270" w:name="sec-s9-2"/>
     <w:p>
       <w:pPr>
         <w:pStyle w:val="Heading2"/>
@@ -40342,7 +40262,7 @@
         <w:t xml:space="preserve">S9.2 Object-level downsampling sensitivity</w:t>
       </w:r>
     </w:p>
-    <w:bookmarkStart w:id="272" w:name="rationale-12"/>
+    <w:bookmarkStart w:id="268" w:name="rationale-12"/>
     <w:p>
       <w:pPr>
         <w:pStyle w:val="Heading3"/>
@@ -40417,7 +40337,7 @@
       <w:tr>
         <w:tc>
           <w:tcPr/>
-          <w:bookmarkStart w:id="266" w:name="tbl-s9-retention"/>
+          <w:bookmarkStart w:id="262" w:name="tbl-s9-retention"/>
           <w:tbl>
             <w:tblPr>
               <w:tblStyle w:val="Table"/>
@@ -42218,7 +42138,7 @@
               <w:t xml:space="preserve">Table 38: Per-site group-retention rate under object-level downsampling to k = 3, 5, 10 objects per site (500 replicates each). Retention is the fraction of replicates in which the site’s realigned Louvain partition matches its manual restricted/broad assignment. Sites with fewer than k objects are excluded at that level.</w:t>
             </w:r>
           </w:p>
-          <w:bookmarkEnd w:id="266"/>
+          <w:bookmarkEnd w:id="262"/>
         </w:tc>
       </w:tr>
     </w:tbl>
@@ -42244,7 +42164,7 @@
       <w:tr>
         <w:tc>
           <w:tcPr/>
-          <w:bookmarkStart w:id="267" w:name="tbl-s9-stability"/>
+          <w:bookmarkStart w:id="263" w:name="tbl-s9-stability"/>
           <w:tbl>
             <w:tblPr>
               <w:tblStyle w:val="Table"/>
@@ -42837,7 +42757,7 @@
               <w:t xml:space="preserve">Table 39: Community-structure stability under object-level downsampling. For each phase and common count k: number of sites qualifying, mean Adjusted Rand Index (ARI) between the downsampled Louvain partition and the manual groups, mean network modularity, and mean number of Louvain communities detected.</w:t>
             </w:r>
           </w:p>
-          <w:bookmarkEnd w:id="267"/>
+          <w:bookmarkEnd w:id="263"/>
         </w:tc>
       </w:tr>
     </w:tbl>
@@ -42855,7 +42775,7 @@
       <w:tr>
         <w:tc>
           <w:tcPr/>
-          <w:bookmarkStart w:id="271" w:name="fig-s9-retention"/>
+          <w:bookmarkStart w:id="267" w:name="fig-s9-retention"/>
           <w:p>
             <w:pPr>
               <w:pStyle w:val="Compact"/>
@@ -42866,18 +42786,18 @@
                 <wp:inline>
                   <wp:extent cx="5943600" cy="5943600"/>
                   <wp:effectExtent b="0" l="0" r="0" t="0"/>
-                  <wp:docPr descr="" title="" id="269" name="Picture"/>
+                  <wp:docPr descr="" title="" id="265" name="Picture"/>
                   <a:graphic>
                     <a:graphicData uri="http://schemas.openxmlformats.org/drawingml/2006/picture">
                       <pic:pic>
                         <pic:nvPicPr>
-                          <pic:cNvPr descr="S1-supplement-sensitivity_files/figure-docx/fig-s9-retention-1.png" id="270" name="Picture"/>
+                          <pic:cNvPr descr="S1-supplement-sensitivity_files/figure-docx/fig-s9-retention-1.png" id="266" name="Picture"/>
                           <pic:cNvPicPr>
                             <a:picLocks noChangeArrowheads="1" noChangeAspect="1"/>
                           </pic:cNvPicPr>
                         </pic:nvPicPr>
                         <pic:blipFill>
-                          <a:blip r:embed="rId268"/>
+                          <a:blip r:embed="rId264"/>
                           <a:stretch>
                             <a:fillRect/>
                           </a:stretch>
@@ -42914,15 +42834,15 @@
               <w:pStyle w:val="ImageCaption"/>
             </w:pPr>
             <w:r>
-              <w:t xml:space="preserve">Figure 9: Group-retention rate by site under object-level downsampling to k = 3, 5, 10 objects per site. Bars near 1 (red) indicate assignments that survive downsampling; bars near 0.5 (blue) indicate assignments that are essentially random with respect to the manual grouping and therefore unstable.</w:t>
+              <w:t xml:space="preserve">Figure 8: Group-retention rate by site under object-level downsampling to k = 3, 5, 10 objects per site. Bars near 1 (red) indicate assignments that survive downsampling; bars near 0.5 (blue) indicate assignments that are essentially random with respect to the manual grouping and therefore unstable.</w:t>
             </w:r>
           </w:p>
-          <w:bookmarkEnd w:id="271"/>
+          <w:bookmarkEnd w:id="267"/>
         </w:tc>
       </w:tr>
     </w:tbl>
-    <w:bookmarkEnd w:id="272"/>
-    <w:bookmarkStart w:id="273" w:name="interpretation-10"/>
+    <w:bookmarkEnd w:id="268"/>
+    <w:bookmarkStart w:id="269" w:name="interpretation-10"/>
     <w:p>
       <w:pPr>
         <w:pStyle w:val="Heading3"/>
@@ -42973,9 +42893,9 @@
         <w:t xml:space="preserve">the R/B assignment of small-object sites is not robust to object-level downsampling; only the best-sampled sites retain their grouping, and the community structure as a whole loses coherence under downsampling. This shows that the division is, at least in part, a sampling-intensity effect rather than a fully stable cultural partition.</w:t>
       </w:r>
     </w:p>
-    <w:bookmarkEnd w:id="273"/>
-    <w:bookmarkEnd w:id="274"/>
-    <w:bookmarkStart w:id="282" w:name="sec-s9-3"/>
+    <w:bookmarkEnd w:id="269"/>
+    <w:bookmarkEnd w:id="270"/>
+    <w:bookmarkStart w:id="278" w:name="sec-s9-3"/>
     <w:p>
       <w:pPr>
         <w:pStyle w:val="Heading2"/>
@@ -42984,7 +42904,7 @@
         <w:t xml:space="preserve">S9.3 Coverage-based rarefaction</w:t>
       </w:r>
     </w:p>
-    <w:bookmarkStart w:id="280" w:name="rationale-13"/>
+    <w:bookmarkStart w:id="276" w:name="rationale-13"/>
     <w:p>
       <w:pPr>
         <w:pStyle w:val="Heading3"/>
@@ -43138,7 +43058,7 @@
       <w:tr>
         <w:tc>
           <w:tcPr/>
-          <w:bookmarkStart w:id="275" w:name="tbl-s9-rarefaction"/>
+          <w:bookmarkStart w:id="271" w:name="tbl-s9-rarefaction"/>
           <w:tbl>
             <w:tblPr>
               <w:tblStyle w:val="Table"/>
@@ -48309,7 +48229,7 @@
               <w:t xml:space="preserve">Table 40: Coverage-based rarefaction per site. richness_full is the observed number of sign types; coverage_chao is Chao and Jost’s analytic sample-coverage estimate at the full sample with 95% bootstrap interval; richness_at_target is the iNEXT incidence_raw richness estimate at target coverage = 0.9 with 95% interval. Sites that never reach the target coverage are reported as NA with the reason in at_target_method, and carry a Chao2 asymptotic-richness estimate with interval as a fallback quantity.</w:t>
             </w:r>
           </w:p>
-          <w:bookmarkEnd w:id="275"/>
+          <w:bookmarkEnd w:id="271"/>
         </w:tc>
       </w:tr>
     </w:tbl>
@@ -48327,7 +48247,7 @@
       <w:tr>
         <w:tc>
           <w:tcPr/>
-          <w:bookmarkStart w:id="279" w:name="fig-s9-rarefaction"/>
+          <w:bookmarkStart w:id="275" w:name="fig-s9-rarefaction"/>
           <w:p>
             <w:pPr>
               <w:pStyle w:val="Compact"/>
@@ -48338,18 +48258,18 @@
                 <wp:inline>
                   <wp:extent cx="5943600" cy="3396342"/>
                   <wp:effectExtent b="0" l="0" r="0" t="0"/>
-                  <wp:docPr descr="" title="" id="277" name="Picture"/>
+                  <wp:docPr descr="" title="" id="273" name="Picture"/>
                   <a:graphic>
                     <a:graphicData uri="http://schemas.openxmlformats.org/drawingml/2006/picture">
                       <pic:pic>
                         <pic:nvPicPr>
-                          <pic:cNvPr descr="S1-supplement-sensitivity_files/figure-docx/fig-s9-rarefaction-1.png" id="278" name="Picture"/>
+                          <pic:cNvPr descr="S1-supplement-sensitivity_files/figure-docx/fig-s9-rarefaction-1.png" id="274" name="Picture"/>
                           <pic:cNvPicPr>
                             <a:picLocks noChangeArrowheads="1" noChangeAspect="1"/>
                           </pic:cNvPicPr>
                         </pic:nvPicPr>
                         <pic:blipFill>
-                          <a:blip r:embed="rId276"/>
+                          <a:blip r:embed="rId272"/>
                           <a:stretch>
                             <a:fillRect/>
                           </a:stretch>
@@ -48386,15 +48306,15 @@
               <w:pStyle w:val="ImageCaption"/>
             </w:pPr>
             <w:r>
-              <w:t xml:space="preserve">Figure 10: Sign-type richness estimated at target coverage = 0.9 with 95% confidence intervals, by manual group, for sites that reach that coverage. Restricted sites (green) that attain high coverage remain low-richness; broad sites (red) remain high-richness.</w:t>
+              <w:t xml:space="preserve">Figure 9: Sign-type richness estimated at target coverage = 0.9 with 95% confidence intervals, by manual group, for sites that reach that coverage. Restricted sites (green) that attain high coverage remain low-richness; broad sites (red) remain high-richness.</w:t>
             </w:r>
           </w:p>
-          <w:bookmarkEnd w:id="279"/>
+          <w:bookmarkEnd w:id="275"/>
         </w:tc>
       </w:tr>
     </w:tbl>
-    <w:bookmarkEnd w:id="280"/>
-    <w:bookmarkStart w:id="281" w:name="interpretation-11"/>
+    <w:bookmarkEnd w:id="276"/>
+    <w:bookmarkStart w:id="277" w:name="interpretation-11"/>
     <w:p>
       <w:pPr>
         <w:pStyle w:val="Heading3"/>
@@ -48455,9 +48375,9 @@
         <w:t xml:space="preserve">— it is not removed by standardising on completeness — but the majority of the smallest sites never attain the target coverage and therefore cannot be placed on a common coverage footing at all. Coverage-based rarefaction is consequently unreliable for the smallest assemblages: it can compare well-sampled sites, but it cannot rescue the assignment of sites with only one or two objects, for which the table reports Chao coverage and Chao2 fallback quantities instead. This is the same limitation encountered in S9.2, approached from the richness axis.</w:t>
       </w:r>
     </w:p>
-    <w:bookmarkEnd w:id="281"/>
-    <w:bookmarkEnd w:id="282"/>
-    <w:bookmarkStart w:id="286" w:name="sec-s9-4"/>
+    <w:bookmarkEnd w:id="277"/>
+    <w:bookmarkEnd w:id="278"/>
+    <w:bookmarkStart w:id="282" w:name="sec-s9-4"/>
     <w:p>
       <w:pPr>
         <w:pStyle w:val="Heading2"/>
@@ -48466,7 +48386,7 @@
         <w:t xml:space="preserve">S9.4 Negative-binomial regression with object-count covariate</w:t>
       </w:r>
     </w:p>
-    <w:bookmarkStart w:id="284" w:name="rationale-14"/>
+    <w:bookmarkStart w:id="280" w:name="rationale-14"/>
     <w:p>
       <w:pPr>
         <w:pStyle w:val="Heading3"/>
@@ -48835,7 +48755,7 @@
       <w:tr>
         <w:tc>
           <w:tcPr/>
-          <w:bookmarkStart w:id="283" w:name="tbl-s9-mixed"/>
+          <w:bookmarkStart w:id="279" w:name="tbl-s9-mixed"/>
           <w:tbl>
             <w:tblPr>
               <w:tblStyle w:val="Table"/>
@@ -49203,12 +49123,12 @@
               <w:t xml:space="preserve">Table 41: Negative-binomial regressions of per-site sign-type richness: offset specification (richness-effort exponent fixed at 1) versus free-slope specification (exponent estimated). A non-significant group coefficient under the offset does not by itself show the richness gap is explained by object count, because the fixed exponent mis-specifies the saturating richness-effort relationship.</w:t>
             </w:r>
           </w:p>
-          <w:bookmarkEnd w:id="283"/>
+          <w:bookmarkEnd w:id="279"/>
         </w:tc>
       </w:tr>
     </w:tbl>
-    <w:bookmarkEnd w:id="284"/>
-    <w:bookmarkStart w:id="285" w:name="interpretation-12"/>
+    <w:bookmarkEnd w:id="280"/>
+    <w:bookmarkStart w:id="281" w:name="interpretation-12"/>
     <w:p>
       <w:pPr>
         <w:pStyle w:val="Heading3"/>
@@ -49298,9 +49218,9 @@
         <w:t xml:space="preserve">the raw richness gap is not distinguishable from a genuine group difference once saturating sampling effort is accounted for; a non-significant offset coefficient cannot be read as positive evidence that effort explains the gap.</w:t>
       </w:r>
     </w:p>
-    <w:bookmarkEnd w:id="285"/>
-    <w:bookmarkEnd w:id="286"/>
-    <w:bookmarkStart w:id="294" w:name="sec-s9-5"/>
+    <w:bookmarkEnd w:id="281"/>
+    <w:bookmarkEnd w:id="282"/>
+    <w:bookmarkStart w:id="290" w:name="sec-s9-5"/>
     <w:p>
       <w:pPr>
         <w:pStyle w:val="Heading2"/>
@@ -49309,7 +49229,7 @@
         <w:t xml:space="preserve">S9.5 Equal-effort pool comparison (iNEXT)</w:t>
       </w:r>
     </w:p>
-    <w:bookmarkStart w:id="292" w:name="rationale-15"/>
+    <w:bookmarkStart w:id="288" w:name="rationale-15"/>
     <w:p>
       <w:pPr>
         <w:pStyle w:val="Heading3"/>
@@ -49414,7 +49334,7 @@
       <w:tr>
         <w:tc>
           <w:tcPr/>
-          <w:bookmarkStart w:id="287" w:name="tbl-s9-pool-inext"/>
+          <w:bookmarkStart w:id="283" w:name="tbl-s9-pool-inext"/>
           <w:tbl>
             <w:tblPr>
               <w:tblStyle w:val="Table"/>
@@ -50286,7 +50206,7 @@
               <w:t xml:space="preserve">Table 42: Equal-effort sign-type pool comparison with iNEXT (incidence_freq, q = 0, 200 bootstraps). Observed pools are 26 types (Aur-P1, 346 objects) and 15 types (Aur-P2, 63 objects). Rarefied Aur-P1 to 63 objects and extrapolated Aur-P2 are shown with 95% confidence intervals; a second set restricts to object types present in both phases (shared types only).</w:t>
             </w:r>
           </w:p>
-          <w:bookmarkEnd w:id="287"/>
+          <w:bookmarkEnd w:id="283"/>
         </w:tc>
       </w:tr>
     </w:tbl>
@@ -50304,7 +50224,7 @@
       <w:tr>
         <w:tc>
           <w:tcPr/>
-          <w:bookmarkStart w:id="291" w:name="fig-s9-pool-inext"/>
+          <w:bookmarkStart w:id="287" w:name="fig-s9-pool-inext"/>
           <w:p>
             <w:pPr>
               <w:pStyle w:val="Compact"/>
@@ -50315,18 +50235,18 @@
                 <wp:inline>
                   <wp:extent cx="5943600" cy="3566160"/>
                   <wp:effectExtent b="0" l="0" r="0" t="0"/>
-                  <wp:docPr descr="" title="" id="289" name="Picture"/>
+                  <wp:docPr descr="" title="" id="285" name="Picture"/>
                   <a:graphic>
                     <a:graphicData uri="http://schemas.openxmlformats.org/drawingml/2006/picture">
                       <pic:pic>
                         <pic:nvPicPr>
-                          <pic:cNvPr descr="S1-supplement-sensitivity_files/figure-docx/fig-s9-pool-inext-1.png" id="290" name="Picture"/>
+                          <pic:cNvPr descr="S1-supplement-sensitivity_files/figure-docx/fig-s9-pool-inext-1.png" id="286" name="Picture"/>
                           <pic:cNvPicPr>
                             <a:picLocks noChangeArrowheads="1" noChangeAspect="1"/>
                           </pic:cNvPicPr>
                         </pic:nvPicPr>
                         <pic:blipFill>
-                          <a:blip r:embed="rId288"/>
+                          <a:blip r:embed="rId284"/>
                           <a:stretch>
                             <a:fillRect/>
                           </a:stretch>
@@ -50363,15 +50283,15 @@
               <w:pStyle w:val="ImageCaption"/>
             </w:pPr>
             <w:r>
-              <w:t xml:space="preserve">Figure 11: iNEXT rarefaction/extrapolation curves for sign-type richness (Hill number q = 0) by phase. Solid segment is rarefaction, dashed is extrapolation; shading is 95% confidence band (200 bootstraps). Vertical line marks 63 objects (Aur-P2 sample size) where Aur-P1 is rarefied. All types (left) and shared types only (right) are shown.</w:t>
+              <w:t xml:space="preserve">Figure 10: iNEXT rarefaction/extrapolation curves for sign-type richness (Hill number q = 0) by phase. Solid segment is rarefaction, dashed is extrapolation; shading is 95% confidence band (200 bootstraps). Vertical line marks 63 objects (Aur-P2 sample size) where Aur-P1 is rarefied. All types (left) and shared types only (right) are shown.</w:t>
             </w:r>
           </w:p>
-          <w:bookmarkEnd w:id="291"/>
+          <w:bookmarkEnd w:id="287"/>
         </w:tc>
       </w:tr>
     </w:tbl>
-    <w:bookmarkEnd w:id="292"/>
-    <w:bookmarkStart w:id="293" w:name="interpretation-13"/>
+    <w:bookmarkEnd w:id="288"/>
+    <w:bookmarkStart w:id="289" w:name="interpretation-13"/>
     <w:p>
       <w:pPr>
         <w:pStyle w:val="Heading3"/>
@@ -50424,9 +50344,9 @@
         <w:t xml:space="preserve">the raw pool difference is not distinguishable from sampling variation at equal object count or equal coverage. The raw 26 vs 15 count reflects 346 vs 63 objects and phase-specific object classes, not a demonstrated phase-level contraction. The diversity-pool paragraphs in the Discussion and Conclusion that call this the most robust finding should be rewritten to the not distinguishable from form and the sample-difference caveat stated.</w:t>
       </w:r>
     </w:p>
-    <w:bookmarkEnd w:id="293"/>
-    <w:bookmarkEnd w:id="294"/>
-    <w:bookmarkStart w:id="295" w:name="sec-s9-6"/>
+    <w:bookmarkEnd w:id="289"/>
+    <w:bookmarkEnd w:id="290"/>
+    <w:bookmarkStart w:id="291" w:name="sec-s9-6"/>
     <w:p>
       <w:pPr>
         <w:pStyle w:val="Heading2"/>
@@ -50468,8 +50388,8 @@
         <w:t xml:space="preserve">: it is recovered robustly for large assemblages, but for the numerous small assemblages it is partly an artefact of how many objects were recovered, and the raw 26 vs 15 pool contraction does not survive equal-effort standardisation.</w:t>
       </w:r>
     </w:p>
-    <w:bookmarkEnd w:id="295"/>
-    <w:bookmarkStart w:id="299" w:name="sec-s9-7"/>
+    <w:bookmarkEnd w:id="291"/>
+    <w:bookmarkStart w:id="295" w:name="sec-s9-7"/>
     <w:p>
       <w:pPr>
         <w:pStyle w:val="Heading2"/>
@@ -50478,7 +50398,7 @@
         <w:t xml:space="preserve">S9.7 Simpson-dissimilarity group test and richness-preserving nulls</w:t>
       </w:r>
     </w:p>
-    <w:bookmarkStart w:id="297" w:name="rationale-16"/>
+    <w:bookmarkStart w:id="293" w:name="rationale-16"/>
     <w:p>
       <w:pPr>
         <w:pStyle w:val="Heading3"/>
@@ -50681,7 +50601,7 @@
       <w:tr>
         <w:tc>
           <w:tcPr/>
-          <w:bookmarkStart w:id="296" w:name="tbl-s9-simpson-null"/>
+          <w:bookmarkStart w:id="292" w:name="tbl-s9-simpson-null"/>
           <w:tbl>
             <w:tblPr>
               <w:tblStyle w:val="Table"/>
@@ -51379,12 +51299,12 @@
               <w:t xml:space="preserve">Table 43: Manual-group separation under richness-preserving nulls. R2_jac and R2_sim are the observed PerMANOVA R-squared of the manual groups on Jaccard and Simpson turnover dissimilarities; ARI is the Adjusted Rand Index between the Louvain partition (realigned to manual labels) and the manual groups. Each is compared to fixed-fixed Curveball and object-count null distributions (999 replicates); p is the quantile of the observed value in its null (upper-tail). Negative R2_sim values indicate zero separation, with within-group variation exceeding between-group variation.</w:t>
             </w:r>
           </w:p>
-          <w:bookmarkEnd w:id="296"/>
+          <w:bookmarkEnd w:id="292"/>
         </w:tc>
       </w:tr>
     </w:tbl>
-    <w:bookmarkEnd w:id="297"/>
-    <w:bookmarkStart w:id="298" w:name="interpretation-14"/>
+    <w:bookmarkEnd w:id="293"/>
+    <w:bookmarkStart w:id="294" w:name="interpretation-14"/>
     <w:p>
       <w:pPr>
         <w:pStyle w:val="Heading3"/>
@@ -51429,9 +51349,9 @@
         <w:t xml:space="preserve">the restricted/broad pattern is carried by the nestedness component — rich versus poor repertoires — rather than by compositional turnover between the groups. This is consistent with S9.3 and the free-slope S9.4: the groups differ in how much they contain at comparable effort, not in turnover-independent composition. The division should accordingly be read as a richness axis whose separation from sampling effort is not demonstrated for small-object sites.</w:t>
       </w:r>
     </w:p>
-    <w:bookmarkEnd w:id="298"/>
-    <w:bookmarkEnd w:id="299"/>
-    <w:bookmarkStart w:id="354" w:name="references-cited"/>
+    <w:bookmarkEnd w:id="294"/>
+    <w:bookmarkEnd w:id="295"/>
+    <w:bookmarkStart w:id="350" w:name="references-cited"/>
     <w:p>
       <w:pPr>
         <w:pStyle w:val="Heading2"/>
@@ -51440,8 +51360,8 @@
         <w:t xml:space="preserve">References cited</w:t>
       </w:r>
     </w:p>
-    <w:bookmarkStart w:id="353" w:name="refs"/>
-    <w:bookmarkStart w:id="301" w:name="X68cdd7ba62fc5dd3e1e9b497937717305f7b9a0"/>
+    <w:bookmarkStart w:id="349" w:name="refs"/>
+    <w:bookmarkStart w:id="297" w:name="X68cdd7ba62fc5dd3e1e9b497937717305f7b9a0"/>
     <w:p>
       <w:pPr>
         <w:pStyle w:val="Bibliography"/>
@@ -51473,7 +51393,7 @@
       <w:r>
         <w:t xml:space="preserve"> </w:t>
       </w:r>
-      <w:hyperlink r:id="rId300">
+      <w:hyperlink r:id="rId296">
         <w:r>
           <w:rPr>
             <w:rStyle w:val="Hyperlink"/>
@@ -51485,8 +51405,8 @@
         <w:t xml:space="preserve">.</w:t>
       </w:r>
     </w:p>
-    <w:bookmarkEnd w:id="301"/>
-    <w:bookmarkStart w:id="303" w:name="ref-teyssandier2018entity"/>
+    <w:bookmarkEnd w:id="297"/>
+    <w:bookmarkStart w:id="299" w:name="ref-teyssandier2018entity"/>
     <w:p>
       <w:pPr>
         <w:pStyle w:val="Bibliography"/>
@@ -51545,7 +51465,7 @@
       <w:r>
         <w:t xml:space="preserve"> </w:t>
       </w:r>
-      <w:hyperlink r:id="rId302">
+      <w:hyperlink r:id="rId298">
         <w:r>
           <w:rPr>
             <w:rStyle w:val="Hyperlink"/>
@@ -51557,8 +51477,8 @@
         <w:t xml:space="preserve">.</w:t>
       </w:r>
     </w:p>
-    <w:bookmarkEnd w:id="303"/>
-    <w:bookmarkStart w:id="305" w:name="ref-Blondel_2008"/>
+    <w:bookmarkEnd w:id="299"/>
+    <w:bookmarkStart w:id="301" w:name="ref-Blondel_2008"/>
     <w:p>
       <w:pPr>
         <w:pStyle w:val="Bibliography"/>
@@ -51578,7 +51498,7 @@
       <w:r>
         <w:t xml:space="preserve"> </w:t>
       </w:r>
-      <w:hyperlink r:id="rId304">
+      <w:hyperlink r:id="rId300">
         <w:r>
           <w:rPr>
             <w:rStyle w:val="Hyperlink"/>
@@ -51590,8 +51510,8 @@
         <w:t xml:space="preserve">.</w:t>
       </w:r>
     </w:p>
-    <w:bookmarkEnd w:id="305"/>
-    <w:bookmarkStart w:id="307" w:name="ref-newman2004finding"/>
+    <w:bookmarkEnd w:id="301"/>
+    <w:bookmarkStart w:id="303" w:name="ref-newman2004finding"/>
     <w:p>
       <w:pPr>
         <w:pStyle w:val="Bibliography"/>
@@ -51611,7 +51531,7 @@
       <w:r>
         <w:t xml:space="preserve"> </w:t>
       </w:r>
-      <w:hyperlink r:id="rId306">
+      <w:hyperlink r:id="rId302">
         <w:r>
           <w:rPr>
             <w:rStyle w:val="Hyperlink"/>
@@ -51623,8 +51543,8 @@
         <w:t xml:space="preserve">.</w:t>
       </w:r>
     </w:p>
-    <w:bookmarkEnd w:id="307"/>
-    <w:bookmarkStart w:id="309" w:name="ref-Roberts_2021"/>
+    <w:bookmarkEnd w:id="303"/>
+    <w:bookmarkStart w:id="305" w:name="ref-Roberts_2021"/>
     <w:p>
       <w:pPr>
         <w:pStyle w:val="Bibliography"/>
@@ -51644,7 +51564,7 @@
       <w:r>
         <w:t xml:space="preserve"> </w:t>
       </w:r>
-      <w:hyperlink r:id="rId308">
+      <w:hyperlink r:id="rId304">
         <w:r>
           <w:rPr>
             <w:rStyle w:val="Hyperlink"/>
@@ -51656,8 +51576,8 @@
         <w:t xml:space="preserve">.</w:t>
       </w:r>
     </w:p>
-    <w:bookmarkEnd w:id="309"/>
-    <w:bookmarkStart w:id="311" w:name="ref-Clarke_Rothery_Raybould_2002"/>
+    <w:bookmarkEnd w:id="305"/>
+    <w:bookmarkStart w:id="307" w:name="ref-Clarke_Rothery_Raybould_2002"/>
     <w:p>
       <w:pPr>
         <w:pStyle w:val="Bibliography"/>
@@ -51677,7 +51597,7 @@
       <w:r>
         <w:t xml:space="preserve"> </w:t>
       </w:r>
-      <w:hyperlink r:id="rId310">
+      <w:hyperlink r:id="rId306">
         <w:r>
           <w:rPr>
             <w:rStyle w:val="Hyperlink"/>
@@ -51689,8 +51609,8 @@
         <w:t xml:space="preserve">.</w:t>
       </w:r>
     </w:p>
-    <w:bookmarkEnd w:id="311"/>
-    <w:bookmarkStart w:id="313" w:name="ref-Lichstein_2007"/>
+    <w:bookmarkEnd w:id="307"/>
+    <w:bookmarkStart w:id="309" w:name="ref-Lichstein_2007"/>
     <w:p>
       <w:pPr>
         <w:pStyle w:val="Bibliography"/>
@@ -51710,7 +51630,7 @@
       <w:r>
         <w:t xml:space="preserve"> </w:t>
       </w:r>
-      <w:hyperlink r:id="rId312">
+      <w:hyperlink r:id="rId308">
         <w:r>
           <w:rPr>
             <w:rStyle w:val="Hyperlink"/>
@@ -51722,8 +51642,8 @@
         <w:t xml:space="preserve">.</w:t>
       </w:r>
     </w:p>
-    <w:bookmarkEnd w:id="313"/>
-    <w:bookmarkStart w:id="315" w:name="ref-Goslee_Urban_2007"/>
+    <w:bookmarkEnd w:id="309"/>
+    <w:bookmarkStart w:id="311" w:name="ref-Goslee_Urban_2007"/>
     <w:p>
       <w:pPr>
         <w:pStyle w:val="Bibliography"/>
@@ -51755,7 +51675,7 @@
       <w:r>
         <w:t xml:space="preserve"> </w:t>
       </w:r>
-      <w:hyperlink r:id="rId314">
+      <w:hyperlink r:id="rId310">
         <w:r>
           <w:rPr>
             <w:rStyle w:val="Hyperlink"/>
@@ -51767,8 +51687,8 @@
         <w:t xml:space="preserve">.</w:t>
       </w:r>
     </w:p>
-    <w:bookmarkEnd w:id="315"/>
-    <w:bookmarkStart w:id="317" w:name="ref-Monti_2003"/>
+    <w:bookmarkEnd w:id="311"/>
+    <w:bookmarkStart w:id="313" w:name="ref-Monti_2003"/>
     <w:p>
       <w:pPr>
         <w:pStyle w:val="Bibliography"/>
@@ -51788,7 +51708,7 @@
       <w:r>
         <w:t xml:space="preserve"> </w:t>
       </w:r>
-      <w:hyperlink r:id="rId316">
+      <w:hyperlink r:id="rId312">
         <w:r>
           <w:rPr>
             <w:rStyle w:val="Hyperlink"/>
@@ -51800,8 +51720,8 @@
         <w:t xml:space="preserve">.</w:t>
       </w:r>
     </w:p>
-    <w:bookmarkEnd w:id="317"/>
-    <w:bookmarkStart w:id="319" w:name="ref-Leger_2016"/>
+    <w:bookmarkEnd w:id="313"/>
+    <w:bookmarkStart w:id="315" w:name="ref-Leger_2016"/>
     <w:p>
       <w:pPr>
         <w:pStyle w:val="Bibliography"/>
@@ -51830,7 +51750,7 @@
       <w:r>
         <w:t xml:space="preserve"> </w:t>
       </w:r>
-      <w:hyperlink r:id="rId318">
+      <w:hyperlink r:id="rId314">
         <w:r>
           <w:rPr>
             <w:rStyle w:val="Hyperlink"/>
@@ -51842,8 +51762,8 @@
         <w:t xml:space="preserve">.</w:t>
       </w:r>
     </w:p>
-    <w:bookmarkEnd w:id="319"/>
-    <w:bookmarkStart w:id="321" w:name="ref-Hubert_Arabie_1985"/>
+    <w:bookmarkEnd w:id="315"/>
+    <w:bookmarkStart w:id="317" w:name="ref-Hubert_Arabie_1985"/>
     <w:p>
       <w:pPr>
         <w:pStyle w:val="Bibliography"/>
@@ -51863,7 +51783,7 @@
       <w:r>
         <w:t xml:space="preserve"> </w:t>
       </w:r>
-      <w:hyperlink r:id="rId320">
+      <w:hyperlink r:id="rId316">
         <w:r>
           <w:rPr>
             <w:rStyle w:val="Hyperlink"/>
@@ -51875,8 +51795,8 @@
         <w:t xml:space="preserve">.</w:t>
       </w:r>
     </w:p>
-    <w:bookmarkEnd w:id="321"/>
-    <w:bookmarkStart w:id="323" w:name="ref-Gao_Bien_Witten_2022"/>
+    <w:bookmarkEnd w:id="317"/>
+    <w:bookmarkStart w:id="319" w:name="ref-Gao_Bien_Witten_2022"/>
     <w:p>
       <w:pPr>
         <w:pStyle w:val="Bibliography"/>
@@ -51908,7 +51828,7 @@
       <w:r>
         <w:t xml:space="preserve"> </w:t>
       </w:r>
-      <w:hyperlink r:id="rId322">
+      <w:hyperlink r:id="rId318">
         <w:r>
           <w:rPr>
             <w:rStyle w:val="Hyperlink"/>
@@ -51920,8 +51840,8 @@
         <w:t xml:space="preserve">.</w:t>
       </w:r>
     </w:p>
-    <w:bookmarkEnd w:id="323"/>
-    <w:bookmarkStart w:id="325" w:name="ref-Neufeld_2024"/>
+    <w:bookmarkEnd w:id="319"/>
+    <w:bookmarkStart w:id="321" w:name="ref-Neufeld_2024"/>
     <w:p>
       <w:pPr>
         <w:pStyle w:val="Bibliography"/>
@@ -51953,7 +51873,7 @@
       <w:r>
         <w:t xml:space="preserve"> </w:t>
       </w:r>
-      <w:hyperlink r:id="rId324">
+      <w:hyperlink r:id="rId320">
         <w:r>
           <w:rPr>
             <w:rStyle w:val="Hyperlink"/>
@@ -51965,8 +51885,8 @@
         <w:t xml:space="preserve">.</w:t>
       </w:r>
     </w:p>
-    <w:bookmarkEnd w:id="325"/>
-    <w:bookmarkStart w:id="327" w:name="ref-Brown_1975"/>
+    <w:bookmarkEnd w:id="321"/>
+    <w:bookmarkStart w:id="323" w:name="ref-Brown_1975"/>
     <w:p>
       <w:pPr>
         <w:pStyle w:val="Bibliography"/>
@@ -51998,7 +51918,7 @@
       <w:r>
         <w:t xml:space="preserve"> </w:t>
       </w:r>
-      <w:hyperlink r:id="rId326">
+      <w:hyperlink r:id="rId322">
         <w:r>
           <w:rPr>
             <w:rStyle w:val="Hyperlink"/>
@@ -52010,8 +51930,8 @@
         <w:t xml:space="preserve">.</w:t>
       </w:r>
     </w:p>
-    <w:bookmarkEnd w:id="327"/>
-    <w:bookmarkStart w:id="329" w:name="ref-Poole_2016"/>
+    <w:bookmarkEnd w:id="323"/>
+    <w:bookmarkStart w:id="325" w:name="ref-Poole_2016"/>
     <w:p>
       <w:pPr>
         <w:pStyle w:val="Bibliography"/>
@@ -52049,7 +51969,7 @@
       <w:r>
         <w:t xml:space="preserve"> </w:t>
       </w:r>
-      <w:hyperlink r:id="rId328">
+      <w:hyperlink r:id="rId324">
         <w:r>
           <w:rPr>
             <w:rStyle w:val="Hyperlink"/>
@@ -52061,8 +51981,8 @@
         <w:t xml:space="preserve">.</w:t>
       </w:r>
     </w:p>
-    <w:bookmarkEnd w:id="329"/>
-    <w:bookmarkStart w:id="331" w:name="ref-Bentz_Dutkiewicz_2026"/>
+    <w:bookmarkEnd w:id="325"/>
+    <w:bookmarkStart w:id="327" w:name="ref-Bentz_Dutkiewicz_2026"/>
     <w:p>
       <w:pPr>
         <w:pStyle w:val="Bibliography"/>
@@ -52082,7 +52002,7 @@
       <w:r>
         <w:t xml:space="preserve"> </w:t>
       </w:r>
-      <w:hyperlink r:id="rId330">
+      <w:hyperlink r:id="rId326">
         <w:r>
           <w:rPr>
             <w:rStyle w:val="Hyperlink"/>
@@ -52094,8 +52014,8 @@
         <w:t xml:space="preserve">.</w:t>
       </w:r>
     </w:p>
-    <w:bookmarkEnd w:id="331"/>
-    <w:bookmarkStart w:id="333" w:name="ref-Chiotti_2005"/>
+    <w:bookmarkEnd w:id="327"/>
+    <w:bookmarkStart w:id="329" w:name="ref-Chiotti_2005"/>
     <w:p>
       <w:pPr>
         <w:pStyle w:val="Bibliography"/>
@@ -52142,7 +52062,7 @@
       <w:r>
         <w:t xml:space="preserve"> </w:t>
       </w:r>
-      <w:hyperlink r:id="rId332">
+      <w:hyperlink r:id="rId328">
         <w:r>
           <w:rPr>
             <w:rStyle w:val="Hyperlink"/>
@@ -52154,8 +52074,8 @@
         <w:t xml:space="preserve">.</w:t>
       </w:r>
     </w:p>
-    <w:bookmarkEnd w:id="333"/>
-    <w:bookmarkStart w:id="335" w:name="ref-Higham_Abri_Pataud_2011"/>
+    <w:bookmarkEnd w:id="329"/>
+    <w:bookmarkStart w:id="331" w:name="ref-Higham_Abri_Pataud_2011"/>
     <w:p>
       <w:pPr>
         <w:pStyle w:val="Bibliography"/>
@@ -52214,7 +52134,7 @@
       <w:r>
         <w:t xml:space="preserve"> </w:t>
       </w:r>
-      <w:hyperlink r:id="rId334">
+      <w:hyperlink r:id="rId330">
         <w:r>
           <w:rPr>
             <w:rStyle w:val="Hyperlink"/>
@@ -52226,8 +52146,8 @@
         <w:t xml:space="preserve">.</w:t>
       </w:r>
     </w:p>
-    <w:bookmarkEnd w:id="335"/>
-    <w:bookmarkStart w:id="337" w:name="ref-Talamo_La_Ferrassie_2020"/>
+    <w:bookmarkEnd w:id="331"/>
+    <w:bookmarkStart w:id="333" w:name="ref-Talamo_La_Ferrassie_2020"/>
     <w:p>
       <w:pPr>
         <w:pStyle w:val="Bibliography"/>
@@ -52328,7 +52248,7 @@
       <w:r>
         <w:t xml:space="preserve"> </w:t>
       </w:r>
-      <w:hyperlink r:id="rId336">
+      <w:hyperlink r:id="rId332">
         <w:r>
           <w:rPr>
             <w:rStyle w:val="Hyperlink"/>
@@ -52340,8 +52260,8 @@
         <w:t xml:space="preserve">.</w:t>
       </w:r>
     </w:p>
-    <w:bookmarkEnd w:id="337"/>
-    <w:bookmarkStart w:id="338" w:name="ref-Delporte_1984_Ferrassie"/>
+    <w:bookmarkEnd w:id="333"/>
+    <w:bookmarkStart w:id="334" w:name="ref-Delporte_1984_Ferrassie"/>
     <w:p>
       <w:pPr>
         <w:pStyle w:val="Bibliography"/>
@@ -52380,8 +52300,8 @@
         <w:t xml:space="preserve">histoire; 1984.</w:t>
       </w:r>
     </w:p>
-    <w:bookmarkEnd w:id="338"/>
-    <w:bookmarkStart w:id="340" w:name="ref-Oliva_2006"/>
+    <w:bookmarkEnd w:id="334"/>
+    <w:bookmarkStart w:id="336" w:name="ref-Oliva_2006"/>
     <w:p>
       <w:pPr>
         <w:pStyle w:val="Bibliography"/>
@@ -52449,7 +52369,7 @@
       <w:r>
         <w:t xml:space="preserve"> </w:t>
       </w:r>
-      <w:hyperlink r:id="rId339">
+      <w:hyperlink r:id="rId335">
         <w:r>
           <w:rPr>
             <w:rStyle w:val="Hyperlink"/>
@@ -52461,8 +52381,8 @@
         <w:t xml:space="preserve">.</w:t>
       </w:r>
     </w:p>
-    <w:bookmarkEnd w:id="340"/>
-    <w:bookmarkStart w:id="342" w:name="ref-Wild_et_al_2005"/>
+    <w:bookmarkEnd w:id="336"/>
+    <w:bookmarkStart w:id="338" w:name="ref-Wild_et_al_2005"/>
     <w:p>
       <w:pPr>
         <w:pStyle w:val="Bibliography"/>
@@ -52518,7 +52438,7 @@
       <w:r>
         <w:t xml:space="preserve"> </w:t>
       </w:r>
-      <w:hyperlink r:id="rId341">
+      <w:hyperlink r:id="rId337">
         <w:r>
           <w:rPr>
             <w:rStyle w:val="Hyperlink"/>
@@ -52530,8 +52450,8 @@
         <w:t xml:space="preserve">.</w:t>
       </w:r>
     </w:p>
-    <w:bookmarkEnd w:id="342"/>
-    <w:bookmarkStart w:id="344" w:name="ref-Schurch_Conard_2026_reassess"/>
+    <w:bookmarkEnd w:id="338"/>
+    <w:bookmarkStart w:id="340" w:name="ref-Schurch_Conard_2026_reassess"/>
     <w:p>
       <w:pPr>
         <w:pStyle w:val="Bibliography"/>
@@ -52566,7 +52486,7 @@
       <w:r>
         <w:t xml:space="preserve"> </w:t>
       </w:r>
-      <w:hyperlink r:id="rId343">
+      <w:hyperlink r:id="rId339">
         <w:r>
           <w:rPr>
             <w:rStyle w:val="Hyperlink"/>
@@ -52578,8 +52498,8 @@
         <w:t xml:space="preserve">.</w:t>
       </w:r>
     </w:p>
-    <w:bookmarkEnd w:id="344"/>
-    <w:bookmarkStart w:id="346" w:name="ref-Chao_Jost_2012"/>
+    <w:bookmarkEnd w:id="340"/>
+    <w:bookmarkStart w:id="342" w:name="ref-Chao_Jost_2012"/>
     <w:p>
       <w:pPr>
         <w:pStyle w:val="Bibliography"/>
@@ -52599,7 +52519,7 @@
       <w:r>
         <w:t xml:space="preserve"> </w:t>
       </w:r>
-      <w:hyperlink r:id="rId345">
+      <w:hyperlink r:id="rId341">
         <w:r>
           <w:rPr>
             <w:rStyle w:val="Hyperlink"/>
@@ -52611,8 +52531,8 @@
         <w:t xml:space="preserve">.</w:t>
       </w:r>
     </w:p>
-    <w:bookmarkEnd w:id="346"/>
-    <w:bookmarkStart w:id="348" w:name="ref-Gotelli_Colwell_2001"/>
+    <w:bookmarkEnd w:id="342"/>
+    <w:bookmarkStart w:id="344" w:name="ref-Gotelli_Colwell_2001"/>
     <w:p>
       <w:pPr>
         <w:pStyle w:val="Bibliography"/>
@@ -52632,7 +52552,7 @@
       <w:r>
         <w:t xml:space="preserve"> </w:t>
       </w:r>
-      <w:hyperlink r:id="rId347">
+      <w:hyperlink r:id="rId343">
         <w:r>
           <w:rPr>
             <w:rStyle w:val="Hyperlink"/>
@@ -52644,8 +52564,8 @@
         <w:t xml:space="preserve">.</w:t>
       </w:r>
     </w:p>
-    <w:bookmarkEnd w:id="348"/>
-    <w:bookmarkStart w:id="350" w:name="ref-Hsieh_Ma_Chao_2016"/>
+    <w:bookmarkEnd w:id="344"/>
+    <w:bookmarkStart w:id="346" w:name="ref-Hsieh_Ma_Chao_2016"/>
     <w:p>
       <w:pPr>
         <w:pStyle w:val="Bibliography"/>
@@ -52695,7 +52615,7 @@
       <w:r>
         <w:t xml:space="preserve"> </w:t>
       </w:r>
-      <w:hyperlink r:id="rId349">
+      <w:hyperlink r:id="rId345">
         <w:r>
           <w:rPr>
             <w:rStyle w:val="Hyperlink"/>
@@ -52707,8 +52627,8 @@
         <w:t xml:space="preserve">.</w:t>
       </w:r>
     </w:p>
-    <w:bookmarkEnd w:id="350"/>
-    <w:bookmarkStart w:id="352" w:name="ref-Venables_Ripley_2002"/>
+    <w:bookmarkEnd w:id="346"/>
+    <w:bookmarkStart w:id="348" w:name="ref-Venables_Ripley_2002"/>
     <w:p>
       <w:pPr>
         <w:pStyle w:val="Bibliography"/>
@@ -52728,7 +52648,7 @@
       <w:r>
         <w:t xml:space="preserve"> </w:t>
       </w:r>
-      <w:hyperlink r:id="rId351">
+      <w:hyperlink r:id="rId347">
         <w:r>
           <w:rPr>
             <w:rStyle w:val="Hyperlink"/>
@@ -52740,10 +52660,10 @@
         <w:t xml:space="preserve">.</w:t>
       </w:r>
     </w:p>
-    <w:bookmarkEnd w:id="352"/>
-    <w:bookmarkEnd w:id="353"/>
-    <w:bookmarkEnd w:id="354"/>
-    <w:bookmarkEnd w:id="355"/>
+    <w:bookmarkEnd w:id="348"/>
+    <w:bookmarkEnd w:id="349"/>
+    <w:bookmarkEnd w:id="350"/>
+    <w:bookmarkEnd w:id="351"/>
     <w:sectPr>
       <w:footnotePr>
         <w:numRestart w:val="eachSect"/>

</xml_diff>